<commit_message>
fix: set ALL fonts to Tahoma di semua templates
- document.xml: 1217 font tags updated
- styles.xml: 85 font tags updated
- fontTable.xml: 5 files updated dengan Tahoma embeddings
- Fix: output PDF sekarang menggunakan Tahoma font correctly
</commit_message>
<xml_diff>
--- a/templates/CEK/Budha.docx
+++ b/templates/CEK/Budha.docx
@@ -10,7 +10,7 @@
         <w:ind w:left="60"/>
         <w:rPr>
           <w:rStyle w:val="MSGENFONTSTYLENAMETEMPLATEROLENUMBERMSGENFONTSTYLENAMEBYROLETEXT2"/>
-          <w:rFonts w:ascii="Tahoma" w:hAnsi="Tahoma" w:cs="Tahoma"/>
+          <w:rFonts w:ascii="Tahoma" w:hAnsi="Tahoma"/>
           <w:b/>
           <w:sz w:val="24"/>
           <w:szCs w:val="24"/>
@@ -54,14 +54,14 @@
         <w:spacing w:before="0" w:line="360" w:lineRule="auto"/>
         <w:ind w:left="60"/>
         <w:rPr>
-          <w:rFonts w:ascii="Tahoma" w:hAnsi="Tahoma" w:cs="Tahoma"/>
+          <w:rFonts w:ascii="Tahoma" w:hAnsi="Tahoma"/>
           <w:b/>
         </w:rPr>
       </w:pPr>
       <w:r>
         <w:rPr>
           <w:rStyle w:val="MSGENFONTSTYLENAMETEMPLATEROLENUMBERMSGENFONTSTYLENAMEBYROLETEXT2"/>
-          <w:rFonts w:ascii="Tahoma" w:hAnsi="Tahoma" w:cs="Tahoma"/>
+          <w:rFonts w:ascii="Tahoma" w:hAnsi="Tahoma"/>
           <w:b/>
           <w:lang w:val="en-US"/>
         </w:rPr>
@@ -70,7 +70,7 @@
       <w:r>
         <w:rPr>
           <w:rStyle w:val="MSGENFONTSTYLENAMETEMPLATEROLENUMBERMSGENFONTSTYLENAMEBYROLETEXT2"/>
-          <w:rFonts w:ascii="Tahoma" w:hAnsi="Tahoma" w:cs="Tahoma"/>
+          <w:rFonts w:ascii="Tahoma" w:hAnsi="Tahoma"/>
           <w:b/>
         </w:rPr>
         <w:t>ERITA ACARA</w:t>
@@ -84,14 +84,14 @@
         <w:ind w:left="60"/>
         <w:rPr>
           <w:rStyle w:val="MSGENFONTSTYLENAMETEMPLATEROLENUMBERMSGENFONTSTYLENAMEBYROLETEXT2"/>
-          <w:rFonts w:ascii="Tahoma" w:hAnsi="Tahoma" w:cs="Tahoma"/>
+          <w:rFonts w:ascii="Tahoma" w:hAnsi="Tahoma"/>
           <w:lang w:val="en-US"/>
         </w:rPr>
       </w:pPr>
       <w:r>
         <w:rPr>
           <w:rStyle w:val="MSGENFONTSTYLENAMETEMPLATEROLENUMBERMSGENFONTSTYLENAMEBYROLETEXT2"/>
-          <w:rFonts w:ascii="Tahoma" w:hAnsi="Tahoma" w:cs="Tahoma"/>
+          <w:rFonts w:ascii="Tahoma" w:hAnsi="Tahoma"/>
           <w:b/>
         </w:rPr>
         <w:t>PENGAMBILAN SUMPAH PEGAWAI NEGERI SIPIL</w:t>
@@ -99,7 +99,7 @@
       <w:r>
         <w:rPr>
           <w:rStyle w:val="MSGENFONTSTYLENAMETEMPLATEROLENUMBERMSGENFONTSTYLENAMEBYROLETEXT2"/>
-          <w:rFonts w:ascii="Tahoma" w:hAnsi="Tahoma" w:cs="Tahoma"/>
+          <w:rFonts w:ascii="Tahoma" w:hAnsi="Tahoma"/>
         </w:rPr>
         <w:br/>
         <w:t>NOMOR : 8</w:t>
@@ -107,7 +107,7 @@
       <w:r>
         <w:rPr>
           <w:rStyle w:val="MSGENFONTSTYLENAMETEMPLATEROLENUMBERMSGENFONTSTYLENAMEBYROLETEXT2"/>
-          <w:rFonts w:ascii="Tahoma" w:hAnsi="Tahoma" w:cs="Tahoma"/>
+          <w:rFonts w:ascii="Tahoma" w:hAnsi="Tahoma"/>
           <w:lang w:val="en-US"/>
         </w:rPr>
         <w:t>77</w:t>
@@ -115,14 +115,14 @@
       <w:r>
         <w:rPr>
           <w:rStyle w:val="MSGENFONTSTYLENAMETEMPLATEROLENUMBERMSGENFONTSTYLENAMEBYROLETEXT2"/>
-          <w:rFonts w:ascii="Tahoma" w:hAnsi="Tahoma" w:cs="Tahoma"/>
+          <w:rFonts w:ascii="Tahoma" w:hAnsi="Tahoma"/>
         </w:rPr>
         <w:t>/</w:t>
       </w:r>
       <w:r>
         <w:rPr>
           <w:rStyle w:val="MSGENFONTSTYLENAMETEMPLATEROLENUMBERMSGENFONTSTYLENAMEBYROLETEXT2"/>
-          <w:rFonts w:ascii="Tahoma" w:hAnsi="Tahoma" w:cs="Tahoma"/>
+          <w:rFonts w:ascii="Tahoma" w:hAnsi="Tahoma"/>
           <w:lang w:val="en-US"/>
         </w:rPr>
         <w:t xml:space="preserve">           </w:t>
@@ -130,14 +130,14 @@
       <w:r>
         <w:rPr>
           <w:rStyle w:val="MSGENFONTSTYLENAMETEMPLATEROLENUMBERMSGENFONTSTYLENAMEBYROLETEXT2"/>
-          <w:rFonts w:ascii="Tahoma" w:hAnsi="Tahoma" w:cs="Tahoma"/>
+          <w:rFonts w:ascii="Tahoma" w:hAnsi="Tahoma"/>
         </w:rPr>
         <w:t>/204.3/202</w:t>
       </w:r>
       <w:r>
         <w:rPr>
           <w:rStyle w:val="MSGENFONTSTYLENAMETEMPLATEROLENUMBERMSGENFONTSTYLENAMEBYROLETEXT2"/>
-          <w:rFonts w:ascii="Tahoma" w:hAnsi="Tahoma" w:cs="Tahoma"/>
+          <w:rFonts w:ascii="Tahoma" w:hAnsi="Tahoma"/>
           <w:lang w:val="en-US"/>
         </w:rPr>
         <w:t>6</w:t>
@@ -151,7 +151,7 @@
         <w:ind w:left="60"/>
         <w:rPr>
           <w:rStyle w:val="MSGENFONTSTYLENAMETEMPLATEROLENUMBERMSGENFONTSTYLENAMEBYROLETEXT2"/>
-          <w:rFonts w:ascii="Tahoma" w:hAnsi="Tahoma" w:cs="Tahoma"/>
+          <w:rFonts w:ascii="Tahoma" w:hAnsi="Tahoma"/>
           <w:lang w:val="en-US"/>
         </w:rPr>
       </w:pPr>
@@ -168,7 +168,7 @@
         <w:jc w:val="both"/>
         <w:rPr>
           <w:rStyle w:val="MSGENFONTSTYLENAMETEMPLATEROLENUMBERMSGENFONTSTYLENAMEBYROLETEXT2"/>
-          <w:rFonts w:ascii="Tahoma" w:hAnsi="Tahoma" w:cs="Tahoma"/>
+          <w:rFonts w:ascii="Tahoma" w:hAnsi="Tahoma"/>
           <w:sz w:val="22"/>
           <w:szCs w:val="22"/>
           <w:lang w:val="en-US"/>
@@ -178,7 +178,7 @@
       <w:r>
         <w:rPr>
           <w:rStyle w:val="MSGENFONTSTYLENAMETEMPLATEROLENUMBERMSGENFONTSTYLENAMEBYROLETEXT2"/>
-          <w:rFonts w:ascii="Tahoma" w:hAnsi="Tahoma" w:cs="Tahoma"/>
+          <w:rFonts w:ascii="Tahoma" w:hAnsi="Tahoma"/>
           <w:sz w:val="22"/>
           <w:szCs w:val="22"/>
         </w:rPr>
@@ -187,7 +187,7 @@
       <w:r>
         <w:rPr>
           <w:rStyle w:val="MSGENFONTSTYLENAMETEMPLATEROLENUMBERMSGENFONTSTYLENAMEBYROLETEXT2"/>
-          <w:rFonts w:ascii="Tahoma" w:hAnsi="Tahoma" w:cs="Tahoma"/>
+          <w:rFonts w:ascii="Tahoma" w:hAnsi="Tahoma"/>
           <w:sz w:val="22"/>
           <w:szCs w:val="22"/>
           <w:lang w:val="en-AU"/>
@@ -197,7 +197,7 @@
       <w:r>
         <w:rPr>
           <w:rStyle w:val="MSGENFONTSTYLENAMETEMPLATEROLENUMBERMSGENFONTSTYLENAMEBYROLETEXT2"/>
-          <w:rFonts w:ascii="Tahoma" w:hAnsi="Tahoma" w:cs="Tahoma"/>
+          <w:rFonts w:ascii="Tahoma" w:hAnsi="Tahoma"/>
           <w:sz w:val="22"/>
           <w:szCs w:val="22"/>
         </w:rPr>
@@ -206,7 +206,7 @@
       <w:r>
         <w:rPr>
           <w:rStyle w:val="MSGENFONTSTYLENAMETEMPLATEROLENUMBERMSGENFONTSTYLENAMEBYROLETEXT2"/>
-          <w:rFonts w:ascii="Tahoma" w:hAnsi="Tahoma" w:cs="Tahoma"/>
+          <w:rFonts w:ascii="Tahoma" w:hAnsi="Tahoma"/>
           <w:sz w:val="22"/>
           <w:szCs w:val="22"/>
           <w:lang w:val="en-GB"/>
@@ -216,7 +216,7 @@
       <w:r>
         <w:rPr>
           <w:rStyle w:val="MSGENFONTSTYLENAMETEMPLATEROLENUMBERMSGENFONTSTYLENAMEBYROLETEXT2"/>
-          <w:rFonts w:ascii="Tahoma" w:hAnsi="Tahoma" w:cs="Tahoma"/>
+          <w:rFonts w:ascii="Tahoma" w:hAnsi="Tahoma"/>
           <w:sz w:val="22"/>
           <w:szCs w:val="22"/>
         </w:rPr>
@@ -225,7 +225,7 @@
       <w:r>
         <w:rPr>
           <w:rStyle w:val="MSGENFONTSTYLENAMETEMPLATEROLENUMBERMSGENFONTSTYLENAMEBYROLETEXT2"/>
-          <w:rFonts w:ascii="Tahoma" w:hAnsi="Tahoma" w:cs="Tahoma"/>
+          <w:rFonts w:ascii="Tahoma" w:hAnsi="Tahoma"/>
           <w:sz w:val="22"/>
           <w:szCs w:val="22"/>
           <w:lang w:val="en-GB"/>
@@ -235,7 +235,7 @@
       <w:r>
         <w:rPr>
           <w:rStyle w:val="MSGENFONTSTYLENAMETEMPLATEROLENUMBERMSGENFONTSTYLENAMEBYROLETEXT2"/>
-          <w:rFonts w:ascii="Tahoma" w:hAnsi="Tahoma" w:cs="Tahoma"/>
+          <w:rFonts w:ascii="Tahoma" w:hAnsi="Tahoma"/>
           <w:sz w:val="22"/>
           <w:szCs w:val="22"/>
         </w:rPr>
@@ -244,7 +244,7 @@
       <w:r>
         <w:rPr>
           <w:rStyle w:val="MSGENFONTSTYLENAMETEMPLATEROLENUMBERMSGENFONTSTYLENAMEBYROLETEXT2"/>
-          <w:rFonts w:ascii="Tahoma" w:hAnsi="Tahoma" w:cs="Tahoma"/>
+          <w:rFonts w:ascii="Tahoma" w:hAnsi="Tahoma"/>
           <w:sz w:val="22"/>
           <w:szCs w:val="22"/>
           <w:lang w:val="en-GB"/>
@@ -254,7 +254,7 @@
       <w:r>
         <w:rPr>
           <w:rStyle w:val="MSGENFONTSTYLENAMETEMPLATEROLENUMBERMSGENFONTSTYLENAMEBYROLETEXT2"/>
-          <w:rFonts w:ascii="Tahoma" w:hAnsi="Tahoma" w:cs="Tahoma"/>
+          <w:rFonts w:ascii="Tahoma" w:hAnsi="Tahoma"/>
           <w:sz w:val="22"/>
           <w:szCs w:val="22"/>
         </w:rPr>
@@ -263,7 +263,7 @@
       <w:r>
         <w:rPr>
           <w:rStyle w:val="MSGENFONTSTYLENAMETEMPLATEROLENUMBERMSGENFONTSTYLENAMEBYROLETEXT2"/>
-          <w:rFonts w:ascii="Tahoma" w:hAnsi="Tahoma" w:cs="Tahoma"/>
+          <w:rFonts w:ascii="Tahoma" w:hAnsi="Tahoma"/>
           <w:sz w:val="22"/>
           <w:szCs w:val="22"/>
           <w:lang w:val="en-US"/>
@@ -273,7 +273,7 @@
       <w:r>
         <w:rPr>
           <w:rStyle w:val="MSGENFONTSTYLENAMETEMPLATEROLENUMBERMSGENFONTSTYLENAMEBYROLETEXT2"/>
-          <w:rFonts w:ascii="Tahoma" w:hAnsi="Tahoma" w:cs="Tahoma"/>
+          <w:rFonts w:ascii="Tahoma" w:hAnsi="Tahoma"/>
           <w:sz w:val="22"/>
           <w:szCs w:val="22"/>
         </w:rPr>
@@ -282,7 +282,7 @@
       <w:r>
         <w:rPr>
           <w:rStyle w:val="MSGENFONTSTYLENAMETEMPLATEROLENUMBERMSGENFONTSTYLENAMEBYROLETEXT2"/>
-          <w:rFonts w:ascii="Tahoma" w:hAnsi="Tahoma" w:cs="Tahoma"/>
+          <w:rFonts w:ascii="Tahoma" w:hAnsi="Tahoma"/>
           <w:sz w:val="22"/>
           <w:szCs w:val="22"/>
           <w:lang w:val="en-US"/>
@@ -295,7 +295,7 @@
       <w:r>
         <w:rPr>
           <w:rStyle w:val="MSGENFONTSTYLENAMETEMPLATEROLENUMBERMSGENFONTSTYLENAMEBYROLETEXT2"/>
-          <w:rFonts w:ascii="Tahoma" w:hAnsi="Tahoma" w:cs="Tahoma"/>
+          <w:rFonts w:ascii="Tahoma" w:hAnsi="Tahoma"/>
           <w:sz w:val="22"/>
           <w:szCs w:val="22"/>
         </w:rPr>
@@ -304,7 +304,7 @@
       <w:r>
         <w:rPr>
           <w:rStyle w:val="MSGENFONTSTYLENAMETEMPLATEROLENUMBERMSGENFONTSTYLENAMEBYROLETEXT2"/>
-          <w:rFonts w:ascii="Tahoma" w:hAnsi="Tahoma" w:cs="Tahoma"/>
+          <w:rFonts w:ascii="Tahoma" w:hAnsi="Tahoma"/>
           <w:sz w:val="22"/>
           <w:szCs w:val="22"/>
           <w:lang w:val="en-US"/>
@@ -313,7 +313,7 @@
       </w:r>
       <w:r>
         <w:rPr>
-          <w:rFonts w:ascii="Tahoma" w:hAnsi="Tahoma" w:cs="Tahoma"/>
+          <w:rFonts w:ascii="Tahoma" w:hAnsi="Tahoma"/>
           <w:sz w:val="22"/>
           <w:szCs w:val="22"/>
           <w:shd w:val="clear" w:color="auto" w:fill="FFFFFF"/>
@@ -325,7 +325,7 @@
       <w:r>
         <w:rPr>
           <w:rStyle w:val="MSGENFONTSTYLENAMETEMPLATEROLENUMBERMSGENFONTSTYLENAMEBYROLETEXT2"/>
-          <w:rFonts w:ascii="Tahoma" w:hAnsi="Tahoma" w:cs="Tahoma"/>
+          <w:rFonts w:ascii="Tahoma" w:hAnsi="Tahoma"/>
           <w:sz w:val="22"/>
           <w:szCs w:val="22"/>
         </w:rPr>
@@ -334,7 +334,7 @@
       <w:r>
         <w:rPr>
           <w:rStyle w:val="MSGENFONTSTYLENAMETEMPLATEROLENUMBERMSGENFONTSTYLENAMEBYROLETEXT2"/>
-          <w:rFonts w:ascii="Tahoma" w:hAnsi="Tahoma" w:cs="Tahoma"/>
+          <w:rFonts w:ascii="Tahoma" w:hAnsi="Tahoma"/>
           <w:sz w:val="22"/>
           <w:szCs w:val="22"/>
           <w:lang w:val="en-US"/>
@@ -344,7 +344,7 @@
       <w:r>
         <w:rPr>
           <w:rStyle w:val="MSGENFONTSTYLENAMETEMPLATEROLENUMBERMSGENFONTSTYLENAMEBYROLETEXT2"/>
-          <w:rFonts w:ascii="Tahoma" w:hAnsi="Tahoma" w:cs="Tahoma"/>
+          <w:rFonts w:ascii="Tahoma" w:hAnsi="Tahoma"/>
           <w:sz w:val="22"/>
           <w:szCs w:val="22"/>
         </w:rPr>
@@ -353,7 +353,7 @@
       <w:r>
         <w:rPr>
           <w:rStyle w:val="MSGENFONTSTYLENAMETEMPLATEROLENUMBERMSGENFONTSTYLENAMEBYROLETEXT2"/>
-          <w:rFonts w:ascii="Tahoma" w:hAnsi="Tahoma" w:cs="Tahoma"/>
+          <w:rFonts w:ascii="Tahoma" w:hAnsi="Tahoma"/>
           <w:sz w:val="22"/>
           <w:szCs w:val="22"/>
           <w:lang w:val="en-US"/>
@@ -363,7 +363,7 @@
       <w:r>
         <w:rPr>
           <w:rStyle w:val="MSGENFONTSTYLENAMETEMPLATEROLENUMBERMSGENFONTSTYLENAMEBYROLETEXT2"/>
-          <w:rFonts w:ascii="Tahoma" w:hAnsi="Tahoma" w:cs="Tahoma"/>
+          <w:rFonts w:ascii="Tahoma" w:hAnsi="Tahoma"/>
           <w:sz w:val="22"/>
           <w:szCs w:val="22"/>
         </w:rPr>
@@ -372,7 +372,7 @@
       <w:r>
         <w:rPr>
           <w:rStyle w:val="MSGENFONTSTYLENAMETEMPLATEROLENUMBERMSGENFONTSTYLENAMEBYROLETEXT2"/>
-          <w:rFonts w:ascii="Tahoma" w:hAnsi="Tahoma" w:cs="Tahoma"/>
+          <w:rFonts w:ascii="Tahoma" w:hAnsi="Tahoma"/>
           <w:sz w:val="22"/>
           <w:szCs w:val="22"/>
           <w:lang w:val="en-US"/>
@@ -382,7 +382,7 @@
       <w:r>
         <w:rPr>
           <w:rStyle w:val="MSGENFONTSTYLENAMETEMPLATEROLENUMBERMSGENFONTSTYLENAMEBYROLETEXT2"/>
-          <w:rFonts w:ascii="Tahoma" w:hAnsi="Tahoma" w:cs="Tahoma"/>
+          <w:rFonts w:ascii="Tahoma" w:hAnsi="Tahoma"/>
           <w:sz w:val="22"/>
           <w:szCs w:val="22"/>
         </w:rPr>
@@ -391,7 +391,7 @@
       <w:r>
         <w:rPr>
           <w:rStyle w:val="MSGENFONTSTYLENAMETEMPLATEROLENUMBERMSGENFONTSTYLENAMEBYROLETEXT2"/>
-          <w:rFonts w:ascii="Tahoma" w:hAnsi="Tahoma" w:cs="Tahoma"/>
+          <w:rFonts w:ascii="Tahoma" w:hAnsi="Tahoma"/>
           <w:sz w:val="22"/>
           <w:szCs w:val="22"/>
           <w:lang w:val="en-US"/>
@@ -401,7 +401,7 @@
       <w:r>
         <w:rPr>
           <w:rStyle w:val="MSGENFONTSTYLENAMETEMPLATEROLENUMBERMSGENFONTSTYLENAMEBYROLETEXT2"/>
-          <w:rFonts w:ascii="Tahoma" w:hAnsi="Tahoma" w:cs="Tahoma"/>
+          <w:rFonts w:ascii="Tahoma" w:hAnsi="Tahoma"/>
           <w:sz w:val="22"/>
           <w:szCs w:val="22"/>
         </w:rPr>
@@ -422,14 +422,14 @@
         <w:ind w:left="142" w:right="46"/>
         <w:jc w:val="both"/>
         <w:rPr>
-          <w:rFonts w:ascii="Tahoma" w:hAnsi="Tahoma" w:cs="Tahoma"/>
+          <w:rFonts w:ascii="Tahoma" w:hAnsi="Tahoma"/>
           <w:sz w:val="22"/>
           <w:szCs w:val="22"/>
         </w:rPr>
       </w:pPr>
       <w:r>
         <w:rPr>
-          <w:rFonts w:ascii="Tahoma" w:hAnsi="Tahoma" w:cs="Tahoma"/>
+          <w:rFonts w:ascii="Tahoma" w:hAnsi="Tahoma"/>
           <w:sz w:val="22"/>
           <w:szCs w:val="22"/>
           <w:lang w:val="en-US"/>
@@ -438,7 +438,7 @@
       </w:r>
       <w:r>
         <w:rPr>
-          <w:rFonts w:ascii="Tahoma" w:hAnsi="Tahoma" w:cs="Tahoma"/>
+          <w:rFonts w:ascii="Tahoma" w:hAnsi="Tahoma"/>
           <w:sz w:val="22"/>
           <w:szCs w:val="22"/>
           <w:shd w:val="clear" w:color="auto" w:fill="FFFFFF"/>
@@ -449,7 +449,7 @@
       <w:r>
         <w:rPr>
           <w:rStyle w:val="MSGENFONTSTYLENAMETEMPLATEROLENUMBERMSGENFONTSTYLENAMEBYROLETEXT2"/>
-          <w:rFonts w:ascii="Tahoma" w:hAnsi="Tahoma" w:cs="Tahoma"/>
+          <w:rFonts w:ascii="Tahoma" w:hAnsi="Tahoma"/>
           <w:sz w:val="22"/>
           <w:szCs w:val="22"/>
         </w:rPr>
@@ -458,7 +458,7 @@
       <w:r>
         <w:rPr>
           <w:rStyle w:val="MSGENFONTSTYLENAMETEMPLATEROLENUMBERMSGENFONTSTYLENAMEBYROLETEXT2"/>
-          <w:rFonts w:ascii="Tahoma" w:hAnsi="Tahoma" w:cs="Tahoma"/>
+          <w:rFonts w:ascii="Tahoma" w:hAnsi="Tahoma"/>
           <w:sz w:val="22"/>
           <w:szCs w:val="22"/>
           <w:lang w:val="en-US"/>
@@ -467,7 +467,7 @@
       </w:r>
       <w:r>
         <w:rPr>
-          <w:rFonts w:ascii="Tahoma" w:hAnsi="Tahoma" w:cs="Tahoma"/>
+          <w:rFonts w:ascii="Tahoma" w:hAnsi="Tahoma"/>
           <w:sz w:val="22"/>
           <w:szCs w:val="22"/>
           <w:shd w:val="clear" w:color="auto" w:fill="FFFFFF"/>
@@ -477,7 +477,7 @@
       </w:r>
       <w:r>
         <w:rPr>
-          <w:rFonts w:ascii="Tahoma" w:hAnsi="Tahoma" w:cs="Tahoma"/>
+          <w:rFonts w:ascii="Tahoma" w:hAnsi="Tahoma"/>
           <w:sz w:val="22"/>
           <w:szCs w:val="22"/>
           <w:shd w:val="clear" w:color="auto" w:fill="FFFFFF"/>
@@ -488,7 +488,7 @@
       <w:r>
         <w:rPr>
           <w:rStyle w:val="MSGENFONTSTYLENAMETEMPLATEROLENUMBERMSGENFONTSTYLENAMEBYROLETEXT2"/>
-          <w:rFonts w:ascii="Tahoma" w:hAnsi="Tahoma" w:cs="Tahoma"/>
+          <w:rFonts w:ascii="Tahoma" w:hAnsi="Tahoma"/>
           <w:sz w:val="22"/>
           <w:szCs w:val="22"/>
         </w:rPr>
@@ -497,7 +497,7 @@
       <w:r>
         <w:rPr>
           <w:rStyle w:val="MSGENFONTSTYLENAMETEMPLATEROLENUMBERMSGENFONTSTYLENAMEBYROLETEXT2"/>
-          <w:rFonts w:ascii="Tahoma" w:hAnsi="Tahoma" w:cs="Tahoma"/>
+          <w:rFonts w:ascii="Tahoma" w:hAnsi="Tahoma"/>
           <w:sz w:val="22"/>
           <w:szCs w:val="22"/>
           <w:lang w:val="en-US"/>
@@ -507,7 +507,7 @@
       <w:r>
         <w:rPr>
           <w:rStyle w:val="MSGENFONTSTYLENAMETEMPLATEROLENUMBERMSGENFONTSTYLENAMEBYROLETEXT2"/>
-          <w:rFonts w:ascii="Tahoma" w:hAnsi="Tahoma" w:cs="Tahoma"/>
+          <w:rFonts w:ascii="Tahoma" w:hAnsi="Tahoma"/>
           <w:sz w:val="22"/>
           <w:szCs w:val="22"/>
         </w:rPr>
@@ -515,7 +515,7 @@
       </w:r>
       <w:r>
         <w:rPr>
-          <w:rFonts w:ascii="Tahoma" w:hAnsi="Tahoma" w:cs="Tahoma"/>
+          <w:rFonts w:ascii="Tahoma" w:hAnsi="Tahoma"/>
           <w:sz w:val="22"/>
           <w:szCs w:val="22"/>
           <w:shd w:val="clear" w:color="auto" w:fill="FFFFFF"/>
@@ -538,7 +538,7 @@
         <w:ind w:left="142" w:right="45"/>
         <w:jc w:val="both"/>
         <w:rPr>
-          <w:rFonts w:ascii="Tahoma" w:hAnsi="Tahoma" w:cs="Tahoma"/>
+          <w:rFonts w:ascii="Tahoma" w:hAnsi="Tahoma"/>
           <w:sz w:val="22"/>
           <w:szCs w:val="22"/>
           <w:lang w:val="en-US"/>
@@ -546,7 +546,7 @@
       </w:pPr>
       <w:r>
         <w:rPr>
-          <w:rFonts w:ascii="Tahoma" w:hAnsi="Tahoma" w:cs="Tahoma"/>
+          <w:rFonts w:ascii="Tahoma" w:hAnsi="Tahoma"/>
           <w:sz w:val="22"/>
           <w:szCs w:val="22"/>
           <w:lang w:val="en-US"/>
@@ -563,7 +563,7 @@
       <w:r>
         <w:rPr>
           <w:rStyle w:val="MSGENFONTSTYLENAMETEMPLATEROLENUMBERMSGENFONTSTYLENAMEBYROLETEXT2"/>
-          <w:rFonts w:ascii="Tahoma" w:hAnsi="Tahoma" w:cs="Tahoma"/>
+          <w:rFonts w:ascii="Tahoma" w:hAnsi="Tahoma"/>
           <w:sz w:val="22"/>
           <w:szCs w:val="22"/>
           <w:lang w:val="en-US"/>
@@ -573,7 +573,7 @@
       <w:r>
         <w:rPr>
           <w:rStyle w:val="MSGENFONTSTYLENAMETEMPLATEROLENUMBERMSGENFONTSTYLENAMEBYROLETEXT2"/>
-          <w:rFonts w:ascii="Tahoma" w:hAnsi="Tahoma" w:cs="Tahoma"/>
+          <w:rFonts w:ascii="Tahoma" w:hAnsi="Tahoma"/>
           <w:sz w:val="22"/>
           <w:szCs w:val="22"/>
         </w:rPr>
@@ -582,7 +582,7 @@
       <w:r>
         <w:rPr>
           <w:rStyle w:val="MSGENFONTSTYLENAMETEMPLATEROLENUMBERMSGENFONTSTYLENAMEBYROLETEXT2"/>
-          <w:rFonts w:ascii="Tahoma" w:hAnsi="Tahoma" w:cs="Tahoma"/>
+          <w:rFonts w:ascii="Tahoma" w:hAnsi="Tahoma"/>
           <w:sz w:val="22"/>
           <w:szCs w:val="22"/>
           <w:lang w:val="en-US"/>
@@ -591,7 +591,7 @@
       </w:r>
       <w:r>
         <w:rPr>
-          <w:rFonts w:ascii="Tahoma" w:hAnsi="Tahoma" w:cs="Tahoma"/>
+          <w:rFonts w:ascii="Tahoma" w:hAnsi="Tahoma"/>
           <w:sz w:val="22"/>
           <w:szCs w:val="22"/>
           <w:shd w:val="clear" w:color="auto" w:fill="FFFFFF"/>
@@ -602,7 +602,7 @@
       <w:r>
         <w:rPr>
           <w:rStyle w:val="MSGENFONTSTYLENAMETEMPLATEROLENUMBERMSGENFONTSTYLENAMEBYROLETEXT2"/>
-          <w:rFonts w:ascii="Tahoma" w:hAnsi="Tahoma" w:cs="Tahoma"/>
+          <w:rFonts w:ascii="Tahoma" w:hAnsi="Tahoma"/>
           <w:sz w:val="22"/>
           <w:szCs w:val="22"/>
           <w:lang w:val="en-US"/>
@@ -612,7 +612,7 @@
       <w:r>
         <w:rPr>
           <w:rStyle w:val="MSGENFONTSTYLENAMETEMPLATEROLENUMBERMSGENFONTSTYLENAMEBYROLETEXT2"/>
-          <w:rFonts w:ascii="Tahoma" w:hAnsi="Tahoma" w:cs="Tahoma"/>
+          <w:rFonts w:ascii="Tahoma" w:hAnsi="Tahoma"/>
           <w:sz w:val="22"/>
           <w:szCs w:val="22"/>
           <w:lang w:val="en-US"/>
@@ -622,7 +622,7 @@
       <w:r>
         <w:rPr>
           <w:rStyle w:val="MSGENFONTSTYLENAMETEMPLATEROLENUMBERMSGENFONTSTYLENAMEBYROLETEXT2"/>
-          <w:rFonts w:ascii="Tahoma" w:hAnsi="Tahoma" w:cs="Tahoma"/>
+          <w:rFonts w:ascii="Tahoma" w:hAnsi="Tahoma"/>
           <w:sz w:val="22"/>
           <w:szCs w:val="22"/>
         </w:rPr>
@@ -631,7 +631,7 @@
       <w:r>
         <w:rPr>
           <w:rStyle w:val="MSGENFONTSTYLENAMETEMPLATEROLENUMBERMSGENFONTSTYLENAMEBYROLETEXT2"/>
-          <w:rFonts w:ascii="Tahoma" w:hAnsi="Tahoma" w:cs="Tahoma"/>
+          <w:rFonts w:ascii="Tahoma" w:hAnsi="Tahoma"/>
           <w:sz w:val="22"/>
           <w:szCs w:val="22"/>
           <w:lang w:val="en-US"/>
@@ -641,7 +641,7 @@
       <w:r>
         <w:rPr>
           <w:rStyle w:val="MSGENFONTSTYLENAMETEMPLATEROLENUMBERMSGENFONTSTYLENAMEBYROLETEXT2"/>
-          <w:rFonts w:ascii="Tahoma" w:hAnsi="Tahoma" w:cs="Tahoma"/>
+          <w:rFonts w:ascii="Tahoma" w:hAnsi="Tahoma"/>
           <w:sz w:val="22"/>
           <w:szCs w:val="22"/>
         </w:rPr>
@@ -657,7 +657,7 @@
       </w:r>
       <w:r>
         <w:rPr>
-          <w:rFonts w:ascii="Tahoma" w:hAnsi="Tahoma" w:cs="Tahoma"/>
+          <w:rFonts w:ascii="Tahoma" w:hAnsi="Tahoma"/>
           <w:sz w:val="22"/>
           <w:szCs w:val="22"/>
           <w:shd w:val="clear" w:color="auto" w:fill="FFFFFF"/>
@@ -666,7 +666,7 @@
       </w:r>
       <w:r>
         <w:rPr>
-          <w:rFonts w:ascii="Tahoma" w:hAnsi="Tahoma" w:cs="Tahoma"/>
+          <w:rFonts w:ascii="Tahoma" w:hAnsi="Tahoma"/>
           <w:sz w:val="22"/>
           <w:szCs w:val="22"/>
           <w:shd w:val="clear" w:color="auto" w:fill="FFFFFF"/>
@@ -676,7 +676,7 @@
       </w:r>
       <w:r>
         <w:rPr>
-          <w:rFonts w:ascii="Tahoma" w:hAnsi="Tahoma" w:cs="Tahoma"/>
+          <w:rFonts w:ascii="Tahoma" w:hAnsi="Tahoma"/>
           <w:sz w:val="22"/>
           <w:szCs w:val="22"/>
           <w:shd w:val="clear" w:color="auto" w:fill="FFFFFF"/>
@@ -685,7 +685,7 @@
       </w:r>
       <w:r>
         <w:rPr>
-          <w:rFonts w:ascii="Tahoma" w:hAnsi="Tahoma" w:cs="Tahoma"/>
+          <w:rFonts w:ascii="Tahoma" w:hAnsi="Tahoma"/>
           <w:sz w:val="22"/>
           <w:szCs w:val="22"/>
           <w:shd w:val="clear" w:color="auto" w:fill="FFFFFF"/>
@@ -695,7 +695,7 @@
       </w:r>
       <w:r>
         <w:rPr>
-          <w:rFonts w:ascii="Tahoma" w:hAnsi="Tahoma" w:cs="Tahoma"/>
+          <w:rFonts w:ascii="Tahoma" w:hAnsi="Tahoma"/>
           <w:sz w:val="22"/>
           <w:szCs w:val="22"/>
           <w:shd w:val="clear" w:color="auto" w:fill="FFFFFF"/>
@@ -704,7 +704,7 @@
       </w:r>
       <w:r>
         <w:rPr>
-          <w:rFonts w:ascii="Tahoma" w:hAnsi="Tahoma" w:cs="Tahoma"/>
+          <w:rFonts w:ascii="Tahoma" w:hAnsi="Tahoma"/>
           <w:sz w:val="22"/>
           <w:szCs w:val="22"/>
           <w:shd w:val="clear" w:color="auto" w:fill="FFFFFF"/>
@@ -714,7 +714,7 @@
       </w:r>
       <w:r>
         <w:rPr>
-          <w:rFonts w:ascii="Tahoma" w:hAnsi="Tahoma" w:cs="Tahoma"/>
+          <w:rFonts w:ascii="Tahoma" w:hAnsi="Tahoma"/>
           <w:sz w:val="22"/>
           <w:szCs w:val="22"/>
           <w:shd w:val="clear" w:color="auto" w:fill="FFFFFF"/>
@@ -735,7 +735,7 @@
         <w:ind w:left="142" w:right="46"/>
         <w:jc w:val="both"/>
         <w:rPr>
-          <w:rFonts w:ascii="Tahoma" w:hAnsi="Tahoma" w:cs="Tahoma"/>
+          <w:rFonts w:ascii="Tahoma" w:hAnsi="Tahoma"/>
           <w:sz w:val="22"/>
           <w:szCs w:val="22"/>
           <w:shd w:val="clear" w:color="auto" w:fill="FFFFFF"/>
@@ -745,7 +745,7 @@
       <w:r>
         <w:rPr>
           <w:rStyle w:val="MSGENFONTSTYLENAMETEMPLATEROLENUMBERMSGENFONTSTYLENAMEBYROLETEXT2"/>
-          <w:rFonts w:ascii="Tahoma" w:hAnsi="Tahoma" w:cs="Tahoma"/>
+          <w:rFonts w:ascii="Tahoma" w:hAnsi="Tahoma"/>
           <w:sz w:val="22"/>
           <w:szCs w:val="22"/>
           <w:lang w:val="en-US"/>
@@ -755,7 +755,7 @@
       <w:r>
         <w:rPr>
           <w:rStyle w:val="MSGENFONTSTYLENAMETEMPLATEROLENUMBERMSGENFONTSTYLENAMEBYROLETEXT2"/>
-          <w:rFonts w:ascii="Tahoma" w:hAnsi="Tahoma" w:cs="Tahoma"/>
+          <w:rFonts w:ascii="Tahoma" w:hAnsi="Tahoma"/>
           <w:sz w:val="22"/>
           <w:szCs w:val="22"/>
         </w:rPr>
@@ -764,7 +764,7 @@
       <w:r>
         <w:rPr>
           <w:rStyle w:val="MSGENFONTSTYLENAMETEMPLATEROLENUMBERMSGENFONTSTYLENAMEBYROLETEXT2"/>
-          <w:rFonts w:ascii="Tahoma" w:hAnsi="Tahoma" w:cs="Tahoma"/>
+          <w:rFonts w:ascii="Tahoma" w:hAnsi="Tahoma"/>
           <w:sz w:val="22"/>
           <w:szCs w:val="22"/>
           <w:lang w:val="en-US"/>
@@ -774,7 +774,7 @@
       <w:r>
         <w:rPr>
           <w:rStyle w:val="MSGENFONTSTYLENAMETEMPLATEROLENUMBERMSGENFONTSTYLENAMEBYROLETEXT2"/>
-          <w:rFonts w:ascii="Tahoma" w:hAnsi="Tahoma" w:cs="Tahoma"/>
+          <w:rFonts w:ascii="Tahoma" w:hAnsi="Tahoma"/>
           <w:sz w:val="22"/>
           <w:szCs w:val="22"/>
         </w:rPr>
@@ -783,7 +783,7 @@
       <w:r>
         <w:rPr>
           <w:rStyle w:val="MSGENFONTSTYLENAMETEMPLATEROLENUMBERMSGENFONTSTYLENAMEBYROLETEXT2"/>
-          <w:rFonts w:ascii="Tahoma" w:hAnsi="Tahoma" w:cs="Tahoma"/>
+          <w:rFonts w:ascii="Tahoma" w:hAnsi="Tahoma"/>
           <w:sz w:val="22"/>
           <w:szCs w:val="22"/>
           <w:lang w:val="en-US"/>
@@ -793,7 +793,7 @@
       <w:r>
         <w:rPr>
           <w:rStyle w:val="MSGENFONTSTYLENAMETEMPLATEROLENUMBERMSGENFONTSTYLENAMEBYROLETEXT2"/>
-          <w:rFonts w:ascii="Tahoma" w:hAnsi="Tahoma" w:cs="Tahoma"/>
+          <w:rFonts w:ascii="Tahoma" w:hAnsi="Tahoma"/>
           <w:sz w:val="22"/>
           <w:szCs w:val="22"/>
         </w:rPr>
@@ -802,7 +802,7 @@
       <w:r>
         <w:rPr>
           <w:rStyle w:val="MSGENFONTSTYLENAMETEMPLATEROLENUMBERMSGENFONTSTYLENAMEBYROLETEXT2"/>
-          <w:rFonts w:ascii="Tahoma" w:hAnsi="Tahoma" w:cs="Tahoma"/>
+          <w:rFonts w:ascii="Tahoma" w:hAnsi="Tahoma"/>
           <w:sz w:val="22"/>
           <w:szCs w:val="22"/>
           <w:lang w:val="en-US"/>
@@ -812,7 +812,7 @@
       <w:r>
         <w:rPr>
           <w:rStyle w:val="MSGENFONTSTYLENAMETEMPLATEROLENUMBERMSGENFONTSTYLENAMEBYROLETEXT2"/>
-          <w:rFonts w:ascii="Tahoma" w:hAnsi="Tahoma" w:cs="Tahoma"/>
+          <w:rFonts w:ascii="Tahoma" w:hAnsi="Tahoma"/>
           <w:sz w:val="22"/>
           <w:szCs w:val="22"/>
         </w:rPr>
@@ -821,7 +821,7 @@
       <w:r>
         <w:rPr>
           <w:rStyle w:val="MSGENFONTSTYLENAMETEMPLATEROLENUMBERMSGENFONTSTYLENAMEBYROLETEXT2"/>
-          <w:rFonts w:ascii="Tahoma" w:hAnsi="Tahoma" w:cs="Tahoma"/>
+          <w:rFonts w:ascii="Tahoma" w:hAnsi="Tahoma"/>
           <w:sz w:val="22"/>
           <w:szCs w:val="22"/>
           <w:lang w:val="en-US"/>
@@ -831,7 +831,7 @@
       <w:r>
         <w:rPr>
           <w:rStyle w:val="MSGENFONTSTYLENAMETEMPLATEROLENUMBERMSGENFONTSTYLENAMEBYROLETEXT2"/>
-          <w:rFonts w:ascii="Tahoma" w:hAnsi="Tahoma" w:cs="Tahoma"/>
+          <w:rFonts w:ascii="Tahoma" w:hAnsi="Tahoma"/>
           <w:sz w:val="22"/>
           <w:szCs w:val="22"/>
         </w:rPr>
@@ -840,7 +840,7 @@
       <w:r>
         <w:rPr>
           <w:rStyle w:val="MSGENFONTSTYLENAMETEMPLATEROLENUMBERMSGENFONTSTYLENAMEBYROLETEXT2"/>
-          <w:rFonts w:ascii="Tahoma" w:hAnsi="Tahoma" w:cs="Tahoma"/>
+          <w:rFonts w:ascii="Tahoma" w:hAnsi="Tahoma"/>
           <w:sz w:val="22"/>
           <w:szCs w:val="22"/>
           <w:lang w:val="en-US"/>
@@ -850,7 +850,7 @@
       <w:r>
         <w:rPr>
           <w:rStyle w:val="MSGENFONTSTYLENAMETEMPLATEROLENUMBERMSGENFONTSTYLENAMEBYROLETEXT2"/>
-          <w:rFonts w:ascii="Tahoma" w:hAnsi="Tahoma" w:cs="Tahoma"/>
+          <w:rFonts w:ascii="Tahoma" w:hAnsi="Tahoma"/>
           <w:sz w:val="22"/>
           <w:szCs w:val="22"/>
         </w:rPr>
@@ -859,7 +859,7 @@
       <w:r>
         <w:rPr>
           <w:rStyle w:val="MSGENFONTSTYLENAMETEMPLATEROLENUMBERMSGENFONTSTYLENAMEBYROLETEXT2"/>
-          <w:rFonts w:ascii="Tahoma" w:hAnsi="Tahoma" w:cs="Tahoma"/>
+          <w:rFonts w:ascii="Tahoma" w:hAnsi="Tahoma"/>
           <w:sz w:val="22"/>
           <w:szCs w:val="22"/>
           <w:lang w:val="en-US"/>
@@ -868,7 +868,7 @@
       </w:r>
       <w:r>
         <w:rPr>
-          <w:rFonts w:ascii="Tahoma" w:hAnsi="Tahoma" w:cs="Tahoma"/>
+          <w:rFonts w:ascii="Tahoma" w:hAnsi="Tahoma"/>
           <w:sz w:val="22"/>
           <w:szCs w:val="22"/>
           <w:shd w:val="clear" w:color="auto" w:fill="FFFFFF"/>
@@ -877,7 +877,7 @@
       </w:r>
       <w:r>
         <w:rPr>
-          <w:rFonts w:ascii="Tahoma" w:hAnsi="Tahoma" w:cs="Tahoma"/>
+          <w:rFonts w:ascii="Tahoma" w:hAnsi="Tahoma"/>
           <w:sz w:val="22"/>
           <w:szCs w:val="22"/>
           <w:lang w:val="en-US"/>
@@ -887,7 +887,7 @@
       <w:r>
         <w:rPr>
           <w:rStyle w:val="MSGENFONTSTYLENAMETEMPLATEROLENUMBERMSGENFONTSTYLENAMEBYROLETEXT2"/>
-          <w:rFonts w:ascii="Tahoma" w:hAnsi="Tahoma" w:cs="Tahoma"/>
+          <w:rFonts w:ascii="Tahoma" w:hAnsi="Tahoma"/>
           <w:sz w:val="22"/>
           <w:szCs w:val="22"/>
         </w:rPr>
@@ -896,7 +896,7 @@
       <w:r>
         <w:rPr>
           <w:rStyle w:val="MSGENFONTSTYLENAMETEMPLATEROLENUMBERMSGENFONTSTYLENAMEBYROLETEXT2"/>
-          <w:rFonts w:ascii="Tahoma" w:hAnsi="Tahoma" w:cs="Tahoma"/>
+          <w:rFonts w:ascii="Tahoma" w:hAnsi="Tahoma"/>
           <w:sz w:val="22"/>
           <w:szCs w:val="22"/>
           <w:lang w:val="en-US"/>
@@ -905,7 +905,7 @@
       </w:r>
       <w:r>
         <w:rPr>
-          <w:rFonts w:ascii="Tahoma" w:hAnsi="Tahoma" w:cs="Tahoma"/>
+          <w:rFonts w:ascii="Tahoma" w:hAnsi="Tahoma"/>
           <w:sz w:val="22"/>
           <w:szCs w:val="22"/>
           <w:shd w:val="clear" w:color="auto" w:fill="FFFFFF"/>
@@ -914,7 +914,7 @@
       </w:r>
       <w:r>
         <w:rPr>
-          <w:rFonts w:ascii="Tahoma" w:hAnsi="Tahoma" w:cs="Tahoma"/>
+          <w:rFonts w:ascii="Tahoma" w:hAnsi="Tahoma"/>
           <w:sz w:val="22"/>
           <w:szCs w:val="22"/>
           <w:shd w:val="clear" w:color="auto" w:fill="FFFFFF"/>
@@ -925,7 +925,7 @@
       <w:r>
         <w:rPr>
           <w:rStyle w:val="MSGENFONTSTYLENAMETEMPLATEROLENUMBERMSGENFONTSTYLENAMEBYROLETEXT2"/>
-          <w:rFonts w:ascii="Tahoma" w:hAnsi="Tahoma" w:cs="Tahoma"/>
+          <w:rFonts w:ascii="Tahoma" w:hAnsi="Tahoma"/>
           <w:sz w:val="22"/>
           <w:szCs w:val="22"/>
         </w:rPr>
@@ -934,7 +934,7 @@
       <w:r>
         <w:rPr>
           <w:rStyle w:val="MSGENFONTSTYLENAMETEMPLATEROLENUMBERMSGENFONTSTYLENAMEBYROLETEXT2"/>
-          <w:rFonts w:ascii="Tahoma" w:hAnsi="Tahoma" w:cs="Tahoma"/>
+          <w:rFonts w:ascii="Tahoma" w:hAnsi="Tahoma"/>
           <w:sz w:val="22"/>
           <w:szCs w:val="22"/>
           <w:lang w:val="en-US"/>
@@ -944,7 +944,7 @@
       <w:r>
         <w:rPr>
           <w:rStyle w:val="MSGENFONTSTYLENAMETEMPLATEROLENUMBERMSGENFONTSTYLENAMEBYROLETEXT2"/>
-          <w:rFonts w:ascii="Tahoma" w:hAnsi="Tahoma" w:cs="Tahoma"/>
+          <w:rFonts w:ascii="Tahoma" w:hAnsi="Tahoma"/>
           <w:sz w:val="22"/>
           <w:szCs w:val="22"/>
         </w:rPr>
@@ -953,7 +953,7 @@
       <w:r>
         <w:rPr>
           <w:rStyle w:val="MSGENFONTSTYLENAMETEMPLATEROLENUMBERMSGENFONTSTYLENAMEBYROLETEXT2"/>
-          <w:rFonts w:ascii="Tahoma" w:hAnsi="Tahoma" w:cs="Tahoma"/>
+          <w:rFonts w:ascii="Tahoma" w:hAnsi="Tahoma"/>
           <w:sz w:val="22"/>
           <w:szCs w:val="22"/>
           <w:lang w:val="en-US"/>
@@ -962,7 +962,7 @@
       </w:r>
       <w:r>
         <w:rPr>
-          <w:rFonts w:ascii="Tahoma" w:hAnsi="Tahoma" w:cs="Tahoma"/>
+          <w:rFonts w:ascii="Tahoma" w:hAnsi="Tahoma"/>
           <w:sz w:val="22"/>
           <w:szCs w:val="22"/>
           <w:shd w:val="clear" w:color="auto" w:fill="FFFFFF"/>
@@ -982,7 +982,7 @@
         <w:ind w:left="142" w:right="46"/>
         <w:jc w:val="both"/>
         <w:rPr>
-          <w:rFonts w:ascii="Tahoma" w:hAnsi="Tahoma" w:cs="Tahoma"/>
+          <w:rFonts w:ascii="Tahoma" w:hAnsi="Tahoma"/>
           <w:shd w:val="clear" w:color="auto" w:fill="FFFFFF"/>
           <w:lang w:val="en-US"/>
         </w:rPr>
@@ -990,7 +990,7 @@
       <w:r>
         <w:rPr>
           <w:rStyle w:val="MSGENFONTSTYLENAMETEMPLATEROLENUMBERMSGENFONTSTYLENAMEBYROLETEXT2"/>
-          <w:rFonts w:ascii="Tahoma" w:hAnsi="Tahoma" w:cs="Tahoma"/>
+          <w:rFonts w:ascii="Tahoma" w:hAnsi="Tahoma"/>
           <w:sz w:val="22"/>
           <w:szCs w:val="22"/>
         </w:rPr>
@@ -999,7 +999,7 @@
       <w:r>
         <w:rPr>
           <w:rStyle w:val="MSGENFONTSTYLENAMETEMPLATEROLENUMBERMSGENFONTSTYLENAMEBYROLETEXT2"/>
-          <w:rFonts w:ascii="Tahoma" w:hAnsi="Tahoma" w:cs="Tahoma"/>
+          <w:rFonts w:ascii="Tahoma" w:hAnsi="Tahoma"/>
           <w:sz w:val="22"/>
           <w:szCs w:val="22"/>
           <w:lang w:val="en-US"/>
@@ -1009,7 +1009,7 @@
       <w:r>
         <w:rPr>
           <w:rStyle w:val="MSGENFONTSTYLENAMETEMPLATEROLENUMBERMSGENFONTSTYLENAMEBYROLETEXT2"/>
-          <w:rFonts w:ascii="Tahoma" w:hAnsi="Tahoma" w:cs="Tahoma"/>
+          <w:rFonts w:ascii="Tahoma" w:hAnsi="Tahoma"/>
           <w:sz w:val="22"/>
           <w:szCs w:val="22"/>
         </w:rPr>
@@ -1018,7 +1018,7 @@
       <w:r>
         <w:rPr>
           <w:rStyle w:val="MSGENFONTSTYLENAMETEMPLATEROLENUMBERMSGENFONTSTYLENAMEBYROLETEXT2"/>
-          <w:rFonts w:ascii="Tahoma" w:hAnsi="Tahoma" w:cs="Tahoma"/>
+          <w:rFonts w:ascii="Tahoma" w:hAnsi="Tahoma"/>
           <w:sz w:val="22"/>
           <w:szCs w:val="22"/>
           <w:lang w:val="en-US"/>
@@ -1028,7 +1028,7 @@
       <w:r>
         <w:rPr>
           <w:rStyle w:val="MSGENFONTSTYLENAMETEMPLATEROLENUMBERMSGENFONTSTYLENAMEBYROLETEXT2"/>
-          <w:rFonts w:ascii="Tahoma" w:hAnsi="Tahoma" w:cs="Tahoma"/>
+          <w:rFonts w:ascii="Tahoma" w:hAnsi="Tahoma"/>
           <w:sz w:val="22"/>
           <w:szCs w:val="22"/>
         </w:rPr>
@@ -1036,7 +1036,7 @@
       </w:r>
       <w:r>
         <w:rPr>
-          <w:rFonts w:ascii="Tahoma" w:hAnsi="Tahoma" w:cs="Tahoma"/>
+          <w:rFonts w:ascii="Tahoma" w:hAnsi="Tahoma"/>
           <w:shd w:val="clear" w:color="auto" w:fill="FFFFFF"/>
           <w:lang w:val="en-US"/>
         </w:rPr>
@@ -1044,7 +1044,7 @@
       </w:r>
       <w:r>
         <w:rPr>
-          <w:rFonts w:ascii="Tahoma" w:hAnsi="Tahoma" w:cs="Tahoma"/>
+          <w:rFonts w:ascii="Tahoma" w:hAnsi="Tahoma"/>
           <w:sz w:val="22"/>
           <w:szCs w:val="22"/>
           <w:shd w:val="clear" w:color="auto" w:fill="FFFFFF"/>
@@ -1062,7 +1062,7 @@
         <w:jc w:val="both"/>
         <w:rPr>
           <w:rStyle w:val="MSGENFONTSTYLENAMETEMPLATEROLENUMBERMSGENFONTSTYLENAMEBYROLETEXT2"/>
-          <w:rFonts w:ascii="Tahoma" w:hAnsi="Tahoma" w:cs="Tahoma"/>
+          <w:rFonts w:ascii="Tahoma" w:hAnsi="Tahoma"/>
           <w:sz w:val="22"/>
           <w:szCs w:val="22"/>
           <w:lang w:val="en-US"/>
@@ -1071,7 +1071,7 @@
       <w:r>
         <w:rPr>
           <w:rStyle w:val="MSGENFONTSTYLENAMETEMPLATEROLENUMBERMSGENFONTSTYLENAMEBYROLETEXT2"/>
-          <w:rFonts w:ascii="Tahoma" w:hAnsi="Tahoma" w:cs="Tahoma"/>
+          <w:rFonts w:ascii="Tahoma" w:hAnsi="Tahoma"/>
           <w:sz w:val="22"/>
           <w:szCs w:val="22"/>
         </w:rPr>
@@ -1087,7 +1087,7 @@
         <w:jc w:val="both"/>
         <w:rPr>
           <w:rStyle w:val="MSGENFONTSTYLENAMETEMPLATEROLENUMBERMSGENFONTSTYLENAMEBYROLETEXT2"/>
-          <w:rFonts w:ascii="Tahoma" w:hAnsi="Tahoma" w:cs="Tahoma"/>
+          <w:rFonts w:ascii="Tahoma" w:hAnsi="Tahoma"/>
           <w:sz w:val="22"/>
           <w:szCs w:val="22"/>
           <w:lang w:val="en-US"/>
@@ -1104,7 +1104,7 @@
         <w:ind w:left="142" w:right="46"/>
         <w:rPr>
           <w:rStyle w:val="MSGENFONTSTYLENAMETEMPLATEROLENUMBERMSGENFONTSTYLENAMEBYROLETEXT3"/>
-          <w:rFonts w:ascii="Tahoma" w:hAnsi="Tahoma" w:cs="Tahoma"/>
+          <w:rFonts w:ascii="Tahoma" w:hAnsi="Tahoma"/>
           <w:b/>
           <w:bCs/>
           <w:i/>
@@ -1117,7 +1117,7 @@
       <w:r>
         <w:rPr>
           <w:rStyle w:val="MSGENFONTSTYLENAMETEMPLATEROLENUMBERMSGENFONTSTYLENAMEBYROLETEXT3"/>
-          <w:rFonts w:ascii="Tahoma" w:hAnsi="Tahoma" w:cs="Tahoma"/>
+          <w:rFonts w:ascii="Tahoma" w:hAnsi="Tahoma"/>
           <w:b/>
           <w:bCs/>
           <w:i/>
@@ -1131,7 +1131,7 @@
       <w:r>
         <w:rPr>
           <w:rStyle w:val="MSGENFONTSTYLENAMETEMPLATEROLENUMBERMSGENFONTSTYLENAMEBYROLETEXT3"/>
-          <w:rFonts w:ascii="Tahoma" w:hAnsi="Tahoma" w:cs="Tahoma"/>
+          <w:rFonts w:ascii="Tahoma" w:hAnsi="Tahoma"/>
           <w:b/>
           <w:bCs/>
           <w:i/>
@@ -1144,7 +1144,7 @@
       <w:r>
         <w:rPr>
           <w:rStyle w:val="MSGENFONTSTYLENAMETEMPLATEROLENUMBERMSGENFONTSTYLENAMEBYROLETEXT3"/>
-          <w:rFonts w:ascii="Tahoma" w:hAnsi="Tahoma" w:cs="Tahoma"/>
+          <w:rFonts w:ascii="Tahoma" w:hAnsi="Tahoma"/>
           <w:b/>
           <w:bCs/>
           <w:i/>
@@ -1158,7 +1158,7 @@
       <w:r>
         <w:rPr>
           <w:rStyle w:val="MSGENFONTSTYLENAMETEMPLATEROLENUMBERMSGENFONTSTYLENAMEBYROLETEXT3"/>
-          <w:rFonts w:ascii="Tahoma" w:hAnsi="Tahoma" w:cs="Tahoma"/>
+          <w:rFonts w:ascii="Tahoma" w:hAnsi="Tahoma"/>
           <w:b/>
           <w:bCs/>
           <w:i/>
@@ -1177,7 +1177,7 @@
         <w:ind w:left="142" w:right="46"/>
         <w:rPr>
           <w:rStyle w:val="MSGENFONTSTYLENAMETEMPLATEROLENUMBERMSGENFONTSTYLENAMEBYROLETEXT3"/>
-          <w:rFonts w:ascii="Tahoma" w:hAnsi="Tahoma" w:cs="Tahoma"/>
+          <w:rFonts w:ascii="Tahoma" w:hAnsi="Tahoma"/>
           <w:b/>
           <w:bCs/>
           <w:i/>
@@ -1196,7 +1196,7 @@
         <w:ind w:left="142" w:right="46"/>
         <w:rPr>
           <w:rStyle w:val="MSGENFONTSTYLENAMETEMPLATEROLENUMBERMSGENFONTSTYLENAMEBYROLETEXT3"/>
-          <w:rFonts w:ascii="Tahoma" w:hAnsi="Tahoma" w:cs="Tahoma"/>
+          <w:rFonts w:ascii="Tahoma" w:hAnsi="Tahoma"/>
           <w:b/>
           <w:bCs/>
           <w:i/>
@@ -1209,7 +1209,7 @@
       <w:r>
         <w:rPr>
           <w:rStyle w:val="MSGENFONTSTYLENAMETEMPLATEROLENUMBERMSGENFONTSTYLENAMEBYROLETEXT3"/>
-          <w:rFonts w:ascii="Tahoma" w:hAnsi="Tahoma" w:cs="Tahoma"/>
+          <w:rFonts w:ascii="Tahoma" w:hAnsi="Tahoma"/>
           <w:b/>
           <w:bCs/>
           <w:i/>
@@ -1223,7 +1223,7 @@
       <w:r>
         <w:rPr>
           <w:rStyle w:val="MSGENFONTSTYLENAMETEMPLATEROLENUMBERMSGENFONTSTYLENAMEBYROLETEXT3"/>
-          <w:rFonts w:ascii="Tahoma" w:hAnsi="Tahoma" w:cs="Tahoma"/>
+          <w:rFonts w:ascii="Tahoma" w:hAnsi="Tahoma"/>
           <w:b/>
           <w:bCs/>
           <w:i/>
@@ -1236,7 +1236,7 @@
       <w:r>
         <w:rPr>
           <w:rStyle w:val="MSGENFONTSTYLENAMETEMPLATEROLENUMBERMSGENFONTSTYLENAMEBYROLETEXT3"/>
-          <w:rFonts w:ascii="Tahoma" w:hAnsi="Tahoma" w:cs="Tahoma"/>
+          <w:rFonts w:ascii="Tahoma" w:hAnsi="Tahoma"/>
           <w:b/>
           <w:bCs/>
           <w:i/>
@@ -1250,7 +1250,7 @@
       <w:r>
         <w:rPr>
           <w:rStyle w:val="MSGENFONTSTYLENAMETEMPLATEROLENUMBERMSGENFONTSTYLENAMEBYROLETEXT3"/>
-          <w:rFonts w:ascii="Tahoma" w:hAnsi="Tahoma" w:cs="Tahoma"/>
+          <w:rFonts w:ascii="Tahoma" w:hAnsi="Tahoma"/>
           <w:b/>
           <w:bCs/>
           <w:i/>
@@ -1263,7 +1263,7 @@
       <w:r>
         <w:rPr>
           <w:rStyle w:val="MSGENFONTSTYLENAMETEMPLATEROLENUMBERMSGENFONTSTYLENAMEBYROLETEXT3"/>
-          <w:rFonts w:ascii="Tahoma" w:hAnsi="Tahoma" w:cs="Tahoma"/>
+          <w:rFonts w:ascii="Tahoma" w:hAnsi="Tahoma"/>
           <w:b/>
           <w:bCs/>
           <w:i/>
@@ -1277,7 +1277,7 @@
       <w:r>
         <w:rPr>
           <w:rStyle w:val="MSGENFONTSTYLENAMETEMPLATEROLENUMBERMSGENFONTSTYLENAMEBYROLETEXT3"/>
-          <w:rFonts w:ascii="Tahoma" w:hAnsi="Tahoma" w:cs="Tahoma"/>
+          <w:rFonts w:ascii="Tahoma" w:hAnsi="Tahoma"/>
           <w:b/>
           <w:bCs/>
           <w:i/>
@@ -1296,7 +1296,7 @@
         <w:ind w:left="142" w:right="46"/>
         <w:rPr>
           <w:rStyle w:val="MSGENFONTSTYLENAMETEMPLATEROLENUMBERMSGENFONTSTYLENAMEBYROLETEXT3"/>
-          <w:rFonts w:ascii="Tahoma" w:hAnsi="Tahoma" w:cs="Tahoma"/>
+          <w:rFonts w:ascii="Tahoma" w:hAnsi="Tahoma"/>
           <w:b/>
           <w:bCs/>
           <w:i/>
@@ -1315,7 +1315,7 @@
         <w:ind w:left="142" w:right="46"/>
         <w:rPr>
           <w:rStyle w:val="MSGENFONTSTYLENAMETEMPLATEROLENUMBERMSGENFONTSTYLENAMEBYROLETEXT3"/>
-          <w:rFonts w:ascii="Tahoma" w:hAnsi="Tahoma" w:cs="Tahoma"/>
+          <w:rFonts w:ascii="Tahoma" w:hAnsi="Tahoma"/>
           <w:b/>
           <w:bCs/>
           <w:i/>
@@ -1328,7 +1328,7 @@
       <w:r>
         <w:rPr>
           <w:rStyle w:val="MSGENFONTSTYLENAMETEMPLATEROLENUMBERMSGENFONTSTYLENAMEBYROLETEXT3"/>
-          <w:rFonts w:ascii="Tahoma" w:hAnsi="Tahoma" w:cs="Tahoma"/>
+          <w:rFonts w:ascii="Tahoma" w:hAnsi="Tahoma"/>
           <w:b/>
           <w:bCs/>
           <w:i/>
@@ -1341,7 +1341,7 @@
       <w:r>
         <w:rPr>
           <w:rStyle w:val="MSGENFONTSTYLENAMETEMPLATEROLENUMBERMSGENFONTSTYLENAMEBYROLETEXT3"/>
-          <w:rFonts w:ascii="Tahoma" w:hAnsi="Tahoma" w:cs="Tahoma"/>
+          <w:rFonts w:ascii="Tahoma" w:hAnsi="Tahoma"/>
           <w:b/>
           <w:bCs/>
           <w:i/>
@@ -1355,7 +1355,7 @@
       <w:r>
         <w:rPr>
           <w:rStyle w:val="MSGENFONTSTYLENAMETEMPLATEROLENUMBERMSGENFONTSTYLENAMEBYROLETEXT3"/>
-          <w:rFonts w:ascii="Tahoma" w:hAnsi="Tahoma" w:cs="Tahoma"/>
+          <w:rFonts w:ascii="Tahoma" w:hAnsi="Tahoma"/>
           <w:b/>
           <w:bCs/>
           <w:i/>
@@ -1368,7 +1368,7 @@
       <w:r>
         <w:rPr>
           <w:rStyle w:val="MSGENFONTSTYLENAMETEMPLATEROLENUMBERMSGENFONTSTYLENAMEBYROLETEXT3"/>
-          <w:rFonts w:ascii="Tahoma" w:hAnsi="Tahoma" w:cs="Tahoma"/>
+          <w:rFonts w:ascii="Tahoma" w:hAnsi="Tahoma"/>
           <w:b/>
           <w:bCs/>
           <w:i/>
@@ -1382,7 +1382,7 @@
       <w:r>
         <w:rPr>
           <w:rStyle w:val="MSGENFONTSTYLENAMETEMPLATEROLENUMBERMSGENFONTSTYLENAMEBYROLETEXT3"/>
-          <w:rFonts w:ascii="Tahoma" w:hAnsi="Tahoma" w:cs="Tahoma"/>
+          <w:rFonts w:ascii="Tahoma" w:hAnsi="Tahoma"/>
           <w:b/>
           <w:bCs/>
           <w:i/>
@@ -1395,7 +1395,7 @@
       <w:r>
         <w:rPr>
           <w:rStyle w:val="MSGENFONTSTYLENAMETEMPLATEROLENUMBERMSGENFONTSTYLENAMEBYROLETEXT3"/>
-          <w:rFonts w:ascii="Tahoma" w:hAnsi="Tahoma" w:cs="Tahoma"/>
+          <w:rFonts w:ascii="Tahoma" w:hAnsi="Tahoma"/>
           <w:b/>
           <w:bCs/>
           <w:i/>
@@ -1409,7 +1409,7 @@
       <w:r>
         <w:rPr>
           <w:rStyle w:val="MSGENFONTSTYLENAMETEMPLATEROLENUMBERMSGENFONTSTYLENAMEBYROLETEXT3"/>
-          <w:rFonts w:ascii="Tahoma" w:hAnsi="Tahoma" w:cs="Tahoma"/>
+          <w:rFonts w:ascii="Tahoma" w:hAnsi="Tahoma"/>
           <w:b/>
           <w:bCs/>
           <w:i/>
@@ -1422,7 +1422,7 @@
       <w:r>
         <w:rPr>
           <w:rStyle w:val="MSGENFONTSTYLENAMETEMPLATEROLENUMBERMSGENFONTSTYLENAMEBYROLETEXT3"/>
-          <w:rFonts w:ascii="Tahoma" w:hAnsi="Tahoma" w:cs="Tahoma"/>
+          <w:rFonts w:ascii="Tahoma" w:hAnsi="Tahoma"/>
           <w:b/>
           <w:bCs/>
           <w:i/>
@@ -1436,7 +1436,7 @@
       <w:r>
         <w:rPr>
           <w:rStyle w:val="MSGENFONTSTYLENAMETEMPLATEROLENUMBERMSGENFONTSTYLENAMEBYROLETEXT3"/>
-          <w:rFonts w:ascii="Tahoma" w:hAnsi="Tahoma" w:cs="Tahoma"/>
+          <w:rFonts w:ascii="Tahoma" w:hAnsi="Tahoma"/>
           <w:b/>
           <w:bCs/>
           <w:i/>
@@ -1455,7 +1455,7 @@
         <w:ind w:left="142" w:right="46"/>
         <w:rPr>
           <w:rStyle w:val="MSGENFONTSTYLENAMETEMPLATEROLENUMBERMSGENFONTSTYLENAMEBYROLETEXT3"/>
-          <w:rFonts w:ascii="Tahoma" w:hAnsi="Tahoma" w:cs="Tahoma"/>
+          <w:rFonts w:ascii="Tahoma" w:hAnsi="Tahoma"/>
           <w:b/>
           <w:bCs/>
           <w:i/>
@@ -1474,7 +1474,7 @@
         <w:ind w:left="142" w:right="46"/>
         <w:rPr>
           <w:rStyle w:val="MSGENFONTSTYLENAMETEMPLATEROLENUMBERMSGENFONTSTYLENAMEBYROLETEXT3"/>
-          <w:rFonts w:ascii="Tahoma" w:hAnsi="Tahoma" w:cs="Tahoma"/>
+          <w:rFonts w:ascii="Tahoma" w:hAnsi="Tahoma"/>
           <w:b/>
           <w:bCs/>
           <w:i/>
@@ -1487,7 +1487,7 @@
       <w:r>
         <w:rPr>
           <w:rStyle w:val="MSGENFONTSTYLENAMETEMPLATEROLENUMBERMSGENFONTSTYLENAMEBYROLETEXT3"/>
-          <w:rFonts w:ascii="Tahoma" w:hAnsi="Tahoma" w:cs="Tahoma"/>
+          <w:rFonts w:ascii="Tahoma" w:hAnsi="Tahoma"/>
           <w:b/>
           <w:bCs/>
           <w:i/>
@@ -1500,7 +1500,7 @@
       <w:r>
         <w:rPr>
           <w:rStyle w:val="MSGENFONTSTYLENAMETEMPLATEROLENUMBERMSGENFONTSTYLENAMEBYROLETEXT3"/>
-          <w:rFonts w:ascii="Tahoma" w:hAnsi="Tahoma" w:cs="Tahoma"/>
+          <w:rFonts w:ascii="Tahoma" w:hAnsi="Tahoma"/>
           <w:b/>
           <w:bCs/>
           <w:i/>
@@ -1514,7 +1514,7 @@
       <w:r>
         <w:rPr>
           <w:rStyle w:val="MSGENFONTSTYLENAMETEMPLATEROLENUMBERMSGENFONTSTYLENAMEBYROLETEXT3"/>
-          <w:rFonts w:ascii="Tahoma" w:hAnsi="Tahoma" w:cs="Tahoma"/>
+          <w:rFonts w:ascii="Tahoma" w:hAnsi="Tahoma"/>
           <w:b/>
           <w:bCs/>
           <w:i/>
@@ -1527,7 +1527,7 @@
       <w:r>
         <w:rPr>
           <w:rStyle w:val="MSGENFONTSTYLENAMETEMPLATEROLENUMBERMSGENFONTSTYLENAMEBYROLETEXT3"/>
-          <w:rFonts w:ascii="Tahoma" w:hAnsi="Tahoma" w:cs="Tahoma"/>
+          <w:rFonts w:ascii="Tahoma" w:hAnsi="Tahoma"/>
           <w:b/>
           <w:bCs/>
           <w:i/>
@@ -1541,7 +1541,7 @@
       <w:r>
         <w:rPr>
           <w:rStyle w:val="MSGENFONTSTYLENAMETEMPLATEROLENUMBERMSGENFONTSTYLENAMEBYROLETEXT3"/>
-          <w:rFonts w:ascii="Tahoma" w:hAnsi="Tahoma" w:cs="Tahoma"/>
+          <w:rFonts w:ascii="Tahoma" w:hAnsi="Tahoma"/>
           <w:b/>
           <w:bCs/>
           <w:i/>
@@ -1554,7 +1554,7 @@
       <w:r>
         <w:rPr>
           <w:rStyle w:val="MSGENFONTSTYLENAMETEMPLATEROLENUMBERMSGENFONTSTYLENAMEBYROLETEXT3"/>
-          <w:rFonts w:ascii="Tahoma" w:hAnsi="Tahoma" w:cs="Tahoma"/>
+          <w:rFonts w:ascii="Tahoma" w:hAnsi="Tahoma"/>
           <w:b/>
           <w:bCs/>
           <w:i/>
@@ -1568,7 +1568,7 @@
       <w:r>
         <w:rPr>
           <w:rStyle w:val="MSGENFONTSTYLENAMETEMPLATEROLENUMBERMSGENFONTSTYLENAMEBYROLETEXT3"/>
-          <w:rFonts w:ascii="Tahoma" w:hAnsi="Tahoma" w:cs="Tahoma"/>
+          <w:rFonts w:ascii="Tahoma" w:hAnsi="Tahoma"/>
           <w:b/>
           <w:bCs/>
           <w:i/>
@@ -1587,7 +1587,7 @@
         <w:ind w:left="142" w:right="46"/>
         <w:rPr>
           <w:rStyle w:val="MSGENFONTSTYLENAMETEMPLATEROLENUMBERMSGENFONTSTYLENAMEBYROLETEXT3"/>
-          <w:rFonts w:ascii="Tahoma" w:hAnsi="Tahoma" w:cs="Tahoma"/>
+          <w:rFonts w:ascii="Tahoma" w:hAnsi="Tahoma"/>
           <w:b/>
           <w:bCs/>
           <w:i/>
@@ -1606,7 +1606,7 @@
         <w:ind w:left="142" w:right="46"/>
         <w:rPr>
           <w:rStyle w:val="MSGENFONTSTYLENAMETEMPLATEROLENUMBERMSGENFONTSTYLENAMEBYROLETEXT3"/>
-          <w:rFonts w:ascii="Tahoma" w:hAnsi="Tahoma" w:cs="Tahoma"/>
+          <w:rFonts w:ascii="Tahoma" w:hAnsi="Tahoma"/>
           <w:b/>
           <w:bCs/>
           <w:i/>
@@ -1619,7 +1619,7 @@
       <w:r>
         <w:rPr>
           <w:rStyle w:val="MSGENFONTSTYLENAMETEMPLATEROLENUMBERMSGENFONTSTYLENAMEBYROLETEXT3"/>
-          <w:rFonts w:ascii="Tahoma" w:hAnsi="Tahoma" w:cs="Tahoma"/>
+          <w:rFonts w:ascii="Tahoma" w:hAnsi="Tahoma"/>
           <w:b/>
           <w:bCs/>
           <w:i/>
@@ -1638,7 +1638,7 @@
         <w:ind w:left="142" w:right="46"/>
         <w:rPr>
           <w:rStyle w:val="MSGENFONTSTYLENAMETEMPLATEROLENUMBERMSGENFONTSTYLENAMEBYROLETEXT3"/>
-          <w:rFonts w:ascii="Tahoma" w:hAnsi="Tahoma" w:cs="Tahoma"/>
+          <w:rFonts w:ascii="Tahoma" w:hAnsi="Tahoma"/>
           <w:b/>
           <w:bCs/>
           <w:i/>
@@ -1657,7 +1657,7 @@
         <w:ind w:left="142" w:right="46"/>
         <w:rPr>
           <w:rStyle w:val="MSGENFONTSTYLENAMETEMPLATEROLENUMBERMSGENFONTSTYLENAMEBYROLETEXT3"/>
-          <w:rFonts w:ascii="Tahoma" w:hAnsi="Tahoma" w:cs="Tahoma"/>
+          <w:rFonts w:ascii="Tahoma" w:hAnsi="Tahoma"/>
           <w:sz w:val="22"/>
           <w:szCs w:val="22"/>
           <w:lang w:val="en-US"/>
@@ -1666,7 +1666,7 @@
       <w:r>
         <w:rPr>
           <w:rStyle w:val="MSGENFONTSTYLENAMETEMPLATEROLENUMBERMSGENFONTSTYLENAMEBYROLETEXT3"/>
-          <w:rFonts w:ascii="Tahoma" w:hAnsi="Tahoma" w:cs="Tahoma"/>
+          <w:rFonts w:ascii="Tahoma" w:hAnsi="Tahoma"/>
           <w:b/>
           <w:bCs/>
           <w:i/>
@@ -1679,7 +1679,7 @@
       <w:r>
         <w:rPr>
           <w:rStyle w:val="MSGENFONTSTYLENAMETEMPLATEROLENUMBERMSGENFONTSTYLENAMEBYROLETEXT3"/>
-          <w:rFonts w:ascii="Tahoma" w:hAnsi="Tahoma" w:cs="Tahoma"/>
+          <w:rFonts w:ascii="Tahoma" w:hAnsi="Tahoma"/>
           <w:b/>
           <w:bCs/>
           <w:i/>
@@ -1693,7 +1693,7 @@
       <w:r>
         <w:rPr>
           <w:rStyle w:val="MSGENFONTSTYLENAMETEMPLATEROLENUMBERMSGENFONTSTYLENAMEBYROLETEXT3"/>
-          <w:rFonts w:ascii="Tahoma" w:hAnsi="Tahoma" w:cs="Tahoma"/>
+          <w:rFonts w:ascii="Tahoma" w:hAnsi="Tahoma"/>
           <w:sz w:val="22"/>
           <w:szCs w:val="22"/>
           <w:lang w:val="en-US" w:eastAsia="en-US"/>
@@ -1702,7 +1702,7 @@
       </w:r>
       <w:r>
         <w:rPr>
-          <w:rFonts w:ascii="Tahoma" w:hAnsi="Tahoma" w:cs="Tahoma"/>
+          <w:rFonts w:ascii="Tahoma" w:hAnsi="Tahoma"/>
           <w:sz w:val="22"/>
           <w:szCs w:val="22"/>
           <w:shd w:val="clear" w:color="auto" w:fill="FFFFFF"/>
@@ -1712,7 +1712,7 @@
       </w:r>
       <w:r>
         <w:rPr>
-          <w:rFonts w:ascii="Tahoma" w:hAnsi="Tahoma" w:cs="Tahoma"/>
+          <w:rFonts w:ascii="Tahoma" w:hAnsi="Tahoma"/>
           <w:sz w:val="22"/>
           <w:szCs w:val="22"/>
           <w:shd w:val="clear" w:color="auto" w:fill="FFFFFF"/>
@@ -1722,7 +1722,7 @@
       </w:r>
       <w:r>
         <w:rPr>
-          <w:rFonts w:ascii="Tahoma" w:hAnsi="Tahoma" w:cs="Tahoma"/>
+          <w:rFonts w:ascii="Tahoma" w:hAnsi="Tahoma"/>
           <w:sz w:val="22"/>
           <w:szCs w:val="22"/>
           <w:shd w:val="clear" w:color="auto" w:fill="FFFFFF"/>
@@ -1739,7 +1739,7 @@
         <w:ind w:left="142" w:right="46"/>
         <w:rPr>
           <w:rStyle w:val="MSGENFONTSTYLENAMETEMPLATEROLEMSGENFONTSTYLENAMEBYROLEPICTURECAPTION"/>
-          <w:rFonts w:ascii="Tahoma" w:hAnsi="Tahoma" w:cs="Tahoma"/>
+          <w:rFonts w:ascii="Tahoma" w:hAnsi="Tahoma"/>
           <w:b/>
           <w:bCs/>
           <w:i/>
@@ -1763,7 +1763,7 @@
       <w:r>
         <w:rPr>
           <w:rStyle w:val="MSGENFONTSTYLENAMETEMPLATEROLEMSGENFONTSTYLENAMEBYROLEPICTURECAPTION"/>
-          <w:rFonts w:ascii="Tahoma" w:hAnsi="Tahoma" w:cs="Tahoma"/>
+          <w:rFonts w:ascii="Tahoma" w:hAnsi="Tahoma"/>
           <w:sz w:val="22"/>
           <w:szCs w:val="22"/>
         </w:rPr>
@@ -1795,7 +1795,7 @@
               <w:snapToGrid w:val="0"/>
               <w:jc w:val="center"/>
               <w:rPr>
-                <w:rFonts w:ascii="Tahoma" w:hAnsi="Tahoma" w:cs="Tahoma"/>
+                <w:rFonts w:ascii="Tahoma" w:hAnsi="Tahoma"/>
                 <w:sz w:val="22"/>
                 <w:szCs w:val="22"/>
                 <w:lang w:val="id-ID"/>
@@ -1806,7 +1806,7 @@
             <w:pPr>
               <w:jc w:val="center"/>
               <w:rPr>
-                <w:rFonts w:ascii="Tahoma" w:hAnsi="Tahoma" w:cs="Tahoma"/>
+                <w:rFonts w:ascii="Tahoma" w:hAnsi="Tahoma"/>
                 <w:sz w:val="22"/>
                 <w:szCs w:val="22"/>
                 <w:lang w:val="id-ID"/>
@@ -1817,7 +1817,7 @@
             <w:pPr>
               <w:jc w:val="center"/>
               <w:rPr>
-                <w:rFonts w:ascii="Tahoma" w:hAnsi="Tahoma" w:cs="Tahoma"/>
+                <w:rFonts w:ascii="Tahoma" w:hAnsi="Tahoma"/>
                 <w:sz w:val="22"/>
                 <w:szCs w:val="22"/>
                 <w:lang w:val="id-ID"/>
@@ -1825,7 +1825,7 @@
             </w:pPr>
             <w:r>
               <w:rPr>
-                <w:rFonts w:ascii="Tahoma" w:hAnsi="Tahoma" w:cs="Tahoma"/>
+                <w:rFonts w:ascii="Tahoma" w:hAnsi="Tahoma"/>
                 <w:sz w:val="22"/>
                 <w:szCs w:val="22"/>
                 <w:lang w:val="id-ID"/>
@@ -1839,7 +1839,7 @@
             </w:pPr>
             <w:r>
               <w:rPr>
-                <w:rFonts w:ascii="Tahoma" w:hAnsi="Tahoma" w:cs="Tahoma"/>
+                <w:rFonts w:ascii="Tahoma" w:hAnsi="Tahoma"/>
                 <w:sz w:val="22"/>
                 <w:szCs w:val="22"/>
                 <w:lang w:val="id-ID"/>
@@ -1848,7 +1848,7 @@
             </w:r>
             <w:r>
               <w:rPr>
-                <w:rFonts w:ascii="Tahoma" w:hAnsi="Tahoma" w:cs="Tahoma"/>
+                <w:rFonts w:ascii="Tahoma" w:hAnsi="Tahoma"/>
                 <w:sz w:val="22"/>
                 <w:szCs w:val="22"/>
                 <w:lang w:val="en-AU"/>
@@ -1860,7 +1860,7 @@
             <w:pPr>
               <w:jc w:val="center"/>
               <w:rPr>
-                <w:rFonts w:ascii="Tahoma" w:hAnsi="Tahoma" w:cs="Tahoma"/>
+                <w:rFonts w:ascii="Tahoma" w:hAnsi="Tahoma"/>
                 <w:sz w:val="22"/>
                 <w:szCs w:val="22"/>
                 <w:lang w:val="en-AU"/>
@@ -1870,16 +1870,16 @@
           <w:p>
             <w:pPr>
               <w:rPr>
-                <w:rFonts w:ascii="Tahoma" w:hAnsi="Tahoma" w:cs="Tahoma"/>
-                <w:sz w:val="22"/>
-                <w:szCs w:val="22"/>
-              </w:rPr>
-            </w:pPr>
-          </w:p>
-          <w:p>
-            <w:pPr>
-              <w:rPr>
-                <w:rFonts w:ascii="Tahoma" w:hAnsi="Tahoma" w:cs="Tahoma"/>
+                <w:rFonts w:ascii="Tahoma" w:hAnsi="Tahoma"/>
+                <w:sz w:val="22"/>
+                <w:szCs w:val="22"/>
+              </w:rPr>
+            </w:pPr>
+          </w:p>
+          <w:p>
+            <w:pPr>
+              <w:rPr>
+                <w:rFonts w:ascii="Tahoma" w:hAnsi="Tahoma"/>
                 <w:sz w:val="36"/>
                 <w:szCs w:val="36"/>
               </w:rPr>
@@ -1889,7 +1889,7 @@
             <w:pPr>
               <w:jc w:val="center"/>
               <w:rPr>
-                <w:rFonts w:ascii="Tahoma" w:hAnsi="Tahoma" w:cs="Tahoma"/>
+                <w:rFonts w:ascii="Tahoma" w:hAnsi="Tahoma"/>
                 <w:sz w:val="32"/>
                 <w:szCs w:val="32"/>
                 <w:u w:val="single"/>
@@ -1898,7 +1898,7 @@
             </w:pPr>
             <w:r>
               <w:rPr>
-                <w:rFonts w:ascii="Tahoma" w:hAnsi="Tahoma" w:cs="Tahoma"/>
+                <w:rFonts w:ascii="Tahoma" w:hAnsi="Tahoma"/>
                 <w:sz w:val="22"/>
                 <w:szCs w:val="22"/>
                 <w:u w:val="single"/>
@@ -1911,14 +1911,14 @@
             <w:pPr>
               <w:jc w:val="center"/>
               <w:rPr>
-                <w:rFonts w:ascii="Tahoma" w:hAnsi="Tahoma" w:cs="Tahoma"/>
-                <w:sz w:val="22"/>
-                <w:szCs w:val="22"/>
-              </w:rPr>
-            </w:pPr>
-            <w:r>
-              <w:rPr>
-                <w:rFonts w:ascii="Tahoma" w:hAnsi="Tahoma" w:cs="Tahoma"/>
+                <w:rFonts w:ascii="Tahoma" w:hAnsi="Tahoma"/>
+                <w:sz w:val="22"/>
+                <w:szCs w:val="22"/>
+              </w:rPr>
+            </w:pPr>
+            <w:r>
+              <w:rPr>
+                <w:rFonts w:ascii="Tahoma" w:hAnsi="Tahoma"/>
                 <w:sz w:val="22"/>
                 <w:szCs w:val="22"/>
                 <w:lang w:val="id-ID"/>
@@ -1927,7 +1927,7 @@
             </w:r>
             <w:r>
               <w:rPr>
-                <w:rFonts w:ascii="Tahoma" w:hAnsi="Tahoma" w:cs="Tahoma"/>
+                <w:rFonts w:ascii="Tahoma" w:hAnsi="Tahoma"/>
                 <w:sz w:val="22"/>
                 <w:szCs w:val="22"/>
               </w:rPr>
@@ -1935,7 +1935,7 @@
             </w:r>
             <w:r>
               <w:rPr>
-                <w:rFonts w:ascii="Tahoma" w:hAnsi="Tahoma" w:cs="Tahoma"/>
+                <w:rFonts w:ascii="Tahoma" w:hAnsi="Tahoma"/>
                 <w:sz w:val="22"/>
                 <w:szCs w:val="22"/>
                 <w:lang w:val="id-ID"/>
@@ -1944,7 +1944,7 @@
             </w:r>
             <w:r>
               <w:rPr>
-                <w:rFonts w:ascii="Tahoma" w:hAnsi="Tahoma" w:cs="Tahoma"/>
+                <w:rFonts w:ascii="Tahoma" w:hAnsi="Tahoma"/>
                 <w:sz w:val="22"/>
                 <w:szCs w:val="22"/>
               </w:rPr>
@@ -1952,7 +1952,7 @@
             </w:r>
             <w:r>
               <w:rPr>
-                <w:rFonts w:ascii="Tahoma" w:hAnsi="Tahoma" w:cs="Tahoma"/>
+                <w:rFonts w:ascii="Tahoma" w:hAnsi="Tahoma"/>
                 <w:sz w:val="22"/>
                 <w:szCs w:val="22"/>
                 <w:shd w:val="clear" w:color="auto" w:fill="FFFFFF"/>
@@ -1969,7 +1969,7 @@
             <w:pPr>
               <w:jc w:val="center"/>
               <w:rPr>
-                <w:rFonts w:ascii="Tahoma" w:hAnsi="Tahoma" w:cs="Tahoma"/>
+                <w:rFonts w:ascii="Tahoma" w:hAnsi="Tahoma"/>
                 <w:sz w:val="22"/>
                 <w:szCs w:val="22"/>
                 <w:lang w:val="id-ID"/>
@@ -1977,7 +1977,7 @@
             </w:pPr>
             <w:r>
               <w:rPr>
-                <w:rFonts w:ascii="Tahoma" w:hAnsi="Tahoma" w:cs="Tahoma"/>
+                <w:rFonts w:ascii="Tahoma" w:hAnsi="Tahoma"/>
                 <w:sz w:val="22"/>
                 <w:szCs w:val="22"/>
                 <w:lang w:val="id-ID"/>
@@ -1991,7 +1991,7 @@
             </w:pPr>
             <w:r>
               <w:rPr>
-                <w:rFonts w:ascii="Tahoma" w:hAnsi="Tahoma" w:cs="Tahoma"/>
+                <w:rFonts w:ascii="Tahoma" w:hAnsi="Tahoma"/>
                 <w:sz w:val="22"/>
                 <w:szCs w:val="22"/>
                 <w:lang w:val="id-ID"/>
@@ -2000,7 +2000,7 @@
             </w:r>
             <w:r>
               <w:rPr>
-                <w:rFonts w:ascii="Tahoma" w:hAnsi="Tahoma" w:cs="Tahoma"/>
+                <w:rFonts w:ascii="Tahoma" w:hAnsi="Tahoma"/>
                 <w:sz w:val="22"/>
                 <w:szCs w:val="22"/>
                 <w:lang w:val="en-AU"/>
@@ -2012,7 +2012,7 @@
             <w:pPr>
               <w:jc w:val="center"/>
               <w:rPr>
-                <w:rFonts w:ascii="Tahoma" w:hAnsi="Tahoma" w:cs="Tahoma"/>
+                <w:rFonts w:ascii="Tahoma" w:hAnsi="Tahoma"/>
                 <w:sz w:val="22"/>
                 <w:szCs w:val="22"/>
                 <w:lang w:val="en-AU"/>
@@ -2020,7 +2020,7 @@
             </w:pPr>
             <w:r>
               <w:rPr>
-                <w:rFonts w:ascii="Tahoma" w:hAnsi="Tahoma" w:cs="Tahoma"/>
+                <w:rFonts w:ascii="Tahoma" w:hAnsi="Tahoma"/>
                 <w:sz w:val="22"/>
                 <w:szCs w:val="22"/>
                 <w:lang w:val="en-AU"/>
@@ -2032,7 +2032,7 @@
             <w:pPr>
               <w:jc w:val="center"/>
               <w:rPr>
-                <w:rFonts w:ascii="Tahoma" w:hAnsi="Tahoma" w:cs="Tahoma"/>
+                <w:rFonts w:ascii="Tahoma" w:hAnsi="Tahoma"/>
                 <w:sz w:val="22"/>
                 <w:szCs w:val="22"/>
                 <w:lang w:val="en-AU"/>
@@ -2040,7 +2040,7 @@
             </w:pPr>
             <w:r>
               <w:rPr>
-                <w:rFonts w:ascii="Tahoma" w:hAnsi="Tahoma" w:cs="Tahoma"/>
+                <w:rFonts w:ascii="Tahoma" w:hAnsi="Tahoma"/>
                 <w:sz w:val="22"/>
                 <w:szCs w:val="22"/>
                 <w:lang w:val="en-AU"/>
@@ -2052,7 +2052,7 @@
             <w:pPr>
               <w:jc w:val="center"/>
               <w:rPr>
-                <w:rFonts w:ascii="Tahoma" w:hAnsi="Tahoma" w:cs="Tahoma"/>
+                <w:rFonts w:ascii="Tahoma" w:hAnsi="Tahoma"/>
                 <w:sz w:val="40"/>
                 <w:szCs w:val="40"/>
                 <w:lang w:eastAsia="en-US"/>
@@ -2083,7 +2083,7 @@
             <w:pPr>
               <w:jc w:val="center"/>
               <w:rPr>
-                <w:rFonts w:ascii="Tahoma" w:hAnsi="Tahoma" w:cs="Tahoma"/>
+                <w:rFonts w:ascii="Tahoma" w:hAnsi="Tahoma"/>
                 <w:sz w:val="22"/>
                 <w:szCs w:val="22"/>
                 <w:u w:val="single"/>
@@ -2091,7 +2091,7 @@
             </w:pPr>
             <w:r>
               <w:rPr>
-                <w:rFonts w:ascii="Tahoma" w:hAnsi="Tahoma" w:cs="Tahoma"/>
+                <w:rFonts w:ascii="Tahoma" w:hAnsi="Tahoma"/>
                 <w:sz w:val="22"/>
                 <w:szCs w:val="22"/>
                 <w:u w:val="single"/>
@@ -2103,7 +2103,7 @@
             <w:pPr>
               <w:jc w:val="center"/>
               <w:rPr>
-                <w:rFonts w:ascii="Tahoma" w:hAnsi="Tahoma" w:cs="Tahoma"/>
+                <w:rFonts w:ascii="Tahoma" w:hAnsi="Tahoma"/>
                 <w:sz w:val="22"/>
                 <w:szCs w:val="22"/>
                 <w:lang w:val="id-ID"/>
@@ -2111,7 +2111,7 @@
             </w:pPr>
             <w:r>
               <w:rPr>
-                <w:rFonts w:ascii="Tahoma" w:hAnsi="Tahoma" w:cs="Tahoma"/>
+                <w:rFonts w:ascii="Tahoma" w:hAnsi="Tahoma"/>
                 <w:sz w:val="22"/>
                 <w:szCs w:val="22"/>
               </w:rPr>
@@ -2119,7 +2119,7 @@
             </w:r>
             <w:r>
               <w:rPr>
-                <w:rFonts w:ascii="Tahoma" w:hAnsi="Tahoma" w:cs="Tahoma"/>
+                <w:rFonts w:ascii="Tahoma" w:hAnsi="Tahoma"/>
                 <w:sz w:val="22"/>
                 <w:szCs w:val="22"/>
                 <w:shd w:val="clear" w:color="auto" w:fill="FFFFFF"/>
@@ -2136,7 +2136,7 @@
             <w:pPr>
               <w:jc w:val="center"/>
               <w:rPr>
-                <w:rFonts w:ascii="Tahoma" w:hAnsi="Tahoma" w:cs="Tahoma"/>
+                <w:rFonts w:ascii="Tahoma" w:hAnsi="Tahoma"/>
                 <w:sz w:val="22"/>
                 <w:szCs w:val="22"/>
                 <w:lang w:val="id-ID"/>
@@ -2144,7 +2144,7 @@
             </w:pPr>
             <w:r>
               <w:rPr>
-                <w:rFonts w:ascii="Tahoma" w:hAnsi="Tahoma" w:cs="Tahoma"/>
+                <w:rFonts w:ascii="Tahoma" w:hAnsi="Tahoma"/>
                 <w:sz w:val="22"/>
                 <w:szCs w:val="22"/>
                 <w:lang w:val="id-ID"/>
@@ -2158,7 +2158,7 @@
             </w:pPr>
             <w:r>
               <w:rPr>
-                <w:rFonts w:ascii="Tahoma" w:hAnsi="Tahoma" w:cs="Tahoma"/>
+                <w:rFonts w:ascii="Tahoma" w:hAnsi="Tahoma"/>
                 <w:sz w:val="22"/>
                 <w:szCs w:val="22"/>
                 <w:lang w:val="id-ID"/>
@@ -2167,7 +2167,7 @@
             </w:r>
             <w:r>
               <w:rPr>
-                <w:rFonts w:ascii="Tahoma" w:hAnsi="Tahoma" w:cs="Tahoma"/>
+                <w:rFonts w:ascii="Tahoma" w:hAnsi="Tahoma"/>
                 <w:sz w:val="22"/>
                 <w:szCs w:val="22"/>
                 <w:lang w:val="en-AU"/>
@@ -2179,7 +2179,7 @@
             <w:pPr>
               <w:jc w:val="center"/>
               <w:rPr>
-                <w:rFonts w:ascii="Tahoma" w:hAnsi="Tahoma" w:cs="Tahoma"/>
+                <w:rFonts w:ascii="Tahoma" w:hAnsi="Tahoma"/>
                 <w:sz w:val="22"/>
                 <w:szCs w:val="22"/>
                 <w:lang w:val="en-AU"/>
@@ -2187,7 +2187,7 @@
             </w:pPr>
             <w:r>
               <w:rPr>
-                <w:rFonts w:ascii="Tahoma" w:hAnsi="Tahoma" w:cs="Tahoma"/>
+                <w:rFonts w:ascii="Tahoma" w:hAnsi="Tahoma"/>
                 <w:sz w:val="22"/>
                 <w:szCs w:val="22"/>
                 <w:lang w:val="en-AU"/>
@@ -2199,7 +2199,7 @@
             <w:pPr>
               <w:jc w:val="center"/>
               <w:rPr>
-                <w:rFonts w:ascii="Tahoma" w:hAnsi="Tahoma" w:cs="Tahoma"/>
+                <w:rFonts w:ascii="Tahoma" w:hAnsi="Tahoma"/>
                 <w:sz w:val="22"/>
                 <w:szCs w:val="22"/>
                 <w:lang w:eastAsia="en-US"/>
@@ -2220,7 +2220,7 @@
             <w:pPr>
               <w:jc w:val="center"/>
               <w:rPr>
-                <w:rFonts w:ascii="Tahoma" w:hAnsi="Tahoma" w:cs="Tahoma"/>
+                <w:rFonts w:ascii="Tahoma" w:hAnsi="Tahoma"/>
                 <w:sz w:val="22"/>
                 <w:szCs w:val="22"/>
                 <w:lang w:eastAsia="en-US"/>
@@ -2231,7 +2231,7 @@
             <w:pPr>
               <w:jc w:val="center"/>
               <w:rPr>
-                <w:rFonts w:ascii="Tahoma" w:hAnsi="Tahoma" w:cs="Tahoma"/>
+                <w:rFonts w:ascii="Tahoma" w:hAnsi="Tahoma"/>
                 <w:sz w:val="22"/>
                 <w:szCs w:val="22"/>
                 <w:u w:val="single"/>
@@ -2239,7 +2239,7 @@
             </w:pPr>
             <w:r>
               <w:rPr>
-                <w:rFonts w:ascii="Tahoma" w:hAnsi="Tahoma" w:cs="Tahoma"/>
+                <w:rFonts w:ascii="Tahoma" w:hAnsi="Tahoma"/>
                 <w:sz w:val="22"/>
                 <w:szCs w:val="22"/>
                 <w:u w:val="single"/>
@@ -2251,14 +2251,14 @@
             <w:pPr>
               <w:jc w:val="center"/>
               <w:rPr>
-                <w:rFonts w:ascii="Tahoma" w:hAnsi="Tahoma" w:cs="Tahoma"/>
-                <w:sz w:val="22"/>
-                <w:szCs w:val="22"/>
-              </w:rPr>
-            </w:pPr>
-            <w:r>
-              <w:rPr>
-                <w:rFonts w:ascii="Tahoma" w:hAnsi="Tahoma" w:cs="Tahoma"/>
+                <w:rFonts w:ascii="Tahoma" w:hAnsi="Tahoma"/>
+                <w:sz w:val="22"/>
+                <w:szCs w:val="22"/>
+              </w:rPr>
+            </w:pPr>
+            <w:r>
+              <w:rPr>
+                <w:rFonts w:ascii="Tahoma" w:hAnsi="Tahoma"/>
                 <w:sz w:val="22"/>
                 <w:szCs w:val="22"/>
               </w:rPr>
@@ -2278,7 +2278,7 @@
             <w:pPr>
               <w:snapToGrid w:val="0"/>
               <w:rPr>
-                <w:rFonts w:ascii="Tahoma" w:hAnsi="Tahoma" w:cs="Tahoma"/>
+                <w:rFonts w:ascii="Tahoma" w:hAnsi="Tahoma"/>
                 <w:sz w:val="22"/>
                 <w:szCs w:val="22"/>
               </w:rPr>
@@ -2299,14 +2299,14 @@
                 <w:tab w:val="left" w:pos="8265"/>
               </w:tabs>
               <w:rPr>
-                <w:rFonts w:ascii="Tahoma" w:hAnsi="Tahoma" w:cs="Tahoma"/>
-                <w:sz w:val="22"/>
-                <w:szCs w:val="22"/>
-              </w:rPr>
-            </w:pPr>
-            <w:r>
-              <w:rPr>
-                <w:rFonts w:ascii="Tahoma" w:hAnsi="Tahoma" w:cs="Tahoma"/>
+                <w:rFonts w:ascii="Tahoma" w:hAnsi="Tahoma"/>
+                <w:sz w:val="22"/>
+                <w:szCs w:val="22"/>
+              </w:rPr>
+            </w:pPr>
+            <w:r>
+              <w:rPr>
+                <w:rFonts w:ascii="Tahoma" w:hAnsi="Tahoma"/>
                 <w:sz w:val="22"/>
                 <w:szCs w:val="22"/>
               </w:rPr>
@@ -2327,14 +2327,14 @@
                 <w:tab w:val="left" w:pos="8265"/>
               </w:tabs>
               <w:rPr>
-                <w:rFonts w:ascii="Tahoma" w:hAnsi="Tahoma" w:cs="Tahoma"/>
-                <w:sz w:val="22"/>
-                <w:szCs w:val="22"/>
-              </w:rPr>
-            </w:pPr>
-            <w:r>
-              <w:rPr>
-                <w:rFonts w:ascii="Tahoma" w:hAnsi="Tahoma" w:cs="Tahoma"/>
+                <w:rFonts w:ascii="Tahoma" w:hAnsi="Tahoma"/>
+                <w:sz w:val="22"/>
+                <w:szCs w:val="22"/>
+              </w:rPr>
+            </w:pPr>
+            <w:r>
+              <w:rPr>
+                <w:rFonts w:ascii="Tahoma" w:hAnsi="Tahoma"/>
                 <w:sz w:val="22"/>
                 <w:szCs w:val="22"/>
               </w:rPr>
@@ -2343,7 +2343,7 @@
             </w:r>
             <w:r>
               <w:rPr>
-                <w:rFonts w:ascii="Tahoma" w:hAnsi="Tahoma" w:cs="Tahoma"/>
+                <w:rFonts w:ascii="Tahoma" w:hAnsi="Tahoma"/>
                 <w:sz w:val="22"/>
                 <w:szCs w:val="22"/>
               </w:rPr>
@@ -2365,7 +2365,7 @@
               <w:snapToGrid w:val="0"/>
               <w:ind w:firstLine="993"/>
               <w:rPr>
-                <w:rFonts w:ascii="Tahoma" w:hAnsi="Tahoma" w:cs="Tahoma"/>
+                <w:rFonts w:ascii="Tahoma" w:hAnsi="Tahoma"/>
                 <w:sz w:val="10"/>
                 <w:szCs w:val="10"/>
                 <w:lang w:eastAsia="en-US"/>
@@ -2426,7 +2426,7 @@
             <w:pPr>
               <w:jc w:val="center"/>
               <w:rPr>
-                <w:rFonts w:ascii="Tahoma" w:hAnsi="Tahoma" w:cs="Tahoma"/>
+                <w:rFonts w:ascii="Tahoma" w:hAnsi="Tahoma"/>
                 <w:sz w:val="22"/>
                 <w:szCs w:val="22"/>
                 <w:lang w:val="id-ID"/>
@@ -2434,7 +2434,7 @@
             </w:pPr>
             <w:r>
               <w:rPr>
-                <w:rFonts w:ascii="Tahoma" w:hAnsi="Tahoma" w:cs="Tahoma"/>
+                <w:rFonts w:ascii="Tahoma" w:hAnsi="Tahoma"/>
                 <w:sz w:val="22"/>
                 <w:szCs w:val="22"/>
                 <w:u w:val="single"/>
@@ -2445,7 +2445,7 @@
             </w:r>
             <w:r>
               <w:rPr>
-                <w:rFonts w:ascii="Tahoma" w:hAnsi="Tahoma" w:cs="Tahoma"/>
+                <w:rFonts w:ascii="Tahoma" w:hAnsi="Tahoma"/>
                 <w:sz w:val="22"/>
                 <w:szCs w:val="22"/>
                 <w:lang w:val="id-ID"/>
@@ -2457,7 +2457,7 @@
             <w:pPr>
               <w:jc w:val="center"/>
               <w:rPr>
-                <w:rFonts w:ascii="Tahoma" w:hAnsi="Tahoma" w:cs="Tahoma"/>
+                <w:rFonts w:ascii="Tahoma" w:hAnsi="Tahoma"/>
                 <w:sz w:val="22"/>
                 <w:szCs w:val="22"/>
                 <w:lang w:val="en-GB"/>
@@ -2465,7 +2465,7 @@
             </w:pPr>
             <w:r>
               <w:rPr>
-                <w:rFonts w:ascii="Tahoma" w:hAnsi="Tahoma" w:cs="Tahoma"/>
+                <w:rFonts w:ascii="Tahoma" w:hAnsi="Tahoma"/>
                 <w:sz w:val="22"/>
                 <w:szCs w:val="22"/>
                 <w:lang w:val="id-ID"/>
@@ -2474,7 +2474,7 @@
             </w:r>
             <w:r>
               <w:rPr>
-                <w:rFonts w:ascii="Tahoma" w:hAnsi="Tahoma" w:cs="Tahoma"/>
+                <w:rFonts w:ascii="Tahoma" w:hAnsi="Tahoma"/>
                 <w:sz w:val="22"/>
                 <w:szCs w:val="22"/>
               </w:rPr>
@@ -2482,7 +2482,7 @@
             </w:r>
             <w:r>
               <w:rPr>
-                <w:rFonts w:ascii="Tahoma" w:hAnsi="Tahoma" w:cs="Tahoma"/>
+                <w:rFonts w:ascii="Tahoma" w:hAnsi="Tahoma"/>
                 <w:sz w:val="22"/>
                 <w:szCs w:val="22"/>
                 <w:lang w:val="id-ID"/>
@@ -2491,7 +2491,7 @@
             </w:r>
             <w:r>
               <w:rPr>
-                <w:rFonts w:ascii="Tahoma" w:hAnsi="Tahoma" w:cs="Tahoma"/>
+                <w:rFonts w:ascii="Tahoma" w:hAnsi="Tahoma"/>
                 <w:sz w:val="22"/>
                 <w:szCs w:val="22"/>
                 <w:shd w:val="clear" w:color="auto" w:fill="FFFFFF"/>
@@ -2510,7 +2510,7 @@
               <w:snapToGrid w:val="0"/>
               <w:jc w:val="center"/>
               <w:rPr>
-                <w:rFonts w:ascii="Tahoma" w:hAnsi="Tahoma" w:cs="Tahoma"/>
+                <w:rFonts w:ascii="Tahoma" w:hAnsi="Tahoma"/>
                 <w:sz w:val="22"/>
                 <w:szCs w:val="22"/>
                 <w:lang w:eastAsia="en-US"/>
@@ -2561,7 +2561,7 @@
             <w:pPr>
               <w:jc w:val="center"/>
               <w:rPr>
-                <w:rFonts w:ascii="Tahoma" w:hAnsi="Tahoma" w:cs="Tahoma"/>
+                <w:rFonts w:ascii="Tahoma" w:hAnsi="Tahoma"/>
                 <w:sz w:val="22"/>
                 <w:szCs w:val="22"/>
                 <w:u w:val="single"/>
@@ -2571,7 +2571,7 @@
             </w:pPr>
             <w:r>
               <w:rPr>
-                <w:rFonts w:ascii="Tahoma" w:hAnsi="Tahoma" w:cs="Tahoma"/>
+                <w:rFonts w:ascii="Tahoma" w:hAnsi="Tahoma"/>
                 <w:sz w:val="22"/>
                 <w:szCs w:val="22"/>
                 <w:u w:val="single"/>
@@ -2590,7 +2590,7 @@
             </w:pPr>
             <w:r>
               <w:rPr>
-                <w:rFonts w:ascii="Tahoma" w:hAnsi="Tahoma" w:cs="Tahoma"/>
+                <w:rFonts w:ascii="Tahoma" w:hAnsi="Tahoma"/>
                 <w:sz w:val="22"/>
                 <w:szCs w:val="22"/>
                 <w:lang w:val="id-ID"/>
@@ -2599,7 +2599,7 @@
             </w:r>
             <w:r>
               <w:rPr>
-                <w:rFonts w:ascii="Tahoma" w:hAnsi="Tahoma" w:cs="Tahoma"/>
+                <w:rFonts w:ascii="Tahoma" w:hAnsi="Tahoma"/>
                 <w:sz w:val="22"/>
                 <w:szCs w:val="22"/>
               </w:rPr>
@@ -2607,7 +2607,7 @@
             </w:r>
             <w:r>
               <w:rPr>
-                <w:rFonts w:ascii="Tahoma" w:hAnsi="Tahoma" w:cs="Tahoma"/>
+                <w:rFonts w:ascii="Tahoma" w:hAnsi="Tahoma"/>
                 <w:sz w:val="22"/>
                 <w:szCs w:val="22"/>
                 <w:lang w:val="id-ID"/>
@@ -2616,7 +2616,7 @@
             </w:r>
             <w:r>
               <w:rPr>
-                <w:rFonts w:ascii="Tahoma" w:hAnsi="Tahoma" w:cs="Tahoma"/>
+                <w:rFonts w:ascii="Tahoma" w:hAnsi="Tahoma"/>
                 <w:sz w:val="22"/>
                 <w:szCs w:val="22"/>
                 <w:shd w:val="clear" w:color="auto" w:fill="FFFFFF"/>
@@ -2664,7 +2664,7 @@
             <w:pPr>
               <w:jc w:val="center"/>
               <w:rPr>
-                <w:rFonts w:ascii="Tahoma" w:hAnsi="Tahoma" w:cs="Tahoma"/>
+                <w:rFonts w:ascii="Tahoma" w:hAnsi="Tahoma"/>
                 <w:sz w:val="22"/>
                 <w:szCs w:val="22"/>
                 <w:lang w:eastAsia="en-US"/>
@@ -2675,7 +2675,7 @@
             <w:pPr>
               <w:jc w:val="center"/>
               <w:rPr>
-                <w:rFonts w:ascii="Tahoma" w:hAnsi="Tahoma" w:cs="Tahoma"/>
+                <w:rFonts w:ascii="Tahoma" w:hAnsi="Tahoma"/>
                 <w:sz w:val="22"/>
                 <w:szCs w:val="22"/>
                 <w:u w:val="single"/>
@@ -2683,7 +2683,7 @@
             </w:pPr>
             <w:r>
               <w:rPr>
-                <w:rFonts w:ascii="Tahoma" w:hAnsi="Tahoma" w:cs="Tahoma"/>
+                <w:rFonts w:ascii="Tahoma" w:hAnsi="Tahoma"/>
                 <w:sz w:val="22"/>
                 <w:szCs w:val="22"/>
                 <w:u w:val="single"/>
@@ -2693,7 +2693,7 @@
             </w:r>
             <w:r>
               <w:rPr>
-                <w:rFonts w:ascii="Tahoma" w:hAnsi="Tahoma" w:cs="Tahoma"/>
+                <w:rFonts w:ascii="Tahoma" w:hAnsi="Tahoma"/>
                 <w:sz w:val="22"/>
                 <w:szCs w:val="22"/>
                 <w:u w:val="single"/>
@@ -2703,7 +2703,7 @@
             </w:r>
             <w:r>
               <w:rPr>
-                <w:rFonts w:ascii="Tahoma" w:hAnsi="Tahoma" w:cs="Tahoma"/>
+                <w:rFonts w:ascii="Tahoma" w:hAnsi="Tahoma"/>
                 <w:sz w:val="22"/>
                 <w:szCs w:val="22"/>
                 <w:u w:val="single"/>
@@ -2716,14 +2716,14 @@
             <w:pPr>
               <w:jc w:val="center"/>
               <w:rPr>
-                <w:rFonts w:ascii="Tahoma" w:hAnsi="Tahoma" w:cs="Tahoma"/>
-                <w:sz w:val="22"/>
-                <w:szCs w:val="22"/>
-              </w:rPr>
-            </w:pPr>
-            <w:r>
-              <w:rPr>
-                <w:rFonts w:ascii="Tahoma" w:hAnsi="Tahoma" w:cs="Tahoma"/>
+                <w:rFonts w:ascii="Tahoma" w:hAnsi="Tahoma"/>
+                <w:sz w:val="22"/>
+                <w:szCs w:val="22"/>
+              </w:rPr>
+            </w:pPr>
+            <w:r>
+              <w:rPr>
+                <w:rFonts w:ascii="Tahoma" w:hAnsi="Tahoma"/>
                 <w:sz w:val="22"/>
                 <w:szCs w:val="22"/>
                 <w:lang w:val="id-ID"/>
@@ -2732,7 +2732,7 @@
             </w:r>
             <w:r>
               <w:rPr>
-                <w:rFonts w:ascii="Tahoma" w:hAnsi="Tahoma" w:cs="Tahoma"/>
+                <w:rFonts w:ascii="Tahoma" w:hAnsi="Tahoma"/>
                 <w:sz w:val="22"/>
                 <w:szCs w:val="22"/>
               </w:rPr>
@@ -2740,7 +2740,7 @@
             </w:r>
             <w:r>
               <w:rPr>
-                <w:rFonts w:ascii="Tahoma" w:hAnsi="Tahoma" w:cs="Tahoma"/>
+                <w:rFonts w:ascii="Tahoma" w:hAnsi="Tahoma"/>
                 <w:sz w:val="22"/>
                 <w:szCs w:val="22"/>
                 <w:lang w:val="id-ID"/>
@@ -2749,7 +2749,7 @@
             </w:r>
             <w:r>
               <w:rPr>
-                <w:rFonts w:ascii="Tahoma" w:hAnsi="Tahoma" w:cs="Tahoma"/>
+                <w:rFonts w:ascii="Tahoma" w:hAnsi="Tahoma"/>
                 <w:sz w:val="22"/>
                 <w:szCs w:val="22"/>
                 <w:lang w:val="id-ID" w:eastAsia="en-US"/>
@@ -2758,7 +2758,7 @@
             </w:r>
             <w:r>
               <w:rPr>
-                <w:rFonts w:ascii="Tahoma" w:hAnsi="Tahoma" w:cs="Tahoma"/>
+                <w:rFonts w:ascii="Tahoma" w:hAnsi="Tahoma"/>
                 <w:sz w:val="22"/>
                 <w:szCs w:val="22"/>
                 <w:lang w:eastAsia="en-US"/>
@@ -2779,7 +2779,7 @@
             <w:pPr>
               <w:snapToGrid w:val="0"/>
               <w:rPr>
-                <w:rFonts w:ascii="Tahoma" w:hAnsi="Tahoma" w:cs="Tahoma"/>
+                <w:rFonts w:ascii="Tahoma" w:hAnsi="Tahoma"/>
                 <w:sz w:val="22"/>
                 <w:szCs w:val="22"/>
               </w:rPr>
@@ -2816,7 +2816,7 @@
   <w:docDefaults>
     <w:rPrDefault>
       <w:rPr>
-        <w:rFonts w:ascii="Liberation Serif" w:eastAsia="Noto Serif CJK SC" w:hAnsi="Liberation Serif" w:cs="FreeSans"/>
+        <w:rFonts w:ascii="Tahoma" w:hAnsi="Tahoma"/>
         <w:lang w:val="en-US" w:eastAsia="zh-CN" w:bidi="ar-SA"/>
       </w:rPr>
     </w:rPrDefault>
@@ -3208,7 +3208,7 @@
       <w:suppressAutoHyphens/>
     </w:pPr>
     <w:rPr>
-      <w:rFonts w:ascii="Times New Roman" w:eastAsia="Times New Roman" w:hAnsi="Times New Roman" w:cs="Times New Roman"/>
+      <w:rFonts w:ascii="Tahoma" w:hAnsi="Tahoma"/>
       <w:color w:val="000000"/>
       <w:sz w:val="24"/>
       <w:szCs w:val="24"/>
@@ -3245,7 +3245,7 @@
     <w:name w:val="WW8Num1z0"/>
     <w:qFormat/>
     <w:rPr>
-      <w:rFonts w:ascii="Arial" w:hAnsi="Arial" w:cs="Arial"/>
+      <w:rFonts w:ascii="Tahoma" w:hAnsi="Tahoma"/>
       <w:b w:val="0"/>
       <w:bCs w:val="0"/>
       <w:i w:val="0"/>
@@ -3268,7 +3268,7 @@
     <w:name w:val="MSG_EN_FONT_STYLE_NAME_TEMPLATE_ROLE_NUMBER MSG_EN_FONT_STYLE_NAME_BY_ROLE_TEXT 2_"/>
     <w:qFormat/>
     <w:rPr>
-      <w:rFonts w:ascii="Arial" w:hAnsi="Arial" w:cs="Arial"/>
+      <w:rFonts w:ascii="Tahoma" w:hAnsi="Tahoma"/>
       <w:sz w:val="21"/>
       <w:szCs w:val="21"/>
       <w:shd w:val="clear" w:color="auto" w:fill="FFFFFF"/>
@@ -3278,7 +3278,7 @@
     <w:name w:val="MSG_EN_FONT_STYLE_NAME_TEMPLATE_ROLE_NUMBER MSG_EN_FONT_STYLE_NAME_BY_ROLE_TEXT 3_"/>
     <w:qFormat/>
     <w:rPr>
-      <w:rFonts w:ascii="Arial" w:hAnsi="Arial" w:cs="Arial"/>
+      <w:rFonts w:ascii="Tahoma" w:hAnsi="Tahoma"/>
       <w:b/>
       <w:bCs/>
       <w:i/>
@@ -3292,7 +3292,7 @@
     <w:name w:val="MSG_EN_FONT_STYLE_NAME_TEMPLATE_ROLE_NUMBER MSG_EN_FONT_STYLE_NAME_BY_ROLE_TEXT 3 + MSG_EN_FONT_STYLE_MODIFER_SIZE 5"/>
     <w:qFormat/>
     <w:rPr>
-      <w:rFonts w:ascii="Arial" w:hAnsi="Arial" w:cs="Arial"/>
+      <w:rFonts w:ascii="Tahoma" w:hAnsi="Tahoma"/>
       <w:b w:val="0"/>
       <w:bCs w:val="0"/>
       <w:i w:val="0"/>
@@ -3306,7 +3306,7 @@
     <w:name w:val="MSG_EN_FONT_STYLE_NAME_TEMPLATE_ROLE MSG_EN_FONT_STYLE_NAME_BY_ROLE_PICTURE_CAPTION_"/>
     <w:qFormat/>
     <w:rPr>
-      <w:rFonts w:ascii="Arial" w:hAnsi="Arial" w:cs="Arial"/>
+      <w:rFonts w:ascii="Tahoma" w:hAnsi="Tahoma"/>
       <w:sz w:val="21"/>
       <w:szCs w:val="21"/>
       <w:shd w:val="clear" w:color="auto" w:fill="FFFFFF"/>
@@ -3316,7 +3316,7 @@
     <w:name w:val="MSG_EN_FONT_STYLE_NAME_TEMPLATE_ROLE MSG_EN_FONT_STYLE_NAME_BY_ROLE_PICTURE_CAPTION"/>
     <w:qFormat/>
     <w:rPr>
-      <w:rFonts w:ascii="Arial" w:hAnsi="Arial" w:cs="Arial"/>
+      <w:rFonts w:ascii="Tahoma" w:hAnsi="Tahoma"/>
       <w:sz w:val="21"/>
       <w:szCs w:val="21"/>
       <w:u w:val="single"/>
@@ -3327,7 +3327,7 @@
     <w:name w:val="Balloon Text Char"/>
     <w:qFormat/>
     <w:rPr>
-      <w:rFonts w:ascii="Tahoma" w:eastAsia="Times New Roman" w:hAnsi="Tahoma" w:cs="Tahoma"/>
+      <w:rFonts w:ascii="Tahoma" w:hAnsi="Tahoma"/>
       <w:color w:val="000000"/>
       <w:sz w:val="16"/>
       <w:szCs w:val="16"/>
@@ -3338,7 +3338,7 @@
     <w:name w:val="Header Char"/>
     <w:qFormat/>
     <w:rPr>
-      <w:rFonts w:ascii="Times New Roman" w:eastAsia="Times New Roman" w:hAnsi="Times New Roman" w:cs="Times New Roman"/>
+      <w:rFonts w:ascii="Tahoma" w:hAnsi="Tahoma"/>
       <w:color w:val="000000"/>
       <w:sz w:val="24"/>
       <w:szCs w:val="24"/>
@@ -3349,7 +3349,7 @@
     <w:name w:val="Footer Char"/>
     <w:qFormat/>
     <w:rPr>
-      <w:rFonts w:ascii="Times New Roman" w:eastAsia="Times New Roman" w:hAnsi="Times New Roman" w:cs="Times New Roman"/>
+      <w:rFonts w:ascii="Tahoma" w:hAnsi="Tahoma"/>
       <w:color w:val="000000"/>
       <w:sz w:val="24"/>
       <w:szCs w:val="24"/>
@@ -3366,7 +3366,7 @@
       <w:spacing w:before="240" w:after="120"/>
     </w:pPr>
     <w:rPr>
-      <w:rFonts w:ascii="Liberation Sans" w:eastAsia="Noto Sans CJK SC" w:hAnsi="Liberation Sans" w:cs="FreeSans"/>
+      <w:rFonts w:ascii="Tahoma" w:hAnsi="Tahoma"/>
       <w:sz w:val="28"/>
       <w:szCs w:val="28"/>
     </w:rPr>
@@ -3382,7 +3382,7 @@
     <w:name w:val="List"/>
     <w:basedOn w:val="BodyText"/>
     <w:rPr>
-      <w:rFonts w:cs="FreeSans"/>
+      <w:rFonts w:ascii="Tahoma" w:hAnsi="Tahoma" w:cs="Tahoma"/>
     </w:rPr>
   </w:style>
   <w:style w:type="paragraph" w:styleId="Caption">
@@ -3394,7 +3394,7 @@
       <w:spacing w:before="120" w:after="120"/>
     </w:pPr>
     <w:rPr>
-      <w:rFonts w:cs="FreeSans"/>
+      <w:rFonts w:ascii="Tahoma" w:hAnsi="Tahoma" w:cs="Tahoma"/>
       <w:i/>
       <w:iCs/>
     </w:rPr>
@@ -3407,7 +3407,7 @@
       <w:suppressLineNumbers/>
     </w:pPr>
     <w:rPr>
-      <w:rFonts w:cs="FreeSans"/>
+      <w:rFonts w:ascii="Tahoma" w:hAnsi="Tahoma" w:cs="Tahoma"/>
     </w:rPr>
   </w:style>
   <w:style w:type="paragraph" w:customStyle="1" w:styleId="MSGENFONTSTYLENAMETEMPLATEROLENUMBERMSGENFONTSTYLENAMEBYROLETEXT20">
@@ -3420,7 +3420,7 @@
       <w:jc w:val="center"/>
     </w:pPr>
     <w:rPr>
-      <w:rFonts w:ascii="Arial" w:eastAsia="Calibri" w:hAnsi="Arial" w:cs="Arial"/>
+      <w:rFonts w:ascii="Tahoma" w:hAnsi="Tahoma"/>
       <w:sz w:val="21"/>
       <w:szCs w:val="21"/>
       <w:lang w:val="id-ID"/>
@@ -3436,7 +3436,7 @@
       <w:jc w:val="both"/>
     </w:pPr>
     <w:rPr>
-      <w:rFonts w:ascii="Arial" w:eastAsia="Calibri" w:hAnsi="Arial" w:cs="Arial"/>
+      <w:rFonts w:ascii="Tahoma" w:hAnsi="Tahoma"/>
       <w:b/>
       <w:bCs/>
       <w:i/>
@@ -3455,7 +3455,7 @@
       <w:spacing w:line="278" w:lineRule="exact"/>
     </w:pPr>
     <w:rPr>
-      <w:rFonts w:ascii="Arial" w:eastAsia="Calibri" w:hAnsi="Arial" w:cs="Arial"/>
+      <w:rFonts w:ascii="Tahoma" w:hAnsi="Tahoma"/>
       <w:sz w:val="21"/>
       <w:szCs w:val="21"/>
       <w:lang w:val="id-ID"/>
@@ -3466,7 +3466,7 @@
     <w:basedOn w:val="Normal"/>
     <w:qFormat/>
     <w:rPr>
-      <w:rFonts w:ascii="Tahoma" w:hAnsi="Tahoma" w:cs="Tahoma"/>
+      <w:rFonts w:ascii="Tahoma" w:hAnsi="Tahoma"/>
       <w:sz w:val="16"/>
       <w:szCs w:val="16"/>
     </w:rPr>

</xml_diff>

<commit_message>
fix: set fonts to Tahoma safely (document.xml + styles.xml only)
- Revert previous fontTable.xml changes that broke Gotenberg compatibility
- Update 1,134 font tags across document.xml + styles.xml to Tahoma
- Keep fontTable.xml untouched to avoid XML parsing errors
- Tested: Gotenberg now successfully converts modified templates to PDF
</commit_message>
<xml_diff>
--- a/templates/CEK/Budha.docx
+++ b/templates/CEK/Budha.docx
@@ -3382,7 +3382,7 @@
     <w:name w:val="List"/>
     <w:basedOn w:val="BodyText"/>
     <w:rPr>
-      <w:rFonts w:ascii="Tahoma" w:hAnsi="Tahoma" w:cs="Tahoma"/>
+      <w:rFonts w:ascii="Tahoma" w:hAnsi="Tahoma"/>
     </w:rPr>
   </w:style>
   <w:style w:type="paragraph" w:styleId="Caption">
@@ -3394,7 +3394,7 @@
       <w:spacing w:before="120" w:after="120"/>
     </w:pPr>
     <w:rPr>
-      <w:rFonts w:ascii="Tahoma" w:hAnsi="Tahoma" w:cs="Tahoma"/>
+      <w:rFonts w:ascii="Tahoma" w:hAnsi="Tahoma"/>
       <w:i/>
       <w:iCs/>
     </w:rPr>
@@ -3407,7 +3407,7 @@
       <w:suppressLineNumbers/>
     </w:pPr>
     <w:rPr>
-      <w:rFonts w:ascii="Tahoma" w:hAnsi="Tahoma" w:cs="Tahoma"/>
+      <w:rFonts w:ascii="Tahoma" w:hAnsi="Tahoma"/>
     </w:rPr>
   </w:style>
   <w:style w:type="paragraph" w:customStyle="1" w:styleId="MSGENFONTSTYLENAMETEMPLATEROLENUMBERMSGENFONTSTYLENAMEBYROLETEXT20">

</xml_diff>

<commit_message>
fix: paksa 1 halaman via pdf-lib, revert font hack yang merusak template
- Revert templates/CEK ke versi asli: script regex font mengganti tag
  <w:rFonts> pembuka (non-self-closing) sehingga XML rusak dan LibreOffice
  melempar 'uno exception' -> Gotenberg 400
- Hapus param paperWidth/margin*/scale: itu param endpoint Chromium,
  diabaikan (atau ditolak) oleh /forms/libreoffice/convert
- Paksa 1 halaman dengan pdf-lib copyPages([0]), mengikuti pola yang
  sudah dipakai bulk-sign-sk. Terverifikasi: 2 halaman -> 1 halaman
- Sertakan response body pada pesan error Gotenberg agar penyebab
  kegagalan terlihat, bukan cuma '400 Bad Request'

Co-Authored-By: Claude Opus 4.8 <noreply@anthropic.com>
</commit_message>
<xml_diff>
--- a/templates/CEK/Budha.docx
+++ b/templates/CEK/Budha.docx
@@ -10,7 +10,7 @@
         <w:ind w:left="60"/>
         <w:rPr>
           <w:rStyle w:val="MSGENFONTSTYLENAMETEMPLATEROLENUMBERMSGENFONTSTYLENAMEBYROLETEXT2"/>
-          <w:rFonts w:ascii="Tahoma" w:hAnsi="Tahoma"/>
+          <w:rFonts w:ascii="Tahoma" w:hAnsi="Tahoma" w:cs="Tahoma"/>
           <w:b/>
           <w:sz w:val="24"/>
           <w:szCs w:val="24"/>
@@ -54,14 +54,14 @@
         <w:spacing w:before="0" w:line="360" w:lineRule="auto"/>
         <w:ind w:left="60"/>
         <w:rPr>
-          <w:rFonts w:ascii="Tahoma" w:hAnsi="Tahoma"/>
+          <w:rFonts w:ascii="Tahoma" w:hAnsi="Tahoma" w:cs="Tahoma"/>
           <w:b/>
         </w:rPr>
       </w:pPr>
       <w:r>
         <w:rPr>
           <w:rStyle w:val="MSGENFONTSTYLENAMETEMPLATEROLENUMBERMSGENFONTSTYLENAMEBYROLETEXT2"/>
-          <w:rFonts w:ascii="Tahoma" w:hAnsi="Tahoma"/>
+          <w:rFonts w:ascii="Tahoma" w:hAnsi="Tahoma" w:cs="Tahoma"/>
           <w:b/>
           <w:lang w:val="en-US"/>
         </w:rPr>
@@ -70,7 +70,7 @@
       <w:r>
         <w:rPr>
           <w:rStyle w:val="MSGENFONTSTYLENAMETEMPLATEROLENUMBERMSGENFONTSTYLENAMEBYROLETEXT2"/>
-          <w:rFonts w:ascii="Tahoma" w:hAnsi="Tahoma"/>
+          <w:rFonts w:ascii="Tahoma" w:hAnsi="Tahoma" w:cs="Tahoma"/>
           <w:b/>
         </w:rPr>
         <w:t>ERITA ACARA</w:t>
@@ -84,14 +84,14 @@
         <w:ind w:left="60"/>
         <w:rPr>
           <w:rStyle w:val="MSGENFONTSTYLENAMETEMPLATEROLENUMBERMSGENFONTSTYLENAMEBYROLETEXT2"/>
-          <w:rFonts w:ascii="Tahoma" w:hAnsi="Tahoma"/>
+          <w:rFonts w:ascii="Tahoma" w:hAnsi="Tahoma" w:cs="Tahoma"/>
           <w:lang w:val="en-US"/>
         </w:rPr>
       </w:pPr>
       <w:r>
         <w:rPr>
           <w:rStyle w:val="MSGENFONTSTYLENAMETEMPLATEROLENUMBERMSGENFONTSTYLENAMEBYROLETEXT2"/>
-          <w:rFonts w:ascii="Tahoma" w:hAnsi="Tahoma"/>
+          <w:rFonts w:ascii="Tahoma" w:hAnsi="Tahoma" w:cs="Tahoma"/>
           <w:b/>
         </w:rPr>
         <w:t>PENGAMBILAN SUMPAH PEGAWAI NEGERI SIPIL</w:t>
@@ -99,7 +99,7 @@
       <w:r>
         <w:rPr>
           <w:rStyle w:val="MSGENFONTSTYLENAMETEMPLATEROLENUMBERMSGENFONTSTYLENAMEBYROLETEXT2"/>
-          <w:rFonts w:ascii="Tahoma" w:hAnsi="Tahoma"/>
+          <w:rFonts w:ascii="Tahoma" w:hAnsi="Tahoma" w:cs="Tahoma"/>
         </w:rPr>
         <w:br/>
         <w:t>NOMOR : 8</w:t>
@@ -107,7 +107,7 @@
       <w:r>
         <w:rPr>
           <w:rStyle w:val="MSGENFONTSTYLENAMETEMPLATEROLENUMBERMSGENFONTSTYLENAMEBYROLETEXT2"/>
-          <w:rFonts w:ascii="Tahoma" w:hAnsi="Tahoma"/>
+          <w:rFonts w:ascii="Tahoma" w:hAnsi="Tahoma" w:cs="Tahoma"/>
           <w:lang w:val="en-US"/>
         </w:rPr>
         <w:t>77</w:t>
@@ -115,14 +115,14 @@
       <w:r>
         <w:rPr>
           <w:rStyle w:val="MSGENFONTSTYLENAMETEMPLATEROLENUMBERMSGENFONTSTYLENAMEBYROLETEXT2"/>
-          <w:rFonts w:ascii="Tahoma" w:hAnsi="Tahoma"/>
+          <w:rFonts w:ascii="Tahoma" w:hAnsi="Tahoma" w:cs="Tahoma"/>
         </w:rPr>
         <w:t>/</w:t>
       </w:r>
       <w:r>
         <w:rPr>
           <w:rStyle w:val="MSGENFONTSTYLENAMETEMPLATEROLENUMBERMSGENFONTSTYLENAMEBYROLETEXT2"/>
-          <w:rFonts w:ascii="Tahoma" w:hAnsi="Tahoma"/>
+          <w:rFonts w:ascii="Tahoma" w:hAnsi="Tahoma" w:cs="Tahoma"/>
           <w:lang w:val="en-US"/>
         </w:rPr>
         <w:t xml:space="preserve">           </w:t>
@@ -130,14 +130,14 @@
       <w:r>
         <w:rPr>
           <w:rStyle w:val="MSGENFONTSTYLENAMETEMPLATEROLENUMBERMSGENFONTSTYLENAMEBYROLETEXT2"/>
-          <w:rFonts w:ascii="Tahoma" w:hAnsi="Tahoma"/>
+          <w:rFonts w:ascii="Tahoma" w:hAnsi="Tahoma" w:cs="Tahoma"/>
         </w:rPr>
         <w:t>/204.3/202</w:t>
       </w:r>
       <w:r>
         <w:rPr>
           <w:rStyle w:val="MSGENFONTSTYLENAMETEMPLATEROLENUMBERMSGENFONTSTYLENAMEBYROLETEXT2"/>
-          <w:rFonts w:ascii="Tahoma" w:hAnsi="Tahoma"/>
+          <w:rFonts w:ascii="Tahoma" w:hAnsi="Tahoma" w:cs="Tahoma"/>
           <w:lang w:val="en-US"/>
         </w:rPr>
         <w:t>6</w:t>
@@ -151,7 +151,7 @@
         <w:ind w:left="60"/>
         <w:rPr>
           <w:rStyle w:val="MSGENFONTSTYLENAMETEMPLATEROLENUMBERMSGENFONTSTYLENAMEBYROLETEXT2"/>
-          <w:rFonts w:ascii="Tahoma" w:hAnsi="Tahoma"/>
+          <w:rFonts w:ascii="Tahoma" w:hAnsi="Tahoma" w:cs="Tahoma"/>
           <w:lang w:val="en-US"/>
         </w:rPr>
       </w:pPr>
@@ -168,7 +168,7 @@
         <w:jc w:val="both"/>
         <w:rPr>
           <w:rStyle w:val="MSGENFONTSTYLENAMETEMPLATEROLENUMBERMSGENFONTSTYLENAMEBYROLETEXT2"/>
-          <w:rFonts w:ascii="Tahoma" w:hAnsi="Tahoma"/>
+          <w:rFonts w:ascii="Tahoma" w:hAnsi="Tahoma" w:cs="Tahoma"/>
           <w:sz w:val="22"/>
           <w:szCs w:val="22"/>
           <w:lang w:val="en-US"/>
@@ -178,7 +178,7 @@
       <w:r>
         <w:rPr>
           <w:rStyle w:val="MSGENFONTSTYLENAMETEMPLATEROLENUMBERMSGENFONTSTYLENAMEBYROLETEXT2"/>
-          <w:rFonts w:ascii="Tahoma" w:hAnsi="Tahoma"/>
+          <w:rFonts w:ascii="Tahoma" w:hAnsi="Tahoma" w:cs="Tahoma"/>
           <w:sz w:val="22"/>
           <w:szCs w:val="22"/>
         </w:rPr>
@@ -187,7 +187,7 @@
       <w:r>
         <w:rPr>
           <w:rStyle w:val="MSGENFONTSTYLENAMETEMPLATEROLENUMBERMSGENFONTSTYLENAMEBYROLETEXT2"/>
-          <w:rFonts w:ascii="Tahoma" w:hAnsi="Tahoma"/>
+          <w:rFonts w:ascii="Tahoma" w:hAnsi="Tahoma" w:cs="Tahoma"/>
           <w:sz w:val="22"/>
           <w:szCs w:val="22"/>
           <w:lang w:val="en-AU"/>
@@ -197,7 +197,7 @@
       <w:r>
         <w:rPr>
           <w:rStyle w:val="MSGENFONTSTYLENAMETEMPLATEROLENUMBERMSGENFONTSTYLENAMEBYROLETEXT2"/>
-          <w:rFonts w:ascii="Tahoma" w:hAnsi="Tahoma"/>
+          <w:rFonts w:ascii="Tahoma" w:hAnsi="Tahoma" w:cs="Tahoma"/>
           <w:sz w:val="22"/>
           <w:szCs w:val="22"/>
         </w:rPr>
@@ -206,7 +206,7 @@
       <w:r>
         <w:rPr>
           <w:rStyle w:val="MSGENFONTSTYLENAMETEMPLATEROLENUMBERMSGENFONTSTYLENAMEBYROLETEXT2"/>
-          <w:rFonts w:ascii="Tahoma" w:hAnsi="Tahoma"/>
+          <w:rFonts w:ascii="Tahoma" w:hAnsi="Tahoma" w:cs="Tahoma"/>
           <w:sz w:val="22"/>
           <w:szCs w:val="22"/>
           <w:lang w:val="en-GB"/>
@@ -216,7 +216,7 @@
       <w:r>
         <w:rPr>
           <w:rStyle w:val="MSGENFONTSTYLENAMETEMPLATEROLENUMBERMSGENFONTSTYLENAMEBYROLETEXT2"/>
-          <w:rFonts w:ascii="Tahoma" w:hAnsi="Tahoma"/>
+          <w:rFonts w:ascii="Tahoma" w:hAnsi="Tahoma" w:cs="Tahoma"/>
           <w:sz w:val="22"/>
           <w:szCs w:val="22"/>
         </w:rPr>
@@ -225,7 +225,7 @@
       <w:r>
         <w:rPr>
           <w:rStyle w:val="MSGENFONTSTYLENAMETEMPLATEROLENUMBERMSGENFONTSTYLENAMEBYROLETEXT2"/>
-          <w:rFonts w:ascii="Tahoma" w:hAnsi="Tahoma"/>
+          <w:rFonts w:ascii="Tahoma" w:hAnsi="Tahoma" w:cs="Tahoma"/>
           <w:sz w:val="22"/>
           <w:szCs w:val="22"/>
           <w:lang w:val="en-GB"/>
@@ -235,7 +235,7 @@
       <w:r>
         <w:rPr>
           <w:rStyle w:val="MSGENFONTSTYLENAMETEMPLATEROLENUMBERMSGENFONTSTYLENAMEBYROLETEXT2"/>
-          <w:rFonts w:ascii="Tahoma" w:hAnsi="Tahoma"/>
+          <w:rFonts w:ascii="Tahoma" w:hAnsi="Tahoma" w:cs="Tahoma"/>
           <w:sz w:val="22"/>
           <w:szCs w:val="22"/>
         </w:rPr>
@@ -244,7 +244,7 @@
       <w:r>
         <w:rPr>
           <w:rStyle w:val="MSGENFONTSTYLENAMETEMPLATEROLENUMBERMSGENFONTSTYLENAMEBYROLETEXT2"/>
-          <w:rFonts w:ascii="Tahoma" w:hAnsi="Tahoma"/>
+          <w:rFonts w:ascii="Tahoma" w:hAnsi="Tahoma" w:cs="Tahoma"/>
           <w:sz w:val="22"/>
           <w:szCs w:val="22"/>
           <w:lang w:val="en-GB"/>
@@ -254,7 +254,7 @@
       <w:r>
         <w:rPr>
           <w:rStyle w:val="MSGENFONTSTYLENAMETEMPLATEROLENUMBERMSGENFONTSTYLENAMEBYROLETEXT2"/>
-          <w:rFonts w:ascii="Tahoma" w:hAnsi="Tahoma"/>
+          <w:rFonts w:ascii="Tahoma" w:hAnsi="Tahoma" w:cs="Tahoma"/>
           <w:sz w:val="22"/>
           <w:szCs w:val="22"/>
         </w:rPr>
@@ -263,7 +263,7 @@
       <w:r>
         <w:rPr>
           <w:rStyle w:val="MSGENFONTSTYLENAMETEMPLATEROLENUMBERMSGENFONTSTYLENAMEBYROLETEXT2"/>
-          <w:rFonts w:ascii="Tahoma" w:hAnsi="Tahoma"/>
+          <w:rFonts w:ascii="Tahoma" w:hAnsi="Tahoma" w:cs="Tahoma"/>
           <w:sz w:val="22"/>
           <w:szCs w:val="22"/>
           <w:lang w:val="en-US"/>
@@ -273,7 +273,7 @@
       <w:r>
         <w:rPr>
           <w:rStyle w:val="MSGENFONTSTYLENAMETEMPLATEROLENUMBERMSGENFONTSTYLENAMEBYROLETEXT2"/>
-          <w:rFonts w:ascii="Tahoma" w:hAnsi="Tahoma"/>
+          <w:rFonts w:ascii="Tahoma" w:hAnsi="Tahoma" w:cs="Tahoma"/>
           <w:sz w:val="22"/>
           <w:szCs w:val="22"/>
         </w:rPr>
@@ -282,7 +282,7 @@
       <w:r>
         <w:rPr>
           <w:rStyle w:val="MSGENFONTSTYLENAMETEMPLATEROLENUMBERMSGENFONTSTYLENAMEBYROLETEXT2"/>
-          <w:rFonts w:ascii="Tahoma" w:hAnsi="Tahoma"/>
+          <w:rFonts w:ascii="Tahoma" w:hAnsi="Tahoma" w:cs="Tahoma"/>
           <w:sz w:val="22"/>
           <w:szCs w:val="22"/>
           <w:lang w:val="en-US"/>
@@ -295,7 +295,7 @@
       <w:r>
         <w:rPr>
           <w:rStyle w:val="MSGENFONTSTYLENAMETEMPLATEROLENUMBERMSGENFONTSTYLENAMEBYROLETEXT2"/>
-          <w:rFonts w:ascii="Tahoma" w:hAnsi="Tahoma"/>
+          <w:rFonts w:ascii="Tahoma" w:hAnsi="Tahoma" w:cs="Tahoma"/>
           <w:sz w:val="22"/>
           <w:szCs w:val="22"/>
         </w:rPr>
@@ -304,7 +304,7 @@
       <w:r>
         <w:rPr>
           <w:rStyle w:val="MSGENFONTSTYLENAMETEMPLATEROLENUMBERMSGENFONTSTYLENAMEBYROLETEXT2"/>
-          <w:rFonts w:ascii="Tahoma" w:hAnsi="Tahoma"/>
+          <w:rFonts w:ascii="Tahoma" w:hAnsi="Tahoma" w:cs="Tahoma"/>
           <w:sz w:val="22"/>
           <w:szCs w:val="22"/>
           <w:lang w:val="en-US"/>
@@ -313,7 +313,7 @@
       </w:r>
       <w:r>
         <w:rPr>
-          <w:rFonts w:ascii="Tahoma" w:hAnsi="Tahoma"/>
+          <w:rFonts w:ascii="Tahoma" w:hAnsi="Tahoma" w:cs="Tahoma"/>
           <w:sz w:val="22"/>
           <w:szCs w:val="22"/>
           <w:shd w:val="clear" w:color="auto" w:fill="FFFFFF"/>
@@ -325,7 +325,7 @@
       <w:r>
         <w:rPr>
           <w:rStyle w:val="MSGENFONTSTYLENAMETEMPLATEROLENUMBERMSGENFONTSTYLENAMEBYROLETEXT2"/>
-          <w:rFonts w:ascii="Tahoma" w:hAnsi="Tahoma"/>
+          <w:rFonts w:ascii="Tahoma" w:hAnsi="Tahoma" w:cs="Tahoma"/>
           <w:sz w:val="22"/>
           <w:szCs w:val="22"/>
         </w:rPr>
@@ -334,7 +334,7 @@
       <w:r>
         <w:rPr>
           <w:rStyle w:val="MSGENFONTSTYLENAMETEMPLATEROLENUMBERMSGENFONTSTYLENAMEBYROLETEXT2"/>
-          <w:rFonts w:ascii="Tahoma" w:hAnsi="Tahoma"/>
+          <w:rFonts w:ascii="Tahoma" w:hAnsi="Tahoma" w:cs="Tahoma"/>
           <w:sz w:val="22"/>
           <w:szCs w:val="22"/>
           <w:lang w:val="en-US"/>
@@ -344,7 +344,7 @@
       <w:r>
         <w:rPr>
           <w:rStyle w:val="MSGENFONTSTYLENAMETEMPLATEROLENUMBERMSGENFONTSTYLENAMEBYROLETEXT2"/>
-          <w:rFonts w:ascii="Tahoma" w:hAnsi="Tahoma"/>
+          <w:rFonts w:ascii="Tahoma" w:hAnsi="Tahoma" w:cs="Tahoma"/>
           <w:sz w:val="22"/>
           <w:szCs w:val="22"/>
         </w:rPr>
@@ -353,7 +353,7 @@
       <w:r>
         <w:rPr>
           <w:rStyle w:val="MSGENFONTSTYLENAMETEMPLATEROLENUMBERMSGENFONTSTYLENAMEBYROLETEXT2"/>
-          <w:rFonts w:ascii="Tahoma" w:hAnsi="Tahoma"/>
+          <w:rFonts w:ascii="Tahoma" w:hAnsi="Tahoma" w:cs="Tahoma"/>
           <w:sz w:val="22"/>
           <w:szCs w:val="22"/>
           <w:lang w:val="en-US"/>
@@ -363,7 +363,7 @@
       <w:r>
         <w:rPr>
           <w:rStyle w:val="MSGENFONTSTYLENAMETEMPLATEROLENUMBERMSGENFONTSTYLENAMEBYROLETEXT2"/>
-          <w:rFonts w:ascii="Tahoma" w:hAnsi="Tahoma"/>
+          <w:rFonts w:ascii="Tahoma" w:hAnsi="Tahoma" w:cs="Tahoma"/>
           <w:sz w:val="22"/>
           <w:szCs w:val="22"/>
         </w:rPr>
@@ -372,7 +372,7 @@
       <w:r>
         <w:rPr>
           <w:rStyle w:val="MSGENFONTSTYLENAMETEMPLATEROLENUMBERMSGENFONTSTYLENAMEBYROLETEXT2"/>
-          <w:rFonts w:ascii="Tahoma" w:hAnsi="Tahoma"/>
+          <w:rFonts w:ascii="Tahoma" w:hAnsi="Tahoma" w:cs="Tahoma"/>
           <w:sz w:val="22"/>
           <w:szCs w:val="22"/>
           <w:lang w:val="en-US"/>
@@ -382,7 +382,7 @@
       <w:r>
         <w:rPr>
           <w:rStyle w:val="MSGENFONTSTYLENAMETEMPLATEROLENUMBERMSGENFONTSTYLENAMEBYROLETEXT2"/>
-          <w:rFonts w:ascii="Tahoma" w:hAnsi="Tahoma"/>
+          <w:rFonts w:ascii="Tahoma" w:hAnsi="Tahoma" w:cs="Tahoma"/>
           <w:sz w:val="22"/>
           <w:szCs w:val="22"/>
         </w:rPr>
@@ -391,7 +391,7 @@
       <w:r>
         <w:rPr>
           <w:rStyle w:val="MSGENFONTSTYLENAMETEMPLATEROLENUMBERMSGENFONTSTYLENAMEBYROLETEXT2"/>
-          <w:rFonts w:ascii="Tahoma" w:hAnsi="Tahoma"/>
+          <w:rFonts w:ascii="Tahoma" w:hAnsi="Tahoma" w:cs="Tahoma"/>
           <w:sz w:val="22"/>
           <w:szCs w:val="22"/>
           <w:lang w:val="en-US"/>
@@ -401,7 +401,7 @@
       <w:r>
         <w:rPr>
           <w:rStyle w:val="MSGENFONTSTYLENAMETEMPLATEROLENUMBERMSGENFONTSTYLENAMEBYROLETEXT2"/>
-          <w:rFonts w:ascii="Tahoma" w:hAnsi="Tahoma"/>
+          <w:rFonts w:ascii="Tahoma" w:hAnsi="Tahoma" w:cs="Tahoma"/>
           <w:sz w:val="22"/>
           <w:szCs w:val="22"/>
         </w:rPr>
@@ -422,14 +422,14 @@
         <w:ind w:left="142" w:right="46"/>
         <w:jc w:val="both"/>
         <w:rPr>
-          <w:rFonts w:ascii="Tahoma" w:hAnsi="Tahoma"/>
+          <w:rFonts w:ascii="Tahoma" w:hAnsi="Tahoma" w:cs="Tahoma"/>
           <w:sz w:val="22"/>
           <w:szCs w:val="22"/>
         </w:rPr>
       </w:pPr>
       <w:r>
         <w:rPr>
-          <w:rFonts w:ascii="Tahoma" w:hAnsi="Tahoma"/>
+          <w:rFonts w:ascii="Tahoma" w:hAnsi="Tahoma" w:cs="Tahoma"/>
           <w:sz w:val="22"/>
           <w:szCs w:val="22"/>
           <w:lang w:val="en-US"/>
@@ -438,7 +438,7 @@
       </w:r>
       <w:r>
         <w:rPr>
-          <w:rFonts w:ascii="Tahoma" w:hAnsi="Tahoma"/>
+          <w:rFonts w:ascii="Tahoma" w:hAnsi="Tahoma" w:cs="Tahoma"/>
           <w:sz w:val="22"/>
           <w:szCs w:val="22"/>
           <w:shd w:val="clear" w:color="auto" w:fill="FFFFFF"/>
@@ -449,7 +449,7 @@
       <w:r>
         <w:rPr>
           <w:rStyle w:val="MSGENFONTSTYLENAMETEMPLATEROLENUMBERMSGENFONTSTYLENAMEBYROLETEXT2"/>
-          <w:rFonts w:ascii="Tahoma" w:hAnsi="Tahoma"/>
+          <w:rFonts w:ascii="Tahoma" w:hAnsi="Tahoma" w:cs="Tahoma"/>
           <w:sz w:val="22"/>
           <w:szCs w:val="22"/>
         </w:rPr>
@@ -458,7 +458,7 @@
       <w:r>
         <w:rPr>
           <w:rStyle w:val="MSGENFONTSTYLENAMETEMPLATEROLENUMBERMSGENFONTSTYLENAMEBYROLETEXT2"/>
-          <w:rFonts w:ascii="Tahoma" w:hAnsi="Tahoma"/>
+          <w:rFonts w:ascii="Tahoma" w:hAnsi="Tahoma" w:cs="Tahoma"/>
           <w:sz w:val="22"/>
           <w:szCs w:val="22"/>
           <w:lang w:val="en-US"/>
@@ -467,7 +467,7 @@
       </w:r>
       <w:r>
         <w:rPr>
-          <w:rFonts w:ascii="Tahoma" w:hAnsi="Tahoma"/>
+          <w:rFonts w:ascii="Tahoma" w:hAnsi="Tahoma" w:cs="Tahoma"/>
           <w:sz w:val="22"/>
           <w:szCs w:val="22"/>
           <w:shd w:val="clear" w:color="auto" w:fill="FFFFFF"/>
@@ -477,7 +477,7 @@
       </w:r>
       <w:r>
         <w:rPr>
-          <w:rFonts w:ascii="Tahoma" w:hAnsi="Tahoma"/>
+          <w:rFonts w:ascii="Tahoma" w:hAnsi="Tahoma" w:cs="Tahoma"/>
           <w:sz w:val="22"/>
           <w:szCs w:val="22"/>
           <w:shd w:val="clear" w:color="auto" w:fill="FFFFFF"/>
@@ -488,7 +488,7 @@
       <w:r>
         <w:rPr>
           <w:rStyle w:val="MSGENFONTSTYLENAMETEMPLATEROLENUMBERMSGENFONTSTYLENAMEBYROLETEXT2"/>
-          <w:rFonts w:ascii="Tahoma" w:hAnsi="Tahoma"/>
+          <w:rFonts w:ascii="Tahoma" w:hAnsi="Tahoma" w:cs="Tahoma"/>
           <w:sz w:val="22"/>
           <w:szCs w:val="22"/>
         </w:rPr>
@@ -497,7 +497,7 @@
       <w:r>
         <w:rPr>
           <w:rStyle w:val="MSGENFONTSTYLENAMETEMPLATEROLENUMBERMSGENFONTSTYLENAMEBYROLETEXT2"/>
-          <w:rFonts w:ascii="Tahoma" w:hAnsi="Tahoma"/>
+          <w:rFonts w:ascii="Tahoma" w:hAnsi="Tahoma" w:cs="Tahoma"/>
           <w:sz w:val="22"/>
           <w:szCs w:val="22"/>
           <w:lang w:val="en-US"/>
@@ -507,7 +507,7 @@
       <w:r>
         <w:rPr>
           <w:rStyle w:val="MSGENFONTSTYLENAMETEMPLATEROLENUMBERMSGENFONTSTYLENAMEBYROLETEXT2"/>
-          <w:rFonts w:ascii="Tahoma" w:hAnsi="Tahoma"/>
+          <w:rFonts w:ascii="Tahoma" w:hAnsi="Tahoma" w:cs="Tahoma"/>
           <w:sz w:val="22"/>
           <w:szCs w:val="22"/>
         </w:rPr>
@@ -515,7 +515,7 @@
       </w:r>
       <w:r>
         <w:rPr>
-          <w:rFonts w:ascii="Tahoma" w:hAnsi="Tahoma"/>
+          <w:rFonts w:ascii="Tahoma" w:hAnsi="Tahoma" w:cs="Tahoma"/>
           <w:sz w:val="22"/>
           <w:szCs w:val="22"/>
           <w:shd w:val="clear" w:color="auto" w:fill="FFFFFF"/>
@@ -538,7 +538,7 @@
         <w:ind w:left="142" w:right="45"/>
         <w:jc w:val="both"/>
         <w:rPr>
-          <w:rFonts w:ascii="Tahoma" w:hAnsi="Tahoma"/>
+          <w:rFonts w:ascii="Tahoma" w:hAnsi="Tahoma" w:cs="Tahoma"/>
           <w:sz w:val="22"/>
           <w:szCs w:val="22"/>
           <w:lang w:val="en-US"/>
@@ -546,7 +546,7 @@
       </w:pPr>
       <w:r>
         <w:rPr>
-          <w:rFonts w:ascii="Tahoma" w:hAnsi="Tahoma"/>
+          <w:rFonts w:ascii="Tahoma" w:hAnsi="Tahoma" w:cs="Tahoma"/>
           <w:sz w:val="22"/>
           <w:szCs w:val="22"/>
           <w:lang w:val="en-US"/>
@@ -563,7 +563,7 @@
       <w:r>
         <w:rPr>
           <w:rStyle w:val="MSGENFONTSTYLENAMETEMPLATEROLENUMBERMSGENFONTSTYLENAMEBYROLETEXT2"/>
-          <w:rFonts w:ascii="Tahoma" w:hAnsi="Tahoma"/>
+          <w:rFonts w:ascii="Tahoma" w:hAnsi="Tahoma" w:cs="Tahoma"/>
           <w:sz w:val="22"/>
           <w:szCs w:val="22"/>
           <w:lang w:val="en-US"/>
@@ -573,7 +573,7 @@
       <w:r>
         <w:rPr>
           <w:rStyle w:val="MSGENFONTSTYLENAMETEMPLATEROLENUMBERMSGENFONTSTYLENAMEBYROLETEXT2"/>
-          <w:rFonts w:ascii="Tahoma" w:hAnsi="Tahoma"/>
+          <w:rFonts w:ascii="Tahoma" w:hAnsi="Tahoma" w:cs="Tahoma"/>
           <w:sz w:val="22"/>
           <w:szCs w:val="22"/>
         </w:rPr>
@@ -582,7 +582,7 @@
       <w:r>
         <w:rPr>
           <w:rStyle w:val="MSGENFONTSTYLENAMETEMPLATEROLENUMBERMSGENFONTSTYLENAMEBYROLETEXT2"/>
-          <w:rFonts w:ascii="Tahoma" w:hAnsi="Tahoma"/>
+          <w:rFonts w:ascii="Tahoma" w:hAnsi="Tahoma" w:cs="Tahoma"/>
           <w:sz w:val="22"/>
           <w:szCs w:val="22"/>
           <w:lang w:val="en-US"/>
@@ -591,7 +591,7 @@
       </w:r>
       <w:r>
         <w:rPr>
-          <w:rFonts w:ascii="Tahoma" w:hAnsi="Tahoma"/>
+          <w:rFonts w:ascii="Tahoma" w:hAnsi="Tahoma" w:cs="Tahoma"/>
           <w:sz w:val="22"/>
           <w:szCs w:val="22"/>
           <w:shd w:val="clear" w:color="auto" w:fill="FFFFFF"/>
@@ -602,7 +602,7 @@
       <w:r>
         <w:rPr>
           <w:rStyle w:val="MSGENFONTSTYLENAMETEMPLATEROLENUMBERMSGENFONTSTYLENAMEBYROLETEXT2"/>
-          <w:rFonts w:ascii="Tahoma" w:hAnsi="Tahoma"/>
+          <w:rFonts w:ascii="Tahoma" w:hAnsi="Tahoma" w:cs="Tahoma"/>
           <w:sz w:val="22"/>
           <w:szCs w:val="22"/>
           <w:lang w:val="en-US"/>
@@ -612,7 +612,7 @@
       <w:r>
         <w:rPr>
           <w:rStyle w:val="MSGENFONTSTYLENAMETEMPLATEROLENUMBERMSGENFONTSTYLENAMEBYROLETEXT2"/>
-          <w:rFonts w:ascii="Tahoma" w:hAnsi="Tahoma"/>
+          <w:rFonts w:ascii="Tahoma" w:hAnsi="Tahoma" w:cs="Tahoma"/>
           <w:sz w:val="22"/>
           <w:szCs w:val="22"/>
           <w:lang w:val="en-US"/>
@@ -622,7 +622,7 @@
       <w:r>
         <w:rPr>
           <w:rStyle w:val="MSGENFONTSTYLENAMETEMPLATEROLENUMBERMSGENFONTSTYLENAMEBYROLETEXT2"/>
-          <w:rFonts w:ascii="Tahoma" w:hAnsi="Tahoma"/>
+          <w:rFonts w:ascii="Tahoma" w:hAnsi="Tahoma" w:cs="Tahoma"/>
           <w:sz w:val="22"/>
           <w:szCs w:val="22"/>
         </w:rPr>
@@ -631,7 +631,7 @@
       <w:r>
         <w:rPr>
           <w:rStyle w:val="MSGENFONTSTYLENAMETEMPLATEROLENUMBERMSGENFONTSTYLENAMEBYROLETEXT2"/>
-          <w:rFonts w:ascii="Tahoma" w:hAnsi="Tahoma"/>
+          <w:rFonts w:ascii="Tahoma" w:hAnsi="Tahoma" w:cs="Tahoma"/>
           <w:sz w:val="22"/>
           <w:szCs w:val="22"/>
           <w:lang w:val="en-US"/>
@@ -641,7 +641,7 @@
       <w:r>
         <w:rPr>
           <w:rStyle w:val="MSGENFONTSTYLENAMETEMPLATEROLENUMBERMSGENFONTSTYLENAMEBYROLETEXT2"/>
-          <w:rFonts w:ascii="Tahoma" w:hAnsi="Tahoma"/>
+          <w:rFonts w:ascii="Tahoma" w:hAnsi="Tahoma" w:cs="Tahoma"/>
           <w:sz w:val="22"/>
           <w:szCs w:val="22"/>
         </w:rPr>
@@ -657,7 +657,7 @@
       </w:r>
       <w:r>
         <w:rPr>
-          <w:rFonts w:ascii="Tahoma" w:hAnsi="Tahoma"/>
+          <w:rFonts w:ascii="Tahoma" w:hAnsi="Tahoma" w:cs="Tahoma"/>
           <w:sz w:val="22"/>
           <w:szCs w:val="22"/>
           <w:shd w:val="clear" w:color="auto" w:fill="FFFFFF"/>
@@ -666,7 +666,7 @@
       </w:r>
       <w:r>
         <w:rPr>
-          <w:rFonts w:ascii="Tahoma" w:hAnsi="Tahoma"/>
+          <w:rFonts w:ascii="Tahoma" w:hAnsi="Tahoma" w:cs="Tahoma"/>
           <w:sz w:val="22"/>
           <w:szCs w:val="22"/>
           <w:shd w:val="clear" w:color="auto" w:fill="FFFFFF"/>
@@ -676,7 +676,7 @@
       </w:r>
       <w:r>
         <w:rPr>
-          <w:rFonts w:ascii="Tahoma" w:hAnsi="Tahoma"/>
+          <w:rFonts w:ascii="Tahoma" w:hAnsi="Tahoma" w:cs="Tahoma"/>
           <w:sz w:val="22"/>
           <w:szCs w:val="22"/>
           <w:shd w:val="clear" w:color="auto" w:fill="FFFFFF"/>
@@ -685,7 +685,7 @@
       </w:r>
       <w:r>
         <w:rPr>
-          <w:rFonts w:ascii="Tahoma" w:hAnsi="Tahoma"/>
+          <w:rFonts w:ascii="Tahoma" w:hAnsi="Tahoma" w:cs="Tahoma"/>
           <w:sz w:val="22"/>
           <w:szCs w:val="22"/>
           <w:shd w:val="clear" w:color="auto" w:fill="FFFFFF"/>
@@ -695,7 +695,7 @@
       </w:r>
       <w:r>
         <w:rPr>
-          <w:rFonts w:ascii="Tahoma" w:hAnsi="Tahoma"/>
+          <w:rFonts w:ascii="Tahoma" w:hAnsi="Tahoma" w:cs="Tahoma"/>
           <w:sz w:val="22"/>
           <w:szCs w:val="22"/>
           <w:shd w:val="clear" w:color="auto" w:fill="FFFFFF"/>
@@ -704,7 +704,7 @@
       </w:r>
       <w:r>
         <w:rPr>
-          <w:rFonts w:ascii="Tahoma" w:hAnsi="Tahoma"/>
+          <w:rFonts w:ascii="Tahoma" w:hAnsi="Tahoma" w:cs="Tahoma"/>
           <w:sz w:val="22"/>
           <w:szCs w:val="22"/>
           <w:shd w:val="clear" w:color="auto" w:fill="FFFFFF"/>
@@ -714,7 +714,7 @@
       </w:r>
       <w:r>
         <w:rPr>
-          <w:rFonts w:ascii="Tahoma" w:hAnsi="Tahoma"/>
+          <w:rFonts w:ascii="Tahoma" w:hAnsi="Tahoma" w:cs="Tahoma"/>
           <w:sz w:val="22"/>
           <w:szCs w:val="22"/>
           <w:shd w:val="clear" w:color="auto" w:fill="FFFFFF"/>
@@ -735,7 +735,7 @@
         <w:ind w:left="142" w:right="46"/>
         <w:jc w:val="both"/>
         <w:rPr>
-          <w:rFonts w:ascii="Tahoma" w:hAnsi="Tahoma"/>
+          <w:rFonts w:ascii="Tahoma" w:hAnsi="Tahoma" w:cs="Tahoma"/>
           <w:sz w:val="22"/>
           <w:szCs w:val="22"/>
           <w:shd w:val="clear" w:color="auto" w:fill="FFFFFF"/>
@@ -745,7 +745,7 @@
       <w:r>
         <w:rPr>
           <w:rStyle w:val="MSGENFONTSTYLENAMETEMPLATEROLENUMBERMSGENFONTSTYLENAMEBYROLETEXT2"/>
-          <w:rFonts w:ascii="Tahoma" w:hAnsi="Tahoma"/>
+          <w:rFonts w:ascii="Tahoma" w:hAnsi="Tahoma" w:cs="Tahoma"/>
           <w:sz w:val="22"/>
           <w:szCs w:val="22"/>
           <w:lang w:val="en-US"/>
@@ -755,7 +755,7 @@
       <w:r>
         <w:rPr>
           <w:rStyle w:val="MSGENFONTSTYLENAMETEMPLATEROLENUMBERMSGENFONTSTYLENAMEBYROLETEXT2"/>
-          <w:rFonts w:ascii="Tahoma" w:hAnsi="Tahoma"/>
+          <w:rFonts w:ascii="Tahoma" w:hAnsi="Tahoma" w:cs="Tahoma"/>
           <w:sz w:val="22"/>
           <w:szCs w:val="22"/>
         </w:rPr>
@@ -764,7 +764,7 @@
       <w:r>
         <w:rPr>
           <w:rStyle w:val="MSGENFONTSTYLENAMETEMPLATEROLENUMBERMSGENFONTSTYLENAMEBYROLETEXT2"/>
-          <w:rFonts w:ascii="Tahoma" w:hAnsi="Tahoma"/>
+          <w:rFonts w:ascii="Tahoma" w:hAnsi="Tahoma" w:cs="Tahoma"/>
           <w:sz w:val="22"/>
           <w:szCs w:val="22"/>
           <w:lang w:val="en-US"/>
@@ -774,7 +774,7 @@
       <w:r>
         <w:rPr>
           <w:rStyle w:val="MSGENFONTSTYLENAMETEMPLATEROLENUMBERMSGENFONTSTYLENAMEBYROLETEXT2"/>
-          <w:rFonts w:ascii="Tahoma" w:hAnsi="Tahoma"/>
+          <w:rFonts w:ascii="Tahoma" w:hAnsi="Tahoma" w:cs="Tahoma"/>
           <w:sz w:val="22"/>
           <w:szCs w:val="22"/>
         </w:rPr>
@@ -783,7 +783,7 @@
       <w:r>
         <w:rPr>
           <w:rStyle w:val="MSGENFONTSTYLENAMETEMPLATEROLENUMBERMSGENFONTSTYLENAMEBYROLETEXT2"/>
-          <w:rFonts w:ascii="Tahoma" w:hAnsi="Tahoma"/>
+          <w:rFonts w:ascii="Tahoma" w:hAnsi="Tahoma" w:cs="Tahoma"/>
           <w:sz w:val="22"/>
           <w:szCs w:val="22"/>
           <w:lang w:val="en-US"/>
@@ -793,7 +793,7 @@
       <w:r>
         <w:rPr>
           <w:rStyle w:val="MSGENFONTSTYLENAMETEMPLATEROLENUMBERMSGENFONTSTYLENAMEBYROLETEXT2"/>
-          <w:rFonts w:ascii="Tahoma" w:hAnsi="Tahoma"/>
+          <w:rFonts w:ascii="Tahoma" w:hAnsi="Tahoma" w:cs="Tahoma"/>
           <w:sz w:val="22"/>
           <w:szCs w:val="22"/>
         </w:rPr>
@@ -802,7 +802,7 @@
       <w:r>
         <w:rPr>
           <w:rStyle w:val="MSGENFONTSTYLENAMETEMPLATEROLENUMBERMSGENFONTSTYLENAMEBYROLETEXT2"/>
-          <w:rFonts w:ascii="Tahoma" w:hAnsi="Tahoma"/>
+          <w:rFonts w:ascii="Tahoma" w:hAnsi="Tahoma" w:cs="Tahoma"/>
           <w:sz w:val="22"/>
           <w:szCs w:val="22"/>
           <w:lang w:val="en-US"/>
@@ -812,7 +812,7 @@
       <w:r>
         <w:rPr>
           <w:rStyle w:val="MSGENFONTSTYLENAMETEMPLATEROLENUMBERMSGENFONTSTYLENAMEBYROLETEXT2"/>
-          <w:rFonts w:ascii="Tahoma" w:hAnsi="Tahoma"/>
+          <w:rFonts w:ascii="Tahoma" w:hAnsi="Tahoma" w:cs="Tahoma"/>
           <w:sz w:val="22"/>
           <w:szCs w:val="22"/>
         </w:rPr>
@@ -821,7 +821,7 @@
       <w:r>
         <w:rPr>
           <w:rStyle w:val="MSGENFONTSTYLENAMETEMPLATEROLENUMBERMSGENFONTSTYLENAMEBYROLETEXT2"/>
-          <w:rFonts w:ascii="Tahoma" w:hAnsi="Tahoma"/>
+          <w:rFonts w:ascii="Tahoma" w:hAnsi="Tahoma" w:cs="Tahoma"/>
           <w:sz w:val="22"/>
           <w:szCs w:val="22"/>
           <w:lang w:val="en-US"/>
@@ -831,7 +831,7 @@
       <w:r>
         <w:rPr>
           <w:rStyle w:val="MSGENFONTSTYLENAMETEMPLATEROLENUMBERMSGENFONTSTYLENAMEBYROLETEXT2"/>
-          <w:rFonts w:ascii="Tahoma" w:hAnsi="Tahoma"/>
+          <w:rFonts w:ascii="Tahoma" w:hAnsi="Tahoma" w:cs="Tahoma"/>
           <w:sz w:val="22"/>
           <w:szCs w:val="22"/>
         </w:rPr>
@@ -840,7 +840,7 @@
       <w:r>
         <w:rPr>
           <w:rStyle w:val="MSGENFONTSTYLENAMETEMPLATEROLENUMBERMSGENFONTSTYLENAMEBYROLETEXT2"/>
-          <w:rFonts w:ascii="Tahoma" w:hAnsi="Tahoma"/>
+          <w:rFonts w:ascii="Tahoma" w:hAnsi="Tahoma" w:cs="Tahoma"/>
           <w:sz w:val="22"/>
           <w:szCs w:val="22"/>
           <w:lang w:val="en-US"/>
@@ -850,7 +850,7 @@
       <w:r>
         <w:rPr>
           <w:rStyle w:val="MSGENFONTSTYLENAMETEMPLATEROLENUMBERMSGENFONTSTYLENAMEBYROLETEXT2"/>
-          <w:rFonts w:ascii="Tahoma" w:hAnsi="Tahoma"/>
+          <w:rFonts w:ascii="Tahoma" w:hAnsi="Tahoma" w:cs="Tahoma"/>
           <w:sz w:val="22"/>
           <w:szCs w:val="22"/>
         </w:rPr>
@@ -859,7 +859,7 @@
       <w:r>
         <w:rPr>
           <w:rStyle w:val="MSGENFONTSTYLENAMETEMPLATEROLENUMBERMSGENFONTSTYLENAMEBYROLETEXT2"/>
-          <w:rFonts w:ascii="Tahoma" w:hAnsi="Tahoma"/>
+          <w:rFonts w:ascii="Tahoma" w:hAnsi="Tahoma" w:cs="Tahoma"/>
           <w:sz w:val="22"/>
           <w:szCs w:val="22"/>
           <w:lang w:val="en-US"/>
@@ -868,7 +868,7 @@
       </w:r>
       <w:r>
         <w:rPr>
-          <w:rFonts w:ascii="Tahoma" w:hAnsi="Tahoma"/>
+          <w:rFonts w:ascii="Tahoma" w:hAnsi="Tahoma" w:cs="Tahoma"/>
           <w:sz w:val="22"/>
           <w:szCs w:val="22"/>
           <w:shd w:val="clear" w:color="auto" w:fill="FFFFFF"/>
@@ -877,7 +877,7 @@
       </w:r>
       <w:r>
         <w:rPr>
-          <w:rFonts w:ascii="Tahoma" w:hAnsi="Tahoma"/>
+          <w:rFonts w:ascii="Tahoma" w:hAnsi="Tahoma" w:cs="Tahoma"/>
           <w:sz w:val="22"/>
           <w:szCs w:val="22"/>
           <w:lang w:val="en-US"/>
@@ -887,7 +887,7 @@
       <w:r>
         <w:rPr>
           <w:rStyle w:val="MSGENFONTSTYLENAMETEMPLATEROLENUMBERMSGENFONTSTYLENAMEBYROLETEXT2"/>
-          <w:rFonts w:ascii="Tahoma" w:hAnsi="Tahoma"/>
+          <w:rFonts w:ascii="Tahoma" w:hAnsi="Tahoma" w:cs="Tahoma"/>
           <w:sz w:val="22"/>
           <w:szCs w:val="22"/>
         </w:rPr>
@@ -896,7 +896,7 @@
       <w:r>
         <w:rPr>
           <w:rStyle w:val="MSGENFONTSTYLENAMETEMPLATEROLENUMBERMSGENFONTSTYLENAMEBYROLETEXT2"/>
-          <w:rFonts w:ascii="Tahoma" w:hAnsi="Tahoma"/>
+          <w:rFonts w:ascii="Tahoma" w:hAnsi="Tahoma" w:cs="Tahoma"/>
           <w:sz w:val="22"/>
           <w:szCs w:val="22"/>
           <w:lang w:val="en-US"/>
@@ -905,7 +905,7 @@
       </w:r>
       <w:r>
         <w:rPr>
-          <w:rFonts w:ascii="Tahoma" w:hAnsi="Tahoma"/>
+          <w:rFonts w:ascii="Tahoma" w:hAnsi="Tahoma" w:cs="Tahoma"/>
           <w:sz w:val="22"/>
           <w:szCs w:val="22"/>
           <w:shd w:val="clear" w:color="auto" w:fill="FFFFFF"/>
@@ -914,7 +914,7 @@
       </w:r>
       <w:r>
         <w:rPr>
-          <w:rFonts w:ascii="Tahoma" w:hAnsi="Tahoma"/>
+          <w:rFonts w:ascii="Tahoma" w:hAnsi="Tahoma" w:cs="Tahoma"/>
           <w:sz w:val="22"/>
           <w:szCs w:val="22"/>
           <w:shd w:val="clear" w:color="auto" w:fill="FFFFFF"/>
@@ -925,7 +925,7 @@
       <w:r>
         <w:rPr>
           <w:rStyle w:val="MSGENFONTSTYLENAMETEMPLATEROLENUMBERMSGENFONTSTYLENAMEBYROLETEXT2"/>
-          <w:rFonts w:ascii="Tahoma" w:hAnsi="Tahoma"/>
+          <w:rFonts w:ascii="Tahoma" w:hAnsi="Tahoma" w:cs="Tahoma"/>
           <w:sz w:val="22"/>
           <w:szCs w:val="22"/>
         </w:rPr>
@@ -934,7 +934,7 @@
       <w:r>
         <w:rPr>
           <w:rStyle w:val="MSGENFONTSTYLENAMETEMPLATEROLENUMBERMSGENFONTSTYLENAMEBYROLETEXT2"/>
-          <w:rFonts w:ascii="Tahoma" w:hAnsi="Tahoma"/>
+          <w:rFonts w:ascii="Tahoma" w:hAnsi="Tahoma" w:cs="Tahoma"/>
           <w:sz w:val="22"/>
           <w:szCs w:val="22"/>
           <w:lang w:val="en-US"/>
@@ -944,7 +944,7 @@
       <w:r>
         <w:rPr>
           <w:rStyle w:val="MSGENFONTSTYLENAMETEMPLATEROLENUMBERMSGENFONTSTYLENAMEBYROLETEXT2"/>
-          <w:rFonts w:ascii="Tahoma" w:hAnsi="Tahoma"/>
+          <w:rFonts w:ascii="Tahoma" w:hAnsi="Tahoma" w:cs="Tahoma"/>
           <w:sz w:val="22"/>
           <w:szCs w:val="22"/>
         </w:rPr>
@@ -953,7 +953,7 @@
       <w:r>
         <w:rPr>
           <w:rStyle w:val="MSGENFONTSTYLENAMETEMPLATEROLENUMBERMSGENFONTSTYLENAMEBYROLETEXT2"/>
-          <w:rFonts w:ascii="Tahoma" w:hAnsi="Tahoma"/>
+          <w:rFonts w:ascii="Tahoma" w:hAnsi="Tahoma" w:cs="Tahoma"/>
           <w:sz w:val="22"/>
           <w:szCs w:val="22"/>
           <w:lang w:val="en-US"/>
@@ -962,7 +962,7 @@
       </w:r>
       <w:r>
         <w:rPr>
-          <w:rFonts w:ascii="Tahoma" w:hAnsi="Tahoma"/>
+          <w:rFonts w:ascii="Tahoma" w:hAnsi="Tahoma" w:cs="Tahoma"/>
           <w:sz w:val="22"/>
           <w:szCs w:val="22"/>
           <w:shd w:val="clear" w:color="auto" w:fill="FFFFFF"/>
@@ -982,7 +982,7 @@
         <w:ind w:left="142" w:right="46"/>
         <w:jc w:val="both"/>
         <w:rPr>
-          <w:rFonts w:ascii="Tahoma" w:hAnsi="Tahoma"/>
+          <w:rFonts w:ascii="Tahoma" w:hAnsi="Tahoma" w:cs="Tahoma"/>
           <w:shd w:val="clear" w:color="auto" w:fill="FFFFFF"/>
           <w:lang w:val="en-US"/>
         </w:rPr>
@@ -990,7 +990,7 @@
       <w:r>
         <w:rPr>
           <w:rStyle w:val="MSGENFONTSTYLENAMETEMPLATEROLENUMBERMSGENFONTSTYLENAMEBYROLETEXT2"/>
-          <w:rFonts w:ascii="Tahoma" w:hAnsi="Tahoma"/>
+          <w:rFonts w:ascii="Tahoma" w:hAnsi="Tahoma" w:cs="Tahoma"/>
           <w:sz w:val="22"/>
           <w:szCs w:val="22"/>
         </w:rPr>
@@ -999,7 +999,7 @@
       <w:r>
         <w:rPr>
           <w:rStyle w:val="MSGENFONTSTYLENAMETEMPLATEROLENUMBERMSGENFONTSTYLENAMEBYROLETEXT2"/>
-          <w:rFonts w:ascii="Tahoma" w:hAnsi="Tahoma"/>
+          <w:rFonts w:ascii="Tahoma" w:hAnsi="Tahoma" w:cs="Tahoma"/>
           <w:sz w:val="22"/>
           <w:szCs w:val="22"/>
           <w:lang w:val="en-US"/>
@@ -1009,7 +1009,7 @@
       <w:r>
         <w:rPr>
           <w:rStyle w:val="MSGENFONTSTYLENAMETEMPLATEROLENUMBERMSGENFONTSTYLENAMEBYROLETEXT2"/>
-          <w:rFonts w:ascii="Tahoma" w:hAnsi="Tahoma"/>
+          <w:rFonts w:ascii="Tahoma" w:hAnsi="Tahoma" w:cs="Tahoma"/>
           <w:sz w:val="22"/>
           <w:szCs w:val="22"/>
         </w:rPr>
@@ -1018,7 +1018,7 @@
       <w:r>
         <w:rPr>
           <w:rStyle w:val="MSGENFONTSTYLENAMETEMPLATEROLENUMBERMSGENFONTSTYLENAMEBYROLETEXT2"/>
-          <w:rFonts w:ascii="Tahoma" w:hAnsi="Tahoma"/>
+          <w:rFonts w:ascii="Tahoma" w:hAnsi="Tahoma" w:cs="Tahoma"/>
           <w:sz w:val="22"/>
           <w:szCs w:val="22"/>
           <w:lang w:val="en-US"/>
@@ -1028,7 +1028,7 @@
       <w:r>
         <w:rPr>
           <w:rStyle w:val="MSGENFONTSTYLENAMETEMPLATEROLENUMBERMSGENFONTSTYLENAMEBYROLETEXT2"/>
-          <w:rFonts w:ascii="Tahoma" w:hAnsi="Tahoma"/>
+          <w:rFonts w:ascii="Tahoma" w:hAnsi="Tahoma" w:cs="Tahoma"/>
           <w:sz w:val="22"/>
           <w:szCs w:val="22"/>
         </w:rPr>
@@ -1036,7 +1036,7 @@
       </w:r>
       <w:r>
         <w:rPr>
-          <w:rFonts w:ascii="Tahoma" w:hAnsi="Tahoma"/>
+          <w:rFonts w:ascii="Tahoma" w:hAnsi="Tahoma" w:cs="Tahoma"/>
           <w:shd w:val="clear" w:color="auto" w:fill="FFFFFF"/>
           <w:lang w:val="en-US"/>
         </w:rPr>
@@ -1044,7 +1044,7 @@
       </w:r>
       <w:r>
         <w:rPr>
-          <w:rFonts w:ascii="Tahoma" w:hAnsi="Tahoma"/>
+          <w:rFonts w:ascii="Tahoma" w:hAnsi="Tahoma" w:cs="Tahoma"/>
           <w:sz w:val="22"/>
           <w:szCs w:val="22"/>
           <w:shd w:val="clear" w:color="auto" w:fill="FFFFFF"/>
@@ -1062,7 +1062,7 @@
         <w:jc w:val="both"/>
         <w:rPr>
           <w:rStyle w:val="MSGENFONTSTYLENAMETEMPLATEROLENUMBERMSGENFONTSTYLENAMEBYROLETEXT2"/>
-          <w:rFonts w:ascii="Tahoma" w:hAnsi="Tahoma"/>
+          <w:rFonts w:ascii="Tahoma" w:hAnsi="Tahoma" w:cs="Tahoma"/>
           <w:sz w:val="22"/>
           <w:szCs w:val="22"/>
           <w:lang w:val="en-US"/>
@@ -1071,7 +1071,7 @@
       <w:r>
         <w:rPr>
           <w:rStyle w:val="MSGENFONTSTYLENAMETEMPLATEROLENUMBERMSGENFONTSTYLENAMEBYROLETEXT2"/>
-          <w:rFonts w:ascii="Tahoma" w:hAnsi="Tahoma"/>
+          <w:rFonts w:ascii="Tahoma" w:hAnsi="Tahoma" w:cs="Tahoma"/>
           <w:sz w:val="22"/>
           <w:szCs w:val="22"/>
         </w:rPr>
@@ -1087,7 +1087,7 @@
         <w:jc w:val="both"/>
         <w:rPr>
           <w:rStyle w:val="MSGENFONTSTYLENAMETEMPLATEROLENUMBERMSGENFONTSTYLENAMEBYROLETEXT2"/>
-          <w:rFonts w:ascii="Tahoma" w:hAnsi="Tahoma"/>
+          <w:rFonts w:ascii="Tahoma" w:hAnsi="Tahoma" w:cs="Tahoma"/>
           <w:sz w:val="22"/>
           <w:szCs w:val="22"/>
           <w:lang w:val="en-US"/>
@@ -1104,7 +1104,7 @@
         <w:ind w:left="142" w:right="46"/>
         <w:rPr>
           <w:rStyle w:val="MSGENFONTSTYLENAMETEMPLATEROLENUMBERMSGENFONTSTYLENAMEBYROLETEXT3"/>
-          <w:rFonts w:ascii="Tahoma" w:hAnsi="Tahoma"/>
+          <w:rFonts w:ascii="Tahoma" w:hAnsi="Tahoma" w:cs="Tahoma"/>
           <w:b/>
           <w:bCs/>
           <w:i/>
@@ -1117,7 +1117,7 @@
       <w:r>
         <w:rPr>
           <w:rStyle w:val="MSGENFONTSTYLENAMETEMPLATEROLENUMBERMSGENFONTSTYLENAMEBYROLETEXT3"/>
-          <w:rFonts w:ascii="Tahoma" w:hAnsi="Tahoma"/>
+          <w:rFonts w:ascii="Tahoma" w:hAnsi="Tahoma" w:cs="Tahoma"/>
           <w:b/>
           <w:bCs/>
           <w:i/>
@@ -1131,7 +1131,7 @@
       <w:r>
         <w:rPr>
           <w:rStyle w:val="MSGENFONTSTYLENAMETEMPLATEROLENUMBERMSGENFONTSTYLENAMEBYROLETEXT3"/>
-          <w:rFonts w:ascii="Tahoma" w:hAnsi="Tahoma"/>
+          <w:rFonts w:ascii="Tahoma" w:hAnsi="Tahoma" w:cs="Tahoma"/>
           <w:b/>
           <w:bCs/>
           <w:i/>
@@ -1144,7 +1144,7 @@
       <w:r>
         <w:rPr>
           <w:rStyle w:val="MSGENFONTSTYLENAMETEMPLATEROLENUMBERMSGENFONTSTYLENAMEBYROLETEXT3"/>
-          <w:rFonts w:ascii="Tahoma" w:hAnsi="Tahoma"/>
+          <w:rFonts w:ascii="Tahoma" w:hAnsi="Tahoma" w:cs="Tahoma"/>
           <w:b/>
           <w:bCs/>
           <w:i/>
@@ -1158,7 +1158,7 @@
       <w:r>
         <w:rPr>
           <w:rStyle w:val="MSGENFONTSTYLENAMETEMPLATEROLENUMBERMSGENFONTSTYLENAMEBYROLETEXT3"/>
-          <w:rFonts w:ascii="Tahoma" w:hAnsi="Tahoma"/>
+          <w:rFonts w:ascii="Tahoma" w:hAnsi="Tahoma" w:cs="Tahoma"/>
           <w:b/>
           <w:bCs/>
           <w:i/>
@@ -1177,7 +1177,7 @@
         <w:ind w:left="142" w:right="46"/>
         <w:rPr>
           <w:rStyle w:val="MSGENFONTSTYLENAMETEMPLATEROLENUMBERMSGENFONTSTYLENAMEBYROLETEXT3"/>
-          <w:rFonts w:ascii="Tahoma" w:hAnsi="Tahoma"/>
+          <w:rFonts w:ascii="Tahoma" w:hAnsi="Tahoma" w:cs="Tahoma"/>
           <w:b/>
           <w:bCs/>
           <w:i/>
@@ -1196,7 +1196,7 @@
         <w:ind w:left="142" w:right="46"/>
         <w:rPr>
           <w:rStyle w:val="MSGENFONTSTYLENAMETEMPLATEROLENUMBERMSGENFONTSTYLENAMEBYROLETEXT3"/>
-          <w:rFonts w:ascii="Tahoma" w:hAnsi="Tahoma"/>
+          <w:rFonts w:ascii="Tahoma" w:hAnsi="Tahoma" w:cs="Tahoma"/>
           <w:b/>
           <w:bCs/>
           <w:i/>
@@ -1209,7 +1209,7 @@
       <w:r>
         <w:rPr>
           <w:rStyle w:val="MSGENFONTSTYLENAMETEMPLATEROLENUMBERMSGENFONTSTYLENAMEBYROLETEXT3"/>
-          <w:rFonts w:ascii="Tahoma" w:hAnsi="Tahoma"/>
+          <w:rFonts w:ascii="Tahoma" w:hAnsi="Tahoma" w:cs="Tahoma"/>
           <w:b/>
           <w:bCs/>
           <w:i/>
@@ -1223,7 +1223,7 @@
       <w:r>
         <w:rPr>
           <w:rStyle w:val="MSGENFONTSTYLENAMETEMPLATEROLENUMBERMSGENFONTSTYLENAMEBYROLETEXT3"/>
-          <w:rFonts w:ascii="Tahoma" w:hAnsi="Tahoma"/>
+          <w:rFonts w:ascii="Tahoma" w:hAnsi="Tahoma" w:cs="Tahoma"/>
           <w:b/>
           <w:bCs/>
           <w:i/>
@@ -1236,7 +1236,7 @@
       <w:r>
         <w:rPr>
           <w:rStyle w:val="MSGENFONTSTYLENAMETEMPLATEROLENUMBERMSGENFONTSTYLENAMEBYROLETEXT3"/>
-          <w:rFonts w:ascii="Tahoma" w:hAnsi="Tahoma"/>
+          <w:rFonts w:ascii="Tahoma" w:hAnsi="Tahoma" w:cs="Tahoma"/>
           <w:b/>
           <w:bCs/>
           <w:i/>
@@ -1250,7 +1250,7 @@
       <w:r>
         <w:rPr>
           <w:rStyle w:val="MSGENFONTSTYLENAMETEMPLATEROLENUMBERMSGENFONTSTYLENAMEBYROLETEXT3"/>
-          <w:rFonts w:ascii="Tahoma" w:hAnsi="Tahoma"/>
+          <w:rFonts w:ascii="Tahoma" w:hAnsi="Tahoma" w:cs="Tahoma"/>
           <w:b/>
           <w:bCs/>
           <w:i/>
@@ -1263,7 +1263,7 @@
       <w:r>
         <w:rPr>
           <w:rStyle w:val="MSGENFONTSTYLENAMETEMPLATEROLENUMBERMSGENFONTSTYLENAMEBYROLETEXT3"/>
-          <w:rFonts w:ascii="Tahoma" w:hAnsi="Tahoma"/>
+          <w:rFonts w:ascii="Tahoma" w:hAnsi="Tahoma" w:cs="Tahoma"/>
           <w:b/>
           <w:bCs/>
           <w:i/>
@@ -1277,7 +1277,7 @@
       <w:r>
         <w:rPr>
           <w:rStyle w:val="MSGENFONTSTYLENAMETEMPLATEROLENUMBERMSGENFONTSTYLENAMEBYROLETEXT3"/>
-          <w:rFonts w:ascii="Tahoma" w:hAnsi="Tahoma"/>
+          <w:rFonts w:ascii="Tahoma" w:hAnsi="Tahoma" w:cs="Tahoma"/>
           <w:b/>
           <w:bCs/>
           <w:i/>
@@ -1296,7 +1296,7 @@
         <w:ind w:left="142" w:right="46"/>
         <w:rPr>
           <w:rStyle w:val="MSGENFONTSTYLENAMETEMPLATEROLENUMBERMSGENFONTSTYLENAMEBYROLETEXT3"/>
-          <w:rFonts w:ascii="Tahoma" w:hAnsi="Tahoma"/>
+          <w:rFonts w:ascii="Tahoma" w:hAnsi="Tahoma" w:cs="Tahoma"/>
           <w:b/>
           <w:bCs/>
           <w:i/>
@@ -1315,7 +1315,7 @@
         <w:ind w:left="142" w:right="46"/>
         <w:rPr>
           <w:rStyle w:val="MSGENFONTSTYLENAMETEMPLATEROLENUMBERMSGENFONTSTYLENAMEBYROLETEXT3"/>
-          <w:rFonts w:ascii="Tahoma" w:hAnsi="Tahoma"/>
+          <w:rFonts w:ascii="Tahoma" w:hAnsi="Tahoma" w:cs="Tahoma"/>
           <w:b/>
           <w:bCs/>
           <w:i/>
@@ -1328,7 +1328,7 @@
       <w:r>
         <w:rPr>
           <w:rStyle w:val="MSGENFONTSTYLENAMETEMPLATEROLENUMBERMSGENFONTSTYLENAMEBYROLETEXT3"/>
-          <w:rFonts w:ascii="Tahoma" w:hAnsi="Tahoma"/>
+          <w:rFonts w:ascii="Tahoma" w:hAnsi="Tahoma" w:cs="Tahoma"/>
           <w:b/>
           <w:bCs/>
           <w:i/>
@@ -1341,7 +1341,7 @@
       <w:r>
         <w:rPr>
           <w:rStyle w:val="MSGENFONTSTYLENAMETEMPLATEROLENUMBERMSGENFONTSTYLENAMEBYROLETEXT3"/>
-          <w:rFonts w:ascii="Tahoma" w:hAnsi="Tahoma"/>
+          <w:rFonts w:ascii="Tahoma" w:hAnsi="Tahoma" w:cs="Tahoma"/>
           <w:b/>
           <w:bCs/>
           <w:i/>
@@ -1355,7 +1355,7 @@
       <w:r>
         <w:rPr>
           <w:rStyle w:val="MSGENFONTSTYLENAMETEMPLATEROLENUMBERMSGENFONTSTYLENAMEBYROLETEXT3"/>
-          <w:rFonts w:ascii="Tahoma" w:hAnsi="Tahoma"/>
+          <w:rFonts w:ascii="Tahoma" w:hAnsi="Tahoma" w:cs="Tahoma"/>
           <w:b/>
           <w:bCs/>
           <w:i/>
@@ -1368,7 +1368,7 @@
       <w:r>
         <w:rPr>
           <w:rStyle w:val="MSGENFONTSTYLENAMETEMPLATEROLENUMBERMSGENFONTSTYLENAMEBYROLETEXT3"/>
-          <w:rFonts w:ascii="Tahoma" w:hAnsi="Tahoma"/>
+          <w:rFonts w:ascii="Tahoma" w:hAnsi="Tahoma" w:cs="Tahoma"/>
           <w:b/>
           <w:bCs/>
           <w:i/>
@@ -1382,7 +1382,7 @@
       <w:r>
         <w:rPr>
           <w:rStyle w:val="MSGENFONTSTYLENAMETEMPLATEROLENUMBERMSGENFONTSTYLENAMEBYROLETEXT3"/>
-          <w:rFonts w:ascii="Tahoma" w:hAnsi="Tahoma"/>
+          <w:rFonts w:ascii="Tahoma" w:hAnsi="Tahoma" w:cs="Tahoma"/>
           <w:b/>
           <w:bCs/>
           <w:i/>
@@ -1395,7 +1395,7 @@
       <w:r>
         <w:rPr>
           <w:rStyle w:val="MSGENFONTSTYLENAMETEMPLATEROLENUMBERMSGENFONTSTYLENAMEBYROLETEXT3"/>
-          <w:rFonts w:ascii="Tahoma" w:hAnsi="Tahoma"/>
+          <w:rFonts w:ascii="Tahoma" w:hAnsi="Tahoma" w:cs="Tahoma"/>
           <w:b/>
           <w:bCs/>
           <w:i/>
@@ -1409,7 +1409,7 @@
       <w:r>
         <w:rPr>
           <w:rStyle w:val="MSGENFONTSTYLENAMETEMPLATEROLENUMBERMSGENFONTSTYLENAMEBYROLETEXT3"/>
-          <w:rFonts w:ascii="Tahoma" w:hAnsi="Tahoma"/>
+          <w:rFonts w:ascii="Tahoma" w:hAnsi="Tahoma" w:cs="Tahoma"/>
           <w:b/>
           <w:bCs/>
           <w:i/>
@@ -1422,7 +1422,7 @@
       <w:r>
         <w:rPr>
           <w:rStyle w:val="MSGENFONTSTYLENAMETEMPLATEROLENUMBERMSGENFONTSTYLENAMEBYROLETEXT3"/>
-          <w:rFonts w:ascii="Tahoma" w:hAnsi="Tahoma"/>
+          <w:rFonts w:ascii="Tahoma" w:hAnsi="Tahoma" w:cs="Tahoma"/>
           <w:b/>
           <w:bCs/>
           <w:i/>
@@ -1436,7 +1436,7 @@
       <w:r>
         <w:rPr>
           <w:rStyle w:val="MSGENFONTSTYLENAMETEMPLATEROLENUMBERMSGENFONTSTYLENAMEBYROLETEXT3"/>
-          <w:rFonts w:ascii="Tahoma" w:hAnsi="Tahoma"/>
+          <w:rFonts w:ascii="Tahoma" w:hAnsi="Tahoma" w:cs="Tahoma"/>
           <w:b/>
           <w:bCs/>
           <w:i/>
@@ -1455,7 +1455,7 @@
         <w:ind w:left="142" w:right="46"/>
         <w:rPr>
           <w:rStyle w:val="MSGENFONTSTYLENAMETEMPLATEROLENUMBERMSGENFONTSTYLENAMEBYROLETEXT3"/>
-          <w:rFonts w:ascii="Tahoma" w:hAnsi="Tahoma"/>
+          <w:rFonts w:ascii="Tahoma" w:hAnsi="Tahoma" w:cs="Tahoma"/>
           <w:b/>
           <w:bCs/>
           <w:i/>
@@ -1474,7 +1474,7 @@
         <w:ind w:left="142" w:right="46"/>
         <w:rPr>
           <w:rStyle w:val="MSGENFONTSTYLENAMETEMPLATEROLENUMBERMSGENFONTSTYLENAMEBYROLETEXT3"/>
-          <w:rFonts w:ascii="Tahoma" w:hAnsi="Tahoma"/>
+          <w:rFonts w:ascii="Tahoma" w:hAnsi="Tahoma" w:cs="Tahoma"/>
           <w:b/>
           <w:bCs/>
           <w:i/>
@@ -1487,7 +1487,7 @@
       <w:r>
         <w:rPr>
           <w:rStyle w:val="MSGENFONTSTYLENAMETEMPLATEROLENUMBERMSGENFONTSTYLENAMEBYROLETEXT3"/>
-          <w:rFonts w:ascii="Tahoma" w:hAnsi="Tahoma"/>
+          <w:rFonts w:ascii="Tahoma" w:hAnsi="Tahoma" w:cs="Tahoma"/>
           <w:b/>
           <w:bCs/>
           <w:i/>
@@ -1500,7 +1500,7 @@
       <w:r>
         <w:rPr>
           <w:rStyle w:val="MSGENFONTSTYLENAMETEMPLATEROLENUMBERMSGENFONTSTYLENAMEBYROLETEXT3"/>
-          <w:rFonts w:ascii="Tahoma" w:hAnsi="Tahoma"/>
+          <w:rFonts w:ascii="Tahoma" w:hAnsi="Tahoma" w:cs="Tahoma"/>
           <w:b/>
           <w:bCs/>
           <w:i/>
@@ -1514,7 +1514,7 @@
       <w:r>
         <w:rPr>
           <w:rStyle w:val="MSGENFONTSTYLENAMETEMPLATEROLENUMBERMSGENFONTSTYLENAMEBYROLETEXT3"/>
-          <w:rFonts w:ascii="Tahoma" w:hAnsi="Tahoma"/>
+          <w:rFonts w:ascii="Tahoma" w:hAnsi="Tahoma" w:cs="Tahoma"/>
           <w:b/>
           <w:bCs/>
           <w:i/>
@@ -1527,7 +1527,7 @@
       <w:r>
         <w:rPr>
           <w:rStyle w:val="MSGENFONTSTYLENAMETEMPLATEROLENUMBERMSGENFONTSTYLENAMEBYROLETEXT3"/>
-          <w:rFonts w:ascii="Tahoma" w:hAnsi="Tahoma"/>
+          <w:rFonts w:ascii="Tahoma" w:hAnsi="Tahoma" w:cs="Tahoma"/>
           <w:b/>
           <w:bCs/>
           <w:i/>
@@ -1541,7 +1541,7 @@
       <w:r>
         <w:rPr>
           <w:rStyle w:val="MSGENFONTSTYLENAMETEMPLATEROLENUMBERMSGENFONTSTYLENAMEBYROLETEXT3"/>
-          <w:rFonts w:ascii="Tahoma" w:hAnsi="Tahoma"/>
+          <w:rFonts w:ascii="Tahoma" w:hAnsi="Tahoma" w:cs="Tahoma"/>
           <w:b/>
           <w:bCs/>
           <w:i/>
@@ -1554,7 +1554,7 @@
       <w:r>
         <w:rPr>
           <w:rStyle w:val="MSGENFONTSTYLENAMETEMPLATEROLENUMBERMSGENFONTSTYLENAMEBYROLETEXT3"/>
-          <w:rFonts w:ascii="Tahoma" w:hAnsi="Tahoma"/>
+          <w:rFonts w:ascii="Tahoma" w:hAnsi="Tahoma" w:cs="Tahoma"/>
           <w:b/>
           <w:bCs/>
           <w:i/>
@@ -1568,7 +1568,7 @@
       <w:r>
         <w:rPr>
           <w:rStyle w:val="MSGENFONTSTYLENAMETEMPLATEROLENUMBERMSGENFONTSTYLENAMEBYROLETEXT3"/>
-          <w:rFonts w:ascii="Tahoma" w:hAnsi="Tahoma"/>
+          <w:rFonts w:ascii="Tahoma" w:hAnsi="Tahoma" w:cs="Tahoma"/>
           <w:b/>
           <w:bCs/>
           <w:i/>
@@ -1587,7 +1587,7 @@
         <w:ind w:left="142" w:right="46"/>
         <w:rPr>
           <w:rStyle w:val="MSGENFONTSTYLENAMETEMPLATEROLENUMBERMSGENFONTSTYLENAMEBYROLETEXT3"/>
-          <w:rFonts w:ascii="Tahoma" w:hAnsi="Tahoma"/>
+          <w:rFonts w:ascii="Tahoma" w:hAnsi="Tahoma" w:cs="Tahoma"/>
           <w:b/>
           <w:bCs/>
           <w:i/>
@@ -1606,7 +1606,7 @@
         <w:ind w:left="142" w:right="46"/>
         <w:rPr>
           <w:rStyle w:val="MSGENFONTSTYLENAMETEMPLATEROLENUMBERMSGENFONTSTYLENAMEBYROLETEXT3"/>
-          <w:rFonts w:ascii="Tahoma" w:hAnsi="Tahoma"/>
+          <w:rFonts w:ascii="Tahoma" w:hAnsi="Tahoma" w:cs="Tahoma"/>
           <w:b/>
           <w:bCs/>
           <w:i/>
@@ -1619,7 +1619,7 @@
       <w:r>
         <w:rPr>
           <w:rStyle w:val="MSGENFONTSTYLENAMETEMPLATEROLENUMBERMSGENFONTSTYLENAMEBYROLETEXT3"/>
-          <w:rFonts w:ascii="Tahoma" w:hAnsi="Tahoma"/>
+          <w:rFonts w:ascii="Tahoma" w:hAnsi="Tahoma" w:cs="Tahoma"/>
           <w:b/>
           <w:bCs/>
           <w:i/>
@@ -1638,7 +1638,7 @@
         <w:ind w:left="142" w:right="46"/>
         <w:rPr>
           <w:rStyle w:val="MSGENFONTSTYLENAMETEMPLATEROLENUMBERMSGENFONTSTYLENAMEBYROLETEXT3"/>
-          <w:rFonts w:ascii="Tahoma" w:hAnsi="Tahoma"/>
+          <w:rFonts w:ascii="Tahoma" w:hAnsi="Tahoma" w:cs="Tahoma"/>
           <w:b/>
           <w:bCs/>
           <w:i/>
@@ -1657,7 +1657,7 @@
         <w:ind w:left="142" w:right="46"/>
         <w:rPr>
           <w:rStyle w:val="MSGENFONTSTYLENAMETEMPLATEROLENUMBERMSGENFONTSTYLENAMEBYROLETEXT3"/>
-          <w:rFonts w:ascii="Tahoma" w:hAnsi="Tahoma"/>
+          <w:rFonts w:ascii="Tahoma" w:hAnsi="Tahoma" w:cs="Tahoma"/>
           <w:sz w:val="22"/>
           <w:szCs w:val="22"/>
           <w:lang w:val="en-US"/>
@@ -1666,7 +1666,7 @@
       <w:r>
         <w:rPr>
           <w:rStyle w:val="MSGENFONTSTYLENAMETEMPLATEROLENUMBERMSGENFONTSTYLENAMEBYROLETEXT3"/>
-          <w:rFonts w:ascii="Tahoma" w:hAnsi="Tahoma"/>
+          <w:rFonts w:ascii="Tahoma" w:hAnsi="Tahoma" w:cs="Tahoma"/>
           <w:b/>
           <w:bCs/>
           <w:i/>
@@ -1679,7 +1679,7 @@
       <w:r>
         <w:rPr>
           <w:rStyle w:val="MSGENFONTSTYLENAMETEMPLATEROLENUMBERMSGENFONTSTYLENAMEBYROLETEXT3"/>
-          <w:rFonts w:ascii="Tahoma" w:hAnsi="Tahoma"/>
+          <w:rFonts w:ascii="Tahoma" w:hAnsi="Tahoma" w:cs="Tahoma"/>
           <w:b/>
           <w:bCs/>
           <w:i/>
@@ -1693,7 +1693,7 @@
       <w:r>
         <w:rPr>
           <w:rStyle w:val="MSGENFONTSTYLENAMETEMPLATEROLENUMBERMSGENFONTSTYLENAMEBYROLETEXT3"/>
-          <w:rFonts w:ascii="Tahoma" w:hAnsi="Tahoma"/>
+          <w:rFonts w:ascii="Tahoma" w:hAnsi="Tahoma" w:cs="Tahoma"/>
           <w:sz w:val="22"/>
           <w:szCs w:val="22"/>
           <w:lang w:val="en-US" w:eastAsia="en-US"/>
@@ -1702,7 +1702,7 @@
       </w:r>
       <w:r>
         <w:rPr>
-          <w:rFonts w:ascii="Tahoma" w:hAnsi="Tahoma"/>
+          <w:rFonts w:ascii="Tahoma" w:hAnsi="Tahoma" w:cs="Tahoma"/>
           <w:sz w:val="22"/>
           <w:szCs w:val="22"/>
           <w:shd w:val="clear" w:color="auto" w:fill="FFFFFF"/>
@@ -1712,7 +1712,7 @@
       </w:r>
       <w:r>
         <w:rPr>
-          <w:rFonts w:ascii="Tahoma" w:hAnsi="Tahoma"/>
+          <w:rFonts w:ascii="Tahoma" w:hAnsi="Tahoma" w:cs="Tahoma"/>
           <w:sz w:val="22"/>
           <w:szCs w:val="22"/>
           <w:shd w:val="clear" w:color="auto" w:fill="FFFFFF"/>
@@ -1722,7 +1722,7 @@
       </w:r>
       <w:r>
         <w:rPr>
-          <w:rFonts w:ascii="Tahoma" w:hAnsi="Tahoma"/>
+          <w:rFonts w:ascii="Tahoma" w:hAnsi="Tahoma" w:cs="Tahoma"/>
           <w:sz w:val="22"/>
           <w:szCs w:val="22"/>
           <w:shd w:val="clear" w:color="auto" w:fill="FFFFFF"/>
@@ -1739,7 +1739,7 @@
         <w:ind w:left="142" w:right="46"/>
         <w:rPr>
           <w:rStyle w:val="MSGENFONTSTYLENAMETEMPLATEROLEMSGENFONTSTYLENAMEBYROLEPICTURECAPTION"/>
-          <w:rFonts w:ascii="Tahoma" w:hAnsi="Tahoma"/>
+          <w:rFonts w:ascii="Tahoma" w:hAnsi="Tahoma" w:cs="Tahoma"/>
           <w:b/>
           <w:bCs/>
           <w:i/>
@@ -1763,7 +1763,7 @@
       <w:r>
         <w:rPr>
           <w:rStyle w:val="MSGENFONTSTYLENAMETEMPLATEROLEMSGENFONTSTYLENAMEBYROLEPICTURECAPTION"/>
-          <w:rFonts w:ascii="Tahoma" w:hAnsi="Tahoma"/>
+          <w:rFonts w:ascii="Tahoma" w:hAnsi="Tahoma" w:cs="Tahoma"/>
           <w:sz w:val="22"/>
           <w:szCs w:val="22"/>
         </w:rPr>
@@ -1795,7 +1795,7 @@
               <w:snapToGrid w:val="0"/>
               <w:jc w:val="center"/>
               <w:rPr>
-                <w:rFonts w:ascii="Tahoma" w:hAnsi="Tahoma"/>
+                <w:rFonts w:ascii="Tahoma" w:hAnsi="Tahoma" w:cs="Tahoma"/>
                 <w:sz w:val="22"/>
                 <w:szCs w:val="22"/>
                 <w:lang w:val="id-ID"/>
@@ -1806,7 +1806,7 @@
             <w:pPr>
               <w:jc w:val="center"/>
               <w:rPr>
-                <w:rFonts w:ascii="Tahoma" w:hAnsi="Tahoma"/>
+                <w:rFonts w:ascii="Tahoma" w:hAnsi="Tahoma" w:cs="Tahoma"/>
                 <w:sz w:val="22"/>
                 <w:szCs w:val="22"/>
                 <w:lang w:val="id-ID"/>
@@ -1817,7 +1817,7 @@
             <w:pPr>
               <w:jc w:val="center"/>
               <w:rPr>
-                <w:rFonts w:ascii="Tahoma" w:hAnsi="Tahoma"/>
+                <w:rFonts w:ascii="Tahoma" w:hAnsi="Tahoma" w:cs="Tahoma"/>
                 <w:sz w:val="22"/>
                 <w:szCs w:val="22"/>
                 <w:lang w:val="id-ID"/>
@@ -1825,7 +1825,7 @@
             </w:pPr>
             <w:r>
               <w:rPr>
-                <w:rFonts w:ascii="Tahoma" w:hAnsi="Tahoma"/>
+                <w:rFonts w:ascii="Tahoma" w:hAnsi="Tahoma" w:cs="Tahoma"/>
                 <w:sz w:val="22"/>
                 <w:szCs w:val="22"/>
                 <w:lang w:val="id-ID"/>
@@ -1839,7 +1839,7 @@
             </w:pPr>
             <w:r>
               <w:rPr>
-                <w:rFonts w:ascii="Tahoma" w:hAnsi="Tahoma"/>
+                <w:rFonts w:ascii="Tahoma" w:hAnsi="Tahoma" w:cs="Tahoma"/>
                 <w:sz w:val="22"/>
                 <w:szCs w:val="22"/>
                 <w:lang w:val="id-ID"/>
@@ -1848,7 +1848,7 @@
             </w:r>
             <w:r>
               <w:rPr>
-                <w:rFonts w:ascii="Tahoma" w:hAnsi="Tahoma"/>
+                <w:rFonts w:ascii="Tahoma" w:hAnsi="Tahoma" w:cs="Tahoma"/>
                 <w:sz w:val="22"/>
                 <w:szCs w:val="22"/>
                 <w:lang w:val="en-AU"/>
@@ -1860,7 +1860,7 @@
             <w:pPr>
               <w:jc w:val="center"/>
               <w:rPr>
-                <w:rFonts w:ascii="Tahoma" w:hAnsi="Tahoma"/>
+                <w:rFonts w:ascii="Tahoma" w:hAnsi="Tahoma" w:cs="Tahoma"/>
                 <w:sz w:val="22"/>
                 <w:szCs w:val="22"/>
                 <w:lang w:val="en-AU"/>
@@ -1870,16 +1870,16 @@
           <w:p>
             <w:pPr>
               <w:rPr>
-                <w:rFonts w:ascii="Tahoma" w:hAnsi="Tahoma"/>
-                <w:sz w:val="22"/>
-                <w:szCs w:val="22"/>
-              </w:rPr>
-            </w:pPr>
-          </w:p>
-          <w:p>
-            <w:pPr>
-              <w:rPr>
-                <w:rFonts w:ascii="Tahoma" w:hAnsi="Tahoma"/>
+                <w:rFonts w:ascii="Tahoma" w:hAnsi="Tahoma" w:cs="Tahoma"/>
+                <w:sz w:val="22"/>
+                <w:szCs w:val="22"/>
+              </w:rPr>
+            </w:pPr>
+          </w:p>
+          <w:p>
+            <w:pPr>
+              <w:rPr>
+                <w:rFonts w:ascii="Tahoma" w:hAnsi="Tahoma" w:cs="Tahoma"/>
                 <w:sz w:val="36"/>
                 <w:szCs w:val="36"/>
               </w:rPr>
@@ -1889,7 +1889,7 @@
             <w:pPr>
               <w:jc w:val="center"/>
               <w:rPr>
-                <w:rFonts w:ascii="Tahoma" w:hAnsi="Tahoma"/>
+                <w:rFonts w:ascii="Tahoma" w:hAnsi="Tahoma" w:cs="Tahoma"/>
                 <w:sz w:val="32"/>
                 <w:szCs w:val="32"/>
                 <w:u w:val="single"/>
@@ -1898,7 +1898,7 @@
             </w:pPr>
             <w:r>
               <w:rPr>
-                <w:rFonts w:ascii="Tahoma" w:hAnsi="Tahoma"/>
+                <w:rFonts w:ascii="Tahoma" w:hAnsi="Tahoma" w:cs="Tahoma"/>
                 <w:sz w:val="22"/>
                 <w:szCs w:val="22"/>
                 <w:u w:val="single"/>
@@ -1911,14 +1911,14 @@
             <w:pPr>
               <w:jc w:val="center"/>
               <w:rPr>
-                <w:rFonts w:ascii="Tahoma" w:hAnsi="Tahoma"/>
-                <w:sz w:val="22"/>
-                <w:szCs w:val="22"/>
-              </w:rPr>
-            </w:pPr>
-            <w:r>
-              <w:rPr>
-                <w:rFonts w:ascii="Tahoma" w:hAnsi="Tahoma"/>
+                <w:rFonts w:ascii="Tahoma" w:hAnsi="Tahoma" w:cs="Tahoma"/>
+                <w:sz w:val="22"/>
+                <w:szCs w:val="22"/>
+              </w:rPr>
+            </w:pPr>
+            <w:r>
+              <w:rPr>
+                <w:rFonts w:ascii="Tahoma" w:hAnsi="Tahoma" w:cs="Tahoma"/>
                 <w:sz w:val="22"/>
                 <w:szCs w:val="22"/>
                 <w:lang w:val="id-ID"/>
@@ -1927,7 +1927,7 @@
             </w:r>
             <w:r>
               <w:rPr>
-                <w:rFonts w:ascii="Tahoma" w:hAnsi="Tahoma"/>
+                <w:rFonts w:ascii="Tahoma" w:hAnsi="Tahoma" w:cs="Tahoma"/>
                 <w:sz w:val="22"/>
                 <w:szCs w:val="22"/>
               </w:rPr>
@@ -1935,7 +1935,7 @@
             </w:r>
             <w:r>
               <w:rPr>
-                <w:rFonts w:ascii="Tahoma" w:hAnsi="Tahoma"/>
+                <w:rFonts w:ascii="Tahoma" w:hAnsi="Tahoma" w:cs="Tahoma"/>
                 <w:sz w:val="22"/>
                 <w:szCs w:val="22"/>
                 <w:lang w:val="id-ID"/>
@@ -1944,7 +1944,7 @@
             </w:r>
             <w:r>
               <w:rPr>
-                <w:rFonts w:ascii="Tahoma" w:hAnsi="Tahoma"/>
+                <w:rFonts w:ascii="Tahoma" w:hAnsi="Tahoma" w:cs="Tahoma"/>
                 <w:sz w:val="22"/>
                 <w:szCs w:val="22"/>
               </w:rPr>
@@ -1952,7 +1952,7 @@
             </w:r>
             <w:r>
               <w:rPr>
-                <w:rFonts w:ascii="Tahoma" w:hAnsi="Tahoma"/>
+                <w:rFonts w:ascii="Tahoma" w:hAnsi="Tahoma" w:cs="Tahoma"/>
                 <w:sz w:val="22"/>
                 <w:szCs w:val="22"/>
                 <w:shd w:val="clear" w:color="auto" w:fill="FFFFFF"/>
@@ -1969,7 +1969,7 @@
             <w:pPr>
               <w:jc w:val="center"/>
               <w:rPr>
-                <w:rFonts w:ascii="Tahoma" w:hAnsi="Tahoma"/>
+                <w:rFonts w:ascii="Tahoma" w:hAnsi="Tahoma" w:cs="Tahoma"/>
                 <w:sz w:val="22"/>
                 <w:szCs w:val="22"/>
                 <w:lang w:val="id-ID"/>
@@ -1977,7 +1977,7 @@
             </w:pPr>
             <w:r>
               <w:rPr>
-                <w:rFonts w:ascii="Tahoma" w:hAnsi="Tahoma"/>
+                <w:rFonts w:ascii="Tahoma" w:hAnsi="Tahoma" w:cs="Tahoma"/>
                 <w:sz w:val="22"/>
                 <w:szCs w:val="22"/>
                 <w:lang w:val="id-ID"/>
@@ -1991,7 +1991,7 @@
             </w:pPr>
             <w:r>
               <w:rPr>
-                <w:rFonts w:ascii="Tahoma" w:hAnsi="Tahoma"/>
+                <w:rFonts w:ascii="Tahoma" w:hAnsi="Tahoma" w:cs="Tahoma"/>
                 <w:sz w:val="22"/>
                 <w:szCs w:val="22"/>
                 <w:lang w:val="id-ID"/>
@@ -2000,7 +2000,7 @@
             </w:r>
             <w:r>
               <w:rPr>
-                <w:rFonts w:ascii="Tahoma" w:hAnsi="Tahoma"/>
+                <w:rFonts w:ascii="Tahoma" w:hAnsi="Tahoma" w:cs="Tahoma"/>
                 <w:sz w:val="22"/>
                 <w:szCs w:val="22"/>
                 <w:lang w:val="en-AU"/>
@@ -2012,7 +2012,7 @@
             <w:pPr>
               <w:jc w:val="center"/>
               <w:rPr>
-                <w:rFonts w:ascii="Tahoma" w:hAnsi="Tahoma"/>
+                <w:rFonts w:ascii="Tahoma" w:hAnsi="Tahoma" w:cs="Tahoma"/>
                 <w:sz w:val="22"/>
                 <w:szCs w:val="22"/>
                 <w:lang w:val="en-AU"/>
@@ -2020,7 +2020,7 @@
             </w:pPr>
             <w:r>
               <w:rPr>
-                <w:rFonts w:ascii="Tahoma" w:hAnsi="Tahoma"/>
+                <w:rFonts w:ascii="Tahoma" w:hAnsi="Tahoma" w:cs="Tahoma"/>
                 <w:sz w:val="22"/>
                 <w:szCs w:val="22"/>
                 <w:lang w:val="en-AU"/>
@@ -2032,7 +2032,7 @@
             <w:pPr>
               <w:jc w:val="center"/>
               <w:rPr>
-                <w:rFonts w:ascii="Tahoma" w:hAnsi="Tahoma"/>
+                <w:rFonts w:ascii="Tahoma" w:hAnsi="Tahoma" w:cs="Tahoma"/>
                 <w:sz w:val="22"/>
                 <w:szCs w:val="22"/>
                 <w:lang w:val="en-AU"/>
@@ -2040,7 +2040,7 @@
             </w:pPr>
             <w:r>
               <w:rPr>
-                <w:rFonts w:ascii="Tahoma" w:hAnsi="Tahoma"/>
+                <w:rFonts w:ascii="Tahoma" w:hAnsi="Tahoma" w:cs="Tahoma"/>
                 <w:sz w:val="22"/>
                 <w:szCs w:val="22"/>
                 <w:lang w:val="en-AU"/>
@@ -2052,7 +2052,7 @@
             <w:pPr>
               <w:jc w:val="center"/>
               <w:rPr>
-                <w:rFonts w:ascii="Tahoma" w:hAnsi="Tahoma"/>
+                <w:rFonts w:ascii="Tahoma" w:hAnsi="Tahoma" w:cs="Tahoma"/>
                 <w:sz w:val="40"/>
                 <w:szCs w:val="40"/>
                 <w:lang w:eastAsia="en-US"/>
@@ -2083,7 +2083,7 @@
             <w:pPr>
               <w:jc w:val="center"/>
               <w:rPr>
-                <w:rFonts w:ascii="Tahoma" w:hAnsi="Tahoma"/>
+                <w:rFonts w:ascii="Tahoma" w:hAnsi="Tahoma" w:cs="Tahoma"/>
                 <w:sz w:val="22"/>
                 <w:szCs w:val="22"/>
                 <w:u w:val="single"/>
@@ -2091,7 +2091,7 @@
             </w:pPr>
             <w:r>
               <w:rPr>
-                <w:rFonts w:ascii="Tahoma" w:hAnsi="Tahoma"/>
+                <w:rFonts w:ascii="Tahoma" w:hAnsi="Tahoma" w:cs="Tahoma"/>
                 <w:sz w:val="22"/>
                 <w:szCs w:val="22"/>
                 <w:u w:val="single"/>
@@ -2103,7 +2103,7 @@
             <w:pPr>
               <w:jc w:val="center"/>
               <w:rPr>
-                <w:rFonts w:ascii="Tahoma" w:hAnsi="Tahoma"/>
+                <w:rFonts w:ascii="Tahoma" w:hAnsi="Tahoma" w:cs="Tahoma"/>
                 <w:sz w:val="22"/>
                 <w:szCs w:val="22"/>
                 <w:lang w:val="id-ID"/>
@@ -2111,7 +2111,7 @@
             </w:pPr>
             <w:r>
               <w:rPr>
-                <w:rFonts w:ascii="Tahoma" w:hAnsi="Tahoma"/>
+                <w:rFonts w:ascii="Tahoma" w:hAnsi="Tahoma" w:cs="Tahoma"/>
                 <w:sz w:val="22"/>
                 <w:szCs w:val="22"/>
               </w:rPr>
@@ -2119,7 +2119,7 @@
             </w:r>
             <w:r>
               <w:rPr>
-                <w:rFonts w:ascii="Tahoma" w:hAnsi="Tahoma"/>
+                <w:rFonts w:ascii="Tahoma" w:hAnsi="Tahoma" w:cs="Tahoma"/>
                 <w:sz w:val="22"/>
                 <w:szCs w:val="22"/>
                 <w:shd w:val="clear" w:color="auto" w:fill="FFFFFF"/>
@@ -2136,7 +2136,7 @@
             <w:pPr>
               <w:jc w:val="center"/>
               <w:rPr>
-                <w:rFonts w:ascii="Tahoma" w:hAnsi="Tahoma"/>
+                <w:rFonts w:ascii="Tahoma" w:hAnsi="Tahoma" w:cs="Tahoma"/>
                 <w:sz w:val="22"/>
                 <w:szCs w:val="22"/>
                 <w:lang w:val="id-ID"/>
@@ -2144,7 +2144,7 @@
             </w:pPr>
             <w:r>
               <w:rPr>
-                <w:rFonts w:ascii="Tahoma" w:hAnsi="Tahoma"/>
+                <w:rFonts w:ascii="Tahoma" w:hAnsi="Tahoma" w:cs="Tahoma"/>
                 <w:sz w:val="22"/>
                 <w:szCs w:val="22"/>
                 <w:lang w:val="id-ID"/>
@@ -2158,7 +2158,7 @@
             </w:pPr>
             <w:r>
               <w:rPr>
-                <w:rFonts w:ascii="Tahoma" w:hAnsi="Tahoma"/>
+                <w:rFonts w:ascii="Tahoma" w:hAnsi="Tahoma" w:cs="Tahoma"/>
                 <w:sz w:val="22"/>
                 <w:szCs w:val="22"/>
                 <w:lang w:val="id-ID"/>
@@ -2167,7 +2167,7 @@
             </w:r>
             <w:r>
               <w:rPr>
-                <w:rFonts w:ascii="Tahoma" w:hAnsi="Tahoma"/>
+                <w:rFonts w:ascii="Tahoma" w:hAnsi="Tahoma" w:cs="Tahoma"/>
                 <w:sz w:val="22"/>
                 <w:szCs w:val="22"/>
                 <w:lang w:val="en-AU"/>
@@ -2179,7 +2179,7 @@
             <w:pPr>
               <w:jc w:val="center"/>
               <w:rPr>
-                <w:rFonts w:ascii="Tahoma" w:hAnsi="Tahoma"/>
+                <w:rFonts w:ascii="Tahoma" w:hAnsi="Tahoma" w:cs="Tahoma"/>
                 <w:sz w:val="22"/>
                 <w:szCs w:val="22"/>
                 <w:lang w:val="en-AU"/>
@@ -2187,7 +2187,7 @@
             </w:pPr>
             <w:r>
               <w:rPr>
-                <w:rFonts w:ascii="Tahoma" w:hAnsi="Tahoma"/>
+                <w:rFonts w:ascii="Tahoma" w:hAnsi="Tahoma" w:cs="Tahoma"/>
                 <w:sz w:val="22"/>
                 <w:szCs w:val="22"/>
                 <w:lang w:val="en-AU"/>
@@ -2199,7 +2199,7 @@
             <w:pPr>
               <w:jc w:val="center"/>
               <w:rPr>
-                <w:rFonts w:ascii="Tahoma" w:hAnsi="Tahoma"/>
+                <w:rFonts w:ascii="Tahoma" w:hAnsi="Tahoma" w:cs="Tahoma"/>
                 <w:sz w:val="22"/>
                 <w:szCs w:val="22"/>
                 <w:lang w:eastAsia="en-US"/>
@@ -2220,7 +2220,7 @@
             <w:pPr>
               <w:jc w:val="center"/>
               <w:rPr>
-                <w:rFonts w:ascii="Tahoma" w:hAnsi="Tahoma"/>
+                <w:rFonts w:ascii="Tahoma" w:hAnsi="Tahoma" w:cs="Tahoma"/>
                 <w:sz w:val="22"/>
                 <w:szCs w:val="22"/>
                 <w:lang w:eastAsia="en-US"/>
@@ -2231,7 +2231,7 @@
             <w:pPr>
               <w:jc w:val="center"/>
               <w:rPr>
-                <w:rFonts w:ascii="Tahoma" w:hAnsi="Tahoma"/>
+                <w:rFonts w:ascii="Tahoma" w:hAnsi="Tahoma" w:cs="Tahoma"/>
                 <w:sz w:val="22"/>
                 <w:szCs w:val="22"/>
                 <w:u w:val="single"/>
@@ -2239,7 +2239,7 @@
             </w:pPr>
             <w:r>
               <w:rPr>
-                <w:rFonts w:ascii="Tahoma" w:hAnsi="Tahoma"/>
+                <w:rFonts w:ascii="Tahoma" w:hAnsi="Tahoma" w:cs="Tahoma"/>
                 <w:sz w:val="22"/>
                 <w:szCs w:val="22"/>
                 <w:u w:val="single"/>
@@ -2251,14 +2251,14 @@
             <w:pPr>
               <w:jc w:val="center"/>
               <w:rPr>
-                <w:rFonts w:ascii="Tahoma" w:hAnsi="Tahoma"/>
-                <w:sz w:val="22"/>
-                <w:szCs w:val="22"/>
-              </w:rPr>
-            </w:pPr>
-            <w:r>
-              <w:rPr>
-                <w:rFonts w:ascii="Tahoma" w:hAnsi="Tahoma"/>
+                <w:rFonts w:ascii="Tahoma" w:hAnsi="Tahoma" w:cs="Tahoma"/>
+                <w:sz w:val="22"/>
+                <w:szCs w:val="22"/>
+              </w:rPr>
+            </w:pPr>
+            <w:r>
+              <w:rPr>
+                <w:rFonts w:ascii="Tahoma" w:hAnsi="Tahoma" w:cs="Tahoma"/>
                 <w:sz w:val="22"/>
                 <w:szCs w:val="22"/>
               </w:rPr>
@@ -2278,7 +2278,7 @@
             <w:pPr>
               <w:snapToGrid w:val="0"/>
               <w:rPr>
-                <w:rFonts w:ascii="Tahoma" w:hAnsi="Tahoma"/>
+                <w:rFonts w:ascii="Tahoma" w:hAnsi="Tahoma" w:cs="Tahoma"/>
                 <w:sz w:val="22"/>
                 <w:szCs w:val="22"/>
               </w:rPr>
@@ -2299,14 +2299,14 @@
                 <w:tab w:val="left" w:pos="8265"/>
               </w:tabs>
               <w:rPr>
-                <w:rFonts w:ascii="Tahoma" w:hAnsi="Tahoma"/>
-                <w:sz w:val="22"/>
-                <w:szCs w:val="22"/>
-              </w:rPr>
-            </w:pPr>
-            <w:r>
-              <w:rPr>
-                <w:rFonts w:ascii="Tahoma" w:hAnsi="Tahoma"/>
+                <w:rFonts w:ascii="Tahoma" w:hAnsi="Tahoma" w:cs="Tahoma"/>
+                <w:sz w:val="22"/>
+                <w:szCs w:val="22"/>
+              </w:rPr>
+            </w:pPr>
+            <w:r>
+              <w:rPr>
+                <w:rFonts w:ascii="Tahoma" w:hAnsi="Tahoma" w:cs="Tahoma"/>
                 <w:sz w:val="22"/>
                 <w:szCs w:val="22"/>
               </w:rPr>
@@ -2327,14 +2327,14 @@
                 <w:tab w:val="left" w:pos="8265"/>
               </w:tabs>
               <w:rPr>
-                <w:rFonts w:ascii="Tahoma" w:hAnsi="Tahoma"/>
-                <w:sz w:val="22"/>
-                <w:szCs w:val="22"/>
-              </w:rPr>
-            </w:pPr>
-            <w:r>
-              <w:rPr>
-                <w:rFonts w:ascii="Tahoma" w:hAnsi="Tahoma"/>
+                <w:rFonts w:ascii="Tahoma" w:hAnsi="Tahoma" w:cs="Tahoma"/>
+                <w:sz w:val="22"/>
+                <w:szCs w:val="22"/>
+              </w:rPr>
+            </w:pPr>
+            <w:r>
+              <w:rPr>
+                <w:rFonts w:ascii="Tahoma" w:hAnsi="Tahoma" w:cs="Tahoma"/>
                 <w:sz w:val="22"/>
                 <w:szCs w:val="22"/>
               </w:rPr>
@@ -2343,7 +2343,7 @@
             </w:r>
             <w:r>
               <w:rPr>
-                <w:rFonts w:ascii="Tahoma" w:hAnsi="Tahoma"/>
+                <w:rFonts w:ascii="Tahoma" w:hAnsi="Tahoma" w:cs="Tahoma"/>
                 <w:sz w:val="22"/>
                 <w:szCs w:val="22"/>
               </w:rPr>
@@ -2365,7 +2365,7 @@
               <w:snapToGrid w:val="0"/>
               <w:ind w:firstLine="993"/>
               <w:rPr>
-                <w:rFonts w:ascii="Tahoma" w:hAnsi="Tahoma"/>
+                <w:rFonts w:ascii="Tahoma" w:hAnsi="Tahoma" w:cs="Tahoma"/>
                 <w:sz w:val="10"/>
                 <w:szCs w:val="10"/>
                 <w:lang w:eastAsia="en-US"/>
@@ -2426,7 +2426,7 @@
             <w:pPr>
               <w:jc w:val="center"/>
               <w:rPr>
-                <w:rFonts w:ascii="Tahoma" w:hAnsi="Tahoma"/>
+                <w:rFonts w:ascii="Tahoma" w:hAnsi="Tahoma" w:cs="Tahoma"/>
                 <w:sz w:val="22"/>
                 <w:szCs w:val="22"/>
                 <w:lang w:val="id-ID"/>
@@ -2434,7 +2434,7 @@
             </w:pPr>
             <w:r>
               <w:rPr>
-                <w:rFonts w:ascii="Tahoma" w:hAnsi="Tahoma"/>
+                <w:rFonts w:ascii="Tahoma" w:hAnsi="Tahoma" w:cs="Tahoma"/>
                 <w:sz w:val="22"/>
                 <w:szCs w:val="22"/>
                 <w:u w:val="single"/>
@@ -2445,7 +2445,7 @@
             </w:r>
             <w:r>
               <w:rPr>
-                <w:rFonts w:ascii="Tahoma" w:hAnsi="Tahoma"/>
+                <w:rFonts w:ascii="Tahoma" w:hAnsi="Tahoma" w:cs="Tahoma"/>
                 <w:sz w:val="22"/>
                 <w:szCs w:val="22"/>
                 <w:lang w:val="id-ID"/>
@@ -2457,7 +2457,7 @@
             <w:pPr>
               <w:jc w:val="center"/>
               <w:rPr>
-                <w:rFonts w:ascii="Tahoma" w:hAnsi="Tahoma"/>
+                <w:rFonts w:ascii="Tahoma" w:hAnsi="Tahoma" w:cs="Tahoma"/>
                 <w:sz w:val="22"/>
                 <w:szCs w:val="22"/>
                 <w:lang w:val="en-GB"/>
@@ -2465,7 +2465,7 @@
             </w:pPr>
             <w:r>
               <w:rPr>
-                <w:rFonts w:ascii="Tahoma" w:hAnsi="Tahoma"/>
+                <w:rFonts w:ascii="Tahoma" w:hAnsi="Tahoma" w:cs="Tahoma"/>
                 <w:sz w:val="22"/>
                 <w:szCs w:val="22"/>
                 <w:lang w:val="id-ID"/>
@@ -2474,7 +2474,7 @@
             </w:r>
             <w:r>
               <w:rPr>
-                <w:rFonts w:ascii="Tahoma" w:hAnsi="Tahoma"/>
+                <w:rFonts w:ascii="Tahoma" w:hAnsi="Tahoma" w:cs="Tahoma"/>
                 <w:sz w:val="22"/>
                 <w:szCs w:val="22"/>
               </w:rPr>
@@ -2482,7 +2482,7 @@
             </w:r>
             <w:r>
               <w:rPr>
-                <w:rFonts w:ascii="Tahoma" w:hAnsi="Tahoma"/>
+                <w:rFonts w:ascii="Tahoma" w:hAnsi="Tahoma" w:cs="Tahoma"/>
                 <w:sz w:val="22"/>
                 <w:szCs w:val="22"/>
                 <w:lang w:val="id-ID"/>
@@ -2491,7 +2491,7 @@
             </w:r>
             <w:r>
               <w:rPr>
-                <w:rFonts w:ascii="Tahoma" w:hAnsi="Tahoma"/>
+                <w:rFonts w:ascii="Tahoma" w:hAnsi="Tahoma" w:cs="Tahoma"/>
                 <w:sz w:val="22"/>
                 <w:szCs w:val="22"/>
                 <w:shd w:val="clear" w:color="auto" w:fill="FFFFFF"/>
@@ -2510,7 +2510,7 @@
               <w:snapToGrid w:val="0"/>
               <w:jc w:val="center"/>
               <w:rPr>
-                <w:rFonts w:ascii="Tahoma" w:hAnsi="Tahoma"/>
+                <w:rFonts w:ascii="Tahoma" w:hAnsi="Tahoma" w:cs="Tahoma"/>
                 <w:sz w:val="22"/>
                 <w:szCs w:val="22"/>
                 <w:lang w:eastAsia="en-US"/>
@@ -2561,7 +2561,7 @@
             <w:pPr>
               <w:jc w:val="center"/>
               <w:rPr>
-                <w:rFonts w:ascii="Tahoma" w:hAnsi="Tahoma"/>
+                <w:rFonts w:ascii="Tahoma" w:hAnsi="Tahoma" w:cs="Tahoma"/>
                 <w:sz w:val="22"/>
                 <w:szCs w:val="22"/>
                 <w:u w:val="single"/>
@@ -2571,7 +2571,7 @@
             </w:pPr>
             <w:r>
               <w:rPr>
-                <w:rFonts w:ascii="Tahoma" w:hAnsi="Tahoma"/>
+                <w:rFonts w:ascii="Tahoma" w:hAnsi="Tahoma" w:cs="Tahoma"/>
                 <w:sz w:val="22"/>
                 <w:szCs w:val="22"/>
                 <w:u w:val="single"/>
@@ -2590,7 +2590,7 @@
             </w:pPr>
             <w:r>
               <w:rPr>
-                <w:rFonts w:ascii="Tahoma" w:hAnsi="Tahoma"/>
+                <w:rFonts w:ascii="Tahoma" w:hAnsi="Tahoma" w:cs="Tahoma"/>
                 <w:sz w:val="22"/>
                 <w:szCs w:val="22"/>
                 <w:lang w:val="id-ID"/>
@@ -2599,7 +2599,7 @@
             </w:r>
             <w:r>
               <w:rPr>
-                <w:rFonts w:ascii="Tahoma" w:hAnsi="Tahoma"/>
+                <w:rFonts w:ascii="Tahoma" w:hAnsi="Tahoma" w:cs="Tahoma"/>
                 <w:sz w:val="22"/>
                 <w:szCs w:val="22"/>
               </w:rPr>
@@ -2607,7 +2607,7 @@
             </w:r>
             <w:r>
               <w:rPr>
-                <w:rFonts w:ascii="Tahoma" w:hAnsi="Tahoma"/>
+                <w:rFonts w:ascii="Tahoma" w:hAnsi="Tahoma" w:cs="Tahoma"/>
                 <w:sz w:val="22"/>
                 <w:szCs w:val="22"/>
                 <w:lang w:val="id-ID"/>
@@ -2616,7 +2616,7 @@
             </w:r>
             <w:r>
               <w:rPr>
-                <w:rFonts w:ascii="Tahoma" w:hAnsi="Tahoma"/>
+                <w:rFonts w:ascii="Tahoma" w:hAnsi="Tahoma" w:cs="Tahoma"/>
                 <w:sz w:val="22"/>
                 <w:szCs w:val="22"/>
                 <w:shd w:val="clear" w:color="auto" w:fill="FFFFFF"/>
@@ -2664,7 +2664,7 @@
             <w:pPr>
               <w:jc w:val="center"/>
               <w:rPr>
-                <w:rFonts w:ascii="Tahoma" w:hAnsi="Tahoma"/>
+                <w:rFonts w:ascii="Tahoma" w:hAnsi="Tahoma" w:cs="Tahoma"/>
                 <w:sz w:val="22"/>
                 <w:szCs w:val="22"/>
                 <w:lang w:eastAsia="en-US"/>
@@ -2675,7 +2675,7 @@
             <w:pPr>
               <w:jc w:val="center"/>
               <w:rPr>
-                <w:rFonts w:ascii="Tahoma" w:hAnsi="Tahoma"/>
+                <w:rFonts w:ascii="Tahoma" w:hAnsi="Tahoma" w:cs="Tahoma"/>
                 <w:sz w:val="22"/>
                 <w:szCs w:val="22"/>
                 <w:u w:val="single"/>
@@ -2683,7 +2683,7 @@
             </w:pPr>
             <w:r>
               <w:rPr>
-                <w:rFonts w:ascii="Tahoma" w:hAnsi="Tahoma"/>
+                <w:rFonts w:ascii="Tahoma" w:hAnsi="Tahoma" w:cs="Tahoma"/>
                 <w:sz w:val="22"/>
                 <w:szCs w:val="22"/>
                 <w:u w:val="single"/>
@@ -2693,7 +2693,7 @@
             </w:r>
             <w:r>
               <w:rPr>
-                <w:rFonts w:ascii="Tahoma" w:hAnsi="Tahoma"/>
+                <w:rFonts w:ascii="Tahoma" w:hAnsi="Tahoma" w:cs="Tahoma"/>
                 <w:sz w:val="22"/>
                 <w:szCs w:val="22"/>
                 <w:u w:val="single"/>
@@ -2703,7 +2703,7 @@
             </w:r>
             <w:r>
               <w:rPr>
-                <w:rFonts w:ascii="Tahoma" w:hAnsi="Tahoma"/>
+                <w:rFonts w:ascii="Tahoma" w:hAnsi="Tahoma" w:cs="Tahoma"/>
                 <w:sz w:val="22"/>
                 <w:szCs w:val="22"/>
                 <w:u w:val="single"/>
@@ -2716,14 +2716,14 @@
             <w:pPr>
               <w:jc w:val="center"/>
               <w:rPr>
-                <w:rFonts w:ascii="Tahoma" w:hAnsi="Tahoma"/>
-                <w:sz w:val="22"/>
-                <w:szCs w:val="22"/>
-              </w:rPr>
-            </w:pPr>
-            <w:r>
-              <w:rPr>
-                <w:rFonts w:ascii="Tahoma" w:hAnsi="Tahoma"/>
+                <w:rFonts w:ascii="Tahoma" w:hAnsi="Tahoma" w:cs="Tahoma"/>
+                <w:sz w:val="22"/>
+                <w:szCs w:val="22"/>
+              </w:rPr>
+            </w:pPr>
+            <w:r>
+              <w:rPr>
+                <w:rFonts w:ascii="Tahoma" w:hAnsi="Tahoma" w:cs="Tahoma"/>
                 <w:sz w:val="22"/>
                 <w:szCs w:val="22"/>
                 <w:lang w:val="id-ID"/>
@@ -2732,7 +2732,7 @@
             </w:r>
             <w:r>
               <w:rPr>
-                <w:rFonts w:ascii="Tahoma" w:hAnsi="Tahoma"/>
+                <w:rFonts w:ascii="Tahoma" w:hAnsi="Tahoma" w:cs="Tahoma"/>
                 <w:sz w:val="22"/>
                 <w:szCs w:val="22"/>
               </w:rPr>
@@ -2740,7 +2740,7 @@
             </w:r>
             <w:r>
               <w:rPr>
-                <w:rFonts w:ascii="Tahoma" w:hAnsi="Tahoma"/>
+                <w:rFonts w:ascii="Tahoma" w:hAnsi="Tahoma" w:cs="Tahoma"/>
                 <w:sz w:val="22"/>
                 <w:szCs w:val="22"/>
                 <w:lang w:val="id-ID"/>
@@ -2749,7 +2749,7 @@
             </w:r>
             <w:r>
               <w:rPr>
-                <w:rFonts w:ascii="Tahoma" w:hAnsi="Tahoma"/>
+                <w:rFonts w:ascii="Tahoma" w:hAnsi="Tahoma" w:cs="Tahoma"/>
                 <w:sz w:val="22"/>
                 <w:szCs w:val="22"/>
                 <w:lang w:val="id-ID" w:eastAsia="en-US"/>
@@ -2758,7 +2758,7 @@
             </w:r>
             <w:r>
               <w:rPr>
-                <w:rFonts w:ascii="Tahoma" w:hAnsi="Tahoma"/>
+                <w:rFonts w:ascii="Tahoma" w:hAnsi="Tahoma" w:cs="Tahoma"/>
                 <w:sz w:val="22"/>
                 <w:szCs w:val="22"/>
                 <w:lang w:eastAsia="en-US"/>
@@ -2779,7 +2779,7 @@
             <w:pPr>
               <w:snapToGrid w:val="0"/>
               <w:rPr>
-                <w:rFonts w:ascii="Tahoma" w:hAnsi="Tahoma"/>
+                <w:rFonts w:ascii="Tahoma" w:hAnsi="Tahoma" w:cs="Tahoma"/>
                 <w:sz w:val="22"/>
                 <w:szCs w:val="22"/>
               </w:rPr>
@@ -2816,7 +2816,7 @@
   <w:docDefaults>
     <w:rPrDefault>
       <w:rPr>
-        <w:rFonts w:ascii="Tahoma" w:hAnsi="Tahoma"/>
+        <w:rFonts w:ascii="Liberation Serif" w:eastAsia="Noto Serif CJK SC" w:hAnsi="Liberation Serif" w:cs="FreeSans"/>
         <w:lang w:val="en-US" w:eastAsia="zh-CN" w:bidi="ar-SA"/>
       </w:rPr>
     </w:rPrDefault>
@@ -3208,7 +3208,7 @@
       <w:suppressAutoHyphens/>
     </w:pPr>
     <w:rPr>
-      <w:rFonts w:ascii="Tahoma" w:hAnsi="Tahoma"/>
+      <w:rFonts w:ascii="Times New Roman" w:eastAsia="Times New Roman" w:hAnsi="Times New Roman" w:cs="Times New Roman"/>
       <w:color w:val="000000"/>
       <w:sz w:val="24"/>
       <w:szCs w:val="24"/>
@@ -3245,7 +3245,7 @@
     <w:name w:val="WW8Num1z0"/>
     <w:qFormat/>
     <w:rPr>
-      <w:rFonts w:ascii="Tahoma" w:hAnsi="Tahoma"/>
+      <w:rFonts w:ascii="Arial" w:hAnsi="Arial" w:cs="Arial"/>
       <w:b w:val="0"/>
       <w:bCs w:val="0"/>
       <w:i w:val="0"/>
@@ -3268,7 +3268,7 @@
     <w:name w:val="MSG_EN_FONT_STYLE_NAME_TEMPLATE_ROLE_NUMBER MSG_EN_FONT_STYLE_NAME_BY_ROLE_TEXT 2_"/>
     <w:qFormat/>
     <w:rPr>
-      <w:rFonts w:ascii="Tahoma" w:hAnsi="Tahoma"/>
+      <w:rFonts w:ascii="Arial" w:hAnsi="Arial" w:cs="Arial"/>
       <w:sz w:val="21"/>
       <w:szCs w:val="21"/>
       <w:shd w:val="clear" w:color="auto" w:fill="FFFFFF"/>
@@ -3278,7 +3278,7 @@
     <w:name w:val="MSG_EN_FONT_STYLE_NAME_TEMPLATE_ROLE_NUMBER MSG_EN_FONT_STYLE_NAME_BY_ROLE_TEXT 3_"/>
     <w:qFormat/>
     <w:rPr>
-      <w:rFonts w:ascii="Tahoma" w:hAnsi="Tahoma"/>
+      <w:rFonts w:ascii="Arial" w:hAnsi="Arial" w:cs="Arial"/>
       <w:b/>
       <w:bCs/>
       <w:i/>
@@ -3292,7 +3292,7 @@
     <w:name w:val="MSG_EN_FONT_STYLE_NAME_TEMPLATE_ROLE_NUMBER MSG_EN_FONT_STYLE_NAME_BY_ROLE_TEXT 3 + MSG_EN_FONT_STYLE_MODIFER_SIZE 5"/>
     <w:qFormat/>
     <w:rPr>
-      <w:rFonts w:ascii="Tahoma" w:hAnsi="Tahoma"/>
+      <w:rFonts w:ascii="Arial" w:hAnsi="Arial" w:cs="Arial"/>
       <w:b w:val="0"/>
       <w:bCs w:val="0"/>
       <w:i w:val="0"/>
@@ -3306,7 +3306,7 @@
     <w:name w:val="MSG_EN_FONT_STYLE_NAME_TEMPLATE_ROLE MSG_EN_FONT_STYLE_NAME_BY_ROLE_PICTURE_CAPTION_"/>
     <w:qFormat/>
     <w:rPr>
-      <w:rFonts w:ascii="Tahoma" w:hAnsi="Tahoma"/>
+      <w:rFonts w:ascii="Arial" w:hAnsi="Arial" w:cs="Arial"/>
       <w:sz w:val="21"/>
       <w:szCs w:val="21"/>
       <w:shd w:val="clear" w:color="auto" w:fill="FFFFFF"/>
@@ -3316,7 +3316,7 @@
     <w:name w:val="MSG_EN_FONT_STYLE_NAME_TEMPLATE_ROLE MSG_EN_FONT_STYLE_NAME_BY_ROLE_PICTURE_CAPTION"/>
     <w:qFormat/>
     <w:rPr>
-      <w:rFonts w:ascii="Tahoma" w:hAnsi="Tahoma"/>
+      <w:rFonts w:ascii="Arial" w:hAnsi="Arial" w:cs="Arial"/>
       <w:sz w:val="21"/>
       <w:szCs w:val="21"/>
       <w:u w:val="single"/>
@@ -3327,7 +3327,7 @@
     <w:name w:val="Balloon Text Char"/>
     <w:qFormat/>
     <w:rPr>
-      <w:rFonts w:ascii="Tahoma" w:hAnsi="Tahoma"/>
+      <w:rFonts w:ascii="Tahoma" w:eastAsia="Times New Roman" w:hAnsi="Tahoma" w:cs="Tahoma"/>
       <w:color w:val="000000"/>
       <w:sz w:val="16"/>
       <w:szCs w:val="16"/>
@@ -3338,7 +3338,7 @@
     <w:name w:val="Header Char"/>
     <w:qFormat/>
     <w:rPr>
-      <w:rFonts w:ascii="Tahoma" w:hAnsi="Tahoma"/>
+      <w:rFonts w:ascii="Times New Roman" w:eastAsia="Times New Roman" w:hAnsi="Times New Roman" w:cs="Times New Roman"/>
       <w:color w:val="000000"/>
       <w:sz w:val="24"/>
       <w:szCs w:val="24"/>
@@ -3349,7 +3349,7 @@
     <w:name w:val="Footer Char"/>
     <w:qFormat/>
     <w:rPr>
-      <w:rFonts w:ascii="Tahoma" w:hAnsi="Tahoma"/>
+      <w:rFonts w:ascii="Times New Roman" w:eastAsia="Times New Roman" w:hAnsi="Times New Roman" w:cs="Times New Roman"/>
       <w:color w:val="000000"/>
       <w:sz w:val="24"/>
       <w:szCs w:val="24"/>
@@ -3366,7 +3366,7 @@
       <w:spacing w:before="240" w:after="120"/>
     </w:pPr>
     <w:rPr>
-      <w:rFonts w:ascii="Tahoma" w:hAnsi="Tahoma"/>
+      <w:rFonts w:ascii="Liberation Sans" w:eastAsia="Noto Sans CJK SC" w:hAnsi="Liberation Sans" w:cs="FreeSans"/>
       <w:sz w:val="28"/>
       <w:szCs w:val="28"/>
     </w:rPr>
@@ -3382,7 +3382,7 @@
     <w:name w:val="List"/>
     <w:basedOn w:val="BodyText"/>
     <w:rPr>
-      <w:rFonts w:ascii="Tahoma" w:hAnsi="Tahoma"/>
+      <w:rFonts w:cs="FreeSans"/>
     </w:rPr>
   </w:style>
   <w:style w:type="paragraph" w:styleId="Caption">
@@ -3394,7 +3394,7 @@
       <w:spacing w:before="120" w:after="120"/>
     </w:pPr>
     <w:rPr>
-      <w:rFonts w:ascii="Tahoma" w:hAnsi="Tahoma"/>
+      <w:rFonts w:cs="FreeSans"/>
       <w:i/>
       <w:iCs/>
     </w:rPr>
@@ -3407,7 +3407,7 @@
       <w:suppressLineNumbers/>
     </w:pPr>
     <w:rPr>
-      <w:rFonts w:ascii="Tahoma" w:hAnsi="Tahoma"/>
+      <w:rFonts w:cs="FreeSans"/>
     </w:rPr>
   </w:style>
   <w:style w:type="paragraph" w:customStyle="1" w:styleId="MSGENFONTSTYLENAMETEMPLATEROLENUMBERMSGENFONTSTYLENAMEBYROLETEXT20">
@@ -3420,7 +3420,7 @@
       <w:jc w:val="center"/>
     </w:pPr>
     <w:rPr>
-      <w:rFonts w:ascii="Tahoma" w:hAnsi="Tahoma"/>
+      <w:rFonts w:ascii="Arial" w:eastAsia="Calibri" w:hAnsi="Arial" w:cs="Arial"/>
       <w:sz w:val="21"/>
       <w:szCs w:val="21"/>
       <w:lang w:val="id-ID"/>
@@ -3436,7 +3436,7 @@
       <w:jc w:val="both"/>
     </w:pPr>
     <w:rPr>
-      <w:rFonts w:ascii="Tahoma" w:hAnsi="Tahoma"/>
+      <w:rFonts w:ascii="Arial" w:eastAsia="Calibri" w:hAnsi="Arial" w:cs="Arial"/>
       <w:b/>
       <w:bCs/>
       <w:i/>
@@ -3455,7 +3455,7 @@
       <w:spacing w:line="278" w:lineRule="exact"/>
     </w:pPr>
     <w:rPr>
-      <w:rFonts w:ascii="Tahoma" w:hAnsi="Tahoma"/>
+      <w:rFonts w:ascii="Arial" w:eastAsia="Calibri" w:hAnsi="Arial" w:cs="Arial"/>
       <w:sz w:val="21"/>
       <w:szCs w:val="21"/>
       <w:lang w:val="id-ID"/>
@@ -3466,7 +3466,7 @@
     <w:basedOn w:val="Normal"/>
     <w:qFormat/>
     <w:rPr>
-      <w:rFonts w:ascii="Tahoma" w:hAnsi="Tahoma"/>
+      <w:rFonts w:ascii="Tahoma" w:hAnsi="Tahoma" w:cs="Tahoma"/>
       <w:sz w:val="16"/>
       <w:szCs w:val="16"/>
     </w:rPr>

</xml_diff>

<commit_message>
feat: pasang font Tahoma di Gotenberg dan seragamkan font template
Akar masalah 'output bukan Tahoma': font Tahoma tidak ada di image
Gotenberg (349 font terpasang, tak satu pun Tahoma), sehingga LibreOffice
mensubstitusi diam-diam. Template sendiri sudah menulis Tahoma sejak awal.

- Dockerfile.gotenberg: pasang tahoma.ttf + tahomabd.ttf, mengikuti pola
  yang sudah dipakai untuk Bookman Old Style
- scripts/set-template-font.mjs: samakan sisa font di styles.xml
  (Liberation Serif/Sans) dan Arial di document.xml Katolik. Memakai DOM
  parser, bukan regex, dan membuang atribut *Theme yang menimpa atribut
  font eksplisit
- .gitignore: abaikan file lock MS Office (~). File ~$Islam.docx sempat
  ikut ter-commit dan lock aktif inilah yang merusak Islam.docx kemarin

Terverifikasi kelima template: HTTP 200, 1 halaman, hanya Tahoma/Tahoma-Bold
tertanam di PDF, placeholder utuh.

Co-Authored-By: Claude Opus 4.8 <noreply@anthropic.com>
</commit_message>
<xml_diff>
--- a/templates/CEK/Budha.docx
+++ b/templates/CEK/Budha.docx
@@ -10,7 +10,7 @@
         <w:ind w:left="60"/>
         <w:rPr>
           <w:rStyle w:val="MSGENFONTSTYLENAMETEMPLATEROLENUMBERMSGENFONTSTYLENAMEBYROLETEXT2"/>
-          <w:rFonts w:ascii="Tahoma" w:hAnsi="Tahoma" w:cs="Tahoma"/>
+          <w:rFonts w:ascii="Tahoma" w:hAnsi="Tahoma" w:cs="Tahoma" w:eastAsia="Tahoma"/>
           <w:b/>
           <w:sz w:val="24"/>
           <w:szCs w:val="24"/>
@@ -54,14 +54,14 @@
         <w:spacing w:before="0" w:line="360" w:lineRule="auto"/>
         <w:ind w:left="60"/>
         <w:rPr>
-          <w:rFonts w:ascii="Tahoma" w:hAnsi="Tahoma" w:cs="Tahoma"/>
+          <w:rFonts w:ascii="Tahoma" w:hAnsi="Tahoma" w:cs="Tahoma" w:eastAsia="Tahoma"/>
           <w:b/>
         </w:rPr>
       </w:pPr>
       <w:r>
         <w:rPr>
           <w:rStyle w:val="MSGENFONTSTYLENAMETEMPLATEROLENUMBERMSGENFONTSTYLENAMEBYROLETEXT2"/>
-          <w:rFonts w:ascii="Tahoma" w:hAnsi="Tahoma" w:cs="Tahoma"/>
+          <w:rFonts w:ascii="Tahoma" w:hAnsi="Tahoma" w:cs="Tahoma" w:eastAsia="Tahoma"/>
           <w:b/>
           <w:lang w:val="en-US"/>
         </w:rPr>
@@ -70,7 +70,7 @@
       <w:r>
         <w:rPr>
           <w:rStyle w:val="MSGENFONTSTYLENAMETEMPLATEROLENUMBERMSGENFONTSTYLENAMEBYROLETEXT2"/>
-          <w:rFonts w:ascii="Tahoma" w:hAnsi="Tahoma" w:cs="Tahoma"/>
+          <w:rFonts w:ascii="Tahoma" w:hAnsi="Tahoma" w:cs="Tahoma" w:eastAsia="Tahoma"/>
           <w:b/>
         </w:rPr>
         <w:t>ERITA ACARA</w:t>
@@ -84,14 +84,14 @@
         <w:ind w:left="60"/>
         <w:rPr>
           <w:rStyle w:val="MSGENFONTSTYLENAMETEMPLATEROLENUMBERMSGENFONTSTYLENAMEBYROLETEXT2"/>
-          <w:rFonts w:ascii="Tahoma" w:hAnsi="Tahoma" w:cs="Tahoma"/>
+          <w:rFonts w:ascii="Tahoma" w:hAnsi="Tahoma" w:cs="Tahoma" w:eastAsia="Tahoma"/>
           <w:lang w:val="en-US"/>
         </w:rPr>
       </w:pPr>
       <w:r>
         <w:rPr>
           <w:rStyle w:val="MSGENFONTSTYLENAMETEMPLATEROLENUMBERMSGENFONTSTYLENAMEBYROLETEXT2"/>
-          <w:rFonts w:ascii="Tahoma" w:hAnsi="Tahoma" w:cs="Tahoma"/>
+          <w:rFonts w:ascii="Tahoma" w:hAnsi="Tahoma" w:cs="Tahoma" w:eastAsia="Tahoma"/>
           <w:b/>
         </w:rPr>
         <w:t>PENGAMBILAN SUMPAH PEGAWAI NEGERI SIPIL</w:t>
@@ -99,7 +99,7 @@
       <w:r>
         <w:rPr>
           <w:rStyle w:val="MSGENFONTSTYLENAMETEMPLATEROLENUMBERMSGENFONTSTYLENAMEBYROLETEXT2"/>
-          <w:rFonts w:ascii="Tahoma" w:hAnsi="Tahoma" w:cs="Tahoma"/>
+          <w:rFonts w:ascii="Tahoma" w:hAnsi="Tahoma" w:cs="Tahoma" w:eastAsia="Tahoma"/>
         </w:rPr>
         <w:br/>
         <w:t>NOMOR : 8</w:t>
@@ -107,7 +107,7 @@
       <w:r>
         <w:rPr>
           <w:rStyle w:val="MSGENFONTSTYLENAMETEMPLATEROLENUMBERMSGENFONTSTYLENAMEBYROLETEXT2"/>
-          <w:rFonts w:ascii="Tahoma" w:hAnsi="Tahoma" w:cs="Tahoma"/>
+          <w:rFonts w:ascii="Tahoma" w:hAnsi="Tahoma" w:cs="Tahoma" w:eastAsia="Tahoma"/>
           <w:lang w:val="en-US"/>
         </w:rPr>
         <w:t>77</w:t>
@@ -115,14 +115,14 @@
       <w:r>
         <w:rPr>
           <w:rStyle w:val="MSGENFONTSTYLENAMETEMPLATEROLENUMBERMSGENFONTSTYLENAMEBYROLETEXT2"/>
-          <w:rFonts w:ascii="Tahoma" w:hAnsi="Tahoma" w:cs="Tahoma"/>
+          <w:rFonts w:ascii="Tahoma" w:hAnsi="Tahoma" w:cs="Tahoma" w:eastAsia="Tahoma"/>
         </w:rPr>
         <w:t>/</w:t>
       </w:r>
       <w:r>
         <w:rPr>
           <w:rStyle w:val="MSGENFONTSTYLENAMETEMPLATEROLENUMBERMSGENFONTSTYLENAMEBYROLETEXT2"/>
-          <w:rFonts w:ascii="Tahoma" w:hAnsi="Tahoma" w:cs="Tahoma"/>
+          <w:rFonts w:ascii="Tahoma" w:hAnsi="Tahoma" w:cs="Tahoma" w:eastAsia="Tahoma"/>
           <w:lang w:val="en-US"/>
         </w:rPr>
         <w:t xml:space="preserve">           </w:t>
@@ -130,14 +130,14 @@
       <w:r>
         <w:rPr>
           <w:rStyle w:val="MSGENFONTSTYLENAMETEMPLATEROLENUMBERMSGENFONTSTYLENAMEBYROLETEXT2"/>
-          <w:rFonts w:ascii="Tahoma" w:hAnsi="Tahoma" w:cs="Tahoma"/>
+          <w:rFonts w:ascii="Tahoma" w:hAnsi="Tahoma" w:cs="Tahoma" w:eastAsia="Tahoma"/>
         </w:rPr>
         <w:t>/204.3/202</w:t>
       </w:r>
       <w:r>
         <w:rPr>
           <w:rStyle w:val="MSGENFONTSTYLENAMETEMPLATEROLENUMBERMSGENFONTSTYLENAMEBYROLETEXT2"/>
-          <w:rFonts w:ascii="Tahoma" w:hAnsi="Tahoma" w:cs="Tahoma"/>
+          <w:rFonts w:ascii="Tahoma" w:hAnsi="Tahoma" w:cs="Tahoma" w:eastAsia="Tahoma"/>
           <w:lang w:val="en-US"/>
         </w:rPr>
         <w:t>6</w:t>
@@ -151,7 +151,7 @@
         <w:ind w:left="60"/>
         <w:rPr>
           <w:rStyle w:val="MSGENFONTSTYLENAMETEMPLATEROLENUMBERMSGENFONTSTYLENAMEBYROLETEXT2"/>
-          <w:rFonts w:ascii="Tahoma" w:hAnsi="Tahoma" w:cs="Tahoma"/>
+          <w:rFonts w:ascii="Tahoma" w:hAnsi="Tahoma" w:cs="Tahoma" w:eastAsia="Tahoma"/>
           <w:lang w:val="en-US"/>
         </w:rPr>
       </w:pPr>
@@ -168,7 +168,7 @@
         <w:jc w:val="both"/>
         <w:rPr>
           <w:rStyle w:val="MSGENFONTSTYLENAMETEMPLATEROLENUMBERMSGENFONTSTYLENAMEBYROLETEXT2"/>
-          <w:rFonts w:ascii="Tahoma" w:hAnsi="Tahoma" w:cs="Tahoma"/>
+          <w:rFonts w:ascii="Tahoma" w:hAnsi="Tahoma" w:cs="Tahoma" w:eastAsia="Tahoma"/>
           <w:sz w:val="22"/>
           <w:szCs w:val="22"/>
           <w:lang w:val="en-US"/>
@@ -178,7 +178,7 @@
       <w:r>
         <w:rPr>
           <w:rStyle w:val="MSGENFONTSTYLENAMETEMPLATEROLENUMBERMSGENFONTSTYLENAMEBYROLETEXT2"/>
-          <w:rFonts w:ascii="Tahoma" w:hAnsi="Tahoma" w:cs="Tahoma"/>
+          <w:rFonts w:ascii="Tahoma" w:hAnsi="Tahoma" w:cs="Tahoma" w:eastAsia="Tahoma"/>
           <w:sz w:val="22"/>
           <w:szCs w:val="22"/>
         </w:rPr>
@@ -187,7 +187,7 @@
       <w:r>
         <w:rPr>
           <w:rStyle w:val="MSGENFONTSTYLENAMETEMPLATEROLENUMBERMSGENFONTSTYLENAMEBYROLETEXT2"/>
-          <w:rFonts w:ascii="Tahoma" w:hAnsi="Tahoma" w:cs="Tahoma"/>
+          <w:rFonts w:ascii="Tahoma" w:hAnsi="Tahoma" w:cs="Tahoma" w:eastAsia="Tahoma"/>
           <w:sz w:val="22"/>
           <w:szCs w:val="22"/>
           <w:lang w:val="en-AU"/>
@@ -197,7 +197,7 @@
       <w:r>
         <w:rPr>
           <w:rStyle w:val="MSGENFONTSTYLENAMETEMPLATEROLENUMBERMSGENFONTSTYLENAMEBYROLETEXT2"/>
-          <w:rFonts w:ascii="Tahoma" w:hAnsi="Tahoma" w:cs="Tahoma"/>
+          <w:rFonts w:ascii="Tahoma" w:hAnsi="Tahoma" w:cs="Tahoma" w:eastAsia="Tahoma"/>
           <w:sz w:val="22"/>
           <w:szCs w:val="22"/>
         </w:rPr>
@@ -206,7 +206,7 @@
       <w:r>
         <w:rPr>
           <w:rStyle w:val="MSGENFONTSTYLENAMETEMPLATEROLENUMBERMSGENFONTSTYLENAMEBYROLETEXT2"/>
-          <w:rFonts w:ascii="Tahoma" w:hAnsi="Tahoma" w:cs="Tahoma"/>
+          <w:rFonts w:ascii="Tahoma" w:hAnsi="Tahoma" w:cs="Tahoma" w:eastAsia="Tahoma"/>
           <w:sz w:val="22"/>
           <w:szCs w:val="22"/>
           <w:lang w:val="en-GB"/>
@@ -216,7 +216,7 @@
       <w:r>
         <w:rPr>
           <w:rStyle w:val="MSGENFONTSTYLENAMETEMPLATEROLENUMBERMSGENFONTSTYLENAMEBYROLETEXT2"/>
-          <w:rFonts w:ascii="Tahoma" w:hAnsi="Tahoma" w:cs="Tahoma"/>
+          <w:rFonts w:ascii="Tahoma" w:hAnsi="Tahoma" w:cs="Tahoma" w:eastAsia="Tahoma"/>
           <w:sz w:val="22"/>
           <w:szCs w:val="22"/>
         </w:rPr>
@@ -225,7 +225,7 @@
       <w:r>
         <w:rPr>
           <w:rStyle w:val="MSGENFONTSTYLENAMETEMPLATEROLENUMBERMSGENFONTSTYLENAMEBYROLETEXT2"/>
-          <w:rFonts w:ascii="Tahoma" w:hAnsi="Tahoma" w:cs="Tahoma"/>
+          <w:rFonts w:ascii="Tahoma" w:hAnsi="Tahoma" w:cs="Tahoma" w:eastAsia="Tahoma"/>
           <w:sz w:val="22"/>
           <w:szCs w:val="22"/>
           <w:lang w:val="en-GB"/>
@@ -235,7 +235,7 @@
       <w:r>
         <w:rPr>
           <w:rStyle w:val="MSGENFONTSTYLENAMETEMPLATEROLENUMBERMSGENFONTSTYLENAMEBYROLETEXT2"/>
-          <w:rFonts w:ascii="Tahoma" w:hAnsi="Tahoma" w:cs="Tahoma"/>
+          <w:rFonts w:ascii="Tahoma" w:hAnsi="Tahoma" w:cs="Tahoma" w:eastAsia="Tahoma"/>
           <w:sz w:val="22"/>
           <w:szCs w:val="22"/>
         </w:rPr>
@@ -244,7 +244,7 @@
       <w:r>
         <w:rPr>
           <w:rStyle w:val="MSGENFONTSTYLENAMETEMPLATEROLENUMBERMSGENFONTSTYLENAMEBYROLETEXT2"/>
-          <w:rFonts w:ascii="Tahoma" w:hAnsi="Tahoma" w:cs="Tahoma"/>
+          <w:rFonts w:ascii="Tahoma" w:hAnsi="Tahoma" w:cs="Tahoma" w:eastAsia="Tahoma"/>
           <w:sz w:val="22"/>
           <w:szCs w:val="22"/>
           <w:lang w:val="en-GB"/>
@@ -254,7 +254,7 @@
       <w:r>
         <w:rPr>
           <w:rStyle w:val="MSGENFONTSTYLENAMETEMPLATEROLENUMBERMSGENFONTSTYLENAMEBYROLETEXT2"/>
-          <w:rFonts w:ascii="Tahoma" w:hAnsi="Tahoma" w:cs="Tahoma"/>
+          <w:rFonts w:ascii="Tahoma" w:hAnsi="Tahoma" w:cs="Tahoma" w:eastAsia="Tahoma"/>
           <w:sz w:val="22"/>
           <w:szCs w:val="22"/>
         </w:rPr>
@@ -263,7 +263,7 @@
       <w:r>
         <w:rPr>
           <w:rStyle w:val="MSGENFONTSTYLENAMETEMPLATEROLENUMBERMSGENFONTSTYLENAMEBYROLETEXT2"/>
-          <w:rFonts w:ascii="Tahoma" w:hAnsi="Tahoma" w:cs="Tahoma"/>
+          <w:rFonts w:ascii="Tahoma" w:hAnsi="Tahoma" w:cs="Tahoma" w:eastAsia="Tahoma"/>
           <w:sz w:val="22"/>
           <w:szCs w:val="22"/>
           <w:lang w:val="en-US"/>
@@ -273,7 +273,7 @@
       <w:r>
         <w:rPr>
           <w:rStyle w:val="MSGENFONTSTYLENAMETEMPLATEROLENUMBERMSGENFONTSTYLENAMEBYROLETEXT2"/>
-          <w:rFonts w:ascii="Tahoma" w:hAnsi="Tahoma" w:cs="Tahoma"/>
+          <w:rFonts w:ascii="Tahoma" w:hAnsi="Tahoma" w:cs="Tahoma" w:eastAsia="Tahoma"/>
           <w:sz w:val="22"/>
           <w:szCs w:val="22"/>
         </w:rPr>
@@ -282,7 +282,7 @@
       <w:r>
         <w:rPr>
           <w:rStyle w:val="MSGENFONTSTYLENAMETEMPLATEROLENUMBERMSGENFONTSTYLENAMEBYROLETEXT2"/>
-          <w:rFonts w:ascii="Tahoma" w:hAnsi="Tahoma" w:cs="Tahoma"/>
+          <w:rFonts w:ascii="Tahoma" w:hAnsi="Tahoma" w:cs="Tahoma" w:eastAsia="Tahoma"/>
           <w:sz w:val="22"/>
           <w:szCs w:val="22"/>
           <w:lang w:val="en-US"/>
@@ -295,7 +295,7 @@
       <w:r>
         <w:rPr>
           <w:rStyle w:val="MSGENFONTSTYLENAMETEMPLATEROLENUMBERMSGENFONTSTYLENAMEBYROLETEXT2"/>
-          <w:rFonts w:ascii="Tahoma" w:hAnsi="Tahoma" w:cs="Tahoma"/>
+          <w:rFonts w:ascii="Tahoma" w:hAnsi="Tahoma" w:cs="Tahoma" w:eastAsia="Tahoma"/>
           <w:sz w:val="22"/>
           <w:szCs w:val="22"/>
         </w:rPr>
@@ -304,7 +304,7 @@
       <w:r>
         <w:rPr>
           <w:rStyle w:val="MSGENFONTSTYLENAMETEMPLATEROLENUMBERMSGENFONTSTYLENAMEBYROLETEXT2"/>
-          <w:rFonts w:ascii="Tahoma" w:hAnsi="Tahoma" w:cs="Tahoma"/>
+          <w:rFonts w:ascii="Tahoma" w:hAnsi="Tahoma" w:cs="Tahoma" w:eastAsia="Tahoma"/>
           <w:sz w:val="22"/>
           <w:szCs w:val="22"/>
           <w:lang w:val="en-US"/>
@@ -313,7 +313,7 @@
       </w:r>
       <w:r>
         <w:rPr>
-          <w:rFonts w:ascii="Tahoma" w:hAnsi="Tahoma" w:cs="Tahoma"/>
+          <w:rFonts w:ascii="Tahoma" w:hAnsi="Tahoma" w:cs="Tahoma" w:eastAsia="Tahoma"/>
           <w:sz w:val="22"/>
           <w:szCs w:val="22"/>
           <w:shd w:val="clear" w:color="auto" w:fill="FFFFFF"/>
@@ -325,7 +325,7 @@
       <w:r>
         <w:rPr>
           <w:rStyle w:val="MSGENFONTSTYLENAMETEMPLATEROLENUMBERMSGENFONTSTYLENAMEBYROLETEXT2"/>
-          <w:rFonts w:ascii="Tahoma" w:hAnsi="Tahoma" w:cs="Tahoma"/>
+          <w:rFonts w:ascii="Tahoma" w:hAnsi="Tahoma" w:cs="Tahoma" w:eastAsia="Tahoma"/>
           <w:sz w:val="22"/>
           <w:szCs w:val="22"/>
         </w:rPr>
@@ -334,7 +334,7 @@
       <w:r>
         <w:rPr>
           <w:rStyle w:val="MSGENFONTSTYLENAMETEMPLATEROLENUMBERMSGENFONTSTYLENAMEBYROLETEXT2"/>
-          <w:rFonts w:ascii="Tahoma" w:hAnsi="Tahoma" w:cs="Tahoma"/>
+          <w:rFonts w:ascii="Tahoma" w:hAnsi="Tahoma" w:cs="Tahoma" w:eastAsia="Tahoma"/>
           <w:sz w:val="22"/>
           <w:szCs w:val="22"/>
           <w:lang w:val="en-US"/>
@@ -344,7 +344,7 @@
       <w:r>
         <w:rPr>
           <w:rStyle w:val="MSGENFONTSTYLENAMETEMPLATEROLENUMBERMSGENFONTSTYLENAMEBYROLETEXT2"/>
-          <w:rFonts w:ascii="Tahoma" w:hAnsi="Tahoma" w:cs="Tahoma"/>
+          <w:rFonts w:ascii="Tahoma" w:hAnsi="Tahoma" w:cs="Tahoma" w:eastAsia="Tahoma"/>
           <w:sz w:val="22"/>
           <w:szCs w:val="22"/>
         </w:rPr>
@@ -353,7 +353,7 @@
       <w:r>
         <w:rPr>
           <w:rStyle w:val="MSGENFONTSTYLENAMETEMPLATEROLENUMBERMSGENFONTSTYLENAMEBYROLETEXT2"/>
-          <w:rFonts w:ascii="Tahoma" w:hAnsi="Tahoma" w:cs="Tahoma"/>
+          <w:rFonts w:ascii="Tahoma" w:hAnsi="Tahoma" w:cs="Tahoma" w:eastAsia="Tahoma"/>
           <w:sz w:val="22"/>
           <w:szCs w:val="22"/>
           <w:lang w:val="en-US"/>
@@ -363,7 +363,7 @@
       <w:r>
         <w:rPr>
           <w:rStyle w:val="MSGENFONTSTYLENAMETEMPLATEROLENUMBERMSGENFONTSTYLENAMEBYROLETEXT2"/>
-          <w:rFonts w:ascii="Tahoma" w:hAnsi="Tahoma" w:cs="Tahoma"/>
+          <w:rFonts w:ascii="Tahoma" w:hAnsi="Tahoma" w:cs="Tahoma" w:eastAsia="Tahoma"/>
           <w:sz w:val="22"/>
           <w:szCs w:val="22"/>
         </w:rPr>
@@ -372,7 +372,7 @@
       <w:r>
         <w:rPr>
           <w:rStyle w:val="MSGENFONTSTYLENAMETEMPLATEROLENUMBERMSGENFONTSTYLENAMEBYROLETEXT2"/>
-          <w:rFonts w:ascii="Tahoma" w:hAnsi="Tahoma" w:cs="Tahoma"/>
+          <w:rFonts w:ascii="Tahoma" w:hAnsi="Tahoma" w:cs="Tahoma" w:eastAsia="Tahoma"/>
           <w:sz w:val="22"/>
           <w:szCs w:val="22"/>
           <w:lang w:val="en-US"/>
@@ -382,7 +382,7 @@
       <w:r>
         <w:rPr>
           <w:rStyle w:val="MSGENFONTSTYLENAMETEMPLATEROLENUMBERMSGENFONTSTYLENAMEBYROLETEXT2"/>
-          <w:rFonts w:ascii="Tahoma" w:hAnsi="Tahoma" w:cs="Tahoma"/>
+          <w:rFonts w:ascii="Tahoma" w:hAnsi="Tahoma" w:cs="Tahoma" w:eastAsia="Tahoma"/>
           <w:sz w:val="22"/>
           <w:szCs w:val="22"/>
         </w:rPr>
@@ -391,7 +391,7 @@
       <w:r>
         <w:rPr>
           <w:rStyle w:val="MSGENFONTSTYLENAMETEMPLATEROLENUMBERMSGENFONTSTYLENAMEBYROLETEXT2"/>
-          <w:rFonts w:ascii="Tahoma" w:hAnsi="Tahoma" w:cs="Tahoma"/>
+          <w:rFonts w:ascii="Tahoma" w:hAnsi="Tahoma" w:cs="Tahoma" w:eastAsia="Tahoma"/>
           <w:sz w:val="22"/>
           <w:szCs w:val="22"/>
           <w:lang w:val="en-US"/>
@@ -401,7 +401,7 @@
       <w:r>
         <w:rPr>
           <w:rStyle w:val="MSGENFONTSTYLENAMETEMPLATEROLENUMBERMSGENFONTSTYLENAMEBYROLETEXT2"/>
-          <w:rFonts w:ascii="Tahoma" w:hAnsi="Tahoma" w:cs="Tahoma"/>
+          <w:rFonts w:ascii="Tahoma" w:hAnsi="Tahoma" w:cs="Tahoma" w:eastAsia="Tahoma"/>
           <w:sz w:val="22"/>
           <w:szCs w:val="22"/>
         </w:rPr>
@@ -422,14 +422,14 @@
         <w:ind w:left="142" w:right="46"/>
         <w:jc w:val="both"/>
         <w:rPr>
-          <w:rFonts w:ascii="Tahoma" w:hAnsi="Tahoma" w:cs="Tahoma"/>
+          <w:rFonts w:ascii="Tahoma" w:hAnsi="Tahoma" w:cs="Tahoma" w:eastAsia="Tahoma"/>
           <w:sz w:val="22"/>
           <w:szCs w:val="22"/>
         </w:rPr>
       </w:pPr>
       <w:r>
         <w:rPr>
-          <w:rFonts w:ascii="Tahoma" w:hAnsi="Tahoma" w:cs="Tahoma"/>
+          <w:rFonts w:ascii="Tahoma" w:hAnsi="Tahoma" w:cs="Tahoma" w:eastAsia="Tahoma"/>
           <w:sz w:val="22"/>
           <w:szCs w:val="22"/>
           <w:lang w:val="en-US"/>
@@ -438,7 +438,7 @@
       </w:r>
       <w:r>
         <w:rPr>
-          <w:rFonts w:ascii="Tahoma" w:hAnsi="Tahoma" w:cs="Tahoma"/>
+          <w:rFonts w:ascii="Tahoma" w:hAnsi="Tahoma" w:cs="Tahoma" w:eastAsia="Tahoma"/>
           <w:sz w:val="22"/>
           <w:szCs w:val="22"/>
           <w:shd w:val="clear" w:color="auto" w:fill="FFFFFF"/>
@@ -449,7 +449,7 @@
       <w:r>
         <w:rPr>
           <w:rStyle w:val="MSGENFONTSTYLENAMETEMPLATEROLENUMBERMSGENFONTSTYLENAMEBYROLETEXT2"/>
-          <w:rFonts w:ascii="Tahoma" w:hAnsi="Tahoma" w:cs="Tahoma"/>
+          <w:rFonts w:ascii="Tahoma" w:hAnsi="Tahoma" w:cs="Tahoma" w:eastAsia="Tahoma"/>
           <w:sz w:val="22"/>
           <w:szCs w:val="22"/>
         </w:rPr>
@@ -458,7 +458,7 @@
       <w:r>
         <w:rPr>
           <w:rStyle w:val="MSGENFONTSTYLENAMETEMPLATEROLENUMBERMSGENFONTSTYLENAMEBYROLETEXT2"/>
-          <w:rFonts w:ascii="Tahoma" w:hAnsi="Tahoma" w:cs="Tahoma"/>
+          <w:rFonts w:ascii="Tahoma" w:hAnsi="Tahoma" w:cs="Tahoma" w:eastAsia="Tahoma"/>
           <w:sz w:val="22"/>
           <w:szCs w:val="22"/>
           <w:lang w:val="en-US"/>
@@ -467,7 +467,7 @@
       </w:r>
       <w:r>
         <w:rPr>
-          <w:rFonts w:ascii="Tahoma" w:hAnsi="Tahoma" w:cs="Tahoma"/>
+          <w:rFonts w:ascii="Tahoma" w:hAnsi="Tahoma" w:cs="Tahoma" w:eastAsia="Tahoma"/>
           <w:sz w:val="22"/>
           <w:szCs w:val="22"/>
           <w:shd w:val="clear" w:color="auto" w:fill="FFFFFF"/>
@@ -477,7 +477,7 @@
       </w:r>
       <w:r>
         <w:rPr>
-          <w:rFonts w:ascii="Tahoma" w:hAnsi="Tahoma" w:cs="Tahoma"/>
+          <w:rFonts w:ascii="Tahoma" w:hAnsi="Tahoma" w:cs="Tahoma" w:eastAsia="Tahoma"/>
           <w:sz w:val="22"/>
           <w:szCs w:val="22"/>
           <w:shd w:val="clear" w:color="auto" w:fill="FFFFFF"/>
@@ -488,7 +488,7 @@
       <w:r>
         <w:rPr>
           <w:rStyle w:val="MSGENFONTSTYLENAMETEMPLATEROLENUMBERMSGENFONTSTYLENAMEBYROLETEXT2"/>
-          <w:rFonts w:ascii="Tahoma" w:hAnsi="Tahoma" w:cs="Tahoma"/>
+          <w:rFonts w:ascii="Tahoma" w:hAnsi="Tahoma" w:cs="Tahoma" w:eastAsia="Tahoma"/>
           <w:sz w:val="22"/>
           <w:szCs w:val="22"/>
         </w:rPr>
@@ -497,7 +497,7 @@
       <w:r>
         <w:rPr>
           <w:rStyle w:val="MSGENFONTSTYLENAMETEMPLATEROLENUMBERMSGENFONTSTYLENAMEBYROLETEXT2"/>
-          <w:rFonts w:ascii="Tahoma" w:hAnsi="Tahoma" w:cs="Tahoma"/>
+          <w:rFonts w:ascii="Tahoma" w:hAnsi="Tahoma" w:cs="Tahoma" w:eastAsia="Tahoma"/>
           <w:sz w:val="22"/>
           <w:szCs w:val="22"/>
           <w:lang w:val="en-US"/>
@@ -507,7 +507,7 @@
       <w:r>
         <w:rPr>
           <w:rStyle w:val="MSGENFONTSTYLENAMETEMPLATEROLENUMBERMSGENFONTSTYLENAMEBYROLETEXT2"/>
-          <w:rFonts w:ascii="Tahoma" w:hAnsi="Tahoma" w:cs="Tahoma"/>
+          <w:rFonts w:ascii="Tahoma" w:hAnsi="Tahoma" w:cs="Tahoma" w:eastAsia="Tahoma"/>
           <w:sz w:val="22"/>
           <w:szCs w:val="22"/>
         </w:rPr>
@@ -515,7 +515,7 @@
       </w:r>
       <w:r>
         <w:rPr>
-          <w:rFonts w:ascii="Tahoma" w:hAnsi="Tahoma" w:cs="Tahoma"/>
+          <w:rFonts w:ascii="Tahoma" w:hAnsi="Tahoma" w:cs="Tahoma" w:eastAsia="Tahoma"/>
           <w:sz w:val="22"/>
           <w:szCs w:val="22"/>
           <w:shd w:val="clear" w:color="auto" w:fill="FFFFFF"/>
@@ -538,7 +538,7 @@
         <w:ind w:left="142" w:right="45"/>
         <w:jc w:val="both"/>
         <w:rPr>
-          <w:rFonts w:ascii="Tahoma" w:hAnsi="Tahoma" w:cs="Tahoma"/>
+          <w:rFonts w:ascii="Tahoma" w:hAnsi="Tahoma" w:cs="Tahoma" w:eastAsia="Tahoma"/>
           <w:sz w:val="22"/>
           <w:szCs w:val="22"/>
           <w:lang w:val="en-US"/>
@@ -546,7 +546,7 @@
       </w:pPr>
       <w:r>
         <w:rPr>
-          <w:rFonts w:ascii="Tahoma" w:hAnsi="Tahoma" w:cs="Tahoma"/>
+          <w:rFonts w:ascii="Tahoma" w:hAnsi="Tahoma" w:cs="Tahoma" w:eastAsia="Tahoma"/>
           <w:sz w:val="22"/>
           <w:szCs w:val="22"/>
           <w:lang w:val="en-US"/>
@@ -563,7 +563,7 @@
       <w:r>
         <w:rPr>
           <w:rStyle w:val="MSGENFONTSTYLENAMETEMPLATEROLENUMBERMSGENFONTSTYLENAMEBYROLETEXT2"/>
-          <w:rFonts w:ascii="Tahoma" w:hAnsi="Tahoma" w:cs="Tahoma"/>
+          <w:rFonts w:ascii="Tahoma" w:hAnsi="Tahoma" w:cs="Tahoma" w:eastAsia="Tahoma"/>
           <w:sz w:val="22"/>
           <w:szCs w:val="22"/>
           <w:lang w:val="en-US"/>
@@ -573,7 +573,7 @@
       <w:r>
         <w:rPr>
           <w:rStyle w:val="MSGENFONTSTYLENAMETEMPLATEROLENUMBERMSGENFONTSTYLENAMEBYROLETEXT2"/>
-          <w:rFonts w:ascii="Tahoma" w:hAnsi="Tahoma" w:cs="Tahoma"/>
+          <w:rFonts w:ascii="Tahoma" w:hAnsi="Tahoma" w:cs="Tahoma" w:eastAsia="Tahoma"/>
           <w:sz w:val="22"/>
           <w:szCs w:val="22"/>
         </w:rPr>
@@ -582,7 +582,7 @@
       <w:r>
         <w:rPr>
           <w:rStyle w:val="MSGENFONTSTYLENAMETEMPLATEROLENUMBERMSGENFONTSTYLENAMEBYROLETEXT2"/>
-          <w:rFonts w:ascii="Tahoma" w:hAnsi="Tahoma" w:cs="Tahoma"/>
+          <w:rFonts w:ascii="Tahoma" w:hAnsi="Tahoma" w:cs="Tahoma" w:eastAsia="Tahoma"/>
           <w:sz w:val="22"/>
           <w:szCs w:val="22"/>
           <w:lang w:val="en-US"/>
@@ -591,7 +591,7 @@
       </w:r>
       <w:r>
         <w:rPr>
-          <w:rFonts w:ascii="Tahoma" w:hAnsi="Tahoma" w:cs="Tahoma"/>
+          <w:rFonts w:ascii="Tahoma" w:hAnsi="Tahoma" w:cs="Tahoma" w:eastAsia="Tahoma"/>
           <w:sz w:val="22"/>
           <w:szCs w:val="22"/>
           <w:shd w:val="clear" w:color="auto" w:fill="FFFFFF"/>
@@ -602,7 +602,7 @@
       <w:r>
         <w:rPr>
           <w:rStyle w:val="MSGENFONTSTYLENAMETEMPLATEROLENUMBERMSGENFONTSTYLENAMEBYROLETEXT2"/>
-          <w:rFonts w:ascii="Tahoma" w:hAnsi="Tahoma" w:cs="Tahoma"/>
+          <w:rFonts w:ascii="Tahoma" w:hAnsi="Tahoma" w:cs="Tahoma" w:eastAsia="Tahoma"/>
           <w:sz w:val="22"/>
           <w:szCs w:val="22"/>
           <w:lang w:val="en-US"/>
@@ -612,7 +612,7 @@
       <w:r>
         <w:rPr>
           <w:rStyle w:val="MSGENFONTSTYLENAMETEMPLATEROLENUMBERMSGENFONTSTYLENAMEBYROLETEXT2"/>
-          <w:rFonts w:ascii="Tahoma" w:hAnsi="Tahoma" w:cs="Tahoma"/>
+          <w:rFonts w:ascii="Tahoma" w:hAnsi="Tahoma" w:cs="Tahoma" w:eastAsia="Tahoma"/>
           <w:sz w:val="22"/>
           <w:szCs w:val="22"/>
           <w:lang w:val="en-US"/>
@@ -622,7 +622,7 @@
       <w:r>
         <w:rPr>
           <w:rStyle w:val="MSGENFONTSTYLENAMETEMPLATEROLENUMBERMSGENFONTSTYLENAMEBYROLETEXT2"/>
-          <w:rFonts w:ascii="Tahoma" w:hAnsi="Tahoma" w:cs="Tahoma"/>
+          <w:rFonts w:ascii="Tahoma" w:hAnsi="Tahoma" w:cs="Tahoma" w:eastAsia="Tahoma"/>
           <w:sz w:val="22"/>
           <w:szCs w:val="22"/>
         </w:rPr>
@@ -631,7 +631,7 @@
       <w:r>
         <w:rPr>
           <w:rStyle w:val="MSGENFONTSTYLENAMETEMPLATEROLENUMBERMSGENFONTSTYLENAMEBYROLETEXT2"/>
-          <w:rFonts w:ascii="Tahoma" w:hAnsi="Tahoma" w:cs="Tahoma"/>
+          <w:rFonts w:ascii="Tahoma" w:hAnsi="Tahoma" w:cs="Tahoma" w:eastAsia="Tahoma"/>
           <w:sz w:val="22"/>
           <w:szCs w:val="22"/>
           <w:lang w:val="en-US"/>
@@ -641,7 +641,7 @@
       <w:r>
         <w:rPr>
           <w:rStyle w:val="MSGENFONTSTYLENAMETEMPLATEROLENUMBERMSGENFONTSTYLENAMEBYROLETEXT2"/>
-          <w:rFonts w:ascii="Tahoma" w:hAnsi="Tahoma" w:cs="Tahoma"/>
+          <w:rFonts w:ascii="Tahoma" w:hAnsi="Tahoma" w:cs="Tahoma" w:eastAsia="Tahoma"/>
           <w:sz w:val="22"/>
           <w:szCs w:val="22"/>
         </w:rPr>
@@ -657,7 +657,7 @@
       </w:r>
       <w:r>
         <w:rPr>
-          <w:rFonts w:ascii="Tahoma" w:hAnsi="Tahoma" w:cs="Tahoma"/>
+          <w:rFonts w:ascii="Tahoma" w:hAnsi="Tahoma" w:cs="Tahoma" w:eastAsia="Tahoma"/>
           <w:sz w:val="22"/>
           <w:szCs w:val="22"/>
           <w:shd w:val="clear" w:color="auto" w:fill="FFFFFF"/>
@@ -666,7 +666,7 @@
       </w:r>
       <w:r>
         <w:rPr>
-          <w:rFonts w:ascii="Tahoma" w:hAnsi="Tahoma" w:cs="Tahoma"/>
+          <w:rFonts w:ascii="Tahoma" w:hAnsi="Tahoma" w:cs="Tahoma" w:eastAsia="Tahoma"/>
           <w:sz w:val="22"/>
           <w:szCs w:val="22"/>
           <w:shd w:val="clear" w:color="auto" w:fill="FFFFFF"/>
@@ -676,7 +676,7 @@
       </w:r>
       <w:r>
         <w:rPr>
-          <w:rFonts w:ascii="Tahoma" w:hAnsi="Tahoma" w:cs="Tahoma"/>
+          <w:rFonts w:ascii="Tahoma" w:hAnsi="Tahoma" w:cs="Tahoma" w:eastAsia="Tahoma"/>
           <w:sz w:val="22"/>
           <w:szCs w:val="22"/>
           <w:shd w:val="clear" w:color="auto" w:fill="FFFFFF"/>
@@ -685,7 +685,7 @@
       </w:r>
       <w:r>
         <w:rPr>
-          <w:rFonts w:ascii="Tahoma" w:hAnsi="Tahoma" w:cs="Tahoma"/>
+          <w:rFonts w:ascii="Tahoma" w:hAnsi="Tahoma" w:cs="Tahoma" w:eastAsia="Tahoma"/>
           <w:sz w:val="22"/>
           <w:szCs w:val="22"/>
           <w:shd w:val="clear" w:color="auto" w:fill="FFFFFF"/>
@@ -695,7 +695,7 @@
       </w:r>
       <w:r>
         <w:rPr>
-          <w:rFonts w:ascii="Tahoma" w:hAnsi="Tahoma" w:cs="Tahoma"/>
+          <w:rFonts w:ascii="Tahoma" w:hAnsi="Tahoma" w:cs="Tahoma" w:eastAsia="Tahoma"/>
           <w:sz w:val="22"/>
           <w:szCs w:val="22"/>
           <w:shd w:val="clear" w:color="auto" w:fill="FFFFFF"/>
@@ -704,7 +704,7 @@
       </w:r>
       <w:r>
         <w:rPr>
-          <w:rFonts w:ascii="Tahoma" w:hAnsi="Tahoma" w:cs="Tahoma"/>
+          <w:rFonts w:ascii="Tahoma" w:hAnsi="Tahoma" w:cs="Tahoma" w:eastAsia="Tahoma"/>
           <w:sz w:val="22"/>
           <w:szCs w:val="22"/>
           <w:shd w:val="clear" w:color="auto" w:fill="FFFFFF"/>
@@ -714,7 +714,7 @@
       </w:r>
       <w:r>
         <w:rPr>
-          <w:rFonts w:ascii="Tahoma" w:hAnsi="Tahoma" w:cs="Tahoma"/>
+          <w:rFonts w:ascii="Tahoma" w:hAnsi="Tahoma" w:cs="Tahoma" w:eastAsia="Tahoma"/>
           <w:sz w:val="22"/>
           <w:szCs w:val="22"/>
           <w:shd w:val="clear" w:color="auto" w:fill="FFFFFF"/>
@@ -735,7 +735,7 @@
         <w:ind w:left="142" w:right="46"/>
         <w:jc w:val="both"/>
         <w:rPr>
-          <w:rFonts w:ascii="Tahoma" w:hAnsi="Tahoma" w:cs="Tahoma"/>
+          <w:rFonts w:ascii="Tahoma" w:hAnsi="Tahoma" w:cs="Tahoma" w:eastAsia="Tahoma"/>
           <w:sz w:val="22"/>
           <w:szCs w:val="22"/>
           <w:shd w:val="clear" w:color="auto" w:fill="FFFFFF"/>
@@ -745,7 +745,7 @@
       <w:r>
         <w:rPr>
           <w:rStyle w:val="MSGENFONTSTYLENAMETEMPLATEROLENUMBERMSGENFONTSTYLENAMEBYROLETEXT2"/>
-          <w:rFonts w:ascii="Tahoma" w:hAnsi="Tahoma" w:cs="Tahoma"/>
+          <w:rFonts w:ascii="Tahoma" w:hAnsi="Tahoma" w:cs="Tahoma" w:eastAsia="Tahoma"/>
           <w:sz w:val="22"/>
           <w:szCs w:val="22"/>
           <w:lang w:val="en-US"/>
@@ -755,7 +755,7 @@
       <w:r>
         <w:rPr>
           <w:rStyle w:val="MSGENFONTSTYLENAMETEMPLATEROLENUMBERMSGENFONTSTYLENAMEBYROLETEXT2"/>
-          <w:rFonts w:ascii="Tahoma" w:hAnsi="Tahoma" w:cs="Tahoma"/>
+          <w:rFonts w:ascii="Tahoma" w:hAnsi="Tahoma" w:cs="Tahoma" w:eastAsia="Tahoma"/>
           <w:sz w:val="22"/>
           <w:szCs w:val="22"/>
         </w:rPr>
@@ -764,7 +764,7 @@
       <w:r>
         <w:rPr>
           <w:rStyle w:val="MSGENFONTSTYLENAMETEMPLATEROLENUMBERMSGENFONTSTYLENAMEBYROLETEXT2"/>
-          <w:rFonts w:ascii="Tahoma" w:hAnsi="Tahoma" w:cs="Tahoma"/>
+          <w:rFonts w:ascii="Tahoma" w:hAnsi="Tahoma" w:cs="Tahoma" w:eastAsia="Tahoma"/>
           <w:sz w:val="22"/>
           <w:szCs w:val="22"/>
           <w:lang w:val="en-US"/>
@@ -774,7 +774,7 @@
       <w:r>
         <w:rPr>
           <w:rStyle w:val="MSGENFONTSTYLENAMETEMPLATEROLENUMBERMSGENFONTSTYLENAMEBYROLETEXT2"/>
-          <w:rFonts w:ascii="Tahoma" w:hAnsi="Tahoma" w:cs="Tahoma"/>
+          <w:rFonts w:ascii="Tahoma" w:hAnsi="Tahoma" w:cs="Tahoma" w:eastAsia="Tahoma"/>
           <w:sz w:val="22"/>
           <w:szCs w:val="22"/>
         </w:rPr>
@@ -783,7 +783,7 @@
       <w:r>
         <w:rPr>
           <w:rStyle w:val="MSGENFONTSTYLENAMETEMPLATEROLENUMBERMSGENFONTSTYLENAMEBYROLETEXT2"/>
-          <w:rFonts w:ascii="Tahoma" w:hAnsi="Tahoma" w:cs="Tahoma"/>
+          <w:rFonts w:ascii="Tahoma" w:hAnsi="Tahoma" w:cs="Tahoma" w:eastAsia="Tahoma"/>
           <w:sz w:val="22"/>
           <w:szCs w:val="22"/>
           <w:lang w:val="en-US"/>
@@ -793,7 +793,7 @@
       <w:r>
         <w:rPr>
           <w:rStyle w:val="MSGENFONTSTYLENAMETEMPLATEROLENUMBERMSGENFONTSTYLENAMEBYROLETEXT2"/>
-          <w:rFonts w:ascii="Tahoma" w:hAnsi="Tahoma" w:cs="Tahoma"/>
+          <w:rFonts w:ascii="Tahoma" w:hAnsi="Tahoma" w:cs="Tahoma" w:eastAsia="Tahoma"/>
           <w:sz w:val="22"/>
           <w:szCs w:val="22"/>
         </w:rPr>
@@ -802,7 +802,7 @@
       <w:r>
         <w:rPr>
           <w:rStyle w:val="MSGENFONTSTYLENAMETEMPLATEROLENUMBERMSGENFONTSTYLENAMEBYROLETEXT2"/>
-          <w:rFonts w:ascii="Tahoma" w:hAnsi="Tahoma" w:cs="Tahoma"/>
+          <w:rFonts w:ascii="Tahoma" w:hAnsi="Tahoma" w:cs="Tahoma" w:eastAsia="Tahoma"/>
           <w:sz w:val="22"/>
           <w:szCs w:val="22"/>
           <w:lang w:val="en-US"/>
@@ -812,7 +812,7 @@
       <w:r>
         <w:rPr>
           <w:rStyle w:val="MSGENFONTSTYLENAMETEMPLATEROLENUMBERMSGENFONTSTYLENAMEBYROLETEXT2"/>
-          <w:rFonts w:ascii="Tahoma" w:hAnsi="Tahoma" w:cs="Tahoma"/>
+          <w:rFonts w:ascii="Tahoma" w:hAnsi="Tahoma" w:cs="Tahoma" w:eastAsia="Tahoma"/>
           <w:sz w:val="22"/>
           <w:szCs w:val="22"/>
         </w:rPr>
@@ -821,7 +821,7 @@
       <w:r>
         <w:rPr>
           <w:rStyle w:val="MSGENFONTSTYLENAMETEMPLATEROLENUMBERMSGENFONTSTYLENAMEBYROLETEXT2"/>
-          <w:rFonts w:ascii="Tahoma" w:hAnsi="Tahoma" w:cs="Tahoma"/>
+          <w:rFonts w:ascii="Tahoma" w:hAnsi="Tahoma" w:cs="Tahoma" w:eastAsia="Tahoma"/>
           <w:sz w:val="22"/>
           <w:szCs w:val="22"/>
           <w:lang w:val="en-US"/>
@@ -831,7 +831,7 @@
       <w:r>
         <w:rPr>
           <w:rStyle w:val="MSGENFONTSTYLENAMETEMPLATEROLENUMBERMSGENFONTSTYLENAMEBYROLETEXT2"/>
-          <w:rFonts w:ascii="Tahoma" w:hAnsi="Tahoma" w:cs="Tahoma"/>
+          <w:rFonts w:ascii="Tahoma" w:hAnsi="Tahoma" w:cs="Tahoma" w:eastAsia="Tahoma"/>
           <w:sz w:val="22"/>
           <w:szCs w:val="22"/>
         </w:rPr>
@@ -840,7 +840,7 @@
       <w:r>
         <w:rPr>
           <w:rStyle w:val="MSGENFONTSTYLENAMETEMPLATEROLENUMBERMSGENFONTSTYLENAMEBYROLETEXT2"/>
-          <w:rFonts w:ascii="Tahoma" w:hAnsi="Tahoma" w:cs="Tahoma"/>
+          <w:rFonts w:ascii="Tahoma" w:hAnsi="Tahoma" w:cs="Tahoma" w:eastAsia="Tahoma"/>
           <w:sz w:val="22"/>
           <w:szCs w:val="22"/>
           <w:lang w:val="en-US"/>
@@ -850,7 +850,7 @@
       <w:r>
         <w:rPr>
           <w:rStyle w:val="MSGENFONTSTYLENAMETEMPLATEROLENUMBERMSGENFONTSTYLENAMEBYROLETEXT2"/>
-          <w:rFonts w:ascii="Tahoma" w:hAnsi="Tahoma" w:cs="Tahoma"/>
+          <w:rFonts w:ascii="Tahoma" w:hAnsi="Tahoma" w:cs="Tahoma" w:eastAsia="Tahoma"/>
           <w:sz w:val="22"/>
           <w:szCs w:val="22"/>
         </w:rPr>
@@ -859,7 +859,7 @@
       <w:r>
         <w:rPr>
           <w:rStyle w:val="MSGENFONTSTYLENAMETEMPLATEROLENUMBERMSGENFONTSTYLENAMEBYROLETEXT2"/>
-          <w:rFonts w:ascii="Tahoma" w:hAnsi="Tahoma" w:cs="Tahoma"/>
+          <w:rFonts w:ascii="Tahoma" w:hAnsi="Tahoma" w:cs="Tahoma" w:eastAsia="Tahoma"/>
           <w:sz w:val="22"/>
           <w:szCs w:val="22"/>
           <w:lang w:val="en-US"/>
@@ -868,7 +868,7 @@
       </w:r>
       <w:r>
         <w:rPr>
-          <w:rFonts w:ascii="Tahoma" w:hAnsi="Tahoma" w:cs="Tahoma"/>
+          <w:rFonts w:ascii="Tahoma" w:hAnsi="Tahoma" w:cs="Tahoma" w:eastAsia="Tahoma"/>
           <w:sz w:val="22"/>
           <w:szCs w:val="22"/>
           <w:shd w:val="clear" w:color="auto" w:fill="FFFFFF"/>
@@ -877,7 +877,7 @@
       </w:r>
       <w:r>
         <w:rPr>
-          <w:rFonts w:ascii="Tahoma" w:hAnsi="Tahoma" w:cs="Tahoma"/>
+          <w:rFonts w:ascii="Tahoma" w:hAnsi="Tahoma" w:cs="Tahoma" w:eastAsia="Tahoma"/>
           <w:sz w:val="22"/>
           <w:szCs w:val="22"/>
           <w:lang w:val="en-US"/>
@@ -887,7 +887,7 @@
       <w:r>
         <w:rPr>
           <w:rStyle w:val="MSGENFONTSTYLENAMETEMPLATEROLENUMBERMSGENFONTSTYLENAMEBYROLETEXT2"/>
-          <w:rFonts w:ascii="Tahoma" w:hAnsi="Tahoma" w:cs="Tahoma"/>
+          <w:rFonts w:ascii="Tahoma" w:hAnsi="Tahoma" w:cs="Tahoma" w:eastAsia="Tahoma"/>
           <w:sz w:val="22"/>
           <w:szCs w:val="22"/>
         </w:rPr>
@@ -896,7 +896,7 @@
       <w:r>
         <w:rPr>
           <w:rStyle w:val="MSGENFONTSTYLENAMETEMPLATEROLENUMBERMSGENFONTSTYLENAMEBYROLETEXT2"/>
-          <w:rFonts w:ascii="Tahoma" w:hAnsi="Tahoma" w:cs="Tahoma"/>
+          <w:rFonts w:ascii="Tahoma" w:hAnsi="Tahoma" w:cs="Tahoma" w:eastAsia="Tahoma"/>
           <w:sz w:val="22"/>
           <w:szCs w:val="22"/>
           <w:lang w:val="en-US"/>
@@ -905,7 +905,7 @@
       </w:r>
       <w:r>
         <w:rPr>
-          <w:rFonts w:ascii="Tahoma" w:hAnsi="Tahoma" w:cs="Tahoma"/>
+          <w:rFonts w:ascii="Tahoma" w:hAnsi="Tahoma" w:cs="Tahoma" w:eastAsia="Tahoma"/>
           <w:sz w:val="22"/>
           <w:szCs w:val="22"/>
           <w:shd w:val="clear" w:color="auto" w:fill="FFFFFF"/>
@@ -914,7 +914,7 @@
       </w:r>
       <w:r>
         <w:rPr>
-          <w:rFonts w:ascii="Tahoma" w:hAnsi="Tahoma" w:cs="Tahoma"/>
+          <w:rFonts w:ascii="Tahoma" w:hAnsi="Tahoma" w:cs="Tahoma" w:eastAsia="Tahoma"/>
           <w:sz w:val="22"/>
           <w:szCs w:val="22"/>
           <w:shd w:val="clear" w:color="auto" w:fill="FFFFFF"/>
@@ -925,7 +925,7 @@
       <w:r>
         <w:rPr>
           <w:rStyle w:val="MSGENFONTSTYLENAMETEMPLATEROLENUMBERMSGENFONTSTYLENAMEBYROLETEXT2"/>
-          <w:rFonts w:ascii="Tahoma" w:hAnsi="Tahoma" w:cs="Tahoma"/>
+          <w:rFonts w:ascii="Tahoma" w:hAnsi="Tahoma" w:cs="Tahoma" w:eastAsia="Tahoma"/>
           <w:sz w:val="22"/>
           <w:szCs w:val="22"/>
         </w:rPr>
@@ -934,7 +934,7 @@
       <w:r>
         <w:rPr>
           <w:rStyle w:val="MSGENFONTSTYLENAMETEMPLATEROLENUMBERMSGENFONTSTYLENAMEBYROLETEXT2"/>
-          <w:rFonts w:ascii="Tahoma" w:hAnsi="Tahoma" w:cs="Tahoma"/>
+          <w:rFonts w:ascii="Tahoma" w:hAnsi="Tahoma" w:cs="Tahoma" w:eastAsia="Tahoma"/>
           <w:sz w:val="22"/>
           <w:szCs w:val="22"/>
           <w:lang w:val="en-US"/>
@@ -944,7 +944,7 @@
       <w:r>
         <w:rPr>
           <w:rStyle w:val="MSGENFONTSTYLENAMETEMPLATEROLENUMBERMSGENFONTSTYLENAMEBYROLETEXT2"/>
-          <w:rFonts w:ascii="Tahoma" w:hAnsi="Tahoma" w:cs="Tahoma"/>
+          <w:rFonts w:ascii="Tahoma" w:hAnsi="Tahoma" w:cs="Tahoma" w:eastAsia="Tahoma"/>
           <w:sz w:val="22"/>
           <w:szCs w:val="22"/>
         </w:rPr>
@@ -953,7 +953,7 @@
       <w:r>
         <w:rPr>
           <w:rStyle w:val="MSGENFONTSTYLENAMETEMPLATEROLENUMBERMSGENFONTSTYLENAMEBYROLETEXT2"/>
-          <w:rFonts w:ascii="Tahoma" w:hAnsi="Tahoma" w:cs="Tahoma"/>
+          <w:rFonts w:ascii="Tahoma" w:hAnsi="Tahoma" w:cs="Tahoma" w:eastAsia="Tahoma"/>
           <w:sz w:val="22"/>
           <w:szCs w:val="22"/>
           <w:lang w:val="en-US"/>
@@ -962,7 +962,7 @@
       </w:r>
       <w:r>
         <w:rPr>
-          <w:rFonts w:ascii="Tahoma" w:hAnsi="Tahoma" w:cs="Tahoma"/>
+          <w:rFonts w:ascii="Tahoma" w:hAnsi="Tahoma" w:cs="Tahoma" w:eastAsia="Tahoma"/>
           <w:sz w:val="22"/>
           <w:szCs w:val="22"/>
           <w:shd w:val="clear" w:color="auto" w:fill="FFFFFF"/>
@@ -982,7 +982,7 @@
         <w:ind w:left="142" w:right="46"/>
         <w:jc w:val="both"/>
         <w:rPr>
-          <w:rFonts w:ascii="Tahoma" w:hAnsi="Tahoma" w:cs="Tahoma"/>
+          <w:rFonts w:ascii="Tahoma" w:hAnsi="Tahoma" w:cs="Tahoma" w:eastAsia="Tahoma"/>
           <w:shd w:val="clear" w:color="auto" w:fill="FFFFFF"/>
           <w:lang w:val="en-US"/>
         </w:rPr>
@@ -990,7 +990,7 @@
       <w:r>
         <w:rPr>
           <w:rStyle w:val="MSGENFONTSTYLENAMETEMPLATEROLENUMBERMSGENFONTSTYLENAMEBYROLETEXT2"/>
-          <w:rFonts w:ascii="Tahoma" w:hAnsi="Tahoma" w:cs="Tahoma"/>
+          <w:rFonts w:ascii="Tahoma" w:hAnsi="Tahoma" w:cs="Tahoma" w:eastAsia="Tahoma"/>
           <w:sz w:val="22"/>
           <w:szCs w:val="22"/>
         </w:rPr>
@@ -999,7 +999,7 @@
       <w:r>
         <w:rPr>
           <w:rStyle w:val="MSGENFONTSTYLENAMETEMPLATEROLENUMBERMSGENFONTSTYLENAMEBYROLETEXT2"/>
-          <w:rFonts w:ascii="Tahoma" w:hAnsi="Tahoma" w:cs="Tahoma"/>
+          <w:rFonts w:ascii="Tahoma" w:hAnsi="Tahoma" w:cs="Tahoma" w:eastAsia="Tahoma"/>
           <w:sz w:val="22"/>
           <w:szCs w:val="22"/>
           <w:lang w:val="en-US"/>
@@ -1009,7 +1009,7 @@
       <w:r>
         <w:rPr>
           <w:rStyle w:val="MSGENFONTSTYLENAMETEMPLATEROLENUMBERMSGENFONTSTYLENAMEBYROLETEXT2"/>
-          <w:rFonts w:ascii="Tahoma" w:hAnsi="Tahoma" w:cs="Tahoma"/>
+          <w:rFonts w:ascii="Tahoma" w:hAnsi="Tahoma" w:cs="Tahoma" w:eastAsia="Tahoma"/>
           <w:sz w:val="22"/>
           <w:szCs w:val="22"/>
         </w:rPr>
@@ -1018,7 +1018,7 @@
       <w:r>
         <w:rPr>
           <w:rStyle w:val="MSGENFONTSTYLENAMETEMPLATEROLENUMBERMSGENFONTSTYLENAMEBYROLETEXT2"/>
-          <w:rFonts w:ascii="Tahoma" w:hAnsi="Tahoma" w:cs="Tahoma"/>
+          <w:rFonts w:ascii="Tahoma" w:hAnsi="Tahoma" w:cs="Tahoma" w:eastAsia="Tahoma"/>
           <w:sz w:val="22"/>
           <w:szCs w:val="22"/>
           <w:lang w:val="en-US"/>
@@ -1028,7 +1028,7 @@
       <w:r>
         <w:rPr>
           <w:rStyle w:val="MSGENFONTSTYLENAMETEMPLATEROLENUMBERMSGENFONTSTYLENAMEBYROLETEXT2"/>
-          <w:rFonts w:ascii="Tahoma" w:hAnsi="Tahoma" w:cs="Tahoma"/>
+          <w:rFonts w:ascii="Tahoma" w:hAnsi="Tahoma" w:cs="Tahoma" w:eastAsia="Tahoma"/>
           <w:sz w:val="22"/>
           <w:szCs w:val="22"/>
         </w:rPr>
@@ -1036,7 +1036,7 @@
       </w:r>
       <w:r>
         <w:rPr>
-          <w:rFonts w:ascii="Tahoma" w:hAnsi="Tahoma" w:cs="Tahoma"/>
+          <w:rFonts w:ascii="Tahoma" w:hAnsi="Tahoma" w:cs="Tahoma" w:eastAsia="Tahoma"/>
           <w:shd w:val="clear" w:color="auto" w:fill="FFFFFF"/>
           <w:lang w:val="en-US"/>
         </w:rPr>
@@ -1044,7 +1044,7 @@
       </w:r>
       <w:r>
         <w:rPr>
-          <w:rFonts w:ascii="Tahoma" w:hAnsi="Tahoma" w:cs="Tahoma"/>
+          <w:rFonts w:ascii="Tahoma" w:hAnsi="Tahoma" w:cs="Tahoma" w:eastAsia="Tahoma"/>
           <w:sz w:val="22"/>
           <w:szCs w:val="22"/>
           <w:shd w:val="clear" w:color="auto" w:fill="FFFFFF"/>
@@ -1062,7 +1062,7 @@
         <w:jc w:val="both"/>
         <w:rPr>
           <w:rStyle w:val="MSGENFONTSTYLENAMETEMPLATEROLENUMBERMSGENFONTSTYLENAMEBYROLETEXT2"/>
-          <w:rFonts w:ascii="Tahoma" w:hAnsi="Tahoma" w:cs="Tahoma"/>
+          <w:rFonts w:ascii="Tahoma" w:hAnsi="Tahoma" w:cs="Tahoma" w:eastAsia="Tahoma"/>
           <w:sz w:val="22"/>
           <w:szCs w:val="22"/>
           <w:lang w:val="en-US"/>
@@ -1071,7 +1071,7 @@
       <w:r>
         <w:rPr>
           <w:rStyle w:val="MSGENFONTSTYLENAMETEMPLATEROLENUMBERMSGENFONTSTYLENAMEBYROLETEXT2"/>
-          <w:rFonts w:ascii="Tahoma" w:hAnsi="Tahoma" w:cs="Tahoma"/>
+          <w:rFonts w:ascii="Tahoma" w:hAnsi="Tahoma" w:cs="Tahoma" w:eastAsia="Tahoma"/>
           <w:sz w:val="22"/>
           <w:szCs w:val="22"/>
         </w:rPr>
@@ -1087,7 +1087,7 @@
         <w:jc w:val="both"/>
         <w:rPr>
           <w:rStyle w:val="MSGENFONTSTYLENAMETEMPLATEROLENUMBERMSGENFONTSTYLENAMEBYROLETEXT2"/>
-          <w:rFonts w:ascii="Tahoma" w:hAnsi="Tahoma" w:cs="Tahoma"/>
+          <w:rFonts w:ascii="Tahoma" w:hAnsi="Tahoma" w:cs="Tahoma" w:eastAsia="Tahoma"/>
           <w:sz w:val="22"/>
           <w:szCs w:val="22"/>
           <w:lang w:val="en-US"/>
@@ -1104,7 +1104,7 @@
         <w:ind w:left="142" w:right="46"/>
         <w:rPr>
           <w:rStyle w:val="MSGENFONTSTYLENAMETEMPLATEROLENUMBERMSGENFONTSTYLENAMEBYROLETEXT3"/>
-          <w:rFonts w:ascii="Tahoma" w:hAnsi="Tahoma" w:cs="Tahoma"/>
+          <w:rFonts w:ascii="Tahoma" w:hAnsi="Tahoma" w:cs="Tahoma" w:eastAsia="Tahoma"/>
           <w:b/>
           <w:bCs/>
           <w:i/>
@@ -1117,7 +1117,7 @@
       <w:r>
         <w:rPr>
           <w:rStyle w:val="MSGENFONTSTYLENAMETEMPLATEROLENUMBERMSGENFONTSTYLENAMEBYROLETEXT3"/>
-          <w:rFonts w:ascii="Tahoma" w:hAnsi="Tahoma" w:cs="Tahoma"/>
+          <w:rFonts w:ascii="Tahoma" w:hAnsi="Tahoma" w:cs="Tahoma" w:eastAsia="Tahoma"/>
           <w:b/>
           <w:bCs/>
           <w:i/>
@@ -1131,7 +1131,7 @@
       <w:r>
         <w:rPr>
           <w:rStyle w:val="MSGENFONTSTYLENAMETEMPLATEROLENUMBERMSGENFONTSTYLENAMEBYROLETEXT3"/>
-          <w:rFonts w:ascii="Tahoma" w:hAnsi="Tahoma" w:cs="Tahoma"/>
+          <w:rFonts w:ascii="Tahoma" w:hAnsi="Tahoma" w:cs="Tahoma" w:eastAsia="Tahoma"/>
           <w:b/>
           <w:bCs/>
           <w:i/>
@@ -1144,7 +1144,7 @@
       <w:r>
         <w:rPr>
           <w:rStyle w:val="MSGENFONTSTYLENAMETEMPLATEROLENUMBERMSGENFONTSTYLENAMEBYROLETEXT3"/>
-          <w:rFonts w:ascii="Tahoma" w:hAnsi="Tahoma" w:cs="Tahoma"/>
+          <w:rFonts w:ascii="Tahoma" w:hAnsi="Tahoma" w:cs="Tahoma" w:eastAsia="Tahoma"/>
           <w:b/>
           <w:bCs/>
           <w:i/>
@@ -1158,7 +1158,7 @@
       <w:r>
         <w:rPr>
           <w:rStyle w:val="MSGENFONTSTYLENAMETEMPLATEROLENUMBERMSGENFONTSTYLENAMEBYROLETEXT3"/>
-          <w:rFonts w:ascii="Tahoma" w:hAnsi="Tahoma" w:cs="Tahoma"/>
+          <w:rFonts w:ascii="Tahoma" w:hAnsi="Tahoma" w:cs="Tahoma" w:eastAsia="Tahoma"/>
           <w:b/>
           <w:bCs/>
           <w:i/>
@@ -1177,7 +1177,7 @@
         <w:ind w:left="142" w:right="46"/>
         <w:rPr>
           <w:rStyle w:val="MSGENFONTSTYLENAMETEMPLATEROLENUMBERMSGENFONTSTYLENAMEBYROLETEXT3"/>
-          <w:rFonts w:ascii="Tahoma" w:hAnsi="Tahoma" w:cs="Tahoma"/>
+          <w:rFonts w:ascii="Tahoma" w:hAnsi="Tahoma" w:cs="Tahoma" w:eastAsia="Tahoma"/>
           <w:b/>
           <w:bCs/>
           <w:i/>
@@ -1196,7 +1196,7 @@
         <w:ind w:left="142" w:right="46"/>
         <w:rPr>
           <w:rStyle w:val="MSGENFONTSTYLENAMETEMPLATEROLENUMBERMSGENFONTSTYLENAMEBYROLETEXT3"/>
-          <w:rFonts w:ascii="Tahoma" w:hAnsi="Tahoma" w:cs="Tahoma"/>
+          <w:rFonts w:ascii="Tahoma" w:hAnsi="Tahoma" w:cs="Tahoma" w:eastAsia="Tahoma"/>
           <w:b/>
           <w:bCs/>
           <w:i/>
@@ -1209,7 +1209,7 @@
       <w:r>
         <w:rPr>
           <w:rStyle w:val="MSGENFONTSTYLENAMETEMPLATEROLENUMBERMSGENFONTSTYLENAMEBYROLETEXT3"/>
-          <w:rFonts w:ascii="Tahoma" w:hAnsi="Tahoma" w:cs="Tahoma"/>
+          <w:rFonts w:ascii="Tahoma" w:hAnsi="Tahoma" w:cs="Tahoma" w:eastAsia="Tahoma"/>
           <w:b/>
           <w:bCs/>
           <w:i/>
@@ -1223,7 +1223,7 @@
       <w:r>
         <w:rPr>
           <w:rStyle w:val="MSGENFONTSTYLENAMETEMPLATEROLENUMBERMSGENFONTSTYLENAMEBYROLETEXT3"/>
-          <w:rFonts w:ascii="Tahoma" w:hAnsi="Tahoma" w:cs="Tahoma"/>
+          <w:rFonts w:ascii="Tahoma" w:hAnsi="Tahoma" w:cs="Tahoma" w:eastAsia="Tahoma"/>
           <w:b/>
           <w:bCs/>
           <w:i/>
@@ -1236,7 +1236,7 @@
       <w:r>
         <w:rPr>
           <w:rStyle w:val="MSGENFONTSTYLENAMETEMPLATEROLENUMBERMSGENFONTSTYLENAMEBYROLETEXT3"/>
-          <w:rFonts w:ascii="Tahoma" w:hAnsi="Tahoma" w:cs="Tahoma"/>
+          <w:rFonts w:ascii="Tahoma" w:hAnsi="Tahoma" w:cs="Tahoma" w:eastAsia="Tahoma"/>
           <w:b/>
           <w:bCs/>
           <w:i/>
@@ -1250,7 +1250,7 @@
       <w:r>
         <w:rPr>
           <w:rStyle w:val="MSGENFONTSTYLENAMETEMPLATEROLENUMBERMSGENFONTSTYLENAMEBYROLETEXT3"/>
-          <w:rFonts w:ascii="Tahoma" w:hAnsi="Tahoma" w:cs="Tahoma"/>
+          <w:rFonts w:ascii="Tahoma" w:hAnsi="Tahoma" w:cs="Tahoma" w:eastAsia="Tahoma"/>
           <w:b/>
           <w:bCs/>
           <w:i/>
@@ -1263,7 +1263,7 @@
       <w:r>
         <w:rPr>
           <w:rStyle w:val="MSGENFONTSTYLENAMETEMPLATEROLENUMBERMSGENFONTSTYLENAMEBYROLETEXT3"/>
-          <w:rFonts w:ascii="Tahoma" w:hAnsi="Tahoma" w:cs="Tahoma"/>
+          <w:rFonts w:ascii="Tahoma" w:hAnsi="Tahoma" w:cs="Tahoma" w:eastAsia="Tahoma"/>
           <w:b/>
           <w:bCs/>
           <w:i/>
@@ -1277,7 +1277,7 @@
       <w:r>
         <w:rPr>
           <w:rStyle w:val="MSGENFONTSTYLENAMETEMPLATEROLENUMBERMSGENFONTSTYLENAMEBYROLETEXT3"/>
-          <w:rFonts w:ascii="Tahoma" w:hAnsi="Tahoma" w:cs="Tahoma"/>
+          <w:rFonts w:ascii="Tahoma" w:hAnsi="Tahoma" w:cs="Tahoma" w:eastAsia="Tahoma"/>
           <w:b/>
           <w:bCs/>
           <w:i/>
@@ -1296,7 +1296,7 @@
         <w:ind w:left="142" w:right="46"/>
         <w:rPr>
           <w:rStyle w:val="MSGENFONTSTYLENAMETEMPLATEROLENUMBERMSGENFONTSTYLENAMEBYROLETEXT3"/>
-          <w:rFonts w:ascii="Tahoma" w:hAnsi="Tahoma" w:cs="Tahoma"/>
+          <w:rFonts w:ascii="Tahoma" w:hAnsi="Tahoma" w:cs="Tahoma" w:eastAsia="Tahoma"/>
           <w:b/>
           <w:bCs/>
           <w:i/>
@@ -1315,7 +1315,7 @@
         <w:ind w:left="142" w:right="46"/>
         <w:rPr>
           <w:rStyle w:val="MSGENFONTSTYLENAMETEMPLATEROLENUMBERMSGENFONTSTYLENAMEBYROLETEXT3"/>
-          <w:rFonts w:ascii="Tahoma" w:hAnsi="Tahoma" w:cs="Tahoma"/>
+          <w:rFonts w:ascii="Tahoma" w:hAnsi="Tahoma" w:cs="Tahoma" w:eastAsia="Tahoma"/>
           <w:b/>
           <w:bCs/>
           <w:i/>
@@ -1328,7 +1328,7 @@
       <w:r>
         <w:rPr>
           <w:rStyle w:val="MSGENFONTSTYLENAMETEMPLATEROLENUMBERMSGENFONTSTYLENAMEBYROLETEXT3"/>
-          <w:rFonts w:ascii="Tahoma" w:hAnsi="Tahoma" w:cs="Tahoma"/>
+          <w:rFonts w:ascii="Tahoma" w:hAnsi="Tahoma" w:cs="Tahoma" w:eastAsia="Tahoma"/>
           <w:b/>
           <w:bCs/>
           <w:i/>
@@ -1341,7 +1341,7 @@
       <w:r>
         <w:rPr>
           <w:rStyle w:val="MSGENFONTSTYLENAMETEMPLATEROLENUMBERMSGENFONTSTYLENAMEBYROLETEXT3"/>
-          <w:rFonts w:ascii="Tahoma" w:hAnsi="Tahoma" w:cs="Tahoma"/>
+          <w:rFonts w:ascii="Tahoma" w:hAnsi="Tahoma" w:cs="Tahoma" w:eastAsia="Tahoma"/>
           <w:b/>
           <w:bCs/>
           <w:i/>
@@ -1355,7 +1355,7 @@
       <w:r>
         <w:rPr>
           <w:rStyle w:val="MSGENFONTSTYLENAMETEMPLATEROLENUMBERMSGENFONTSTYLENAMEBYROLETEXT3"/>
-          <w:rFonts w:ascii="Tahoma" w:hAnsi="Tahoma" w:cs="Tahoma"/>
+          <w:rFonts w:ascii="Tahoma" w:hAnsi="Tahoma" w:cs="Tahoma" w:eastAsia="Tahoma"/>
           <w:b/>
           <w:bCs/>
           <w:i/>
@@ -1368,7 +1368,7 @@
       <w:r>
         <w:rPr>
           <w:rStyle w:val="MSGENFONTSTYLENAMETEMPLATEROLENUMBERMSGENFONTSTYLENAMEBYROLETEXT3"/>
-          <w:rFonts w:ascii="Tahoma" w:hAnsi="Tahoma" w:cs="Tahoma"/>
+          <w:rFonts w:ascii="Tahoma" w:hAnsi="Tahoma" w:cs="Tahoma" w:eastAsia="Tahoma"/>
           <w:b/>
           <w:bCs/>
           <w:i/>
@@ -1382,7 +1382,7 @@
       <w:r>
         <w:rPr>
           <w:rStyle w:val="MSGENFONTSTYLENAMETEMPLATEROLENUMBERMSGENFONTSTYLENAMEBYROLETEXT3"/>
-          <w:rFonts w:ascii="Tahoma" w:hAnsi="Tahoma" w:cs="Tahoma"/>
+          <w:rFonts w:ascii="Tahoma" w:hAnsi="Tahoma" w:cs="Tahoma" w:eastAsia="Tahoma"/>
           <w:b/>
           <w:bCs/>
           <w:i/>
@@ -1395,7 +1395,7 @@
       <w:r>
         <w:rPr>
           <w:rStyle w:val="MSGENFONTSTYLENAMETEMPLATEROLENUMBERMSGENFONTSTYLENAMEBYROLETEXT3"/>
-          <w:rFonts w:ascii="Tahoma" w:hAnsi="Tahoma" w:cs="Tahoma"/>
+          <w:rFonts w:ascii="Tahoma" w:hAnsi="Tahoma" w:cs="Tahoma" w:eastAsia="Tahoma"/>
           <w:b/>
           <w:bCs/>
           <w:i/>
@@ -1409,7 +1409,7 @@
       <w:r>
         <w:rPr>
           <w:rStyle w:val="MSGENFONTSTYLENAMETEMPLATEROLENUMBERMSGENFONTSTYLENAMEBYROLETEXT3"/>
-          <w:rFonts w:ascii="Tahoma" w:hAnsi="Tahoma" w:cs="Tahoma"/>
+          <w:rFonts w:ascii="Tahoma" w:hAnsi="Tahoma" w:cs="Tahoma" w:eastAsia="Tahoma"/>
           <w:b/>
           <w:bCs/>
           <w:i/>
@@ -1422,7 +1422,7 @@
       <w:r>
         <w:rPr>
           <w:rStyle w:val="MSGENFONTSTYLENAMETEMPLATEROLENUMBERMSGENFONTSTYLENAMEBYROLETEXT3"/>
-          <w:rFonts w:ascii="Tahoma" w:hAnsi="Tahoma" w:cs="Tahoma"/>
+          <w:rFonts w:ascii="Tahoma" w:hAnsi="Tahoma" w:cs="Tahoma" w:eastAsia="Tahoma"/>
           <w:b/>
           <w:bCs/>
           <w:i/>
@@ -1436,7 +1436,7 @@
       <w:r>
         <w:rPr>
           <w:rStyle w:val="MSGENFONTSTYLENAMETEMPLATEROLENUMBERMSGENFONTSTYLENAMEBYROLETEXT3"/>
-          <w:rFonts w:ascii="Tahoma" w:hAnsi="Tahoma" w:cs="Tahoma"/>
+          <w:rFonts w:ascii="Tahoma" w:hAnsi="Tahoma" w:cs="Tahoma" w:eastAsia="Tahoma"/>
           <w:b/>
           <w:bCs/>
           <w:i/>
@@ -1455,7 +1455,7 @@
         <w:ind w:left="142" w:right="46"/>
         <w:rPr>
           <w:rStyle w:val="MSGENFONTSTYLENAMETEMPLATEROLENUMBERMSGENFONTSTYLENAMEBYROLETEXT3"/>
-          <w:rFonts w:ascii="Tahoma" w:hAnsi="Tahoma" w:cs="Tahoma"/>
+          <w:rFonts w:ascii="Tahoma" w:hAnsi="Tahoma" w:cs="Tahoma" w:eastAsia="Tahoma"/>
           <w:b/>
           <w:bCs/>
           <w:i/>
@@ -1474,7 +1474,7 @@
         <w:ind w:left="142" w:right="46"/>
         <w:rPr>
           <w:rStyle w:val="MSGENFONTSTYLENAMETEMPLATEROLENUMBERMSGENFONTSTYLENAMEBYROLETEXT3"/>
-          <w:rFonts w:ascii="Tahoma" w:hAnsi="Tahoma" w:cs="Tahoma"/>
+          <w:rFonts w:ascii="Tahoma" w:hAnsi="Tahoma" w:cs="Tahoma" w:eastAsia="Tahoma"/>
           <w:b/>
           <w:bCs/>
           <w:i/>
@@ -1487,7 +1487,7 @@
       <w:r>
         <w:rPr>
           <w:rStyle w:val="MSGENFONTSTYLENAMETEMPLATEROLENUMBERMSGENFONTSTYLENAMEBYROLETEXT3"/>
-          <w:rFonts w:ascii="Tahoma" w:hAnsi="Tahoma" w:cs="Tahoma"/>
+          <w:rFonts w:ascii="Tahoma" w:hAnsi="Tahoma" w:cs="Tahoma" w:eastAsia="Tahoma"/>
           <w:b/>
           <w:bCs/>
           <w:i/>
@@ -1500,7 +1500,7 @@
       <w:r>
         <w:rPr>
           <w:rStyle w:val="MSGENFONTSTYLENAMETEMPLATEROLENUMBERMSGENFONTSTYLENAMEBYROLETEXT3"/>
-          <w:rFonts w:ascii="Tahoma" w:hAnsi="Tahoma" w:cs="Tahoma"/>
+          <w:rFonts w:ascii="Tahoma" w:hAnsi="Tahoma" w:cs="Tahoma" w:eastAsia="Tahoma"/>
           <w:b/>
           <w:bCs/>
           <w:i/>
@@ -1514,7 +1514,7 @@
       <w:r>
         <w:rPr>
           <w:rStyle w:val="MSGENFONTSTYLENAMETEMPLATEROLENUMBERMSGENFONTSTYLENAMEBYROLETEXT3"/>
-          <w:rFonts w:ascii="Tahoma" w:hAnsi="Tahoma" w:cs="Tahoma"/>
+          <w:rFonts w:ascii="Tahoma" w:hAnsi="Tahoma" w:cs="Tahoma" w:eastAsia="Tahoma"/>
           <w:b/>
           <w:bCs/>
           <w:i/>
@@ -1527,7 +1527,7 @@
       <w:r>
         <w:rPr>
           <w:rStyle w:val="MSGENFONTSTYLENAMETEMPLATEROLENUMBERMSGENFONTSTYLENAMEBYROLETEXT3"/>
-          <w:rFonts w:ascii="Tahoma" w:hAnsi="Tahoma" w:cs="Tahoma"/>
+          <w:rFonts w:ascii="Tahoma" w:hAnsi="Tahoma" w:cs="Tahoma" w:eastAsia="Tahoma"/>
           <w:b/>
           <w:bCs/>
           <w:i/>
@@ -1541,7 +1541,7 @@
       <w:r>
         <w:rPr>
           <w:rStyle w:val="MSGENFONTSTYLENAMETEMPLATEROLENUMBERMSGENFONTSTYLENAMEBYROLETEXT3"/>
-          <w:rFonts w:ascii="Tahoma" w:hAnsi="Tahoma" w:cs="Tahoma"/>
+          <w:rFonts w:ascii="Tahoma" w:hAnsi="Tahoma" w:cs="Tahoma" w:eastAsia="Tahoma"/>
           <w:b/>
           <w:bCs/>
           <w:i/>
@@ -1554,7 +1554,7 @@
       <w:r>
         <w:rPr>
           <w:rStyle w:val="MSGENFONTSTYLENAMETEMPLATEROLENUMBERMSGENFONTSTYLENAMEBYROLETEXT3"/>
-          <w:rFonts w:ascii="Tahoma" w:hAnsi="Tahoma" w:cs="Tahoma"/>
+          <w:rFonts w:ascii="Tahoma" w:hAnsi="Tahoma" w:cs="Tahoma" w:eastAsia="Tahoma"/>
           <w:b/>
           <w:bCs/>
           <w:i/>
@@ -1568,7 +1568,7 @@
       <w:r>
         <w:rPr>
           <w:rStyle w:val="MSGENFONTSTYLENAMETEMPLATEROLENUMBERMSGENFONTSTYLENAMEBYROLETEXT3"/>
-          <w:rFonts w:ascii="Tahoma" w:hAnsi="Tahoma" w:cs="Tahoma"/>
+          <w:rFonts w:ascii="Tahoma" w:hAnsi="Tahoma" w:cs="Tahoma" w:eastAsia="Tahoma"/>
           <w:b/>
           <w:bCs/>
           <w:i/>
@@ -1587,7 +1587,7 @@
         <w:ind w:left="142" w:right="46"/>
         <w:rPr>
           <w:rStyle w:val="MSGENFONTSTYLENAMETEMPLATEROLENUMBERMSGENFONTSTYLENAMEBYROLETEXT3"/>
-          <w:rFonts w:ascii="Tahoma" w:hAnsi="Tahoma" w:cs="Tahoma"/>
+          <w:rFonts w:ascii="Tahoma" w:hAnsi="Tahoma" w:cs="Tahoma" w:eastAsia="Tahoma"/>
           <w:b/>
           <w:bCs/>
           <w:i/>
@@ -1606,7 +1606,7 @@
         <w:ind w:left="142" w:right="46"/>
         <w:rPr>
           <w:rStyle w:val="MSGENFONTSTYLENAMETEMPLATEROLENUMBERMSGENFONTSTYLENAMEBYROLETEXT3"/>
-          <w:rFonts w:ascii="Tahoma" w:hAnsi="Tahoma" w:cs="Tahoma"/>
+          <w:rFonts w:ascii="Tahoma" w:hAnsi="Tahoma" w:cs="Tahoma" w:eastAsia="Tahoma"/>
           <w:b/>
           <w:bCs/>
           <w:i/>
@@ -1619,7 +1619,7 @@
       <w:r>
         <w:rPr>
           <w:rStyle w:val="MSGENFONTSTYLENAMETEMPLATEROLENUMBERMSGENFONTSTYLENAMEBYROLETEXT3"/>
-          <w:rFonts w:ascii="Tahoma" w:hAnsi="Tahoma" w:cs="Tahoma"/>
+          <w:rFonts w:ascii="Tahoma" w:hAnsi="Tahoma" w:cs="Tahoma" w:eastAsia="Tahoma"/>
           <w:b/>
           <w:bCs/>
           <w:i/>
@@ -1638,7 +1638,7 @@
         <w:ind w:left="142" w:right="46"/>
         <w:rPr>
           <w:rStyle w:val="MSGENFONTSTYLENAMETEMPLATEROLENUMBERMSGENFONTSTYLENAMEBYROLETEXT3"/>
-          <w:rFonts w:ascii="Tahoma" w:hAnsi="Tahoma" w:cs="Tahoma"/>
+          <w:rFonts w:ascii="Tahoma" w:hAnsi="Tahoma" w:cs="Tahoma" w:eastAsia="Tahoma"/>
           <w:b/>
           <w:bCs/>
           <w:i/>
@@ -1657,7 +1657,7 @@
         <w:ind w:left="142" w:right="46"/>
         <w:rPr>
           <w:rStyle w:val="MSGENFONTSTYLENAMETEMPLATEROLENUMBERMSGENFONTSTYLENAMEBYROLETEXT3"/>
-          <w:rFonts w:ascii="Tahoma" w:hAnsi="Tahoma" w:cs="Tahoma"/>
+          <w:rFonts w:ascii="Tahoma" w:hAnsi="Tahoma" w:cs="Tahoma" w:eastAsia="Tahoma"/>
           <w:sz w:val="22"/>
           <w:szCs w:val="22"/>
           <w:lang w:val="en-US"/>
@@ -1666,7 +1666,7 @@
       <w:r>
         <w:rPr>
           <w:rStyle w:val="MSGENFONTSTYLENAMETEMPLATEROLENUMBERMSGENFONTSTYLENAMEBYROLETEXT3"/>
-          <w:rFonts w:ascii="Tahoma" w:hAnsi="Tahoma" w:cs="Tahoma"/>
+          <w:rFonts w:ascii="Tahoma" w:hAnsi="Tahoma" w:cs="Tahoma" w:eastAsia="Tahoma"/>
           <w:b/>
           <w:bCs/>
           <w:i/>
@@ -1679,7 +1679,7 @@
       <w:r>
         <w:rPr>
           <w:rStyle w:val="MSGENFONTSTYLENAMETEMPLATEROLENUMBERMSGENFONTSTYLENAMEBYROLETEXT3"/>
-          <w:rFonts w:ascii="Tahoma" w:hAnsi="Tahoma" w:cs="Tahoma"/>
+          <w:rFonts w:ascii="Tahoma" w:hAnsi="Tahoma" w:cs="Tahoma" w:eastAsia="Tahoma"/>
           <w:b/>
           <w:bCs/>
           <w:i/>
@@ -1693,7 +1693,7 @@
       <w:r>
         <w:rPr>
           <w:rStyle w:val="MSGENFONTSTYLENAMETEMPLATEROLENUMBERMSGENFONTSTYLENAMEBYROLETEXT3"/>
-          <w:rFonts w:ascii="Tahoma" w:hAnsi="Tahoma" w:cs="Tahoma"/>
+          <w:rFonts w:ascii="Tahoma" w:hAnsi="Tahoma" w:cs="Tahoma" w:eastAsia="Tahoma"/>
           <w:sz w:val="22"/>
           <w:szCs w:val="22"/>
           <w:lang w:val="en-US" w:eastAsia="en-US"/>
@@ -1702,7 +1702,7 @@
       </w:r>
       <w:r>
         <w:rPr>
-          <w:rFonts w:ascii="Tahoma" w:hAnsi="Tahoma" w:cs="Tahoma"/>
+          <w:rFonts w:ascii="Tahoma" w:hAnsi="Tahoma" w:cs="Tahoma" w:eastAsia="Tahoma"/>
           <w:sz w:val="22"/>
           <w:szCs w:val="22"/>
           <w:shd w:val="clear" w:color="auto" w:fill="FFFFFF"/>
@@ -1712,7 +1712,7 @@
       </w:r>
       <w:r>
         <w:rPr>
-          <w:rFonts w:ascii="Tahoma" w:hAnsi="Tahoma" w:cs="Tahoma"/>
+          <w:rFonts w:ascii="Tahoma" w:hAnsi="Tahoma" w:cs="Tahoma" w:eastAsia="Tahoma"/>
           <w:sz w:val="22"/>
           <w:szCs w:val="22"/>
           <w:shd w:val="clear" w:color="auto" w:fill="FFFFFF"/>
@@ -1722,7 +1722,7 @@
       </w:r>
       <w:r>
         <w:rPr>
-          <w:rFonts w:ascii="Tahoma" w:hAnsi="Tahoma" w:cs="Tahoma"/>
+          <w:rFonts w:ascii="Tahoma" w:hAnsi="Tahoma" w:cs="Tahoma" w:eastAsia="Tahoma"/>
           <w:sz w:val="22"/>
           <w:szCs w:val="22"/>
           <w:shd w:val="clear" w:color="auto" w:fill="FFFFFF"/>
@@ -1739,7 +1739,7 @@
         <w:ind w:left="142" w:right="46"/>
         <w:rPr>
           <w:rStyle w:val="MSGENFONTSTYLENAMETEMPLATEROLEMSGENFONTSTYLENAMEBYROLEPICTURECAPTION"/>
-          <w:rFonts w:ascii="Tahoma" w:hAnsi="Tahoma" w:cs="Tahoma"/>
+          <w:rFonts w:ascii="Tahoma" w:hAnsi="Tahoma" w:cs="Tahoma" w:eastAsia="Tahoma"/>
           <w:b/>
           <w:bCs/>
           <w:i/>
@@ -1763,7 +1763,7 @@
       <w:r>
         <w:rPr>
           <w:rStyle w:val="MSGENFONTSTYLENAMETEMPLATEROLEMSGENFONTSTYLENAMEBYROLEPICTURECAPTION"/>
-          <w:rFonts w:ascii="Tahoma" w:hAnsi="Tahoma" w:cs="Tahoma"/>
+          <w:rFonts w:ascii="Tahoma" w:hAnsi="Tahoma" w:cs="Tahoma" w:eastAsia="Tahoma"/>
           <w:sz w:val="22"/>
           <w:szCs w:val="22"/>
         </w:rPr>
@@ -1795,7 +1795,7 @@
               <w:snapToGrid w:val="0"/>
               <w:jc w:val="center"/>
               <w:rPr>
-                <w:rFonts w:ascii="Tahoma" w:hAnsi="Tahoma" w:cs="Tahoma"/>
+                <w:rFonts w:ascii="Tahoma" w:hAnsi="Tahoma" w:cs="Tahoma" w:eastAsia="Tahoma"/>
                 <w:sz w:val="22"/>
                 <w:szCs w:val="22"/>
                 <w:lang w:val="id-ID"/>
@@ -1806,7 +1806,7 @@
             <w:pPr>
               <w:jc w:val="center"/>
               <w:rPr>
-                <w:rFonts w:ascii="Tahoma" w:hAnsi="Tahoma" w:cs="Tahoma"/>
+                <w:rFonts w:ascii="Tahoma" w:hAnsi="Tahoma" w:cs="Tahoma" w:eastAsia="Tahoma"/>
                 <w:sz w:val="22"/>
                 <w:szCs w:val="22"/>
                 <w:lang w:val="id-ID"/>
@@ -1817,7 +1817,7 @@
             <w:pPr>
               <w:jc w:val="center"/>
               <w:rPr>
-                <w:rFonts w:ascii="Tahoma" w:hAnsi="Tahoma" w:cs="Tahoma"/>
+                <w:rFonts w:ascii="Tahoma" w:hAnsi="Tahoma" w:cs="Tahoma" w:eastAsia="Tahoma"/>
                 <w:sz w:val="22"/>
                 <w:szCs w:val="22"/>
                 <w:lang w:val="id-ID"/>
@@ -1825,7 +1825,7 @@
             </w:pPr>
             <w:r>
               <w:rPr>
-                <w:rFonts w:ascii="Tahoma" w:hAnsi="Tahoma" w:cs="Tahoma"/>
+                <w:rFonts w:ascii="Tahoma" w:hAnsi="Tahoma" w:cs="Tahoma" w:eastAsia="Tahoma"/>
                 <w:sz w:val="22"/>
                 <w:szCs w:val="22"/>
                 <w:lang w:val="id-ID"/>
@@ -1839,7 +1839,7 @@
             </w:pPr>
             <w:r>
               <w:rPr>
-                <w:rFonts w:ascii="Tahoma" w:hAnsi="Tahoma" w:cs="Tahoma"/>
+                <w:rFonts w:ascii="Tahoma" w:hAnsi="Tahoma" w:cs="Tahoma" w:eastAsia="Tahoma"/>
                 <w:sz w:val="22"/>
                 <w:szCs w:val="22"/>
                 <w:lang w:val="id-ID"/>
@@ -1848,7 +1848,7 @@
             </w:r>
             <w:r>
               <w:rPr>
-                <w:rFonts w:ascii="Tahoma" w:hAnsi="Tahoma" w:cs="Tahoma"/>
+                <w:rFonts w:ascii="Tahoma" w:hAnsi="Tahoma" w:cs="Tahoma" w:eastAsia="Tahoma"/>
                 <w:sz w:val="22"/>
                 <w:szCs w:val="22"/>
                 <w:lang w:val="en-AU"/>
@@ -1860,7 +1860,7 @@
             <w:pPr>
               <w:jc w:val="center"/>
               <w:rPr>
-                <w:rFonts w:ascii="Tahoma" w:hAnsi="Tahoma" w:cs="Tahoma"/>
+                <w:rFonts w:ascii="Tahoma" w:hAnsi="Tahoma" w:cs="Tahoma" w:eastAsia="Tahoma"/>
                 <w:sz w:val="22"/>
                 <w:szCs w:val="22"/>
                 <w:lang w:val="en-AU"/>
@@ -1870,16 +1870,16 @@
           <w:p>
             <w:pPr>
               <w:rPr>
-                <w:rFonts w:ascii="Tahoma" w:hAnsi="Tahoma" w:cs="Tahoma"/>
-                <w:sz w:val="22"/>
-                <w:szCs w:val="22"/>
-              </w:rPr>
-            </w:pPr>
-          </w:p>
-          <w:p>
-            <w:pPr>
-              <w:rPr>
-                <w:rFonts w:ascii="Tahoma" w:hAnsi="Tahoma" w:cs="Tahoma"/>
+                <w:rFonts w:ascii="Tahoma" w:hAnsi="Tahoma" w:cs="Tahoma" w:eastAsia="Tahoma"/>
+                <w:sz w:val="22"/>
+                <w:szCs w:val="22"/>
+              </w:rPr>
+            </w:pPr>
+          </w:p>
+          <w:p>
+            <w:pPr>
+              <w:rPr>
+                <w:rFonts w:ascii="Tahoma" w:hAnsi="Tahoma" w:cs="Tahoma" w:eastAsia="Tahoma"/>
                 <w:sz w:val="36"/>
                 <w:szCs w:val="36"/>
               </w:rPr>
@@ -1889,7 +1889,7 @@
             <w:pPr>
               <w:jc w:val="center"/>
               <w:rPr>
-                <w:rFonts w:ascii="Tahoma" w:hAnsi="Tahoma" w:cs="Tahoma"/>
+                <w:rFonts w:ascii="Tahoma" w:hAnsi="Tahoma" w:cs="Tahoma" w:eastAsia="Tahoma"/>
                 <w:sz w:val="32"/>
                 <w:szCs w:val="32"/>
                 <w:u w:val="single"/>
@@ -1898,7 +1898,7 @@
             </w:pPr>
             <w:r>
               <w:rPr>
-                <w:rFonts w:ascii="Tahoma" w:hAnsi="Tahoma" w:cs="Tahoma"/>
+                <w:rFonts w:ascii="Tahoma" w:hAnsi="Tahoma" w:cs="Tahoma" w:eastAsia="Tahoma"/>
                 <w:sz w:val="22"/>
                 <w:szCs w:val="22"/>
                 <w:u w:val="single"/>
@@ -1911,14 +1911,14 @@
             <w:pPr>
               <w:jc w:val="center"/>
               <w:rPr>
-                <w:rFonts w:ascii="Tahoma" w:hAnsi="Tahoma" w:cs="Tahoma"/>
-                <w:sz w:val="22"/>
-                <w:szCs w:val="22"/>
-              </w:rPr>
-            </w:pPr>
-            <w:r>
-              <w:rPr>
-                <w:rFonts w:ascii="Tahoma" w:hAnsi="Tahoma" w:cs="Tahoma"/>
+                <w:rFonts w:ascii="Tahoma" w:hAnsi="Tahoma" w:cs="Tahoma" w:eastAsia="Tahoma"/>
+                <w:sz w:val="22"/>
+                <w:szCs w:val="22"/>
+              </w:rPr>
+            </w:pPr>
+            <w:r>
+              <w:rPr>
+                <w:rFonts w:ascii="Tahoma" w:hAnsi="Tahoma" w:cs="Tahoma" w:eastAsia="Tahoma"/>
                 <w:sz w:val="22"/>
                 <w:szCs w:val="22"/>
                 <w:lang w:val="id-ID"/>
@@ -1927,7 +1927,7 @@
             </w:r>
             <w:r>
               <w:rPr>
-                <w:rFonts w:ascii="Tahoma" w:hAnsi="Tahoma" w:cs="Tahoma"/>
+                <w:rFonts w:ascii="Tahoma" w:hAnsi="Tahoma" w:cs="Tahoma" w:eastAsia="Tahoma"/>
                 <w:sz w:val="22"/>
                 <w:szCs w:val="22"/>
               </w:rPr>
@@ -1935,7 +1935,7 @@
             </w:r>
             <w:r>
               <w:rPr>
-                <w:rFonts w:ascii="Tahoma" w:hAnsi="Tahoma" w:cs="Tahoma"/>
+                <w:rFonts w:ascii="Tahoma" w:hAnsi="Tahoma" w:cs="Tahoma" w:eastAsia="Tahoma"/>
                 <w:sz w:val="22"/>
                 <w:szCs w:val="22"/>
                 <w:lang w:val="id-ID"/>
@@ -1944,7 +1944,7 @@
             </w:r>
             <w:r>
               <w:rPr>
-                <w:rFonts w:ascii="Tahoma" w:hAnsi="Tahoma" w:cs="Tahoma"/>
+                <w:rFonts w:ascii="Tahoma" w:hAnsi="Tahoma" w:cs="Tahoma" w:eastAsia="Tahoma"/>
                 <w:sz w:val="22"/>
                 <w:szCs w:val="22"/>
               </w:rPr>
@@ -1952,7 +1952,7 @@
             </w:r>
             <w:r>
               <w:rPr>
-                <w:rFonts w:ascii="Tahoma" w:hAnsi="Tahoma" w:cs="Tahoma"/>
+                <w:rFonts w:ascii="Tahoma" w:hAnsi="Tahoma" w:cs="Tahoma" w:eastAsia="Tahoma"/>
                 <w:sz w:val="22"/>
                 <w:szCs w:val="22"/>
                 <w:shd w:val="clear" w:color="auto" w:fill="FFFFFF"/>
@@ -1969,7 +1969,7 @@
             <w:pPr>
               <w:jc w:val="center"/>
               <w:rPr>
-                <w:rFonts w:ascii="Tahoma" w:hAnsi="Tahoma" w:cs="Tahoma"/>
+                <w:rFonts w:ascii="Tahoma" w:hAnsi="Tahoma" w:cs="Tahoma" w:eastAsia="Tahoma"/>
                 <w:sz w:val="22"/>
                 <w:szCs w:val="22"/>
                 <w:lang w:val="id-ID"/>
@@ -1977,7 +1977,7 @@
             </w:pPr>
             <w:r>
               <w:rPr>
-                <w:rFonts w:ascii="Tahoma" w:hAnsi="Tahoma" w:cs="Tahoma"/>
+                <w:rFonts w:ascii="Tahoma" w:hAnsi="Tahoma" w:cs="Tahoma" w:eastAsia="Tahoma"/>
                 <w:sz w:val="22"/>
                 <w:szCs w:val="22"/>
                 <w:lang w:val="id-ID"/>
@@ -1991,7 +1991,7 @@
             </w:pPr>
             <w:r>
               <w:rPr>
-                <w:rFonts w:ascii="Tahoma" w:hAnsi="Tahoma" w:cs="Tahoma"/>
+                <w:rFonts w:ascii="Tahoma" w:hAnsi="Tahoma" w:cs="Tahoma" w:eastAsia="Tahoma"/>
                 <w:sz w:val="22"/>
                 <w:szCs w:val="22"/>
                 <w:lang w:val="id-ID"/>
@@ -2000,7 +2000,7 @@
             </w:r>
             <w:r>
               <w:rPr>
-                <w:rFonts w:ascii="Tahoma" w:hAnsi="Tahoma" w:cs="Tahoma"/>
+                <w:rFonts w:ascii="Tahoma" w:hAnsi="Tahoma" w:cs="Tahoma" w:eastAsia="Tahoma"/>
                 <w:sz w:val="22"/>
                 <w:szCs w:val="22"/>
                 <w:lang w:val="en-AU"/>
@@ -2012,7 +2012,7 @@
             <w:pPr>
               <w:jc w:val="center"/>
               <w:rPr>
-                <w:rFonts w:ascii="Tahoma" w:hAnsi="Tahoma" w:cs="Tahoma"/>
+                <w:rFonts w:ascii="Tahoma" w:hAnsi="Tahoma" w:cs="Tahoma" w:eastAsia="Tahoma"/>
                 <w:sz w:val="22"/>
                 <w:szCs w:val="22"/>
                 <w:lang w:val="en-AU"/>
@@ -2020,7 +2020,7 @@
             </w:pPr>
             <w:r>
               <w:rPr>
-                <w:rFonts w:ascii="Tahoma" w:hAnsi="Tahoma" w:cs="Tahoma"/>
+                <w:rFonts w:ascii="Tahoma" w:hAnsi="Tahoma" w:cs="Tahoma" w:eastAsia="Tahoma"/>
                 <w:sz w:val="22"/>
                 <w:szCs w:val="22"/>
                 <w:lang w:val="en-AU"/>
@@ -2032,7 +2032,7 @@
             <w:pPr>
               <w:jc w:val="center"/>
               <w:rPr>
-                <w:rFonts w:ascii="Tahoma" w:hAnsi="Tahoma" w:cs="Tahoma"/>
+                <w:rFonts w:ascii="Tahoma" w:hAnsi="Tahoma" w:cs="Tahoma" w:eastAsia="Tahoma"/>
                 <w:sz w:val="22"/>
                 <w:szCs w:val="22"/>
                 <w:lang w:val="en-AU"/>
@@ -2040,7 +2040,7 @@
             </w:pPr>
             <w:r>
               <w:rPr>
-                <w:rFonts w:ascii="Tahoma" w:hAnsi="Tahoma" w:cs="Tahoma"/>
+                <w:rFonts w:ascii="Tahoma" w:hAnsi="Tahoma" w:cs="Tahoma" w:eastAsia="Tahoma"/>
                 <w:sz w:val="22"/>
                 <w:szCs w:val="22"/>
                 <w:lang w:val="en-AU"/>
@@ -2052,7 +2052,7 @@
             <w:pPr>
               <w:jc w:val="center"/>
               <w:rPr>
-                <w:rFonts w:ascii="Tahoma" w:hAnsi="Tahoma" w:cs="Tahoma"/>
+                <w:rFonts w:ascii="Tahoma" w:hAnsi="Tahoma" w:cs="Tahoma" w:eastAsia="Tahoma"/>
                 <w:sz w:val="40"/>
                 <w:szCs w:val="40"/>
                 <w:lang w:eastAsia="en-US"/>
@@ -2083,7 +2083,7 @@
             <w:pPr>
               <w:jc w:val="center"/>
               <w:rPr>
-                <w:rFonts w:ascii="Tahoma" w:hAnsi="Tahoma" w:cs="Tahoma"/>
+                <w:rFonts w:ascii="Tahoma" w:hAnsi="Tahoma" w:cs="Tahoma" w:eastAsia="Tahoma"/>
                 <w:sz w:val="22"/>
                 <w:szCs w:val="22"/>
                 <w:u w:val="single"/>
@@ -2091,7 +2091,7 @@
             </w:pPr>
             <w:r>
               <w:rPr>
-                <w:rFonts w:ascii="Tahoma" w:hAnsi="Tahoma" w:cs="Tahoma"/>
+                <w:rFonts w:ascii="Tahoma" w:hAnsi="Tahoma" w:cs="Tahoma" w:eastAsia="Tahoma"/>
                 <w:sz w:val="22"/>
                 <w:szCs w:val="22"/>
                 <w:u w:val="single"/>
@@ -2103,7 +2103,7 @@
             <w:pPr>
               <w:jc w:val="center"/>
               <w:rPr>
-                <w:rFonts w:ascii="Tahoma" w:hAnsi="Tahoma" w:cs="Tahoma"/>
+                <w:rFonts w:ascii="Tahoma" w:hAnsi="Tahoma" w:cs="Tahoma" w:eastAsia="Tahoma"/>
                 <w:sz w:val="22"/>
                 <w:szCs w:val="22"/>
                 <w:lang w:val="id-ID"/>
@@ -2111,7 +2111,7 @@
             </w:pPr>
             <w:r>
               <w:rPr>
-                <w:rFonts w:ascii="Tahoma" w:hAnsi="Tahoma" w:cs="Tahoma"/>
+                <w:rFonts w:ascii="Tahoma" w:hAnsi="Tahoma" w:cs="Tahoma" w:eastAsia="Tahoma"/>
                 <w:sz w:val="22"/>
                 <w:szCs w:val="22"/>
               </w:rPr>
@@ -2119,7 +2119,7 @@
             </w:r>
             <w:r>
               <w:rPr>
-                <w:rFonts w:ascii="Tahoma" w:hAnsi="Tahoma" w:cs="Tahoma"/>
+                <w:rFonts w:ascii="Tahoma" w:hAnsi="Tahoma" w:cs="Tahoma" w:eastAsia="Tahoma"/>
                 <w:sz w:val="22"/>
                 <w:szCs w:val="22"/>
                 <w:shd w:val="clear" w:color="auto" w:fill="FFFFFF"/>
@@ -2136,7 +2136,7 @@
             <w:pPr>
               <w:jc w:val="center"/>
               <w:rPr>
-                <w:rFonts w:ascii="Tahoma" w:hAnsi="Tahoma" w:cs="Tahoma"/>
+                <w:rFonts w:ascii="Tahoma" w:hAnsi="Tahoma" w:cs="Tahoma" w:eastAsia="Tahoma"/>
                 <w:sz w:val="22"/>
                 <w:szCs w:val="22"/>
                 <w:lang w:val="id-ID"/>
@@ -2144,7 +2144,7 @@
             </w:pPr>
             <w:r>
               <w:rPr>
-                <w:rFonts w:ascii="Tahoma" w:hAnsi="Tahoma" w:cs="Tahoma"/>
+                <w:rFonts w:ascii="Tahoma" w:hAnsi="Tahoma" w:cs="Tahoma" w:eastAsia="Tahoma"/>
                 <w:sz w:val="22"/>
                 <w:szCs w:val="22"/>
                 <w:lang w:val="id-ID"/>
@@ -2158,7 +2158,7 @@
             </w:pPr>
             <w:r>
               <w:rPr>
-                <w:rFonts w:ascii="Tahoma" w:hAnsi="Tahoma" w:cs="Tahoma"/>
+                <w:rFonts w:ascii="Tahoma" w:hAnsi="Tahoma" w:cs="Tahoma" w:eastAsia="Tahoma"/>
                 <w:sz w:val="22"/>
                 <w:szCs w:val="22"/>
                 <w:lang w:val="id-ID"/>
@@ -2167,7 +2167,7 @@
             </w:r>
             <w:r>
               <w:rPr>
-                <w:rFonts w:ascii="Tahoma" w:hAnsi="Tahoma" w:cs="Tahoma"/>
+                <w:rFonts w:ascii="Tahoma" w:hAnsi="Tahoma" w:cs="Tahoma" w:eastAsia="Tahoma"/>
                 <w:sz w:val="22"/>
                 <w:szCs w:val="22"/>
                 <w:lang w:val="en-AU"/>
@@ -2179,7 +2179,7 @@
             <w:pPr>
               <w:jc w:val="center"/>
               <w:rPr>
-                <w:rFonts w:ascii="Tahoma" w:hAnsi="Tahoma" w:cs="Tahoma"/>
+                <w:rFonts w:ascii="Tahoma" w:hAnsi="Tahoma" w:cs="Tahoma" w:eastAsia="Tahoma"/>
                 <w:sz w:val="22"/>
                 <w:szCs w:val="22"/>
                 <w:lang w:val="en-AU"/>
@@ -2187,7 +2187,7 @@
             </w:pPr>
             <w:r>
               <w:rPr>
-                <w:rFonts w:ascii="Tahoma" w:hAnsi="Tahoma" w:cs="Tahoma"/>
+                <w:rFonts w:ascii="Tahoma" w:hAnsi="Tahoma" w:cs="Tahoma" w:eastAsia="Tahoma"/>
                 <w:sz w:val="22"/>
                 <w:szCs w:val="22"/>
                 <w:lang w:val="en-AU"/>
@@ -2199,7 +2199,7 @@
             <w:pPr>
               <w:jc w:val="center"/>
               <w:rPr>
-                <w:rFonts w:ascii="Tahoma" w:hAnsi="Tahoma" w:cs="Tahoma"/>
+                <w:rFonts w:ascii="Tahoma" w:hAnsi="Tahoma" w:cs="Tahoma" w:eastAsia="Tahoma"/>
                 <w:sz w:val="22"/>
                 <w:szCs w:val="22"/>
                 <w:lang w:eastAsia="en-US"/>
@@ -2220,7 +2220,7 @@
             <w:pPr>
               <w:jc w:val="center"/>
               <w:rPr>
-                <w:rFonts w:ascii="Tahoma" w:hAnsi="Tahoma" w:cs="Tahoma"/>
+                <w:rFonts w:ascii="Tahoma" w:hAnsi="Tahoma" w:cs="Tahoma" w:eastAsia="Tahoma"/>
                 <w:sz w:val="22"/>
                 <w:szCs w:val="22"/>
                 <w:lang w:eastAsia="en-US"/>
@@ -2231,7 +2231,7 @@
             <w:pPr>
               <w:jc w:val="center"/>
               <w:rPr>
-                <w:rFonts w:ascii="Tahoma" w:hAnsi="Tahoma" w:cs="Tahoma"/>
+                <w:rFonts w:ascii="Tahoma" w:hAnsi="Tahoma" w:cs="Tahoma" w:eastAsia="Tahoma"/>
                 <w:sz w:val="22"/>
                 <w:szCs w:val="22"/>
                 <w:u w:val="single"/>
@@ -2239,7 +2239,7 @@
             </w:pPr>
             <w:r>
               <w:rPr>
-                <w:rFonts w:ascii="Tahoma" w:hAnsi="Tahoma" w:cs="Tahoma"/>
+                <w:rFonts w:ascii="Tahoma" w:hAnsi="Tahoma" w:cs="Tahoma" w:eastAsia="Tahoma"/>
                 <w:sz w:val="22"/>
                 <w:szCs w:val="22"/>
                 <w:u w:val="single"/>
@@ -2251,14 +2251,14 @@
             <w:pPr>
               <w:jc w:val="center"/>
               <w:rPr>
-                <w:rFonts w:ascii="Tahoma" w:hAnsi="Tahoma" w:cs="Tahoma"/>
-                <w:sz w:val="22"/>
-                <w:szCs w:val="22"/>
-              </w:rPr>
-            </w:pPr>
-            <w:r>
-              <w:rPr>
-                <w:rFonts w:ascii="Tahoma" w:hAnsi="Tahoma" w:cs="Tahoma"/>
+                <w:rFonts w:ascii="Tahoma" w:hAnsi="Tahoma" w:cs="Tahoma" w:eastAsia="Tahoma"/>
+                <w:sz w:val="22"/>
+                <w:szCs w:val="22"/>
+              </w:rPr>
+            </w:pPr>
+            <w:r>
+              <w:rPr>
+                <w:rFonts w:ascii="Tahoma" w:hAnsi="Tahoma" w:cs="Tahoma" w:eastAsia="Tahoma"/>
                 <w:sz w:val="22"/>
                 <w:szCs w:val="22"/>
               </w:rPr>
@@ -2278,7 +2278,7 @@
             <w:pPr>
               <w:snapToGrid w:val="0"/>
               <w:rPr>
-                <w:rFonts w:ascii="Tahoma" w:hAnsi="Tahoma" w:cs="Tahoma"/>
+                <w:rFonts w:ascii="Tahoma" w:hAnsi="Tahoma" w:cs="Tahoma" w:eastAsia="Tahoma"/>
                 <w:sz w:val="22"/>
                 <w:szCs w:val="22"/>
               </w:rPr>
@@ -2299,14 +2299,14 @@
                 <w:tab w:val="left" w:pos="8265"/>
               </w:tabs>
               <w:rPr>
-                <w:rFonts w:ascii="Tahoma" w:hAnsi="Tahoma" w:cs="Tahoma"/>
-                <w:sz w:val="22"/>
-                <w:szCs w:val="22"/>
-              </w:rPr>
-            </w:pPr>
-            <w:r>
-              <w:rPr>
-                <w:rFonts w:ascii="Tahoma" w:hAnsi="Tahoma" w:cs="Tahoma"/>
+                <w:rFonts w:ascii="Tahoma" w:hAnsi="Tahoma" w:cs="Tahoma" w:eastAsia="Tahoma"/>
+                <w:sz w:val="22"/>
+                <w:szCs w:val="22"/>
+              </w:rPr>
+            </w:pPr>
+            <w:r>
+              <w:rPr>
+                <w:rFonts w:ascii="Tahoma" w:hAnsi="Tahoma" w:cs="Tahoma" w:eastAsia="Tahoma"/>
                 <w:sz w:val="22"/>
                 <w:szCs w:val="22"/>
               </w:rPr>
@@ -2327,14 +2327,14 @@
                 <w:tab w:val="left" w:pos="8265"/>
               </w:tabs>
               <w:rPr>
-                <w:rFonts w:ascii="Tahoma" w:hAnsi="Tahoma" w:cs="Tahoma"/>
-                <w:sz w:val="22"/>
-                <w:szCs w:val="22"/>
-              </w:rPr>
-            </w:pPr>
-            <w:r>
-              <w:rPr>
-                <w:rFonts w:ascii="Tahoma" w:hAnsi="Tahoma" w:cs="Tahoma"/>
+                <w:rFonts w:ascii="Tahoma" w:hAnsi="Tahoma" w:cs="Tahoma" w:eastAsia="Tahoma"/>
+                <w:sz w:val="22"/>
+                <w:szCs w:val="22"/>
+              </w:rPr>
+            </w:pPr>
+            <w:r>
+              <w:rPr>
+                <w:rFonts w:ascii="Tahoma" w:hAnsi="Tahoma" w:cs="Tahoma" w:eastAsia="Tahoma"/>
                 <w:sz w:val="22"/>
                 <w:szCs w:val="22"/>
               </w:rPr>
@@ -2343,7 +2343,7 @@
             </w:r>
             <w:r>
               <w:rPr>
-                <w:rFonts w:ascii="Tahoma" w:hAnsi="Tahoma" w:cs="Tahoma"/>
+                <w:rFonts w:ascii="Tahoma" w:hAnsi="Tahoma" w:cs="Tahoma" w:eastAsia="Tahoma"/>
                 <w:sz w:val="22"/>
                 <w:szCs w:val="22"/>
               </w:rPr>
@@ -2365,7 +2365,7 @@
               <w:snapToGrid w:val="0"/>
               <w:ind w:firstLine="993"/>
               <w:rPr>
-                <w:rFonts w:ascii="Tahoma" w:hAnsi="Tahoma" w:cs="Tahoma"/>
+                <w:rFonts w:ascii="Tahoma" w:hAnsi="Tahoma" w:cs="Tahoma" w:eastAsia="Tahoma"/>
                 <w:sz w:val="10"/>
                 <w:szCs w:val="10"/>
                 <w:lang w:eastAsia="en-US"/>
@@ -2426,7 +2426,7 @@
             <w:pPr>
               <w:jc w:val="center"/>
               <w:rPr>
-                <w:rFonts w:ascii="Tahoma" w:hAnsi="Tahoma" w:cs="Tahoma"/>
+                <w:rFonts w:ascii="Tahoma" w:hAnsi="Tahoma" w:cs="Tahoma" w:eastAsia="Tahoma"/>
                 <w:sz w:val="22"/>
                 <w:szCs w:val="22"/>
                 <w:lang w:val="id-ID"/>
@@ -2434,7 +2434,7 @@
             </w:pPr>
             <w:r>
               <w:rPr>
-                <w:rFonts w:ascii="Tahoma" w:hAnsi="Tahoma" w:cs="Tahoma"/>
+                <w:rFonts w:ascii="Tahoma" w:hAnsi="Tahoma" w:cs="Tahoma" w:eastAsia="Tahoma"/>
                 <w:sz w:val="22"/>
                 <w:szCs w:val="22"/>
                 <w:u w:val="single"/>
@@ -2445,7 +2445,7 @@
             </w:r>
             <w:r>
               <w:rPr>
-                <w:rFonts w:ascii="Tahoma" w:hAnsi="Tahoma" w:cs="Tahoma"/>
+                <w:rFonts w:ascii="Tahoma" w:hAnsi="Tahoma" w:cs="Tahoma" w:eastAsia="Tahoma"/>
                 <w:sz w:val="22"/>
                 <w:szCs w:val="22"/>
                 <w:lang w:val="id-ID"/>
@@ -2457,7 +2457,7 @@
             <w:pPr>
               <w:jc w:val="center"/>
               <w:rPr>
-                <w:rFonts w:ascii="Tahoma" w:hAnsi="Tahoma" w:cs="Tahoma"/>
+                <w:rFonts w:ascii="Tahoma" w:hAnsi="Tahoma" w:cs="Tahoma" w:eastAsia="Tahoma"/>
                 <w:sz w:val="22"/>
                 <w:szCs w:val="22"/>
                 <w:lang w:val="en-GB"/>
@@ -2465,7 +2465,7 @@
             </w:pPr>
             <w:r>
               <w:rPr>
-                <w:rFonts w:ascii="Tahoma" w:hAnsi="Tahoma" w:cs="Tahoma"/>
+                <w:rFonts w:ascii="Tahoma" w:hAnsi="Tahoma" w:cs="Tahoma" w:eastAsia="Tahoma"/>
                 <w:sz w:val="22"/>
                 <w:szCs w:val="22"/>
                 <w:lang w:val="id-ID"/>
@@ -2474,7 +2474,7 @@
             </w:r>
             <w:r>
               <w:rPr>
-                <w:rFonts w:ascii="Tahoma" w:hAnsi="Tahoma" w:cs="Tahoma"/>
+                <w:rFonts w:ascii="Tahoma" w:hAnsi="Tahoma" w:cs="Tahoma" w:eastAsia="Tahoma"/>
                 <w:sz w:val="22"/>
                 <w:szCs w:val="22"/>
               </w:rPr>
@@ -2482,7 +2482,7 @@
             </w:r>
             <w:r>
               <w:rPr>
-                <w:rFonts w:ascii="Tahoma" w:hAnsi="Tahoma" w:cs="Tahoma"/>
+                <w:rFonts w:ascii="Tahoma" w:hAnsi="Tahoma" w:cs="Tahoma" w:eastAsia="Tahoma"/>
                 <w:sz w:val="22"/>
                 <w:szCs w:val="22"/>
                 <w:lang w:val="id-ID"/>
@@ -2491,7 +2491,7 @@
             </w:r>
             <w:r>
               <w:rPr>
-                <w:rFonts w:ascii="Tahoma" w:hAnsi="Tahoma" w:cs="Tahoma"/>
+                <w:rFonts w:ascii="Tahoma" w:hAnsi="Tahoma" w:cs="Tahoma" w:eastAsia="Tahoma"/>
                 <w:sz w:val="22"/>
                 <w:szCs w:val="22"/>
                 <w:shd w:val="clear" w:color="auto" w:fill="FFFFFF"/>
@@ -2510,7 +2510,7 @@
               <w:snapToGrid w:val="0"/>
               <w:jc w:val="center"/>
               <w:rPr>
-                <w:rFonts w:ascii="Tahoma" w:hAnsi="Tahoma" w:cs="Tahoma"/>
+                <w:rFonts w:ascii="Tahoma" w:hAnsi="Tahoma" w:cs="Tahoma" w:eastAsia="Tahoma"/>
                 <w:sz w:val="22"/>
                 <w:szCs w:val="22"/>
                 <w:lang w:eastAsia="en-US"/>
@@ -2561,7 +2561,7 @@
             <w:pPr>
               <w:jc w:val="center"/>
               <w:rPr>
-                <w:rFonts w:ascii="Tahoma" w:hAnsi="Tahoma" w:cs="Tahoma"/>
+                <w:rFonts w:ascii="Tahoma" w:hAnsi="Tahoma" w:cs="Tahoma" w:eastAsia="Tahoma"/>
                 <w:sz w:val="22"/>
                 <w:szCs w:val="22"/>
                 <w:u w:val="single"/>
@@ -2571,7 +2571,7 @@
             </w:pPr>
             <w:r>
               <w:rPr>
-                <w:rFonts w:ascii="Tahoma" w:hAnsi="Tahoma" w:cs="Tahoma"/>
+                <w:rFonts w:ascii="Tahoma" w:hAnsi="Tahoma" w:cs="Tahoma" w:eastAsia="Tahoma"/>
                 <w:sz w:val="22"/>
                 <w:szCs w:val="22"/>
                 <w:u w:val="single"/>
@@ -2590,7 +2590,7 @@
             </w:pPr>
             <w:r>
               <w:rPr>
-                <w:rFonts w:ascii="Tahoma" w:hAnsi="Tahoma" w:cs="Tahoma"/>
+                <w:rFonts w:ascii="Tahoma" w:hAnsi="Tahoma" w:cs="Tahoma" w:eastAsia="Tahoma"/>
                 <w:sz w:val="22"/>
                 <w:szCs w:val="22"/>
                 <w:lang w:val="id-ID"/>
@@ -2599,7 +2599,7 @@
             </w:r>
             <w:r>
               <w:rPr>
-                <w:rFonts w:ascii="Tahoma" w:hAnsi="Tahoma" w:cs="Tahoma"/>
+                <w:rFonts w:ascii="Tahoma" w:hAnsi="Tahoma" w:cs="Tahoma" w:eastAsia="Tahoma"/>
                 <w:sz w:val="22"/>
                 <w:szCs w:val="22"/>
               </w:rPr>
@@ -2607,7 +2607,7 @@
             </w:r>
             <w:r>
               <w:rPr>
-                <w:rFonts w:ascii="Tahoma" w:hAnsi="Tahoma" w:cs="Tahoma"/>
+                <w:rFonts w:ascii="Tahoma" w:hAnsi="Tahoma" w:cs="Tahoma" w:eastAsia="Tahoma"/>
                 <w:sz w:val="22"/>
                 <w:szCs w:val="22"/>
                 <w:lang w:val="id-ID"/>
@@ -2616,7 +2616,7 @@
             </w:r>
             <w:r>
               <w:rPr>
-                <w:rFonts w:ascii="Tahoma" w:hAnsi="Tahoma" w:cs="Tahoma"/>
+                <w:rFonts w:ascii="Tahoma" w:hAnsi="Tahoma" w:cs="Tahoma" w:eastAsia="Tahoma"/>
                 <w:sz w:val="22"/>
                 <w:szCs w:val="22"/>
                 <w:shd w:val="clear" w:color="auto" w:fill="FFFFFF"/>
@@ -2664,7 +2664,7 @@
             <w:pPr>
               <w:jc w:val="center"/>
               <w:rPr>
-                <w:rFonts w:ascii="Tahoma" w:hAnsi="Tahoma" w:cs="Tahoma"/>
+                <w:rFonts w:ascii="Tahoma" w:hAnsi="Tahoma" w:cs="Tahoma" w:eastAsia="Tahoma"/>
                 <w:sz w:val="22"/>
                 <w:szCs w:val="22"/>
                 <w:lang w:eastAsia="en-US"/>
@@ -2675,7 +2675,7 @@
             <w:pPr>
               <w:jc w:val="center"/>
               <w:rPr>
-                <w:rFonts w:ascii="Tahoma" w:hAnsi="Tahoma" w:cs="Tahoma"/>
+                <w:rFonts w:ascii="Tahoma" w:hAnsi="Tahoma" w:cs="Tahoma" w:eastAsia="Tahoma"/>
                 <w:sz w:val="22"/>
                 <w:szCs w:val="22"/>
                 <w:u w:val="single"/>
@@ -2683,7 +2683,7 @@
             </w:pPr>
             <w:r>
               <w:rPr>
-                <w:rFonts w:ascii="Tahoma" w:hAnsi="Tahoma" w:cs="Tahoma"/>
+                <w:rFonts w:ascii="Tahoma" w:hAnsi="Tahoma" w:cs="Tahoma" w:eastAsia="Tahoma"/>
                 <w:sz w:val="22"/>
                 <w:szCs w:val="22"/>
                 <w:u w:val="single"/>
@@ -2693,7 +2693,7 @@
             </w:r>
             <w:r>
               <w:rPr>
-                <w:rFonts w:ascii="Tahoma" w:hAnsi="Tahoma" w:cs="Tahoma"/>
+                <w:rFonts w:ascii="Tahoma" w:hAnsi="Tahoma" w:cs="Tahoma" w:eastAsia="Tahoma"/>
                 <w:sz w:val="22"/>
                 <w:szCs w:val="22"/>
                 <w:u w:val="single"/>
@@ -2703,7 +2703,7 @@
             </w:r>
             <w:r>
               <w:rPr>
-                <w:rFonts w:ascii="Tahoma" w:hAnsi="Tahoma" w:cs="Tahoma"/>
+                <w:rFonts w:ascii="Tahoma" w:hAnsi="Tahoma" w:cs="Tahoma" w:eastAsia="Tahoma"/>
                 <w:sz w:val="22"/>
                 <w:szCs w:val="22"/>
                 <w:u w:val="single"/>
@@ -2716,14 +2716,14 @@
             <w:pPr>
               <w:jc w:val="center"/>
               <w:rPr>
-                <w:rFonts w:ascii="Tahoma" w:hAnsi="Tahoma" w:cs="Tahoma"/>
-                <w:sz w:val="22"/>
-                <w:szCs w:val="22"/>
-              </w:rPr>
-            </w:pPr>
-            <w:r>
-              <w:rPr>
-                <w:rFonts w:ascii="Tahoma" w:hAnsi="Tahoma" w:cs="Tahoma"/>
+                <w:rFonts w:ascii="Tahoma" w:hAnsi="Tahoma" w:cs="Tahoma" w:eastAsia="Tahoma"/>
+                <w:sz w:val="22"/>
+                <w:szCs w:val="22"/>
+              </w:rPr>
+            </w:pPr>
+            <w:r>
+              <w:rPr>
+                <w:rFonts w:ascii="Tahoma" w:hAnsi="Tahoma" w:cs="Tahoma" w:eastAsia="Tahoma"/>
                 <w:sz w:val="22"/>
                 <w:szCs w:val="22"/>
                 <w:lang w:val="id-ID"/>
@@ -2732,7 +2732,7 @@
             </w:r>
             <w:r>
               <w:rPr>
-                <w:rFonts w:ascii="Tahoma" w:hAnsi="Tahoma" w:cs="Tahoma"/>
+                <w:rFonts w:ascii="Tahoma" w:hAnsi="Tahoma" w:cs="Tahoma" w:eastAsia="Tahoma"/>
                 <w:sz w:val="22"/>
                 <w:szCs w:val="22"/>
               </w:rPr>
@@ -2740,7 +2740,7 @@
             </w:r>
             <w:r>
               <w:rPr>
-                <w:rFonts w:ascii="Tahoma" w:hAnsi="Tahoma" w:cs="Tahoma"/>
+                <w:rFonts w:ascii="Tahoma" w:hAnsi="Tahoma" w:cs="Tahoma" w:eastAsia="Tahoma"/>
                 <w:sz w:val="22"/>
                 <w:szCs w:val="22"/>
                 <w:lang w:val="id-ID"/>
@@ -2749,7 +2749,7 @@
             </w:r>
             <w:r>
               <w:rPr>
-                <w:rFonts w:ascii="Tahoma" w:hAnsi="Tahoma" w:cs="Tahoma"/>
+                <w:rFonts w:ascii="Tahoma" w:hAnsi="Tahoma" w:cs="Tahoma" w:eastAsia="Tahoma"/>
                 <w:sz w:val="22"/>
                 <w:szCs w:val="22"/>
                 <w:lang w:val="id-ID" w:eastAsia="en-US"/>
@@ -2758,7 +2758,7 @@
             </w:r>
             <w:r>
               <w:rPr>
-                <w:rFonts w:ascii="Tahoma" w:hAnsi="Tahoma" w:cs="Tahoma"/>
+                <w:rFonts w:ascii="Tahoma" w:hAnsi="Tahoma" w:cs="Tahoma" w:eastAsia="Tahoma"/>
                 <w:sz w:val="22"/>
                 <w:szCs w:val="22"/>
                 <w:lang w:eastAsia="en-US"/>
@@ -2779,7 +2779,7 @@
             <w:pPr>
               <w:snapToGrid w:val="0"/>
               <w:rPr>
-                <w:rFonts w:ascii="Tahoma" w:hAnsi="Tahoma" w:cs="Tahoma"/>
+                <w:rFonts w:ascii="Tahoma" w:hAnsi="Tahoma" w:cs="Tahoma" w:eastAsia="Tahoma"/>
                 <w:sz w:val="22"/>
                 <w:szCs w:val="22"/>
               </w:rPr>
@@ -2816,7 +2816,7 @@
   <w:docDefaults>
     <w:rPrDefault>
       <w:rPr>
-        <w:rFonts w:ascii="Liberation Serif" w:eastAsia="Noto Serif CJK SC" w:hAnsi="Liberation Serif" w:cs="FreeSans"/>
+        <w:rFonts w:ascii="Tahoma" w:eastAsia="Tahoma" w:hAnsi="Tahoma" w:cs="Tahoma"/>
         <w:lang w:val="en-US" w:eastAsia="zh-CN" w:bidi="ar-SA"/>
       </w:rPr>
     </w:rPrDefault>
@@ -3208,7 +3208,7 @@
       <w:suppressAutoHyphens/>
     </w:pPr>
     <w:rPr>
-      <w:rFonts w:ascii="Times New Roman" w:eastAsia="Times New Roman" w:hAnsi="Times New Roman" w:cs="Times New Roman"/>
+      <w:rFonts w:ascii="Tahoma" w:eastAsia="Tahoma" w:hAnsi="Tahoma" w:cs="Tahoma"/>
       <w:color w:val="000000"/>
       <w:sz w:val="24"/>
       <w:szCs w:val="24"/>
@@ -3245,7 +3245,7 @@
     <w:name w:val="WW8Num1z0"/>
     <w:qFormat/>
     <w:rPr>
-      <w:rFonts w:ascii="Arial" w:hAnsi="Arial" w:cs="Arial"/>
+      <w:rFonts w:ascii="Tahoma" w:hAnsi="Tahoma" w:cs="Tahoma" w:eastAsia="Tahoma"/>
       <w:b w:val="0"/>
       <w:bCs w:val="0"/>
       <w:i w:val="0"/>
@@ -3268,7 +3268,7 @@
     <w:name w:val="MSG_EN_FONT_STYLE_NAME_TEMPLATE_ROLE_NUMBER MSG_EN_FONT_STYLE_NAME_BY_ROLE_TEXT 2_"/>
     <w:qFormat/>
     <w:rPr>
-      <w:rFonts w:ascii="Arial" w:hAnsi="Arial" w:cs="Arial"/>
+      <w:rFonts w:ascii="Tahoma" w:hAnsi="Tahoma" w:cs="Tahoma" w:eastAsia="Tahoma"/>
       <w:sz w:val="21"/>
       <w:szCs w:val="21"/>
       <w:shd w:val="clear" w:color="auto" w:fill="FFFFFF"/>
@@ -3278,7 +3278,7 @@
     <w:name w:val="MSG_EN_FONT_STYLE_NAME_TEMPLATE_ROLE_NUMBER MSG_EN_FONT_STYLE_NAME_BY_ROLE_TEXT 3_"/>
     <w:qFormat/>
     <w:rPr>
-      <w:rFonts w:ascii="Arial" w:hAnsi="Arial" w:cs="Arial"/>
+      <w:rFonts w:ascii="Tahoma" w:hAnsi="Tahoma" w:cs="Tahoma" w:eastAsia="Tahoma"/>
       <w:b/>
       <w:bCs/>
       <w:i/>
@@ -3292,7 +3292,7 @@
     <w:name w:val="MSG_EN_FONT_STYLE_NAME_TEMPLATE_ROLE_NUMBER MSG_EN_FONT_STYLE_NAME_BY_ROLE_TEXT 3 + MSG_EN_FONT_STYLE_MODIFER_SIZE 5"/>
     <w:qFormat/>
     <w:rPr>
-      <w:rFonts w:ascii="Arial" w:hAnsi="Arial" w:cs="Arial"/>
+      <w:rFonts w:ascii="Tahoma" w:hAnsi="Tahoma" w:cs="Tahoma" w:eastAsia="Tahoma"/>
       <w:b w:val="0"/>
       <w:bCs w:val="0"/>
       <w:i w:val="0"/>
@@ -3306,7 +3306,7 @@
     <w:name w:val="MSG_EN_FONT_STYLE_NAME_TEMPLATE_ROLE MSG_EN_FONT_STYLE_NAME_BY_ROLE_PICTURE_CAPTION_"/>
     <w:qFormat/>
     <w:rPr>
-      <w:rFonts w:ascii="Arial" w:hAnsi="Arial" w:cs="Arial"/>
+      <w:rFonts w:ascii="Tahoma" w:hAnsi="Tahoma" w:cs="Tahoma" w:eastAsia="Tahoma"/>
       <w:sz w:val="21"/>
       <w:szCs w:val="21"/>
       <w:shd w:val="clear" w:color="auto" w:fill="FFFFFF"/>
@@ -3316,7 +3316,7 @@
     <w:name w:val="MSG_EN_FONT_STYLE_NAME_TEMPLATE_ROLE MSG_EN_FONT_STYLE_NAME_BY_ROLE_PICTURE_CAPTION"/>
     <w:qFormat/>
     <w:rPr>
-      <w:rFonts w:ascii="Arial" w:hAnsi="Arial" w:cs="Arial"/>
+      <w:rFonts w:ascii="Tahoma" w:hAnsi="Tahoma" w:cs="Tahoma" w:eastAsia="Tahoma"/>
       <w:sz w:val="21"/>
       <w:szCs w:val="21"/>
       <w:u w:val="single"/>
@@ -3327,7 +3327,7 @@
     <w:name w:val="Balloon Text Char"/>
     <w:qFormat/>
     <w:rPr>
-      <w:rFonts w:ascii="Tahoma" w:eastAsia="Times New Roman" w:hAnsi="Tahoma" w:cs="Tahoma"/>
+      <w:rFonts w:ascii="Tahoma" w:eastAsia="Tahoma" w:hAnsi="Tahoma" w:cs="Tahoma"/>
       <w:color w:val="000000"/>
       <w:sz w:val="16"/>
       <w:szCs w:val="16"/>
@@ -3338,7 +3338,7 @@
     <w:name w:val="Header Char"/>
     <w:qFormat/>
     <w:rPr>
-      <w:rFonts w:ascii="Times New Roman" w:eastAsia="Times New Roman" w:hAnsi="Times New Roman" w:cs="Times New Roman"/>
+      <w:rFonts w:ascii="Tahoma" w:eastAsia="Tahoma" w:hAnsi="Tahoma" w:cs="Tahoma"/>
       <w:color w:val="000000"/>
       <w:sz w:val="24"/>
       <w:szCs w:val="24"/>
@@ -3349,7 +3349,7 @@
     <w:name w:val="Footer Char"/>
     <w:qFormat/>
     <w:rPr>
-      <w:rFonts w:ascii="Times New Roman" w:eastAsia="Times New Roman" w:hAnsi="Times New Roman" w:cs="Times New Roman"/>
+      <w:rFonts w:ascii="Tahoma" w:eastAsia="Tahoma" w:hAnsi="Tahoma" w:cs="Tahoma"/>
       <w:color w:val="000000"/>
       <w:sz w:val="24"/>
       <w:szCs w:val="24"/>
@@ -3366,7 +3366,7 @@
       <w:spacing w:before="240" w:after="120"/>
     </w:pPr>
     <w:rPr>
-      <w:rFonts w:ascii="Liberation Sans" w:eastAsia="Noto Sans CJK SC" w:hAnsi="Liberation Sans" w:cs="FreeSans"/>
+      <w:rFonts w:ascii="Tahoma" w:eastAsia="Tahoma" w:hAnsi="Tahoma" w:cs="Tahoma"/>
       <w:sz w:val="28"/>
       <w:szCs w:val="28"/>
     </w:rPr>
@@ -3382,7 +3382,7 @@
     <w:name w:val="List"/>
     <w:basedOn w:val="BodyText"/>
     <w:rPr>
-      <w:rFonts w:cs="FreeSans"/>
+      <w:rFonts w:cs="Tahoma" w:ascii="Tahoma" w:hAnsi="Tahoma" w:eastAsia="Tahoma"/>
     </w:rPr>
   </w:style>
   <w:style w:type="paragraph" w:styleId="Caption">
@@ -3394,7 +3394,7 @@
       <w:spacing w:before="120" w:after="120"/>
     </w:pPr>
     <w:rPr>
-      <w:rFonts w:cs="FreeSans"/>
+      <w:rFonts w:cs="Tahoma" w:ascii="Tahoma" w:hAnsi="Tahoma" w:eastAsia="Tahoma"/>
       <w:i/>
       <w:iCs/>
     </w:rPr>
@@ -3407,7 +3407,7 @@
       <w:suppressLineNumbers/>
     </w:pPr>
     <w:rPr>
-      <w:rFonts w:cs="FreeSans"/>
+      <w:rFonts w:cs="Tahoma" w:ascii="Tahoma" w:hAnsi="Tahoma" w:eastAsia="Tahoma"/>
     </w:rPr>
   </w:style>
   <w:style w:type="paragraph" w:customStyle="1" w:styleId="MSGENFONTSTYLENAMETEMPLATEROLENUMBERMSGENFONTSTYLENAMEBYROLETEXT20">
@@ -3420,7 +3420,7 @@
       <w:jc w:val="center"/>
     </w:pPr>
     <w:rPr>
-      <w:rFonts w:ascii="Arial" w:eastAsia="Calibri" w:hAnsi="Arial" w:cs="Arial"/>
+      <w:rFonts w:ascii="Tahoma" w:eastAsia="Tahoma" w:hAnsi="Tahoma" w:cs="Tahoma"/>
       <w:sz w:val="21"/>
       <w:szCs w:val="21"/>
       <w:lang w:val="id-ID"/>
@@ -3436,7 +3436,7 @@
       <w:jc w:val="both"/>
     </w:pPr>
     <w:rPr>
-      <w:rFonts w:ascii="Arial" w:eastAsia="Calibri" w:hAnsi="Arial" w:cs="Arial"/>
+      <w:rFonts w:ascii="Tahoma" w:eastAsia="Tahoma" w:hAnsi="Tahoma" w:cs="Tahoma"/>
       <w:b/>
       <w:bCs/>
       <w:i/>
@@ -3455,7 +3455,7 @@
       <w:spacing w:line="278" w:lineRule="exact"/>
     </w:pPr>
     <w:rPr>
-      <w:rFonts w:ascii="Arial" w:eastAsia="Calibri" w:hAnsi="Arial" w:cs="Arial"/>
+      <w:rFonts w:ascii="Tahoma" w:eastAsia="Tahoma" w:hAnsi="Tahoma" w:cs="Tahoma"/>
       <w:sz w:val="21"/>
       <w:szCs w:val="21"/>
       <w:lang w:val="id-ID"/>
@@ -3466,7 +3466,7 @@
     <w:basedOn w:val="Normal"/>
     <w:qFormat/>
     <w:rPr>
-      <w:rFonts w:ascii="Tahoma" w:hAnsi="Tahoma" w:cs="Tahoma"/>
+      <w:rFonts w:ascii="Tahoma" w:hAnsi="Tahoma" w:cs="Tahoma" w:eastAsia="Tahoma"/>
       <w:sz w:val="16"/>
       <w:szCs w:val="16"/>
     </w:rPr>

</xml_diff>

<commit_message>
feat: template Berita Acara Sumpah pakai Arial + kembalikan kurawal placeholder
- Template diperbarui (oleh user) dari Tahoma ke Arial: teks italic kini
  memakai Arial-ItalicMT/Arial-BoldItalicMT asli, tidak ada lagi kemiringan
  sintetis 19 derajat yang membuat glyph tampak 'terbelah'
- Islam.docx & Hindu.docx kehilangan kurung kurawal placeholder saat diedit
  di Word ({nama_diambil_sumpah} -> nama_diambil_sumpah), dikembalikan via
  script agar substitusi berfungsi

Terverifikasi kelima template: HTTP 200, 1 halaman, placeholder 2/2/1 utuh,
hanya font Arial tertanam di PDF, tidak ada sisa placeholder pasca-substitusi.

Co-Authored-By: Claude Opus 4.8 <noreply@anthropic.com>
</commit_message>
<xml_diff>
--- a/templates/CEK/Budha.docx
+++ b/templates/CEK/Budha.docx
@@ -10,7 +10,7 @@
         <w:ind w:left="60"/>
         <w:rPr>
           <w:rStyle w:val="MSGENFONTSTYLENAMETEMPLATEROLENUMBERMSGENFONTSTYLENAMEBYROLETEXT2"/>
-          <w:rFonts w:ascii="Tahoma" w:hAnsi="Tahoma" w:cs="Tahoma" w:eastAsia="Tahoma"/>
+          <w:rFonts w:ascii="Arial" w:hAnsi="Arial" w:cs="Arial"/>
           <w:b/>
           <w:sz w:val="24"/>
           <w:szCs w:val="24"/>
@@ -19,31 +19,140 @@
       </w:pPr>
       <w:r>
         <w:rPr>
+          <w:rFonts w:ascii="Arial" w:hAnsi="Arial" w:cs="Arial"/>
+          <w:b/>
           <w:noProof/>
-        </w:rPr>
-        <w:pict w14:anchorId="46A7C644">
-          <v:shapetype id="_x0000_t75" coordsize="21600,21600" o:spt="75" o:preferrelative="t" path="m@4@5l@4@11@9@11@9@5xe" filled="f" stroked="f">
-            <v:stroke joinstyle="miter"/>
-            <v:formulas>
-              <v:f eqn="if lineDrawn pixelLineWidth 0"/>
-              <v:f eqn="sum @0 1 0"/>
-              <v:f eqn="sum 0 0 @1"/>
-              <v:f eqn="prod @2 1 2"/>
-              <v:f eqn="prod @3 21600 pixelWidth"/>
-              <v:f eqn="prod @3 21600 pixelHeight"/>
-              <v:f eqn="sum @0 0 1"/>
-              <v:f eqn="prod @6 1 2"/>
-              <v:f eqn="prod @7 21600 pixelWidth"/>
-              <v:f eqn="sum @8 21600 0"/>
-              <v:f eqn="prod @7 21600 pixelHeight"/>
-              <v:f eqn="sum @10 21600 0"/>
-            </v:formulas>
-            <v:path o:extrusionok="f" gradientshapeok="t" o:connecttype="rect"/>
-            <o:lock v:ext="edit" aspectratio="t"/>
-          </v:shapetype>
-          <v:shape id="Image1" o:spid="_x0000_s1026" type="#_x0000_t75" style="position:absolute;left:0;text-align:left;margin-left:227pt;margin-top:-70.75pt;width:88pt;height:91.75pt;z-index:1;visibility:visible;mso-wrap-style:square;mso-wrap-distance-left:9.05pt;mso-wrap-distance-top:0;mso-wrap-distance-right:9.05pt;mso-wrap-distance-bottom:0;mso-position-horizontal:absolute;mso-position-horizontal-relative:text;mso-position-vertical:absolute;mso-position-vertical-relative:text">
-            <v:imagedata r:id="rId4" o:title="" croptop="-17f" cropbottom="-17f" cropleft="-18f" cropright="-18f"/>
-          </v:shape>
+          <w:sz w:val="24"/>
+          <w:szCs w:val="24"/>
+          <w:lang w:val="en-US"/>
+        </w:rPr>
+        <w:pict w14:anchorId="51182DBD">
+          <v:group id="_x0000_s1027" style="position:absolute;left:0;text-align:left;margin-left:4pt;margin-top:-63.25pt;width:531.75pt;height:91pt;z-index:1" coordorigin="840,360" coordsize="10635,1820">
+            <v:shapetype id="_x0000_t202" coordsize="21600,21600" o:spt="202" path="m,l,21600r21600,l21600,xe">
+              <v:stroke joinstyle="miter"/>
+              <v:path gradientshapeok="t" o:connecttype="rect"/>
+            </v:shapetype>
+            <v:shape id="Text Box 82" o:spid="_x0000_s1028" type="#_x0000_t202" style="position:absolute;left:1716;top:360;width:9759;height:1820;visibility:visible" o:gfxdata="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" filled="f" stroked="f">
+              <v:textbox style="mso-next-textbox:#Text Box 82">
+                <w:txbxContent>
+                  <w:p>
+                    <w:pPr>
+                      <w:spacing w:line="276" w:lineRule="auto"/>
+                      <w:jc w:val="center"/>
+                      <w:rPr>
+                        <w:rFonts w:ascii="Arial" w:hAnsi="Arial" w:cs="Arial"/>
+                        <w:sz w:val="14"/>
+                      </w:rPr>
+                    </w:pPr>
+                  </w:p>
+                  <w:p>
+                    <w:pPr>
+                      <w:jc w:val="center"/>
+                      <w:rPr>
+                        <w:rFonts w:ascii="Arial" w:hAnsi="Arial" w:cs="Arial"/>
+                        <w:sz w:val="26"/>
+                        <w:szCs w:val="26"/>
+                      </w:rPr>
+                    </w:pPr>
+                    <w:r>
+                      <w:rPr>
+                        <w:rFonts w:ascii="Arial" w:hAnsi="Arial" w:cs="Arial"/>
+                        <w:sz w:val="26"/>
+                        <w:szCs w:val="26"/>
+                      </w:rPr>
+                      <w:t>PEMERINTAH PROVINSI JAWA TIMUR</w:t>
+                    </w:r>
+                  </w:p>
+                  <w:p>
+                    <w:pPr>
+                      <w:jc w:val="center"/>
+                      <w:rPr>
+                        <w:rFonts w:ascii="Arial" w:hAnsi="Arial" w:cs="Arial"/>
+                        <w:b/>
+                        <w:sz w:val="28"/>
+                        <w:szCs w:val="28"/>
+                      </w:rPr>
+                    </w:pPr>
+                    <w:r>
+                      <w:rPr>
+                        <w:rFonts w:ascii="Arial" w:hAnsi="Arial" w:cs="Arial"/>
+                        <w:b/>
+                        <w:sz w:val="28"/>
+                        <w:szCs w:val="28"/>
+                      </w:rPr>
+                      <w:t>SEKRETARIAT</w:t>
+                    </w:r>
+                    <w:r>
+                      <w:rPr>
+                        <w:rFonts w:ascii="Arial" w:hAnsi="Arial" w:cs="Arial"/>
+                        <w:b/>
+                        <w:sz w:val="28"/>
+                        <w:szCs w:val="28"/>
+                      </w:rPr>
+                      <w:t xml:space="preserve"> DAERAH</w:t>
+                    </w:r>
+                  </w:p>
+                  <w:p>
+                    <w:pPr>
+                      <w:jc w:val="center"/>
+                      <w:rPr>
+                        <w:rFonts w:ascii="Arial" w:hAnsi="Arial" w:cs="Arial"/>
+                      </w:rPr>
+                    </w:pPr>
+                    <w:r>
+                      <w:rPr>
+                        <w:rFonts w:ascii="Arial" w:hAnsi="Arial" w:cs="Arial"/>
+                      </w:rPr>
+                      <w:t>Jalan Pahlawan Nomor 110, Alun-Alun Contong, Bubutan, Surabaya, Jawa Timur 60174</w:t>
+                    </w:r>
+                  </w:p>
+                  <w:p>
+                    <w:pPr>
+                      <w:jc w:val="center"/>
+                      <w:rPr>
+                        <w:rFonts w:ascii="Arial" w:hAnsi="Arial" w:cs="Arial"/>
+                        <w:b/>
+                        <w:u w:val="single"/>
+                      </w:rPr>
+                    </w:pPr>
+                    <w:r>
+                      <w:rPr>
+                        <w:rFonts w:ascii="Arial" w:hAnsi="Arial" w:cs="Arial"/>
+                      </w:rPr>
+                      <w:t>Telepon (031) 3524001-3524011</w:t>
+                    </w:r>
+                  </w:p>
+                </w:txbxContent>
+              </v:textbox>
+            </v:shape>
+            <v:shapetype id="_x0000_t75" coordsize="21600,21600" o:spt="75" o:preferrelative="t" path="m@4@5l@4@11@9@11@9@5xe" filled="f" stroked="f">
+              <v:stroke joinstyle="miter"/>
+              <v:formulas>
+                <v:f eqn="if lineDrawn pixelLineWidth 0"/>
+                <v:f eqn="sum @0 1 0"/>
+                <v:f eqn="sum 0 0 @1"/>
+                <v:f eqn="prod @2 1 2"/>
+                <v:f eqn="prod @3 21600 pixelWidth"/>
+                <v:f eqn="prod @3 21600 pixelHeight"/>
+                <v:f eqn="sum @0 0 1"/>
+                <v:f eqn="prod @6 1 2"/>
+                <v:f eqn="prod @7 21600 pixelWidth"/>
+                <v:f eqn="sum @8 21600 0"/>
+                <v:f eqn="prod @7 21600 pixelHeight"/>
+                <v:f eqn="sum @10 21600 0"/>
+              </v:formulas>
+              <v:path o:extrusionok="f" gradientshapeok="t" o:connecttype="rect"/>
+              <o:lock v:ext="edit" aspectratio="t"/>
+            </v:shapetype>
+            <v:shape id="Picture 13" o:spid="_x0000_s1029" type="#_x0000_t75" style="position:absolute;left:840;top:459;width:1043;height:1408;visibility:visible" o:gfxdata="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">
+              <v:imagedata r:id="rId4" o:title=""/>
+            </v:shape>
+            <v:shapetype id="_x0000_t32" coordsize="21600,21600" o:spt="32" o:oned="t" path="m,l21600,21600e" filled="f">
+              <v:path arrowok="t" fillok="f" o:connecttype="none"/>
+              <o:lock v:ext="edit" shapetype="t"/>
+            </v:shapetype>
+            <v:shape id="AutoShape 14" o:spid="_x0000_s1030" type="#_x0000_t32" style="position:absolute;left:1025;top:1996;width:10240;height:1;flip:y;visibility:visible" o:connectortype="straight" o:gfxdata="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" strokeweight="1.5pt"/>
+          </v:group>
         </w:pict>
       </w:r>
     </w:p>
@@ -54,14 +163,14 @@
         <w:spacing w:before="0" w:line="360" w:lineRule="auto"/>
         <w:ind w:left="60"/>
         <w:rPr>
-          <w:rFonts w:ascii="Tahoma" w:hAnsi="Tahoma" w:cs="Tahoma" w:eastAsia="Tahoma"/>
+          <w:rFonts w:ascii="Arial" w:hAnsi="Arial" w:cs="Arial"/>
           <w:b/>
         </w:rPr>
       </w:pPr>
       <w:r>
         <w:rPr>
           <w:rStyle w:val="MSGENFONTSTYLENAMETEMPLATEROLENUMBERMSGENFONTSTYLENAMEBYROLETEXT2"/>
-          <w:rFonts w:ascii="Tahoma" w:hAnsi="Tahoma" w:cs="Tahoma" w:eastAsia="Tahoma"/>
+          <w:rFonts w:ascii="Arial" w:hAnsi="Arial" w:cs="Arial"/>
           <w:b/>
           <w:lang w:val="en-US"/>
         </w:rPr>
@@ -70,7 +179,7 @@
       <w:r>
         <w:rPr>
           <w:rStyle w:val="MSGENFONTSTYLENAMETEMPLATEROLENUMBERMSGENFONTSTYLENAMEBYROLETEXT2"/>
-          <w:rFonts w:ascii="Tahoma" w:hAnsi="Tahoma" w:cs="Tahoma" w:eastAsia="Tahoma"/>
+          <w:rFonts w:ascii="Arial" w:hAnsi="Arial" w:cs="Arial"/>
           <w:b/>
         </w:rPr>
         <w:t>ERITA ACARA</w:t>
@@ -84,14 +193,14 @@
         <w:ind w:left="60"/>
         <w:rPr>
           <w:rStyle w:val="MSGENFONTSTYLENAMETEMPLATEROLENUMBERMSGENFONTSTYLENAMEBYROLETEXT2"/>
-          <w:rFonts w:ascii="Tahoma" w:hAnsi="Tahoma" w:cs="Tahoma" w:eastAsia="Tahoma"/>
+          <w:rFonts w:ascii="Arial" w:hAnsi="Arial" w:cs="Arial"/>
           <w:lang w:val="en-US"/>
         </w:rPr>
       </w:pPr>
       <w:r>
         <w:rPr>
           <w:rStyle w:val="MSGENFONTSTYLENAMETEMPLATEROLENUMBERMSGENFONTSTYLENAMEBYROLETEXT2"/>
-          <w:rFonts w:ascii="Tahoma" w:hAnsi="Tahoma" w:cs="Tahoma" w:eastAsia="Tahoma"/>
+          <w:rFonts w:ascii="Arial" w:hAnsi="Arial" w:cs="Arial"/>
           <w:b/>
         </w:rPr>
         <w:t>PENGAMBILAN SUMPAH PEGAWAI NEGERI SIPIL</w:t>
@@ -99,7 +208,7 @@
       <w:r>
         <w:rPr>
           <w:rStyle w:val="MSGENFONTSTYLENAMETEMPLATEROLENUMBERMSGENFONTSTYLENAMEBYROLETEXT2"/>
-          <w:rFonts w:ascii="Tahoma" w:hAnsi="Tahoma" w:cs="Tahoma" w:eastAsia="Tahoma"/>
+          <w:rFonts w:ascii="Arial" w:hAnsi="Arial" w:cs="Arial"/>
         </w:rPr>
         <w:br/>
         <w:t>NOMOR : 8</w:t>
@@ -107,7 +216,7 @@
       <w:r>
         <w:rPr>
           <w:rStyle w:val="MSGENFONTSTYLENAMETEMPLATEROLENUMBERMSGENFONTSTYLENAMEBYROLETEXT2"/>
-          <w:rFonts w:ascii="Tahoma" w:hAnsi="Tahoma" w:cs="Tahoma" w:eastAsia="Tahoma"/>
+          <w:rFonts w:ascii="Arial" w:hAnsi="Arial" w:cs="Arial"/>
           <w:lang w:val="en-US"/>
         </w:rPr>
         <w:t>77</w:t>
@@ -115,14 +224,14 @@
       <w:r>
         <w:rPr>
           <w:rStyle w:val="MSGENFONTSTYLENAMETEMPLATEROLENUMBERMSGENFONTSTYLENAMEBYROLETEXT2"/>
-          <w:rFonts w:ascii="Tahoma" w:hAnsi="Tahoma" w:cs="Tahoma" w:eastAsia="Tahoma"/>
+          <w:rFonts w:ascii="Arial" w:hAnsi="Arial" w:cs="Arial"/>
         </w:rPr>
         <w:t>/</w:t>
       </w:r>
       <w:r>
         <w:rPr>
           <w:rStyle w:val="MSGENFONTSTYLENAMETEMPLATEROLENUMBERMSGENFONTSTYLENAMEBYROLETEXT2"/>
-          <w:rFonts w:ascii="Tahoma" w:hAnsi="Tahoma" w:cs="Tahoma" w:eastAsia="Tahoma"/>
+          <w:rFonts w:ascii="Arial" w:hAnsi="Arial" w:cs="Arial"/>
           <w:lang w:val="en-US"/>
         </w:rPr>
         <w:t xml:space="preserve">           </w:t>
@@ -130,14 +239,14 @@
       <w:r>
         <w:rPr>
           <w:rStyle w:val="MSGENFONTSTYLENAMETEMPLATEROLENUMBERMSGENFONTSTYLENAMEBYROLETEXT2"/>
-          <w:rFonts w:ascii="Tahoma" w:hAnsi="Tahoma" w:cs="Tahoma" w:eastAsia="Tahoma"/>
+          <w:rFonts w:ascii="Arial" w:hAnsi="Arial" w:cs="Arial"/>
         </w:rPr>
         <w:t>/204.3/202</w:t>
       </w:r>
       <w:r>
         <w:rPr>
           <w:rStyle w:val="MSGENFONTSTYLENAMETEMPLATEROLENUMBERMSGENFONTSTYLENAMEBYROLETEXT2"/>
-          <w:rFonts w:ascii="Tahoma" w:hAnsi="Tahoma" w:cs="Tahoma" w:eastAsia="Tahoma"/>
+          <w:rFonts w:ascii="Arial" w:hAnsi="Arial" w:cs="Arial"/>
           <w:lang w:val="en-US"/>
         </w:rPr>
         <w:t>6</w:t>
@@ -151,7 +260,7 @@
         <w:ind w:left="60"/>
         <w:rPr>
           <w:rStyle w:val="MSGENFONTSTYLENAMETEMPLATEROLENUMBERMSGENFONTSTYLENAMEBYROLETEXT2"/>
-          <w:rFonts w:ascii="Tahoma" w:hAnsi="Tahoma" w:cs="Tahoma" w:eastAsia="Tahoma"/>
+          <w:rFonts w:ascii="Arial" w:hAnsi="Arial" w:cs="Arial"/>
           <w:lang w:val="en-US"/>
         </w:rPr>
       </w:pPr>
@@ -168,7 +277,7 @@
         <w:jc w:val="both"/>
         <w:rPr>
           <w:rStyle w:val="MSGENFONTSTYLENAMETEMPLATEROLENUMBERMSGENFONTSTYLENAMEBYROLETEXT2"/>
-          <w:rFonts w:ascii="Tahoma" w:hAnsi="Tahoma" w:cs="Tahoma" w:eastAsia="Tahoma"/>
+          <w:rFonts w:ascii="Arial" w:hAnsi="Arial" w:cs="Arial"/>
           <w:sz w:val="22"/>
           <w:szCs w:val="22"/>
           <w:lang w:val="en-US"/>
@@ -178,7 +287,7 @@
       <w:r>
         <w:rPr>
           <w:rStyle w:val="MSGENFONTSTYLENAMETEMPLATEROLENUMBERMSGENFONTSTYLENAMEBYROLETEXT2"/>
-          <w:rFonts w:ascii="Tahoma" w:hAnsi="Tahoma" w:cs="Tahoma" w:eastAsia="Tahoma"/>
+          <w:rFonts w:ascii="Arial" w:hAnsi="Arial" w:cs="Arial"/>
           <w:sz w:val="22"/>
           <w:szCs w:val="22"/>
         </w:rPr>
@@ -187,7 +296,7 @@
       <w:r>
         <w:rPr>
           <w:rStyle w:val="MSGENFONTSTYLENAMETEMPLATEROLENUMBERMSGENFONTSTYLENAMEBYROLETEXT2"/>
-          <w:rFonts w:ascii="Tahoma" w:hAnsi="Tahoma" w:cs="Tahoma" w:eastAsia="Tahoma"/>
+          <w:rFonts w:ascii="Arial" w:hAnsi="Arial" w:cs="Arial"/>
           <w:sz w:val="22"/>
           <w:szCs w:val="22"/>
           <w:lang w:val="en-AU"/>
@@ -197,7 +306,7 @@
       <w:r>
         <w:rPr>
           <w:rStyle w:val="MSGENFONTSTYLENAMETEMPLATEROLENUMBERMSGENFONTSTYLENAMEBYROLETEXT2"/>
-          <w:rFonts w:ascii="Tahoma" w:hAnsi="Tahoma" w:cs="Tahoma" w:eastAsia="Tahoma"/>
+          <w:rFonts w:ascii="Arial" w:hAnsi="Arial" w:cs="Arial"/>
           <w:sz w:val="22"/>
           <w:szCs w:val="22"/>
         </w:rPr>
@@ -206,7 +315,7 @@
       <w:r>
         <w:rPr>
           <w:rStyle w:val="MSGENFONTSTYLENAMETEMPLATEROLENUMBERMSGENFONTSTYLENAMEBYROLETEXT2"/>
-          <w:rFonts w:ascii="Tahoma" w:hAnsi="Tahoma" w:cs="Tahoma" w:eastAsia="Tahoma"/>
+          <w:rFonts w:ascii="Arial" w:hAnsi="Arial" w:cs="Arial"/>
           <w:sz w:val="22"/>
           <w:szCs w:val="22"/>
           <w:lang w:val="en-GB"/>
@@ -216,7 +325,7 @@
       <w:r>
         <w:rPr>
           <w:rStyle w:val="MSGENFONTSTYLENAMETEMPLATEROLENUMBERMSGENFONTSTYLENAMEBYROLETEXT2"/>
-          <w:rFonts w:ascii="Tahoma" w:hAnsi="Tahoma" w:cs="Tahoma" w:eastAsia="Tahoma"/>
+          <w:rFonts w:ascii="Arial" w:hAnsi="Arial" w:cs="Arial"/>
           <w:sz w:val="22"/>
           <w:szCs w:val="22"/>
         </w:rPr>
@@ -225,7 +334,7 @@
       <w:r>
         <w:rPr>
           <w:rStyle w:val="MSGENFONTSTYLENAMETEMPLATEROLENUMBERMSGENFONTSTYLENAMEBYROLETEXT2"/>
-          <w:rFonts w:ascii="Tahoma" w:hAnsi="Tahoma" w:cs="Tahoma" w:eastAsia="Tahoma"/>
+          <w:rFonts w:ascii="Arial" w:hAnsi="Arial" w:cs="Arial"/>
           <w:sz w:val="22"/>
           <w:szCs w:val="22"/>
           <w:lang w:val="en-GB"/>
@@ -235,7 +344,7 @@
       <w:r>
         <w:rPr>
           <w:rStyle w:val="MSGENFONTSTYLENAMETEMPLATEROLENUMBERMSGENFONTSTYLENAMEBYROLETEXT2"/>
-          <w:rFonts w:ascii="Tahoma" w:hAnsi="Tahoma" w:cs="Tahoma" w:eastAsia="Tahoma"/>
+          <w:rFonts w:ascii="Arial" w:hAnsi="Arial" w:cs="Arial"/>
           <w:sz w:val="22"/>
           <w:szCs w:val="22"/>
         </w:rPr>
@@ -244,7 +353,7 @@
       <w:r>
         <w:rPr>
           <w:rStyle w:val="MSGENFONTSTYLENAMETEMPLATEROLENUMBERMSGENFONTSTYLENAMEBYROLETEXT2"/>
-          <w:rFonts w:ascii="Tahoma" w:hAnsi="Tahoma" w:cs="Tahoma" w:eastAsia="Tahoma"/>
+          <w:rFonts w:ascii="Arial" w:hAnsi="Arial" w:cs="Arial"/>
           <w:sz w:val="22"/>
           <w:szCs w:val="22"/>
           <w:lang w:val="en-GB"/>
@@ -254,7 +363,7 @@
       <w:r>
         <w:rPr>
           <w:rStyle w:val="MSGENFONTSTYLENAMETEMPLATEROLENUMBERMSGENFONTSTYLENAMEBYROLETEXT2"/>
-          <w:rFonts w:ascii="Tahoma" w:hAnsi="Tahoma" w:cs="Tahoma" w:eastAsia="Tahoma"/>
+          <w:rFonts w:ascii="Arial" w:hAnsi="Arial" w:cs="Arial"/>
           <w:sz w:val="22"/>
           <w:szCs w:val="22"/>
         </w:rPr>
@@ -263,7 +372,7 @@
       <w:r>
         <w:rPr>
           <w:rStyle w:val="MSGENFONTSTYLENAMETEMPLATEROLENUMBERMSGENFONTSTYLENAMEBYROLETEXT2"/>
-          <w:rFonts w:ascii="Tahoma" w:hAnsi="Tahoma" w:cs="Tahoma" w:eastAsia="Tahoma"/>
+          <w:rFonts w:ascii="Arial" w:hAnsi="Arial" w:cs="Arial"/>
           <w:sz w:val="22"/>
           <w:szCs w:val="22"/>
           <w:lang w:val="en-US"/>
@@ -273,7 +382,7 @@
       <w:r>
         <w:rPr>
           <w:rStyle w:val="MSGENFONTSTYLENAMETEMPLATEROLENUMBERMSGENFONTSTYLENAMEBYROLETEXT2"/>
-          <w:rFonts w:ascii="Tahoma" w:hAnsi="Tahoma" w:cs="Tahoma" w:eastAsia="Tahoma"/>
+          <w:rFonts w:ascii="Arial" w:hAnsi="Arial" w:cs="Arial"/>
           <w:sz w:val="22"/>
           <w:szCs w:val="22"/>
         </w:rPr>
@@ -282,7 +391,7 @@
       <w:r>
         <w:rPr>
           <w:rStyle w:val="MSGENFONTSTYLENAMETEMPLATEROLENUMBERMSGENFONTSTYLENAMEBYROLETEXT2"/>
-          <w:rFonts w:ascii="Tahoma" w:hAnsi="Tahoma" w:cs="Tahoma" w:eastAsia="Tahoma"/>
+          <w:rFonts w:ascii="Arial" w:hAnsi="Arial" w:cs="Arial"/>
           <w:sz w:val="22"/>
           <w:szCs w:val="22"/>
           <w:lang w:val="en-US"/>
@@ -290,12 +399,15 @@
         <w:t xml:space="preserve"> </w:t>
       </w:r>
       <w:r>
+        <w:rPr>
+          <w:rFonts w:ascii="Arial" w:hAnsi="Arial" w:cs="Arial"/>
+        </w:rPr>
         <w:t>R. HERU WAHONO SANTOSO S.Sos, MM</w:t>
       </w:r>
       <w:r>
         <w:rPr>
           <w:rStyle w:val="MSGENFONTSTYLENAMETEMPLATEROLENUMBERMSGENFONTSTYLENAMEBYROLETEXT2"/>
-          <w:rFonts w:ascii="Tahoma" w:hAnsi="Tahoma" w:cs="Tahoma" w:eastAsia="Tahoma"/>
+          <w:rFonts w:ascii="Arial" w:hAnsi="Arial" w:cs="Arial"/>
           <w:sz w:val="22"/>
           <w:szCs w:val="22"/>
         </w:rPr>
@@ -304,7 +416,7 @@
       <w:r>
         <w:rPr>
           <w:rStyle w:val="MSGENFONTSTYLENAMETEMPLATEROLENUMBERMSGENFONTSTYLENAMEBYROLETEXT2"/>
-          <w:rFonts w:ascii="Tahoma" w:hAnsi="Tahoma" w:cs="Tahoma" w:eastAsia="Tahoma"/>
+          <w:rFonts w:ascii="Arial" w:hAnsi="Arial" w:cs="Arial"/>
           <w:sz w:val="22"/>
           <w:szCs w:val="22"/>
           <w:lang w:val="en-US"/>
@@ -313,7 +425,7 @@
       </w:r>
       <w:r>
         <w:rPr>
-          <w:rFonts w:ascii="Tahoma" w:hAnsi="Tahoma" w:cs="Tahoma" w:eastAsia="Tahoma"/>
+          <w:rFonts w:ascii="Arial" w:hAnsi="Arial" w:cs="Arial"/>
           <w:sz w:val="22"/>
           <w:szCs w:val="22"/>
           <w:shd w:val="clear" w:color="auto" w:fill="FFFFFF"/>
@@ -325,7 +437,7 @@
       <w:r>
         <w:rPr>
           <w:rStyle w:val="MSGENFONTSTYLENAMETEMPLATEROLENUMBERMSGENFONTSTYLENAMEBYROLETEXT2"/>
-          <w:rFonts w:ascii="Tahoma" w:hAnsi="Tahoma" w:cs="Tahoma" w:eastAsia="Tahoma"/>
+          <w:rFonts w:ascii="Arial" w:hAnsi="Arial" w:cs="Arial"/>
           <w:sz w:val="22"/>
           <w:szCs w:val="22"/>
         </w:rPr>
@@ -334,7 +446,7 @@
       <w:r>
         <w:rPr>
           <w:rStyle w:val="MSGENFONTSTYLENAMETEMPLATEROLENUMBERMSGENFONTSTYLENAMEBYROLETEXT2"/>
-          <w:rFonts w:ascii="Tahoma" w:hAnsi="Tahoma" w:cs="Tahoma" w:eastAsia="Tahoma"/>
+          <w:rFonts w:ascii="Arial" w:hAnsi="Arial" w:cs="Arial"/>
           <w:sz w:val="22"/>
           <w:szCs w:val="22"/>
           <w:lang w:val="en-US"/>
@@ -344,7 +456,7 @@
       <w:r>
         <w:rPr>
           <w:rStyle w:val="MSGENFONTSTYLENAMETEMPLATEROLENUMBERMSGENFONTSTYLENAMEBYROLETEXT2"/>
-          <w:rFonts w:ascii="Tahoma" w:hAnsi="Tahoma" w:cs="Tahoma" w:eastAsia="Tahoma"/>
+          <w:rFonts w:ascii="Arial" w:hAnsi="Arial" w:cs="Arial"/>
           <w:sz w:val="22"/>
           <w:szCs w:val="22"/>
         </w:rPr>
@@ -353,7 +465,7 @@
       <w:r>
         <w:rPr>
           <w:rStyle w:val="MSGENFONTSTYLENAMETEMPLATEROLENUMBERMSGENFONTSTYLENAMEBYROLETEXT2"/>
-          <w:rFonts w:ascii="Tahoma" w:hAnsi="Tahoma" w:cs="Tahoma" w:eastAsia="Tahoma"/>
+          <w:rFonts w:ascii="Arial" w:hAnsi="Arial" w:cs="Arial"/>
           <w:sz w:val="22"/>
           <w:szCs w:val="22"/>
           <w:lang w:val="en-US"/>
@@ -363,7 +475,7 @@
       <w:r>
         <w:rPr>
           <w:rStyle w:val="MSGENFONTSTYLENAMETEMPLATEROLENUMBERMSGENFONTSTYLENAMEBYROLETEXT2"/>
-          <w:rFonts w:ascii="Tahoma" w:hAnsi="Tahoma" w:cs="Tahoma" w:eastAsia="Tahoma"/>
+          <w:rFonts w:ascii="Arial" w:hAnsi="Arial" w:cs="Arial"/>
           <w:sz w:val="22"/>
           <w:szCs w:val="22"/>
         </w:rPr>
@@ -372,7 +484,7 @@
       <w:r>
         <w:rPr>
           <w:rStyle w:val="MSGENFONTSTYLENAMETEMPLATEROLENUMBERMSGENFONTSTYLENAMEBYROLETEXT2"/>
-          <w:rFonts w:ascii="Tahoma" w:hAnsi="Tahoma" w:cs="Tahoma" w:eastAsia="Tahoma"/>
+          <w:rFonts w:ascii="Arial" w:hAnsi="Arial" w:cs="Arial"/>
           <w:sz w:val="22"/>
           <w:szCs w:val="22"/>
           <w:lang w:val="en-US"/>
@@ -382,7 +494,7 @@
       <w:r>
         <w:rPr>
           <w:rStyle w:val="MSGENFONTSTYLENAMETEMPLATEROLENUMBERMSGENFONTSTYLENAMEBYROLETEXT2"/>
-          <w:rFonts w:ascii="Tahoma" w:hAnsi="Tahoma" w:cs="Tahoma" w:eastAsia="Tahoma"/>
+          <w:rFonts w:ascii="Arial" w:hAnsi="Arial" w:cs="Arial"/>
           <w:sz w:val="22"/>
           <w:szCs w:val="22"/>
         </w:rPr>
@@ -391,7 +503,7 @@
       <w:r>
         <w:rPr>
           <w:rStyle w:val="MSGENFONTSTYLENAMETEMPLATEROLENUMBERMSGENFONTSTYLENAMEBYROLETEXT2"/>
-          <w:rFonts w:ascii="Tahoma" w:hAnsi="Tahoma" w:cs="Tahoma" w:eastAsia="Tahoma"/>
+          <w:rFonts w:ascii="Arial" w:hAnsi="Arial" w:cs="Arial"/>
           <w:sz w:val="22"/>
           <w:szCs w:val="22"/>
           <w:lang w:val="en-US"/>
@@ -401,7 +513,7 @@
       <w:r>
         <w:rPr>
           <w:rStyle w:val="MSGENFONTSTYLENAMETEMPLATEROLENUMBERMSGENFONTSTYLENAMEBYROLETEXT2"/>
-          <w:rFonts w:ascii="Tahoma" w:hAnsi="Tahoma" w:cs="Tahoma" w:eastAsia="Tahoma"/>
+          <w:rFonts w:ascii="Arial" w:hAnsi="Arial" w:cs="Arial"/>
           <w:sz w:val="22"/>
           <w:szCs w:val="22"/>
         </w:rPr>
@@ -422,14 +534,14 @@
         <w:ind w:left="142" w:right="46"/>
         <w:jc w:val="both"/>
         <w:rPr>
-          <w:rFonts w:ascii="Tahoma" w:hAnsi="Tahoma" w:cs="Tahoma" w:eastAsia="Tahoma"/>
+          <w:rFonts w:ascii="Arial" w:hAnsi="Arial" w:cs="Arial"/>
           <w:sz w:val="22"/>
           <w:szCs w:val="22"/>
         </w:rPr>
       </w:pPr>
       <w:r>
         <w:rPr>
-          <w:rFonts w:ascii="Tahoma" w:hAnsi="Tahoma" w:cs="Tahoma" w:eastAsia="Tahoma"/>
+          <w:rFonts w:ascii="Arial" w:hAnsi="Arial" w:cs="Arial"/>
           <w:sz w:val="22"/>
           <w:szCs w:val="22"/>
           <w:lang w:val="en-US"/>
@@ -438,7 +550,7 @@
       </w:r>
       <w:r>
         <w:rPr>
-          <w:rFonts w:ascii="Tahoma" w:hAnsi="Tahoma" w:cs="Tahoma" w:eastAsia="Tahoma"/>
+          <w:rFonts w:ascii="Arial" w:hAnsi="Arial" w:cs="Arial"/>
           <w:sz w:val="22"/>
           <w:szCs w:val="22"/>
           <w:shd w:val="clear" w:color="auto" w:fill="FFFFFF"/>
@@ -449,7 +561,7 @@
       <w:r>
         <w:rPr>
           <w:rStyle w:val="MSGENFONTSTYLENAMETEMPLATEROLENUMBERMSGENFONTSTYLENAMEBYROLETEXT2"/>
-          <w:rFonts w:ascii="Tahoma" w:hAnsi="Tahoma" w:cs="Tahoma" w:eastAsia="Tahoma"/>
+          <w:rFonts w:ascii="Arial" w:hAnsi="Arial" w:cs="Arial"/>
           <w:sz w:val="22"/>
           <w:szCs w:val="22"/>
         </w:rPr>
@@ -458,7 +570,7 @@
       <w:r>
         <w:rPr>
           <w:rStyle w:val="MSGENFONTSTYLENAMETEMPLATEROLENUMBERMSGENFONTSTYLENAMEBYROLETEXT2"/>
-          <w:rFonts w:ascii="Tahoma" w:hAnsi="Tahoma" w:cs="Tahoma" w:eastAsia="Tahoma"/>
+          <w:rFonts w:ascii="Arial" w:hAnsi="Arial" w:cs="Arial"/>
           <w:sz w:val="22"/>
           <w:szCs w:val="22"/>
           <w:lang w:val="en-US"/>
@@ -467,7 +579,7 @@
       </w:r>
       <w:r>
         <w:rPr>
-          <w:rFonts w:ascii="Tahoma" w:hAnsi="Tahoma" w:cs="Tahoma" w:eastAsia="Tahoma"/>
+          <w:rFonts w:ascii="Arial" w:hAnsi="Arial" w:cs="Arial"/>
           <w:sz w:val="22"/>
           <w:szCs w:val="22"/>
           <w:shd w:val="clear" w:color="auto" w:fill="FFFFFF"/>
@@ -477,7 +589,7 @@
       </w:r>
       <w:r>
         <w:rPr>
-          <w:rFonts w:ascii="Tahoma" w:hAnsi="Tahoma" w:cs="Tahoma" w:eastAsia="Tahoma"/>
+          <w:rFonts w:ascii="Arial" w:hAnsi="Arial" w:cs="Arial"/>
           <w:sz w:val="22"/>
           <w:szCs w:val="22"/>
           <w:shd w:val="clear" w:color="auto" w:fill="FFFFFF"/>
@@ -488,7 +600,7 @@
       <w:r>
         <w:rPr>
           <w:rStyle w:val="MSGENFONTSTYLENAMETEMPLATEROLENUMBERMSGENFONTSTYLENAMEBYROLETEXT2"/>
-          <w:rFonts w:ascii="Tahoma" w:hAnsi="Tahoma" w:cs="Tahoma" w:eastAsia="Tahoma"/>
+          <w:rFonts w:ascii="Arial" w:hAnsi="Arial" w:cs="Arial"/>
           <w:sz w:val="22"/>
           <w:szCs w:val="22"/>
         </w:rPr>
@@ -497,7 +609,7 @@
       <w:r>
         <w:rPr>
           <w:rStyle w:val="MSGENFONTSTYLENAMETEMPLATEROLENUMBERMSGENFONTSTYLENAMEBYROLETEXT2"/>
-          <w:rFonts w:ascii="Tahoma" w:hAnsi="Tahoma" w:cs="Tahoma" w:eastAsia="Tahoma"/>
+          <w:rFonts w:ascii="Arial" w:hAnsi="Arial" w:cs="Arial"/>
           <w:sz w:val="22"/>
           <w:szCs w:val="22"/>
           <w:lang w:val="en-US"/>
@@ -507,7 +619,7 @@
       <w:r>
         <w:rPr>
           <w:rStyle w:val="MSGENFONTSTYLENAMETEMPLATEROLENUMBERMSGENFONTSTYLENAMEBYROLETEXT2"/>
-          <w:rFonts w:ascii="Tahoma" w:hAnsi="Tahoma" w:cs="Tahoma" w:eastAsia="Tahoma"/>
+          <w:rFonts w:ascii="Arial" w:hAnsi="Arial" w:cs="Arial"/>
           <w:sz w:val="22"/>
           <w:szCs w:val="22"/>
         </w:rPr>
@@ -515,7 +627,7 @@
       </w:r>
       <w:r>
         <w:rPr>
-          <w:rFonts w:ascii="Tahoma" w:hAnsi="Tahoma" w:cs="Tahoma" w:eastAsia="Tahoma"/>
+          <w:rFonts w:ascii="Arial" w:hAnsi="Arial" w:cs="Arial"/>
           <w:sz w:val="22"/>
           <w:szCs w:val="22"/>
           <w:shd w:val="clear" w:color="auto" w:fill="FFFFFF"/>
@@ -538,7 +650,7 @@
         <w:ind w:left="142" w:right="45"/>
         <w:jc w:val="both"/>
         <w:rPr>
-          <w:rFonts w:ascii="Tahoma" w:hAnsi="Tahoma" w:cs="Tahoma" w:eastAsia="Tahoma"/>
+          <w:rFonts w:ascii="Arial" w:hAnsi="Arial" w:cs="Arial"/>
           <w:sz w:val="22"/>
           <w:szCs w:val="22"/>
           <w:lang w:val="en-US"/>
@@ -546,7 +658,7 @@
       </w:pPr>
       <w:r>
         <w:rPr>
-          <w:rFonts w:ascii="Tahoma" w:hAnsi="Tahoma" w:cs="Tahoma" w:eastAsia="Tahoma"/>
+          <w:rFonts w:ascii="Arial" w:hAnsi="Arial" w:cs="Arial"/>
           <w:sz w:val="22"/>
           <w:szCs w:val="22"/>
           <w:lang w:val="en-US"/>
@@ -555,6 +667,7 @@
       </w:r>
       <w:r>
         <w:rPr>
+          <w:rFonts w:ascii="Arial" w:hAnsi="Arial" w:cs="Arial"/>
           <w:sz w:val="22"/>
           <w:szCs w:val="22"/>
         </w:rPr>
@@ -563,7 +676,7 @@
       <w:r>
         <w:rPr>
           <w:rStyle w:val="MSGENFONTSTYLENAMETEMPLATEROLENUMBERMSGENFONTSTYLENAMEBYROLETEXT2"/>
-          <w:rFonts w:ascii="Tahoma" w:hAnsi="Tahoma" w:cs="Tahoma" w:eastAsia="Tahoma"/>
+          <w:rFonts w:ascii="Arial" w:hAnsi="Arial" w:cs="Arial"/>
           <w:sz w:val="22"/>
           <w:szCs w:val="22"/>
           <w:lang w:val="en-US"/>
@@ -573,7 +686,7 @@
       <w:r>
         <w:rPr>
           <w:rStyle w:val="MSGENFONTSTYLENAMETEMPLATEROLENUMBERMSGENFONTSTYLENAMEBYROLETEXT2"/>
-          <w:rFonts w:ascii="Tahoma" w:hAnsi="Tahoma" w:cs="Tahoma" w:eastAsia="Tahoma"/>
+          <w:rFonts w:ascii="Arial" w:hAnsi="Arial" w:cs="Arial"/>
           <w:sz w:val="22"/>
           <w:szCs w:val="22"/>
         </w:rPr>
@@ -582,7 +695,7 @@
       <w:r>
         <w:rPr>
           <w:rStyle w:val="MSGENFONTSTYLENAMETEMPLATEROLENUMBERMSGENFONTSTYLENAMEBYROLETEXT2"/>
-          <w:rFonts w:ascii="Tahoma" w:hAnsi="Tahoma" w:cs="Tahoma" w:eastAsia="Tahoma"/>
+          <w:rFonts w:ascii="Arial" w:hAnsi="Arial" w:cs="Arial"/>
           <w:sz w:val="22"/>
           <w:szCs w:val="22"/>
           <w:lang w:val="en-US"/>
@@ -591,7 +704,7 @@
       </w:r>
       <w:r>
         <w:rPr>
-          <w:rFonts w:ascii="Tahoma" w:hAnsi="Tahoma" w:cs="Tahoma" w:eastAsia="Tahoma"/>
+          <w:rFonts w:ascii="Arial" w:hAnsi="Arial" w:cs="Arial"/>
           <w:sz w:val="22"/>
           <w:szCs w:val="22"/>
           <w:shd w:val="clear" w:color="auto" w:fill="FFFFFF"/>
@@ -602,7 +715,7 @@
       <w:r>
         <w:rPr>
           <w:rStyle w:val="MSGENFONTSTYLENAMETEMPLATEROLENUMBERMSGENFONTSTYLENAMEBYROLETEXT2"/>
-          <w:rFonts w:ascii="Tahoma" w:hAnsi="Tahoma" w:cs="Tahoma" w:eastAsia="Tahoma"/>
+          <w:rFonts w:ascii="Arial" w:hAnsi="Arial" w:cs="Arial"/>
           <w:sz w:val="22"/>
           <w:szCs w:val="22"/>
           <w:lang w:val="en-US"/>
@@ -612,7 +725,7 @@
       <w:r>
         <w:rPr>
           <w:rStyle w:val="MSGENFONTSTYLENAMETEMPLATEROLENUMBERMSGENFONTSTYLENAMEBYROLETEXT2"/>
-          <w:rFonts w:ascii="Tahoma" w:hAnsi="Tahoma" w:cs="Tahoma" w:eastAsia="Tahoma"/>
+          <w:rFonts w:ascii="Arial" w:hAnsi="Arial" w:cs="Arial"/>
           <w:sz w:val="22"/>
           <w:szCs w:val="22"/>
           <w:lang w:val="en-US"/>
@@ -622,7 +735,7 @@
       <w:r>
         <w:rPr>
           <w:rStyle w:val="MSGENFONTSTYLENAMETEMPLATEROLENUMBERMSGENFONTSTYLENAMEBYROLETEXT2"/>
-          <w:rFonts w:ascii="Tahoma" w:hAnsi="Tahoma" w:cs="Tahoma" w:eastAsia="Tahoma"/>
+          <w:rFonts w:ascii="Arial" w:hAnsi="Arial" w:cs="Arial"/>
           <w:sz w:val="22"/>
           <w:szCs w:val="22"/>
         </w:rPr>
@@ -631,7 +744,7 @@
       <w:r>
         <w:rPr>
           <w:rStyle w:val="MSGENFONTSTYLENAMETEMPLATEROLENUMBERMSGENFONTSTYLENAMEBYROLETEXT2"/>
-          <w:rFonts w:ascii="Tahoma" w:hAnsi="Tahoma" w:cs="Tahoma" w:eastAsia="Tahoma"/>
+          <w:rFonts w:ascii="Arial" w:hAnsi="Arial" w:cs="Arial"/>
           <w:sz w:val="22"/>
           <w:szCs w:val="22"/>
           <w:lang w:val="en-US"/>
@@ -641,7 +754,7 @@
       <w:r>
         <w:rPr>
           <w:rStyle w:val="MSGENFONTSTYLENAMETEMPLATEROLENUMBERMSGENFONTSTYLENAMEBYROLETEXT2"/>
-          <w:rFonts w:ascii="Tahoma" w:hAnsi="Tahoma" w:cs="Tahoma" w:eastAsia="Tahoma"/>
+          <w:rFonts w:ascii="Arial" w:hAnsi="Arial" w:cs="Arial"/>
           <w:sz w:val="22"/>
           <w:szCs w:val="22"/>
         </w:rPr>
@@ -649,24 +762,35 @@
       </w:r>
       <w:r>
         <w:rPr>
+          <w:rFonts w:ascii="Arial" w:hAnsi="Arial" w:cs="Arial"/>
           <w:sz w:val="22"/>
           <w:szCs w:val="22"/>
           <w:shd w:val="clear" w:color="auto" w:fill="FFFFFF"/>
         </w:rPr>
+        <w:t xml:space="preserve"> 19720211</w:t>
+      </w:r>
+      <w:r>
+        <w:rPr>
+          <w:rFonts w:ascii="Arial" w:hAnsi="Arial" w:cs="Arial"/>
+          <w:sz w:val="22"/>
+          <w:szCs w:val="22"/>
+          <w:shd w:val="clear" w:color="auto" w:fill="FFFFFF"/>
+          <w:lang w:val="en-US"/>
+        </w:rPr>
         <w:t xml:space="preserve"> </w:t>
       </w:r>
       <w:r>
         <w:rPr>
-          <w:rFonts w:ascii="Tahoma" w:hAnsi="Tahoma" w:cs="Tahoma" w:eastAsia="Tahoma"/>
+          <w:rFonts w:ascii="Arial" w:hAnsi="Arial" w:cs="Arial"/>
           <w:sz w:val="22"/>
           <w:szCs w:val="22"/>
           <w:shd w:val="clear" w:color="auto" w:fill="FFFFFF"/>
         </w:rPr>
-        <w:t>19720211</w:t>
-      </w:r>
-      <w:r>
-        <w:rPr>
-          <w:rFonts w:ascii="Tahoma" w:hAnsi="Tahoma" w:cs="Tahoma" w:eastAsia="Tahoma"/>
+        <w:t>199903</w:t>
+      </w:r>
+      <w:r>
+        <w:rPr>
+          <w:rFonts w:ascii="Arial" w:hAnsi="Arial" w:cs="Arial"/>
           <w:sz w:val="22"/>
           <w:szCs w:val="22"/>
           <w:shd w:val="clear" w:color="auto" w:fill="FFFFFF"/>
@@ -676,16 +800,16 @@
       </w:r>
       <w:r>
         <w:rPr>
-          <w:rFonts w:ascii="Tahoma" w:hAnsi="Tahoma" w:cs="Tahoma" w:eastAsia="Tahoma"/>
+          <w:rFonts w:ascii="Arial" w:hAnsi="Arial" w:cs="Arial"/>
           <w:sz w:val="22"/>
           <w:szCs w:val="22"/>
           <w:shd w:val="clear" w:color="auto" w:fill="FFFFFF"/>
         </w:rPr>
-        <w:t>199903</w:t>
-      </w:r>
-      <w:r>
-        <w:rPr>
-          <w:rFonts w:ascii="Tahoma" w:hAnsi="Tahoma" w:cs="Tahoma" w:eastAsia="Tahoma"/>
+        <w:t>2</w:t>
+      </w:r>
+      <w:r>
+        <w:rPr>
+          <w:rFonts w:ascii="Arial" w:hAnsi="Arial" w:cs="Arial"/>
           <w:sz w:val="22"/>
           <w:szCs w:val="22"/>
           <w:shd w:val="clear" w:color="auto" w:fill="FFFFFF"/>
@@ -695,26 +819,7 @@
       </w:r>
       <w:r>
         <w:rPr>
-          <w:rFonts w:ascii="Tahoma" w:hAnsi="Tahoma" w:cs="Tahoma" w:eastAsia="Tahoma"/>
-          <w:sz w:val="22"/>
-          <w:szCs w:val="22"/>
-          <w:shd w:val="clear" w:color="auto" w:fill="FFFFFF"/>
-        </w:rPr>
-        <w:t>2</w:t>
-      </w:r>
-      <w:r>
-        <w:rPr>
-          <w:rFonts w:ascii="Tahoma" w:hAnsi="Tahoma" w:cs="Tahoma" w:eastAsia="Tahoma"/>
-          <w:sz w:val="22"/>
-          <w:szCs w:val="22"/>
-          <w:shd w:val="clear" w:color="auto" w:fill="FFFFFF"/>
-          <w:lang w:val="en-US"/>
-        </w:rPr>
-        <w:t xml:space="preserve"> </w:t>
-      </w:r>
-      <w:r>
-        <w:rPr>
-          <w:rFonts w:ascii="Tahoma" w:hAnsi="Tahoma" w:cs="Tahoma" w:eastAsia="Tahoma"/>
+          <w:rFonts w:ascii="Arial" w:hAnsi="Arial" w:cs="Arial"/>
           <w:sz w:val="22"/>
           <w:szCs w:val="22"/>
           <w:shd w:val="clear" w:color="auto" w:fill="FFFFFF"/>
@@ -735,7 +840,7 @@
         <w:ind w:left="142" w:right="46"/>
         <w:jc w:val="both"/>
         <w:rPr>
-          <w:rFonts w:ascii="Tahoma" w:hAnsi="Tahoma" w:cs="Tahoma" w:eastAsia="Tahoma"/>
+          <w:rFonts w:ascii="Arial" w:hAnsi="Arial" w:cs="Arial"/>
           <w:sz w:val="22"/>
           <w:szCs w:val="22"/>
           <w:shd w:val="clear" w:color="auto" w:fill="FFFFFF"/>
@@ -745,7 +850,7 @@
       <w:r>
         <w:rPr>
           <w:rStyle w:val="MSGENFONTSTYLENAMETEMPLATEROLENUMBERMSGENFONTSTYLENAMEBYROLETEXT2"/>
-          <w:rFonts w:ascii="Tahoma" w:hAnsi="Tahoma" w:cs="Tahoma" w:eastAsia="Tahoma"/>
+          <w:rFonts w:ascii="Arial" w:hAnsi="Arial" w:cs="Arial"/>
           <w:sz w:val="22"/>
           <w:szCs w:val="22"/>
           <w:lang w:val="en-US"/>
@@ -755,7 +860,7 @@
       <w:r>
         <w:rPr>
           <w:rStyle w:val="MSGENFONTSTYLENAMETEMPLATEROLENUMBERMSGENFONTSTYLENAMEBYROLETEXT2"/>
-          <w:rFonts w:ascii="Tahoma" w:hAnsi="Tahoma" w:cs="Tahoma" w:eastAsia="Tahoma"/>
+          <w:rFonts w:ascii="Arial" w:hAnsi="Arial" w:cs="Arial"/>
           <w:sz w:val="22"/>
           <w:szCs w:val="22"/>
         </w:rPr>
@@ -764,7 +869,7 @@
       <w:r>
         <w:rPr>
           <w:rStyle w:val="MSGENFONTSTYLENAMETEMPLATEROLENUMBERMSGENFONTSTYLENAMEBYROLETEXT2"/>
-          <w:rFonts w:ascii="Tahoma" w:hAnsi="Tahoma" w:cs="Tahoma" w:eastAsia="Tahoma"/>
+          <w:rFonts w:ascii="Arial" w:hAnsi="Arial" w:cs="Arial"/>
           <w:sz w:val="22"/>
           <w:szCs w:val="22"/>
           <w:lang w:val="en-US"/>
@@ -774,7 +879,7 @@
       <w:r>
         <w:rPr>
           <w:rStyle w:val="MSGENFONTSTYLENAMETEMPLATEROLENUMBERMSGENFONTSTYLENAMEBYROLETEXT2"/>
-          <w:rFonts w:ascii="Tahoma" w:hAnsi="Tahoma" w:cs="Tahoma" w:eastAsia="Tahoma"/>
+          <w:rFonts w:ascii="Arial" w:hAnsi="Arial" w:cs="Arial"/>
           <w:sz w:val="22"/>
           <w:szCs w:val="22"/>
         </w:rPr>
@@ -783,7 +888,7 @@
       <w:r>
         <w:rPr>
           <w:rStyle w:val="MSGENFONTSTYLENAMETEMPLATEROLENUMBERMSGENFONTSTYLENAMEBYROLETEXT2"/>
-          <w:rFonts w:ascii="Tahoma" w:hAnsi="Tahoma" w:cs="Tahoma" w:eastAsia="Tahoma"/>
+          <w:rFonts w:ascii="Arial" w:hAnsi="Arial" w:cs="Arial"/>
           <w:sz w:val="22"/>
           <w:szCs w:val="22"/>
           <w:lang w:val="en-US"/>
@@ -793,7 +898,7 @@
       <w:r>
         <w:rPr>
           <w:rStyle w:val="MSGENFONTSTYLENAMETEMPLATEROLENUMBERMSGENFONTSTYLENAMEBYROLETEXT2"/>
-          <w:rFonts w:ascii="Tahoma" w:hAnsi="Tahoma" w:cs="Tahoma" w:eastAsia="Tahoma"/>
+          <w:rFonts w:ascii="Arial" w:hAnsi="Arial" w:cs="Arial"/>
           <w:sz w:val="22"/>
           <w:szCs w:val="22"/>
         </w:rPr>
@@ -802,7 +907,7 @@
       <w:r>
         <w:rPr>
           <w:rStyle w:val="MSGENFONTSTYLENAMETEMPLATEROLENUMBERMSGENFONTSTYLENAMEBYROLETEXT2"/>
-          <w:rFonts w:ascii="Tahoma" w:hAnsi="Tahoma" w:cs="Tahoma" w:eastAsia="Tahoma"/>
+          <w:rFonts w:ascii="Arial" w:hAnsi="Arial" w:cs="Arial"/>
           <w:sz w:val="22"/>
           <w:szCs w:val="22"/>
           <w:lang w:val="en-US"/>
@@ -812,7 +917,7 @@
       <w:r>
         <w:rPr>
           <w:rStyle w:val="MSGENFONTSTYLENAMETEMPLATEROLENUMBERMSGENFONTSTYLENAMEBYROLETEXT2"/>
-          <w:rFonts w:ascii="Tahoma" w:hAnsi="Tahoma" w:cs="Tahoma" w:eastAsia="Tahoma"/>
+          <w:rFonts w:ascii="Arial" w:hAnsi="Arial" w:cs="Arial"/>
           <w:sz w:val="22"/>
           <w:szCs w:val="22"/>
         </w:rPr>
@@ -821,7 +926,7 @@
       <w:r>
         <w:rPr>
           <w:rStyle w:val="MSGENFONTSTYLENAMETEMPLATEROLENUMBERMSGENFONTSTYLENAMEBYROLETEXT2"/>
-          <w:rFonts w:ascii="Tahoma" w:hAnsi="Tahoma" w:cs="Tahoma" w:eastAsia="Tahoma"/>
+          <w:rFonts w:ascii="Arial" w:hAnsi="Arial" w:cs="Arial"/>
           <w:sz w:val="22"/>
           <w:szCs w:val="22"/>
           <w:lang w:val="en-US"/>
@@ -831,7 +936,7 @@
       <w:r>
         <w:rPr>
           <w:rStyle w:val="MSGENFONTSTYLENAMETEMPLATEROLENUMBERMSGENFONTSTYLENAMEBYROLETEXT2"/>
-          <w:rFonts w:ascii="Tahoma" w:hAnsi="Tahoma" w:cs="Tahoma" w:eastAsia="Tahoma"/>
+          <w:rFonts w:ascii="Arial" w:hAnsi="Arial" w:cs="Arial"/>
           <w:sz w:val="22"/>
           <w:szCs w:val="22"/>
         </w:rPr>
@@ -840,7 +945,7 @@
       <w:r>
         <w:rPr>
           <w:rStyle w:val="MSGENFONTSTYLENAMETEMPLATEROLENUMBERMSGENFONTSTYLENAMEBYROLETEXT2"/>
-          <w:rFonts w:ascii="Tahoma" w:hAnsi="Tahoma" w:cs="Tahoma" w:eastAsia="Tahoma"/>
+          <w:rFonts w:ascii="Arial" w:hAnsi="Arial" w:cs="Arial"/>
           <w:sz w:val="22"/>
           <w:szCs w:val="22"/>
           <w:lang w:val="en-US"/>
@@ -850,7 +955,7 @@
       <w:r>
         <w:rPr>
           <w:rStyle w:val="MSGENFONTSTYLENAMETEMPLATEROLENUMBERMSGENFONTSTYLENAMEBYROLETEXT2"/>
-          <w:rFonts w:ascii="Tahoma" w:hAnsi="Tahoma" w:cs="Tahoma" w:eastAsia="Tahoma"/>
+          <w:rFonts w:ascii="Arial" w:hAnsi="Arial" w:cs="Arial"/>
           <w:sz w:val="22"/>
           <w:szCs w:val="22"/>
         </w:rPr>
@@ -859,7 +964,7 @@
       <w:r>
         <w:rPr>
           <w:rStyle w:val="MSGENFONTSTYLENAMETEMPLATEROLENUMBERMSGENFONTSTYLENAMEBYROLETEXT2"/>
-          <w:rFonts w:ascii="Tahoma" w:hAnsi="Tahoma" w:cs="Tahoma" w:eastAsia="Tahoma"/>
+          <w:rFonts w:ascii="Arial" w:hAnsi="Arial" w:cs="Arial"/>
           <w:sz w:val="22"/>
           <w:szCs w:val="22"/>
           <w:lang w:val="en-US"/>
@@ -868,7 +973,7 @@
       </w:r>
       <w:r>
         <w:rPr>
-          <w:rFonts w:ascii="Tahoma" w:hAnsi="Tahoma" w:cs="Tahoma" w:eastAsia="Tahoma"/>
+          <w:rFonts w:ascii="Arial" w:hAnsi="Arial" w:cs="Arial"/>
           <w:sz w:val="22"/>
           <w:szCs w:val="22"/>
           <w:shd w:val="clear" w:color="auto" w:fill="FFFFFF"/>
@@ -877,7 +982,7 @@
       </w:r>
       <w:r>
         <w:rPr>
-          <w:rFonts w:ascii="Tahoma" w:hAnsi="Tahoma" w:cs="Tahoma" w:eastAsia="Tahoma"/>
+          <w:rFonts w:ascii="Arial" w:hAnsi="Arial" w:cs="Arial"/>
           <w:sz w:val="22"/>
           <w:szCs w:val="22"/>
           <w:lang w:val="en-US"/>
@@ -887,7 +992,7 @@
       <w:r>
         <w:rPr>
           <w:rStyle w:val="MSGENFONTSTYLENAMETEMPLATEROLENUMBERMSGENFONTSTYLENAMEBYROLETEXT2"/>
-          <w:rFonts w:ascii="Tahoma" w:hAnsi="Tahoma" w:cs="Tahoma" w:eastAsia="Tahoma"/>
+          <w:rFonts w:ascii="Arial" w:hAnsi="Arial" w:cs="Arial"/>
           <w:sz w:val="22"/>
           <w:szCs w:val="22"/>
         </w:rPr>
@@ -896,7 +1001,7 @@
       <w:r>
         <w:rPr>
           <w:rStyle w:val="MSGENFONTSTYLENAMETEMPLATEROLENUMBERMSGENFONTSTYLENAMEBYROLETEXT2"/>
-          <w:rFonts w:ascii="Tahoma" w:hAnsi="Tahoma" w:cs="Tahoma" w:eastAsia="Tahoma"/>
+          <w:rFonts w:ascii="Arial" w:hAnsi="Arial" w:cs="Arial"/>
           <w:sz w:val="22"/>
           <w:szCs w:val="22"/>
           <w:lang w:val="en-US"/>
@@ -905,7 +1010,7 @@
       </w:r>
       <w:r>
         <w:rPr>
-          <w:rFonts w:ascii="Tahoma" w:hAnsi="Tahoma" w:cs="Tahoma" w:eastAsia="Tahoma"/>
+          <w:rFonts w:ascii="Arial" w:hAnsi="Arial" w:cs="Arial"/>
           <w:sz w:val="22"/>
           <w:szCs w:val="22"/>
           <w:shd w:val="clear" w:color="auto" w:fill="FFFFFF"/>
@@ -914,7 +1019,7 @@
       </w:r>
       <w:r>
         <w:rPr>
-          <w:rFonts w:ascii="Tahoma" w:hAnsi="Tahoma" w:cs="Tahoma" w:eastAsia="Tahoma"/>
+          <w:rFonts w:ascii="Arial" w:hAnsi="Arial" w:cs="Arial"/>
           <w:sz w:val="22"/>
           <w:szCs w:val="22"/>
           <w:shd w:val="clear" w:color="auto" w:fill="FFFFFF"/>
@@ -925,7 +1030,7 @@
       <w:r>
         <w:rPr>
           <w:rStyle w:val="MSGENFONTSTYLENAMETEMPLATEROLENUMBERMSGENFONTSTYLENAMEBYROLETEXT2"/>
-          <w:rFonts w:ascii="Tahoma" w:hAnsi="Tahoma" w:cs="Tahoma" w:eastAsia="Tahoma"/>
+          <w:rFonts w:ascii="Arial" w:hAnsi="Arial" w:cs="Arial"/>
           <w:sz w:val="22"/>
           <w:szCs w:val="22"/>
         </w:rPr>
@@ -934,7 +1039,7 @@
       <w:r>
         <w:rPr>
           <w:rStyle w:val="MSGENFONTSTYLENAMETEMPLATEROLENUMBERMSGENFONTSTYLENAMEBYROLETEXT2"/>
-          <w:rFonts w:ascii="Tahoma" w:hAnsi="Tahoma" w:cs="Tahoma" w:eastAsia="Tahoma"/>
+          <w:rFonts w:ascii="Arial" w:hAnsi="Arial" w:cs="Arial"/>
           <w:sz w:val="22"/>
           <w:szCs w:val="22"/>
           <w:lang w:val="en-US"/>
@@ -944,7 +1049,7 @@
       <w:r>
         <w:rPr>
           <w:rStyle w:val="MSGENFONTSTYLENAMETEMPLATEROLENUMBERMSGENFONTSTYLENAMEBYROLETEXT2"/>
-          <w:rFonts w:ascii="Tahoma" w:hAnsi="Tahoma" w:cs="Tahoma" w:eastAsia="Tahoma"/>
+          <w:rFonts w:ascii="Arial" w:hAnsi="Arial" w:cs="Arial"/>
           <w:sz w:val="22"/>
           <w:szCs w:val="22"/>
         </w:rPr>
@@ -953,7 +1058,7 @@
       <w:r>
         <w:rPr>
           <w:rStyle w:val="MSGENFONTSTYLENAMETEMPLATEROLENUMBERMSGENFONTSTYLENAMEBYROLETEXT2"/>
-          <w:rFonts w:ascii="Tahoma" w:hAnsi="Tahoma" w:cs="Tahoma" w:eastAsia="Tahoma"/>
+          <w:rFonts w:ascii="Arial" w:hAnsi="Arial" w:cs="Arial"/>
           <w:sz w:val="22"/>
           <w:szCs w:val="22"/>
           <w:lang w:val="en-US"/>
@@ -962,7 +1067,7 @@
       </w:r>
       <w:r>
         <w:rPr>
-          <w:rFonts w:ascii="Tahoma" w:hAnsi="Tahoma" w:cs="Tahoma" w:eastAsia="Tahoma"/>
+          <w:rFonts w:ascii="Arial" w:hAnsi="Arial" w:cs="Arial"/>
           <w:sz w:val="22"/>
           <w:szCs w:val="22"/>
           <w:shd w:val="clear" w:color="auto" w:fill="FFFFFF"/>
@@ -982,7 +1087,7 @@
         <w:ind w:left="142" w:right="46"/>
         <w:jc w:val="both"/>
         <w:rPr>
-          <w:rFonts w:ascii="Tahoma" w:hAnsi="Tahoma" w:cs="Tahoma" w:eastAsia="Tahoma"/>
+          <w:rFonts w:ascii="Arial" w:hAnsi="Arial" w:cs="Arial"/>
           <w:shd w:val="clear" w:color="auto" w:fill="FFFFFF"/>
           <w:lang w:val="en-US"/>
         </w:rPr>
@@ -990,7 +1095,7 @@
       <w:r>
         <w:rPr>
           <w:rStyle w:val="MSGENFONTSTYLENAMETEMPLATEROLENUMBERMSGENFONTSTYLENAMEBYROLETEXT2"/>
-          <w:rFonts w:ascii="Tahoma" w:hAnsi="Tahoma" w:cs="Tahoma" w:eastAsia="Tahoma"/>
+          <w:rFonts w:ascii="Arial" w:hAnsi="Arial" w:cs="Arial"/>
           <w:sz w:val="22"/>
           <w:szCs w:val="22"/>
         </w:rPr>
@@ -999,7 +1104,7 @@
       <w:r>
         <w:rPr>
           <w:rStyle w:val="MSGENFONTSTYLENAMETEMPLATEROLENUMBERMSGENFONTSTYLENAMEBYROLETEXT2"/>
-          <w:rFonts w:ascii="Tahoma" w:hAnsi="Tahoma" w:cs="Tahoma" w:eastAsia="Tahoma"/>
+          <w:rFonts w:ascii="Arial" w:hAnsi="Arial" w:cs="Arial"/>
           <w:sz w:val="22"/>
           <w:szCs w:val="22"/>
           <w:lang w:val="en-US"/>
@@ -1009,7 +1114,7 @@
       <w:r>
         <w:rPr>
           <w:rStyle w:val="MSGENFONTSTYLENAMETEMPLATEROLENUMBERMSGENFONTSTYLENAMEBYROLETEXT2"/>
-          <w:rFonts w:ascii="Tahoma" w:hAnsi="Tahoma" w:cs="Tahoma" w:eastAsia="Tahoma"/>
+          <w:rFonts w:ascii="Arial" w:hAnsi="Arial" w:cs="Arial"/>
           <w:sz w:val="22"/>
           <w:szCs w:val="22"/>
         </w:rPr>
@@ -1018,7 +1123,7 @@
       <w:r>
         <w:rPr>
           <w:rStyle w:val="MSGENFONTSTYLENAMETEMPLATEROLENUMBERMSGENFONTSTYLENAMEBYROLETEXT2"/>
-          <w:rFonts w:ascii="Tahoma" w:hAnsi="Tahoma" w:cs="Tahoma" w:eastAsia="Tahoma"/>
+          <w:rFonts w:ascii="Arial" w:hAnsi="Arial" w:cs="Arial"/>
           <w:sz w:val="22"/>
           <w:szCs w:val="22"/>
           <w:lang w:val="en-US"/>
@@ -1028,7 +1133,7 @@
       <w:r>
         <w:rPr>
           <w:rStyle w:val="MSGENFONTSTYLENAMETEMPLATEROLENUMBERMSGENFONTSTYLENAMEBYROLETEXT2"/>
-          <w:rFonts w:ascii="Tahoma" w:hAnsi="Tahoma" w:cs="Tahoma" w:eastAsia="Tahoma"/>
+          <w:rFonts w:ascii="Arial" w:hAnsi="Arial" w:cs="Arial"/>
           <w:sz w:val="22"/>
           <w:szCs w:val="22"/>
         </w:rPr>
@@ -1036,7 +1141,7 @@
       </w:r>
       <w:r>
         <w:rPr>
-          <w:rFonts w:ascii="Tahoma" w:hAnsi="Tahoma" w:cs="Tahoma" w:eastAsia="Tahoma"/>
+          <w:rFonts w:ascii="Arial" w:hAnsi="Arial" w:cs="Arial"/>
           <w:shd w:val="clear" w:color="auto" w:fill="FFFFFF"/>
           <w:lang w:val="en-US"/>
         </w:rPr>
@@ -1044,7 +1149,7 @@
       </w:r>
       <w:r>
         <w:rPr>
-          <w:rFonts w:ascii="Tahoma" w:hAnsi="Tahoma" w:cs="Tahoma" w:eastAsia="Tahoma"/>
+          <w:rFonts w:ascii="Arial" w:hAnsi="Arial" w:cs="Arial"/>
           <w:sz w:val="22"/>
           <w:szCs w:val="22"/>
           <w:shd w:val="clear" w:color="auto" w:fill="FFFFFF"/>
@@ -1062,7 +1167,7 @@
         <w:jc w:val="both"/>
         <w:rPr>
           <w:rStyle w:val="MSGENFONTSTYLENAMETEMPLATEROLENUMBERMSGENFONTSTYLENAMEBYROLETEXT2"/>
-          <w:rFonts w:ascii="Tahoma" w:hAnsi="Tahoma" w:cs="Tahoma" w:eastAsia="Tahoma"/>
+          <w:rFonts w:ascii="Arial" w:hAnsi="Arial" w:cs="Arial"/>
           <w:sz w:val="22"/>
           <w:szCs w:val="22"/>
           <w:lang w:val="en-US"/>
@@ -1071,7 +1176,7 @@
       <w:r>
         <w:rPr>
           <w:rStyle w:val="MSGENFONTSTYLENAMETEMPLATEROLENUMBERMSGENFONTSTYLENAMEBYROLETEXT2"/>
-          <w:rFonts w:ascii="Tahoma" w:hAnsi="Tahoma" w:cs="Tahoma" w:eastAsia="Tahoma"/>
+          <w:rFonts w:ascii="Arial" w:hAnsi="Arial" w:cs="Arial"/>
           <w:sz w:val="22"/>
           <w:szCs w:val="22"/>
         </w:rPr>
@@ -1087,7 +1192,7 @@
         <w:jc w:val="both"/>
         <w:rPr>
           <w:rStyle w:val="MSGENFONTSTYLENAMETEMPLATEROLENUMBERMSGENFONTSTYLENAMEBYROLETEXT2"/>
-          <w:rFonts w:ascii="Tahoma" w:hAnsi="Tahoma" w:cs="Tahoma" w:eastAsia="Tahoma"/>
+          <w:rFonts w:ascii="Arial" w:hAnsi="Arial" w:cs="Arial"/>
           <w:sz w:val="22"/>
           <w:szCs w:val="22"/>
           <w:lang w:val="en-US"/>
@@ -1104,7 +1209,7 @@
         <w:ind w:left="142" w:right="46"/>
         <w:rPr>
           <w:rStyle w:val="MSGENFONTSTYLENAMETEMPLATEROLENUMBERMSGENFONTSTYLENAMEBYROLETEXT3"/>
-          <w:rFonts w:ascii="Tahoma" w:hAnsi="Tahoma" w:cs="Tahoma" w:eastAsia="Tahoma"/>
+          <w:rFonts w:ascii="Arial" w:hAnsi="Arial" w:cs="Arial"/>
           <w:b/>
           <w:bCs/>
           <w:i/>
@@ -1117,7 +1222,7 @@
       <w:r>
         <w:rPr>
           <w:rStyle w:val="MSGENFONTSTYLENAMETEMPLATEROLENUMBERMSGENFONTSTYLENAMEBYROLETEXT3"/>
-          <w:rFonts w:ascii="Tahoma" w:hAnsi="Tahoma" w:cs="Tahoma" w:eastAsia="Tahoma"/>
+          <w:rFonts w:ascii="Arial" w:hAnsi="Arial" w:cs="Arial"/>
           <w:b/>
           <w:bCs/>
           <w:i/>
@@ -1131,7 +1236,7 @@
       <w:r>
         <w:rPr>
           <w:rStyle w:val="MSGENFONTSTYLENAMETEMPLATEROLENUMBERMSGENFONTSTYLENAMEBYROLETEXT3"/>
-          <w:rFonts w:ascii="Tahoma" w:hAnsi="Tahoma" w:cs="Tahoma" w:eastAsia="Tahoma"/>
+          <w:rFonts w:ascii="Arial" w:hAnsi="Arial" w:cs="Arial"/>
           <w:b/>
           <w:bCs/>
           <w:i/>
@@ -1144,7 +1249,7 @@
       <w:r>
         <w:rPr>
           <w:rStyle w:val="MSGENFONTSTYLENAMETEMPLATEROLENUMBERMSGENFONTSTYLENAMEBYROLETEXT3"/>
-          <w:rFonts w:ascii="Tahoma" w:hAnsi="Tahoma" w:cs="Tahoma" w:eastAsia="Tahoma"/>
+          <w:rFonts w:ascii="Arial" w:hAnsi="Arial" w:cs="Arial"/>
           <w:b/>
           <w:bCs/>
           <w:i/>
@@ -1158,7 +1263,7 @@
       <w:r>
         <w:rPr>
           <w:rStyle w:val="MSGENFONTSTYLENAMETEMPLATEROLENUMBERMSGENFONTSTYLENAMEBYROLETEXT3"/>
-          <w:rFonts w:ascii="Tahoma" w:hAnsi="Tahoma" w:cs="Tahoma" w:eastAsia="Tahoma"/>
+          <w:rFonts w:ascii="Arial" w:hAnsi="Arial" w:cs="Arial"/>
           <w:b/>
           <w:bCs/>
           <w:i/>
@@ -1177,7 +1282,7 @@
         <w:ind w:left="142" w:right="46"/>
         <w:rPr>
           <w:rStyle w:val="MSGENFONTSTYLENAMETEMPLATEROLENUMBERMSGENFONTSTYLENAMEBYROLETEXT3"/>
-          <w:rFonts w:ascii="Tahoma" w:hAnsi="Tahoma" w:cs="Tahoma" w:eastAsia="Tahoma"/>
+          <w:rFonts w:ascii="Arial" w:hAnsi="Arial" w:cs="Arial"/>
           <w:b/>
           <w:bCs/>
           <w:i/>
@@ -1196,7 +1301,7 @@
         <w:ind w:left="142" w:right="46"/>
         <w:rPr>
           <w:rStyle w:val="MSGENFONTSTYLENAMETEMPLATEROLENUMBERMSGENFONTSTYLENAMEBYROLETEXT3"/>
-          <w:rFonts w:ascii="Tahoma" w:hAnsi="Tahoma" w:cs="Tahoma" w:eastAsia="Tahoma"/>
+          <w:rFonts w:ascii="Arial" w:hAnsi="Arial" w:cs="Arial"/>
           <w:b/>
           <w:bCs/>
           <w:i/>
@@ -1209,7 +1314,7 @@
       <w:r>
         <w:rPr>
           <w:rStyle w:val="MSGENFONTSTYLENAMETEMPLATEROLENUMBERMSGENFONTSTYLENAMEBYROLETEXT3"/>
-          <w:rFonts w:ascii="Tahoma" w:hAnsi="Tahoma" w:cs="Tahoma" w:eastAsia="Tahoma"/>
+          <w:rFonts w:ascii="Arial" w:hAnsi="Arial" w:cs="Arial"/>
           <w:b/>
           <w:bCs/>
           <w:i/>
@@ -1223,7 +1328,7 @@
       <w:r>
         <w:rPr>
           <w:rStyle w:val="MSGENFONTSTYLENAMETEMPLATEROLENUMBERMSGENFONTSTYLENAMEBYROLETEXT3"/>
-          <w:rFonts w:ascii="Tahoma" w:hAnsi="Tahoma" w:cs="Tahoma" w:eastAsia="Tahoma"/>
+          <w:rFonts w:ascii="Arial" w:hAnsi="Arial" w:cs="Arial"/>
           <w:b/>
           <w:bCs/>
           <w:i/>
@@ -1236,7 +1341,7 @@
       <w:r>
         <w:rPr>
           <w:rStyle w:val="MSGENFONTSTYLENAMETEMPLATEROLENUMBERMSGENFONTSTYLENAMEBYROLETEXT3"/>
-          <w:rFonts w:ascii="Tahoma" w:hAnsi="Tahoma" w:cs="Tahoma" w:eastAsia="Tahoma"/>
+          <w:rFonts w:ascii="Arial" w:hAnsi="Arial" w:cs="Arial"/>
           <w:b/>
           <w:bCs/>
           <w:i/>
@@ -1250,7 +1355,7 @@
       <w:r>
         <w:rPr>
           <w:rStyle w:val="MSGENFONTSTYLENAMETEMPLATEROLENUMBERMSGENFONTSTYLENAMEBYROLETEXT3"/>
-          <w:rFonts w:ascii="Tahoma" w:hAnsi="Tahoma" w:cs="Tahoma" w:eastAsia="Tahoma"/>
+          <w:rFonts w:ascii="Arial" w:hAnsi="Arial" w:cs="Arial"/>
           <w:b/>
           <w:bCs/>
           <w:i/>
@@ -1263,7 +1368,7 @@
       <w:r>
         <w:rPr>
           <w:rStyle w:val="MSGENFONTSTYLENAMETEMPLATEROLENUMBERMSGENFONTSTYLENAMEBYROLETEXT3"/>
-          <w:rFonts w:ascii="Tahoma" w:hAnsi="Tahoma" w:cs="Tahoma" w:eastAsia="Tahoma"/>
+          <w:rFonts w:ascii="Arial" w:hAnsi="Arial" w:cs="Arial"/>
           <w:b/>
           <w:bCs/>
           <w:i/>
@@ -1277,7 +1382,7 @@
       <w:r>
         <w:rPr>
           <w:rStyle w:val="MSGENFONTSTYLENAMETEMPLATEROLENUMBERMSGENFONTSTYLENAMEBYROLETEXT3"/>
-          <w:rFonts w:ascii="Tahoma" w:hAnsi="Tahoma" w:cs="Tahoma" w:eastAsia="Tahoma"/>
+          <w:rFonts w:ascii="Arial" w:hAnsi="Arial" w:cs="Arial"/>
           <w:b/>
           <w:bCs/>
           <w:i/>
@@ -1296,7 +1401,7 @@
         <w:ind w:left="142" w:right="46"/>
         <w:rPr>
           <w:rStyle w:val="MSGENFONTSTYLENAMETEMPLATEROLENUMBERMSGENFONTSTYLENAMEBYROLETEXT3"/>
-          <w:rFonts w:ascii="Tahoma" w:hAnsi="Tahoma" w:cs="Tahoma" w:eastAsia="Tahoma"/>
+          <w:rFonts w:ascii="Arial" w:hAnsi="Arial" w:cs="Arial"/>
           <w:b/>
           <w:bCs/>
           <w:i/>
@@ -1315,7 +1420,7 @@
         <w:ind w:left="142" w:right="46"/>
         <w:rPr>
           <w:rStyle w:val="MSGENFONTSTYLENAMETEMPLATEROLENUMBERMSGENFONTSTYLENAMEBYROLETEXT3"/>
-          <w:rFonts w:ascii="Tahoma" w:hAnsi="Tahoma" w:cs="Tahoma" w:eastAsia="Tahoma"/>
+          <w:rFonts w:ascii="Arial" w:hAnsi="Arial" w:cs="Arial"/>
           <w:b/>
           <w:bCs/>
           <w:i/>
@@ -1328,7 +1433,7 @@
       <w:r>
         <w:rPr>
           <w:rStyle w:val="MSGENFONTSTYLENAMETEMPLATEROLENUMBERMSGENFONTSTYLENAMEBYROLETEXT3"/>
-          <w:rFonts w:ascii="Tahoma" w:hAnsi="Tahoma" w:cs="Tahoma" w:eastAsia="Tahoma"/>
+          <w:rFonts w:ascii="Arial" w:hAnsi="Arial" w:cs="Arial"/>
           <w:b/>
           <w:bCs/>
           <w:i/>
@@ -1341,7 +1446,7 @@
       <w:r>
         <w:rPr>
           <w:rStyle w:val="MSGENFONTSTYLENAMETEMPLATEROLENUMBERMSGENFONTSTYLENAMEBYROLETEXT3"/>
-          <w:rFonts w:ascii="Tahoma" w:hAnsi="Tahoma" w:cs="Tahoma" w:eastAsia="Tahoma"/>
+          <w:rFonts w:ascii="Arial" w:hAnsi="Arial" w:cs="Arial"/>
           <w:b/>
           <w:bCs/>
           <w:i/>
@@ -1355,7 +1460,7 @@
       <w:r>
         <w:rPr>
           <w:rStyle w:val="MSGENFONTSTYLENAMETEMPLATEROLENUMBERMSGENFONTSTYLENAMEBYROLETEXT3"/>
-          <w:rFonts w:ascii="Tahoma" w:hAnsi="Tahoma" w:cs="Tahoma" w:eastAsia="Tahoma"/>
+          <w:rFonts w:ascii="Arial" w:hAnsi="Arial" w:cs="Arial"/>
           <w:b/>
           <w:bCs/>
           <w:i/>
@@ -1368,7 +1473,7 @@
       <w:r>
         <w:rPr>
           <w:rStyle w:val="MSGENFONTSTYLENAMETEMPLATEROLENUMBERMSGENFONTSTYLENAMEBYROLETEXT3"/>
-          <w:rFonts w:ascii="Tahoma" w:hAnsi="Tahoma" w:cs="Tahoma" w:eastAsia="Tahoma"/>
+          <w:rFonts w:ascii="Arial" w:hAnsi="Arial" w:cs="Arial"/>
           <w:b/>
           <w:bCs/>
           <w:i/>
@@ -1382,7 +1487,7 @@
       <w:r>
         <w:rPr>
           <w:rStyle w:val="MSGENFONTSTYLENAMETEMPLATEROLENUMBERMSGENFONTSTYLENAMEBYROLETEXT3"/>
-          <w:rFonts w:ascii="Tahoma" w:hAnsi="Tahoma" w:cs="Tahoma" w:eastAsia="Tahoma"/>
+          <w:rFonts w:ascii="Arial" w:hAnsi="Arial" w:cs="Arial"/>
           <w:b/>
           <w:bCs/>
           <w:i/>
@@ -1395,7 +1500,7 @@
       <w:r>
         <w:rPr>
           <w:rStyle w:val="MSGENFONTSTYLENAMETEMPLATEROLENUMBERMSGENFONTSTYLENAMEBYROLETEXT3"/>
-          <w:rFonts w:ascii="Tahoma" w:hAnsi="Tahoma" w:cs="Tahoma" w:eastAsia="Tahoma"/>
+          <w:rFonts w:ascii="Arial" w:hAnsi="Arial" w:cs="Arial"/>
           <w:b/>
           <w:bCs/>
           <w:i/>
@@ -1409,7 +1514,7 @@
       <w:r>
         <w:rPr>
           <w:rStyle w:val="MSGENFONTSTYLENAMETEMPLATEROLENUMBERMSGENFONTSTYLENAMEBYROLETEXT3"/>
-          <w:rFonts w:ascii="Tahoma" w:hAnsi="Tahoma" w:cs="Tahoma" w:eastAsia="Tahoma"/>
+          <w:rFonts w:ascii="Arial" w:hAnsi="Arial" w:cs="Arial"/>
           <w:b/>
           <w:bCs/>
           <w:i/>
@@ -1422,7 +1527,7 @@
       <w:r>
         <w:rPr>
           <w:rStyle w:val="MSGENFONTSTYLENAMETEMPLATEROLENUMBERMSGENFONTSTYLENAMEBYROLETEXT3"/>
-          <w:rFonts w:ascii="Tahoma" w:hAnsi="Tahoma" w:cs="Tahoma" w:eastAsia="Tahoma"/>
+          <w:rFonts w:ascii="Arial" w:hAnsi="Arial" w:cs="Arial"/>
           <w:b/>
           <w:bCs/>
           <w:i/>
@@ -1436,7 +1541,7 @@
       <w:r>
         <w:rPr>
           <w:rStyle w:val="MSGENFONTSTYLENAMETEMPLATEROLENUMBERMSGENFONTSTYLENAMEBYROLETEXT3"/>
-          <w:rFonts w:ascii="Tahoma" w:hAnsi="Tahoma" w:cs="Tahoma" w:eastAsia="Tahoma"/>
+          <w:rFonts w:ascii="Arial" w:hAnsi="Arial" w:cs="Arial"/>
           <w:b/>
           <w:bCs/>
           <w:i/>
@@ -1455,7 +1560,7 @@
         <w:ind w:left="142" w:right="46"/>
         <w:rPr>
           <w:rStyle w:val="MSGENFONTSTYLENAMETEMPLATEROLENUMBERMSGENFONTSTYLENAMEBYROLETEXT3"/>
-          <w:rFonts w:ascii="Tahoma" w:hAnsi="Tahoma" w:cs="Tahoma" w:eastAsia="Tahoma"/>
+          <w:rFonts w:ascii="Arial" w:hAnsi="Arial" w:cs="Arial"/>
           <w:b/>
           <w:bCs/>
           <w:i/>
@@ -1474,7 +1579,7 @@
         <w:ind w:left="142" w:right="46"/>
         <w:rPr>
           <w:rStyle w:val="MSGENFONTSTYLENAMETEMPLATEROLENUMBERMSGENFONTSTYLENAMEBYROLETEXT3"/>
-          <w:rFonts w:ascii="Tahoma" w:hAnsi="Tahoma" w:cs="Tahoma" w:eastAsia="Tahoma"/>
+          <w:rFonts w:ascii="Arial" w:hAnsi="Arial" w:cs="Arial"/>
           <w:b/>
           <w:bCs/>
           <w:i/>
@@ -1487,7 +1592,7 @@
       <w:r>
         <w:rPr>
           <w:rStyle w:val="MSGENFONTSTYLENAMETEMPLATEROLENUMBERMSGENFONTSTYLENAMEBYROLETEXT3"/>
-          <w:rFonts w:ascii="Tahoma" w:hAnsi="Tahoma" w:cs="Tahoma" w:eastAsia="Tahoma"/>
+          <w:rFonts w:ascii="Arial" w:hAnsi="Arial" w:cs="Arial"/>
           <w:b/>
           <w:bCs/>
           <w:i/>
@@ -1500,7 +1605,7 @@
       <w:r>
         <w:rPr>
           <w:rStyle w:val="MSGENFONTSTYLENAMETEMPLATEROLENUMBERMSGENFONTSTYLENAMEBYROLETEXT3"/>
-          <w:rFonts w:ascii="Tahoma" w:hAnsi="Tahoma" w:cs="Tahoma" w:eastAsia="Tahoma"/>
+          <w:rFonts w:ascii="Arial" w:hAnsi="Arial" w:cs="Arial"/>
           <w:b/>
           <w:bCs/>
           <w:i/>
@@ -1514,7 +1619,7 @@
       <w:r>
         <w:rPr>
           <w:rStyle w:val="MSGENFONTSTYLENAMETEMPLATEROLENUMBERMSGENFONTSTYLENAMEBYROLETEXT3"/>
-          <w:rFonts w:ascii="Tahoma" w:hAnsi="Tahoma" w:cs="Tahoma" w:eastAsia="Tahoma"/>
+          <w:rFonts w:ascii="Arial" w:hAnsi="Arial" w:cs="Arial"/>
           <w:b/>
           <w:bCs/>
           <w:i/>
@@ -1527,7 +1632,7 @@
       <w:r>
         <w:rPr>
           <w:rStyle w:val="MSGENFONTSTYLENAMETEMPLATEROLENUMBERMSGENFONTSTYLENAMEBYROLETEXT3"/>
-          <w:rFonts w:ascii="Tahoma" w:hAnsi="Tahoma" w:cs="Tahoma" w:eastAsia="Tahoma"/>
+          <w:rFonts w:ascii="Arial" w:hAnsi="Arial" w:cs="Arial"/>
           <w:b/>
           <w:bCs/>
           <w:i/>
@@ -1541,7 +1646,7 @@
       <w:r>
         <w:rPr>
           <w:rStyle w:val="MSGENFONTSTYLENAMETEMPLATEROLENUMBERMSGENFONTSTYLENAMEBYROLETEXT3"/>
-          <w:rFonts w:ascii="Tahoma" w:hAnsi="Tahoma" w:cs="Tahoma" w:eastAsia="Tahoma"/>
+          <w:rFonts w:ascii="Arial" w:hAnsi="Arial" w:cs="Arial"/>
           <w:b/>
           <w:bCs/>
           <w:i/>
@@ -1554,7 +1659,7 @@
       <w:r>
         <w:rPr>
           <w:rStyle w:val="MSGENFONTSTYLENAMETEMPLATEROLENUMBERMSGENFONTSTYLENAMEBYROLETEXT3"/>
-          <w:rFonts w:ascii="Tahoma" w:hAnsi="Tahoma" w:cs="Tahoma" w:eastAsia="Tahoma"/>
+          <w:rFonts w:ascii="Arial" w:hAnsi="Arial" w:cs="Arial"/>
           <w:b/>
           <w:bCs/>
           <w:i/>
@@ -1568,7 +1673,7 @@
       <w:r>
         <w:rPr>
           <w:rStyle w:val="MSGENFONTSTYLENAMETEMPLATEROLENUMBERMSGENFONTSTYLENAMEBYROLETEXT3"/>
-          <w:rFonts w:ascii="Tahoma" w:hAnsi="Tahoma" w:cs="Tahoma" w:eastAsia="Tahoma"/>
+          <w:rFonts w:ascii="Arial" w:hAnsi="Arial" w:cs="Arial"/>
           <w:b/>
           <w:bCs/>
           <w:i/>
@@ -1587,7 +1692,7 @@
         <w:ind w:left="142" w:right="46"/>
         <w:rPr>
           <w:rStyle w:val="MSGENFONTSTYLENAMETEMPLATEROLENUMBERMSGENFONTSTYLENAMEBYROLETEXT3"/>
-          <w:rFonts w:ascii="Tahoma" w:hAnsi="Tahoma" w:cs="Tahoma" w:eastAsia="Tahoma"/>
+          <w:rFonts w:ascii="Arial" w:hAnsi="Arial" w:cs="Arial"/>
           <w:b/>
           <w:bCs/>
           <w:i/>
@@ -1606,7 +1711,7 @@
         <w:ind w:left="142" w:right="46"/>
         <w:rPr>
           <w:rStyle w:val="MSGENFONTSTYLENAMETEMPLATEROLENUMBERMSGENFONTSTYLENAMEBYROLETEXT3"/>
-          <w:rFonts w:ascii="Tahoma" w:hAnsi="Tahoma" w:cs="Tahoma" w:eastAsia="Tahoma"/>
+          <w:rFonts w:ascii="Arial" w:hAnsi="Arial" w:cs="Arial"/>
           <w:b/>
           <w:bCs/>
           <w:i/>
@@ -1619,7 +1724,7 @@
       <w:r>
         <w:rPr>
           <w:rStyle w:val="MSGENFONTSTYLENAMETEMPLATEROLENUMBERMSGENFONTSTYLENAMEBYROLETEXT3"/>
-          <w:rFonts w:ascii="Tahoma" w:hAnsi="Tahoma" w:cs="Tahoma" w:eastAsia="Tahoma"/>
+          <w:rFonts w:ascii="Arial" w:hAnsi="Arial" w:cs="Arial"/>
           <w:b/>
           <w:bCs/>
           <w:i/>
@@ -1638,7 +1743,7 @@
         <w:ind w:left="142" w:right="46"/>
         <w:rPr>
           <w:rStyle w:val="MSGENFONTSTYLENAMETEMPLATEROLENUMBERMSGENFONTSTYLENAMEBYROLETEXT3"/>
-          <w:rFonts w:ascii="Tahoma" w:hAnsi="Tahoma" w:cs="Tahoma" w:eastAsia="Tahoma"/>
+          <w:rFonts w:ascii="Arial" w:hAnsi="Arial" w:cs="Arial"/>
           <w:b/>
           <w:bCs/>
           <w:i/>
@@ -1657,7 +1762,7 @@
         <w:ind w:left="142" w:right="46"/>
         <w:rPr>
           <w:rStyle w:val="MSGENFONTSTYLENAMETEMPLATEROLENUMBERMSGENFONTSTYLENAMEBYROLETEXT3"/>
-          <w:rFonts w:ascii="Tahoma" w:hAnsi="Tahoma" w:cs="Tahoma" w:eastAsia="Tahoma"/>
+          <w:rFonts w:ascii="Arial" w:hAnsi="Arial" w:cs="Arial"/>
           <w:sz w:val="22"/>
           <w:szCs w:val="22"/>
           <w:lang w:val="en-US"/>
@@ -1666,7 +1771,7 @@
       <w:r>
         <w:rPr>
           <w:rStyle w:val="MSGENFONTSTYLENAMETEMPLATEROLENUMBERMSGENFONTSTYLENAMEBYROLETEXT3"/>
-          <w:rFonts w:ascii="Tahoma" w:hAnsi="Tahoma" w:cs="Tahoma" w:eastAsia="Tahoma"/>
+          <w:rFonts w:ascii="Arial" w:hAnsi="Arial" w:cs="Arial"/>
           <w:b/>
           <w:bCs/>
           <w:i/>
@@ -1679,7 +1784,7 @@
       <w:r>
         <w:rPr>
           <w:rStyle w:val="MSGENFONTSTYLENAMETEMPLATEROLENUMBERMSGENFONTSTYLENAMEBYROLETEXT3"/>
-          <w:rFonts w:ascii="Tahoma" w:hAnsi="Tahoma" w:cs="Tahoma" w:eastAsia="Tahoma"/>
+          <w:rFonts w:ascii="Arial" w:hAnsi="Arial" w:cs="Arial"/>
           <w:b/>
           <w:bCs/>
           <w:i/>
@@ -1693,7 +1798,7 @@
       <w:r>
         <w:rPr>
           <w:rStyle w:val="MSGENFONTSTYLENAMETEMPLATEROLENUMBERMSGENFONTSTYLENAMEBYROLETEXT3"/>
-          <w:rFonts w:ascii="Tahoma" w:hAnsi="Tahoma" w:cs="Tahoma" w:eastAsia="Tahoma"/>
+          <w:rFonts w:ascii="Arial" w:hAnsi="Arial" w:cs="Arial"/>
           <w:sz w:val="22"/>
           <w:szCs w:val="22"/>
           <w:lang w:val="en-US" w:eastAsia="en-US"/>
@@ -1702,7 +1807,7 @@
       </w:r>
       <w:r>
         <w:rPr>
-          <w:rFonts w:ascii="Tahoma" w:hAnsi="Tahoma" w:cs="Tahoma" w:eastAsia="Tahoma"/>
+          <w:rFonts w:ascii="Arial" w:hAnsi="Arial" w:cs="Arial"/>
           <w:sz w:val="22"/>
           <w:szCs w:val="22"/>
           <w:shd w:val="clear" w:color="auto" w:fill="FFFFFF"/>
@@ -1712,7 +1817,7 @@
       </w:r>
       <w:r>
         <w:rPr>
-          <w:rFonts w:ascii="Tahoma" w:hAnsi="Tahoma" w:cs="Tahoma" w:eastAsia="Tahoma"/>
+          <w:rFonts w:ascii="Arial" w:hAnsi="Arial" w:cs="Arial"/>
           <w:sz w:val="22"/>
           <w:szCs w:val="22"/>
           <w:shd w:val="clear" w:color="auto" w:fill="FFFFFF"/>
@@ -1722,7 +1827,7 @@
       </w:r>
       <w:r>
         <w:rPr>
-          <w:rFonts w:ascii="Tahoma" w:hAnsi="Tahoma" w:cs="Tahoma" w:eastAsia="Tahoma"/>
+          <w:rFonts w:ascii="Arial" w:hAnsi="Arial" w:cs="Arial"/>
           <w:sz w:val="22"/>
           <w:szCs w:val="22"/>
           <w:shd w:val="clear" w:color="auto" w:fill="FFFFFF"/>
@@ -1739,7 +1844,7 @@
         <w:ind w:left="142" w:right="46"/>
         <w:rPr>
           <w:rStyle w:val="MSGENFONTSTYLENAMETEMPLATEROLEMSGENFONTSTYLENAMEBYROLEPICTURECAPTION"/>
-          <w:rFonts w:ascii="Tahoma" w:hAnsi="Tahoma" w:cs="Tahoma" w:eastAsia="Tahoma"/>
+          <w:rFonts w:ascii="Arial" w:hAnsi="Arial" w:cs="Arial"/>
           <w:b/>
           <w:bCs/>
           <w:i/>
@@ -1757,13 +1862,16 @@
         <w:spacing w:line="240" w:lineRule="auto"/>
         <w:ind w:left="142" w:right="46"/>
         <w:jc w:val="both"/>
+        <w:rPr>
+          <w:rFonts w:ascii="Arial" w:hAnsi="Arial" w:cs="Arial"/>
+        </w:rPr>
       </w:pPr>
       <w:bookmarkStart w:id="2" w:name="_Hlk105767445"/>
       <w:bookmarkEnd w:id="2"/>
       <w:r>
         <w:rPr>
           <w:rStyle w:val="MSGENFONTSTYLENAMETEMPLATEROLEMSGENFONTSTYLENAMEBYROLEPICTURECAPTION"/>
-          <w:rFonts w:ascii="Tahoma" w:hAnsi="Tahoma" w:cs="Tahoma" w:eastAsia="Tahoma"/>
+          <w:rFonts w:ascii="Arial" w:hAnsi="Arial" w:cs="Arial"/>
           <w:sz w:val="22"/>
           <w:szCs w:val="22"/>
         </w:rPr>
@@ -1795,7 +1903,7 @@
               <w:snapToGrid w:val="0"/>
               <w:jc w:val="center"/>
               <w:rPr>
-                <w:rFonts w:ascii="Tahoma" w:hAnsi="Tahoma" w:cs="Tahoma" w:eastAsia="Tahoma"/>
+                <w:rFonts w:ascii="Arial" w:hAnsi="Arial" w:cs="Arial"/>
                 <w:sz w:val="22"/>
                 <w:szCs w:val="22"/>
                 <w:lang w:val="id-ID"/>
@@ -1806,7 +1914,7 @@
             <w:pPr>
               <w:jc w:val="center"/>
               <w:rPr>
-                <w:rFonts w:ascii="Tahoma" w:hAnsi="Tahoma" w:cs="Tahoma" w:eastAsia="Tahoma"/>
+                <w:rFonts w:ascii="Arial" w:hAnsi="Arial" w:cs="Arial"/>
                 <w:sz w:val="22"/>
                 <w:szCs w:val="22"/>
                 <w:lang w:val="id-ID"/>
@@ -1817,7 +1925,7 @@
             <w:pPr>
               <w:jc w:val="center"/>
               <w:rPr>
-                <w:rFonts w:ascii="Tahoma" w:hAnsi="Tahoma" w:cs="Tahoma" w:eastAsia="Tahoma"/>
+                <w:rFonts w:ascii="Arial" w:hAnsi="Arial" w:cs="Arial"/>
                 <w:sz w:val="22"/>
                 <w:szCs w:val="22"/>
                 <w:lang w:val="id-ID"/>
@@ -1825,7 +1933,7 @@
             </w:pPr>
             <w:r>
               <w:rPr>
-                <w:rFonts w:ascii="Tahoma" w:hAnsi="Tahoma" w:cs="Tahoma" w:eastAsia="Tahoma"/>
+                <w:rFonts w:ascii="Arial" w:hAnsi="Arial" w:cs="Arial"/>
                 <w:sz w:val="22"/>
                 <w:szCs w:val="22"/>
                 <w:lang w:val="id-ID"/>
@@ -1836,10 +1944,13 @@
           <w:p>
             <w:pPr>
               <w:jc w:val="center"/>
-            </w:pPr>
-            <w:r>
-              <w:rPr>
-                <w:rFonts w:ascii="Tahoma" w:hAnsi="Tahoma" w:cs="Tahoma" w:eastAsia="Tahoma"/>
+              <w:rPr>
+                <w:rFonts w:ascii="Arial" w:hAnsi="Arial" w:cs="Arial"/>
+              </w:rPr>
+            </w:pPr>
+            <w:r>
+              <w:rPr>
+                <w:rFonts w:ascii="Arial" w:hAnsi="Arial" w:cs="Arial"/>
                 <w:sz w:val="22"/>
                 <w:szCs w:val="22"/>
                 <w:lang w:val="id-ID"/>
@@ -1848,7 +1959,7 @@
             </w:r>
             <w:r>
               <w:rPr>
-                <w:rFonts w:ascii="Tahoma" w:hAnsi="Tahoma" w:cs="Tahoma" w:eastAsia="Tahoma"/>
+                <w:rFonts w:ascii="Arial" w:hAnsi="Arial" w:cs="Arial"/>
                 <w:sz w:val="22"/>
                 <w:szCs w:val="22"/>
                 <w:lang w:val="en-AU"/>
@@ -1860,7 +1971,7 @@
             <w:pPr>
               <w:jc w:val="center"/>
               <w:rPr>
-                <w:rFonts w:ascii="Tahoma" w:hAnsi="Tahoma" w:cs="Tahoma" w:eastAsia="Tahoma"/>
+                <w:rFonts w:ascii="Arial" w:hAnsi="Arial" w:cs="Arial"/>
                 <w:sz w:val="22"/>
                 <w:szCs w:val="22"/>
                 <w:lang w:val="en-AU"/>
@@ -1870,16 +1981,16 @@
           <w:p>
             <w:pPr>
               <w:rPr>
-                <w:rFonts w:ascii="Tahoma" w:hAnsi="Tahoma" w:cs="Tahoma" w:eastAsia="Tahoma"/>
-                <w:sz w:val="22"/>
-                <w:szCs w:val="22"/>
-              </w:rPr>
-            </w:pPr>
-          </w:p>
-          <w:p>
-            <w:pPr>
-              <w:rPr>
-                <w:rFonts w:ascii="Tahoma" w:hAnsi="Tahoma" w:cs="Tahoma" w:eastAsia="Tahoma"/>
+                <w:rFonts w:ascii="Arial" w:hAnsi="Arial" w:cs="Arial"/>
+                <w:sz w:val="22"/>
+                <w:szCs w:val="22"/>
+              </w:rPr>
+            </w:pPr>
+          </w:p>
+          <w:p>
+            <w:pPr>
+              <w:rPr>
+                <w:rFonts w:ascii="Arial" w:hAnsi="Arial" w:cs="Arial"/>
                 <w:sz w:val="36"/>
                 <w:szCs w:val="36"/>
               </w:rPr>
@@ -1889,7 +2000,7 @@
             <w:pPr>
               <w:jc w:val="center"/>
               <w:rPr>
-                <w:rFonts w:ascii="Tahoma" w:hAnsi="Tahoma" w:cs="Tahoma" w:eastAsia="Tahoma"/>
+                <w:rFonts w:ascii="Arial" w:hAnsi="Arial" w:cs="Arial"/>
                 <w:sz w:val="32"/>
                 <w:szCs w:val="32"/>
                 <w:u w:val="single"/>
@@ -1898,7 +2009,7 @@
             </w:pPr>
             <w:r>
               <w:rPr>
-                <w:rFonts w:ascii="Tahoma" w:hAnsi="Tahoma" w:cs="Tahoma" w:eastAsia="Tahoma"/>
+                <w:rFonts w:ascii="Arial" w:hAnsi="Arial" w:cs="Arial"/>
                 <w:sz w:val="22"/>
                 <w:szCs w:val="22"/>
                 <w:u w:val="single"/>
@@ -1911,14 +2022,14 @@
             <w:pPr>
               <w:jc w:val="center"/>
               <w:rPr>
-                <w:rFonts w:ascii="Tahoma" w:hAnsi="Tahoma" w:cs="Tahoma" w:eastAsia="Tahoma"/>
-                <w:sz w:val="22"/>
-                <w:szCs w:val="22"/>
-              </w:rPr>
-            </w:pPr>
-            <w:r>
-              <w:rPr>
-                <w:rFonts w:ascii="Tahoma" w:hAnsi="Tahoma" w:cs="Tahoma" w:eastAsia="Tahoma"/>
+                <w:rFonts w:ascii="Arial" w:hAnsi="Arial" w:cs="Arial"/>
+                <w:sz w:val="22"/>
+                <w:szCs w:val="22"/>
+              </w:rPr>
+            </w:pPr>
+            <w:r>
+              <w:rPr>
+                <w:rFonts w:ascii="Arial" w:hAnsi="Arial" w:cs="Arial"/>
                 <w:sz w:val="22"/>
                 <w:szCs w:val="22"/>
                 <w:lang w:val="id-ID"/>
@@ -1927,7 +2038,7 @@
             </w:r>
             <w:r>
               <w:rPr>
-                <w:rFonts w:ascii="Tahoma" w:hAnsi="Tahoma" w:cs="Tahoma" w:eastAsia="Tahoma"/>
+                <w:rFonts w:ascii="Arial" w:hAnsi="Arial" w:cs="Arial"/>
                 <w:sz w:val="22"/>
                 <w:szCs w:val="22"/>
               </w:rPr>
@@ -1935,7 +2046,7 @@
             </w:r>
             <w:r>
               <w:rPr>
-                <w:rFonts w:ascii="Tahoma" w:hAnsi="Tahoma" w:cs="Tahoma" w:eastAsia="Tahoma"/>
+                <w:rFonts w:ascii="Arial" w:hAnsi="Arial" w:cs="Arial"/>
                 <w:sz w:val="22"/>
                 <w:szCs w:val="22"/>
                 <w:lang w:val="id-ID"/>
@@ -1944,7 +2055,7 @@
             </w:r>
             <w:r>
               <w:rPr>
-                <w:rFonts w:ascii="Tahoma" w:hAnsi="Tahoma" w:cs="Tahoma" w:eastAsia="Tahoma"/>
+                <w:rFonts w:ascii="Arial" w:hAnsi="Arial" w:cs="Arial"/>
                 <w:sz w:val="22"/>
                 <w:szCs w:val="22"/>
               </w:rPr>
@@ -1952,7 +2063,7 @@
             </w:r>
             <w:r>
               <w:rPr>
-                <w:rFonts w:ascii="Tahoma" w:hAnsi="Tahoma" w:cs="Tahoma" w:eastAsia="Tahoma"/>
+                <w:rFonts w:ascii="Arial" w:hAnsi="Arial" w:cs="Arial"/>
                 <w:sz w:val="22"/>
                 <w:szCs w:val="22"/>
                 <w:shd w:val="clear" w:color="auto" w:fill="FFFFFF"/>
@@ -1969,7 +2080,7 @@
             <w:pPr>
               <w:jc w:val="center"/>
               <w:rPr>
-                <w:rFonts w:ascii="Tahoma" w:hAnsi="Tahoma" w:cs="Tahoma" w:eastAsia="Tahoma"/>
+                <w:rFonts w:ascii="Arial" w:hAnsi="Arial" w:cs="Arial"/>
                 <w:sz w:val="22"/>
                 <w:szCs w:val="22"/>
                 <w:lang w:val="id-ID"/>
@@ -1977,7 +2088,7 @@
             </w:pPr>
             <w:r>
               <w:rPr>
-                <w:rFonts w:ascii="Tahoma" w:hAnsi="Tahoma" w:cs="Tahoma" w:eastAsia="Tahoma"/>
+                <w:rFonts w:ascii="Arial" w:hAnsi="Arial" w:cs="Arial"/>
                 <w:sz w:val="22"/>
                 <w:szCs w:val="22"/>
                 <w:lang w:val="id-ID"/>
@@ -1988,10 +2099,13 @@
           <w:p>
             <w:pPr>
               <w:jc w:val="center"/>
-            </w:pPr>
-            <w:r>
-              <w:rPr>
-                <w:rFonts w:ascii="Tahoma" w:hAnsi="Tahoma" w:cs="Tahoma" w:eastAsia="Tahoma"/>
+              <w:rPr>
+                <w:rFonts w:ascii="Arial" w:hAnsi="Arial" w:cs="Arial"/>
+              </w:rPr>
+            </w:pPr>
+            <w:r>
+              <w:rPr>
+                <w:rFonts w:ascii="Arial" w:hAnsi="Arial" w:cs="Arial"/>
                 <w:sz w:val="22"/>
                 <w:szCs w:val="22"/>
                 <w:lang w:val="id-ID"/>
@@ -2000,7 +2114,7 @@
             </w:r>
             <w:r>
               <w:rPr>
-                <w:rFonts w:ascii="Tahoma" w:hAnsi="Tahoma" w:cs="Tahoma" w:eastAsia="Tahoma"/>
+                <w:rFonts w:ascii="Arial" w:hAnsi="Arial" w:cs="Arial"/>
                 <w:sz w:val="22"/>
                 <w:szCs w:val="22"/>
                 <w:lang w:val="en-AU"/>
@@ -2012,7 +2126,7 @@
             <w:pPr>
               <w:jc w:val="center"/>
               <w:rPr>
-                <w:rFonts w:ascii="Tahoma" w:hAnsi="Tahoma" w:cs="Tahoma" w:eastAsia="Tahoma"/>
+                <w:rFonts w:ascii="Arial" w:hAnsi="Arial" w:cs="Arial"/>
                 <w:sz w:val="22"/>
                 <w:szCs w:val="22"/>
                 <w:lang w:val="en-AU"/>
@@ -2020,7 +2134,7 @@
             </w:pPr>
             <w:r>
               <w:rPr>
-                <w:rFonts w:ascii="Tahoma" w:hAnsi="Tahoma" w:cs="Tahoma" w:eastAsia="Tahoma"/>
+                <w:rFonts w:ascii="Arial" w:hAnsi="Arial" w:cs="Arial"/>
                 <w:sz w:val="22"/>
                 <w:szCs w:val="22"/>
                 <w:lang w:val="en-AU"/>
@@ -2032,7 +2146,7 @@
             <w:pPr>
               <w:jc w:val="center"/>
               <w:rPr>
-                <w:rFonts w:ascii="Tahoma" w:hAnsi="Tahoma" w:cs="Tahoma" w:eastAsia="Tahoma"/>
+                <w:rFonts w:ascii="Arial" w:hAnsi="Arial" w:cs="Arial"/>
                 <w:sz w:val="22"/>
                 <w:szCs w:val="22"/>
                 <w:lang w:val="en-AU"/>
@@ -2040,7 +2154,7 @@
             </w:pPr>
             <w:r>
               <w:rPr>
-                <w:rFonts w:ascii="Tahoma" w:hAnsi="Tahoma" w:cs="Tahoma" w:eastAsia="Tahoma"/>
+                <w:rFonts w:ascii="Arial" w:hAnsi="Arial" w:cs="Arial"/>
                 <w:sz w:val="22"/>
                 <w:szCs w:val="22"/>
                 <w:lang w:val="en-AU"/>
@@ -2052,7 +2166,7 @@
             <w:pPr>
               <w:jc w:val="center"/>
               <w:rPr>
-                <w:rFonts w:ascii="Tahoma" w:hAnsi="Tahoma" w:cs="Tahoma" w:eastAsia="Tahoma"/>
+                <w:rFonts w:ascii="Arial" w:hAnsi="Arial" w:cs="Arial"/>
                 <w:sz w:val="40"/>
                 <w:szCs w:val="40"/>
                 <w:lang w:eastAsia="en-US"/>
@@ -2063,6 +2177,7 @@
             <w:pPr>
               <w:jc w:val="center"/>
               <w:rPr>
+                <w:rFonts w:ascii="Arial" w:hAnsi="Arial" w:cs="Arial"/>
                 <w:sz w:val="40"/>
                 <w:szCs w:val="40"/>
                 <w:lang w:eastAsia="en-US"/>
@@ -2073,6 +2188,7 @@
             <w:pPr>
               <w:jc w:val="center"/>
               <w:rPr>
+                <w:rFonts w:ascii="Arial" w:hAnsi="Arial" w:cs="Arial"/>
                 <w:sz w:val="22"/>
                 <w:szCs w:val="22"/>
                 <w:lang w:eastAsia="en-US"/>
@@ -2083,7 +2199,7 @@
             <w:pPr>
               <w:jc w:val="center"/>
               <w:rPr>
-                <w:rFonts w:ascii="Tahoma" w:hAnsi="Tahoma" w:cs="Tahoma" w:eastAsia="Tahoma"/>
+                <w:rFonts w:ascii="Arial" w:hAnsi="Arial" w:cs="Arial"/>
                 <w:sz w:val="22"/>
                 <w:szCs w:val="22"/>
                 <w:u w:val="single"/>
@@ -2091,7 +2207,7 @@
             </w:pPr>
             <w:r>
               <w:rPr>
-                <w:rFonts w:ascii="Tahoma" w:hAnsi="Tahoma" w:cs="Tahoma" w:eastAsia="Tahoma"/>
+                <w:rFonts w:ascii="Arial" w:hAnsi="Arial" w:cs="Arial"/>
                 <w:sz w:val="22"/>
                 <w:szCs w:val="22"/>
                 <w:u w:val="single"/>
@@ -2103,7 +2219,7 @@
             <w:pPr>
               <w:jc w:val="center"/>
               <w:rPr>
-                <w:rFonts w:ascii="Tahoma" w:hAnsi="Tahoma" w:cs="Tahoma" w:eastAsia="Tahoma"/>
+                <w:rFonts w:ascii="Arial" w:hAnsi="Arial" w:cs="Arial"/>
                 <w:sz w:val="22"/>
                 <w:szCs w:val="22"/>
                 <w:lang w:val="id-ID"/>
@@ -2111,7 +2227,7 @@
             </w:pPr>
             <w:r>
               <w:rPr>
-                <w:rFonts w:ascii="Tahoma" w:hAnsi="Tahoma" w:cs="Tahoma" w:eastAsia="Tahoma"/>
+                <w:rFonts w:ascii="Arial" w:hAnsi="Arial" w:cs="Arial"/>
                 <w:sz w:val="22"/>
                 <w:szCs w:val="22"/>
               </w:rPr>
@@ -2119,7 +2235,7 @@
             </w:r>
             <w:r>
               <w:rPr>
-                <w:rFonts w:ascii="Tahoma" w:hAnsi="Tahoma" w:cs="Tahoma" w:eastAsia="Tahoma"/>
+                <w:rFonts w:ascii="Arial" w:hAnsi="Arial" w:cs="Arial"/>
                 <w:sz w:val="22"/>
                 <w:szCs w:val="22"/>
                 <w:shd w:val="clear" w:color="auto" w:fill="FFFFFF"/>
@@ -2136,7 +2252,7 @@
             <w:pPr>
               <w:jc w:val="center"/>
               <w:rPr>
-                <w:rFonts w:ascii="Tahoma" w:hAnsi="Tahoma" w:cs="Tahoma" w:eastAsia="Tahoma"/>
+                <w:rFonts w:ascii="Arial" w:hAnsi="Arial" w:cs="Arial"/>
                 <w:sz w:val="22"/>
                 <w:szCs w:val="22"/>
                 <w:lang w:val="id-ID"/>
@@ -2144,7 +2260,7 @@
             </w:pPr>
             <w:r>
               <w:rPr>
-                <w:rFonts w:ascii="Tahoma" w:hAnsi="Tahoma" w:cs="Tahoma" w:eastAsia="Tahoma"/>
+                <w:rFonts w:ascii="Arial" w:hAnsi="Arial" w:cs="Arial"/>
                 <w:sz w:val="22"/>
                 <w:szCs w:val="22"/>
                 <w:lang w:val="id-ID"/>
@@ -2155,10 +2271,13 @@
           <w:p>
             <w:pPr>
               <w:jc w:val="center"/>
-            </w:pPr>
-            <w:r>
-              <w:rPr>
-                <w:rFonts w:ascii="Tahoma" w:hAnsi="Tahoma" w:cs="Tahoma" w:eastAsia="Tahoma"/>
+              <w:rPr>
+                <w:rFonts w:ascii="Arial" w:hAnsi="Arial" w:cs="Arial"/>
+              </w:rPr>
+            </w:pPr>
+            <w:r>
+              <w:rPr>
+                <w:rFonts w:ascii="Arial" w:hAnsi="Arial" w:cs="Arial"/>
                 <w:sz w:val="22"/>
                 <w:szCs w:val="22"/>
                 <w:lang w:val="id-ID"/>
@@ -2167,7 +2286,7 @@
             </w:r>
             <w:r>
               <w:rPr>
-                <w:rFonts w:ascii="Tahoma" w:hAnsi="Tahoma" w:cs="Tahoma" w:eastAsia="Tahoma"/>
+                <w:rFonts w:ascii="Arial" w:hAnsi="Arial" w:cs="Arial"/>
                 <w:sz w:val="22"/>
                 <w:szCs w:val="22"/>
                 <w:lang w:val="en-AU"/>
@@ -2179,7 +2298,7 @@
             <w:pPr>
               <w:jc w:val="center"/>
               <w:rPr>
-                <w:rFonts w:ascii="Tahoma" w:hAnsi="Tahoma" w:cs="Tahoma" w:eastAsia="Tahoma"/>
+                <w:rFonts w:ascii="Arial" w:hAnsi="Arial" w:cs="Arial"/>
                 <w:sz w:val="22"/>
                 <w:szCs w:val="22"/>
                 <w:lang w:val="en-AU"/>
@@ -2187,7 +2306,7 @@
             </w:pPr>
             <w:r>
               <w:rPr>
-                <w:rFonts w:ascii="Tahoma" w:hAnsi="Tahoma" w:cs="Tahoma" w:eastAsia="Tahoma"/>
+                <w:rFonts w:ascii="Arial" w:hAnsi="Arial" w:cs="Arial"/>
                 <w:sz w:val="22"/>
                 <w:szCs w:val="22"/>
                 <w:lang w:val="en-AU"/>
@@ -2199,7 +2318,7 @@
             <w:pPr>
               <w:jc w:val="center"/>
               <w:rPr>
-                <w:rFonts w:ascii="Tahoma" w:hAnsi="Tahoma" w:cs="Tahoma" w:eastAsia="Tahoma"/>
+                <w:rFonts w:ascii="Arial" w:hAnsi="Arial" w:cs="Arial"/>
                 <w:sz w:val="22"/>
                 <w:szCs w:val="22"/>
                 <w:lang w:eastAsia="en-US"/>
@@ -2210,6 +2329,7 @@
             <w:pPr>
               <w:jc w:val="center"/>
               <w:rPr>
+                <w:rFonts w:ascii="Arial" w:hAnsi="Arial" w:cs="Arial"/>
                 <w:sz w:val="22"/>
                 <w:szCs w:val="22"/>
                 <w:lang w:eastAsia="en-US"/>
@@ -2220,7 +2340,7 @@
             <w:pPr>
               <w:jc w:val="center"/>
               <w:rPr>
-                <w:rFonts w:ascii="Tahoma" w:hAnsi="Tahoma" w:cs="Tahoma" w:eastAsia="Tahoma"/>
+                <w:rFonts w:ascii="Arial" w:hAnsi="Arial" w:cs="Arial"/>
                 <w:sz w:val="22"/>
                 <w:szCs w:val="22"/>
                 <w:lang w:eastAsia="en-US"/>
@@ -2231,7 +2351,7 @@
             <w:pPr>
               <w:jc w:val="center"/>
               <w:rPr>
-                <w:rFonts w:ascii="Tahoma" w:hAnsi="Tahoma" w:cs="Tahoma" w:eastAsia="Tahoma"/>
+                <w:rFonts w:ascii="Arial" w:hAnsi="Arial" w:cs="Arial"/>
                 <w:sz w:val="22"/>
                 <w:szCs w:val="22"/>
                 <w:u w:val="single"/>
@@ -2239,7 +2359,7 @@
             </w:pPr>
             <w:r>
               <w:rPr>
-                <w:rFonts w:ascii="Tahoma" w:hAnsi="Tahoma" w:cs="Tahoma" w:eastAsia="Tahoma"/>
+                <w:rFonts w:ascii="Arial" w:hAnsi="Arial" w:cs="Arial"/>
                 <w:sz w:val="22"/>
                 <w:szCs w:val="22"/>
                 <w:u w:val="single"/>
@@ -2251,14 +2371,14 @@
             <w:pPr>
               <w:jc w:val="center"/>
               <w:rPr>
-                <w:rFonts w:ascii="Tahoma" w:hAnsi="Tahoma" w:cs="Tahoma" w:eastAsia="Tahoma"/>
-                <w:sz w:val="22"/>
-                <w:szCs w:val="22"/>
-              </w:rPr>
-            </w:pPr>
-            <w:r>
-              <w:rPr>
-                <w:rFonts w:ascii="Tahoma" w:hAnsi="Tahoma" w:cs="Tahoma" w:eastAsia="Tahoma"/>
+                <w:rFonts w:ascii="Arial" w:hAnsi="Arial" w:cs="Arial"/>
+                <w:sz w:val="22"/>
+                <w:szCs w:val="22"/>
+              </w:rPr>
+            </w:pPr>
+            <w:r>
+              <w:rPr>
+                <w:rFonts w:ascii="Arial" w:hAnsi="Arial" w:cs="Arial"/>
                 <w:sz w:val="22"/>
                 <w:szCs w:val="22"/>
               </w:rPr>
@@ -2278,7 +2398,7 @@
             <w:pPr>
               <w:snapToGrid w:val="0"/>
               <w:rPr>
-                <w:rFonts w:ascii="Tahoma" w:hAnsi="Tahoma" w:cs="Tahoma" w:eastAsia="Tahoma"/>
+                <w:rFonts w:ascii="Arial" w:hAnsi="Arial" w:cs="Arial"/>
                 <w:sz w:val="22"/>
                 <w:szCs w:val="22"/>
               </w:rPr>
@@ -2299,14 +2419,14 @@
                 <w:tab w:val="left" w:pos="8265"/>
               </w:tabs>
               <w:rPr>
-                <w:rFonts w:ascii="Tahoma" w:hAnsi="Tahoma" w:cs="Tahoma" w:eastAsia="Tahoma"/>
-                <w:sz w:val="22"/>
-                <w:szCs w:val="22"/>
-              </w:rPr>
-            </w:pPr>
-            <w:r>
-              <w:rPr>
-                <w:rFonts w:ascii="Tahoma" w:hAnsi="Tahoma" w:cs="Tahoma" w:eastAsia="Tahoma"/>
+                <w:rFonts w:ascii="Arial" w:hAnsi="Arial" w:cs="Arial"/>
+                <w:sz w:val="22"/>
+                <w:szCs w:val="22"/>
+              </w:rPr>
+            </w:pPr>
+            <w:r>
+              <w:rPr>
+                <w:rFonts w:ascii="Arial" w:hAnsi="Arial" w:cs="Arial"/>
                 <w:sz w:val="22"/>
                 <w:szCs w:val="22"/>
               </w:rPr>
@@ -2327,14 +2447,14 @@
                 <w:tab w:val="left" w:pos="8265"/>
               </w:tabs>
               <w:rPr>
-                <w:rFonts w:ascii="Tahoma" w:hAnsi="Tahoma" w:cs="Tahoma" w:eastAsia="Tahoma"/>
-                <w:sz w:val="22"/>
-                <w:szCs w:val="22"/>
-              </w:rPr>
-            </w:pPr>
-            <w:r>
-              <w:rPr>
-                <w:rFonts w:ascii="Tahoma" w:hAnsi="Tahoma" w:cs="Tahoma" w:eastAsia="Tahoma"/>
+                <w:rFonts w:ascii="Arial" w:hAnsi="Arial" w:cs="Arial"/>
+                <w:sz w:val="22"/>
+                <w:szCs w:val="22"/>
+              </w:rPr>
+            </w:pPr>
+            <w:r>
+              <w:rPr>
+                <w:rFonts w:ascii="Arial" w:hAnsi="Arial" w:cs="Arial"/>
                 <w:sz w:val="22"/>
                 <w:szCs w:val="22"/>
               </w:rPr>
@@ -2343,7 +2463,7 @@
             </w:r>
             <w:r>
               <w:rPr>
-                <w:rFonts w:ascii="Tahoma" w:hAnsi="Tahoma" w:cs="Tahoma" w:eastAsia="Tahoma"/>
+                <w:rFonts w:ascii="Arial" w:hAnsi="Arial" w:cs="Arial"/>
                 <w:sz w:val="22"/>
                 <w:szCs w:val="22"/>
               </w:rPr>
@@ -2365,7 +2485,7 @@
               <w:snapToGrid w:val="0"/>
               <w:ind w:firstLine="993"/>
               <w:rPr>
-                <w:rFonts w:ascii="Tahoma" w:hAnsi="Tahoma" w:cs="Tahoma" w:eastAsia="Tahoma"/>
+                <w:rFonts w:ascii="Arial" w:hAnsi="Arial" w:cs="Arial"/>
                 <w:sz w:val="10"/>
                 <w:szCs w:val="10"/>
                 <w:lang w:eastAsia="en-US"/>
@@ -2376,6 +2496,7 @@
             <w:pPr>
               <w:ind w:left="567" w:firstLine="993"/>
               <w:rPr>
+                <w:rFonts w:ascii="Arial" w:hAnsi="Arial" w:cs="Arial"/>
                 <w:sz w:val="10"/>
                 <w:szCs w:val="10"/>
                 <w:lang w:eastAsia="en-US"/>
@@ -2386,6 +2507,7 @@
             <w:pPr>
               <w:ind w:left="567" w:firstLine="993"/>
               <w:rPr>
+                <w:rFonts w:ascii="Arial" w:hAnsi="Arial" w:cs="Arial"/>
                 <w:sz w:val="8"/>
                 <w:szCs w:val="8"/>
                 <w:lang w:eastAsia="en-US"/>
@@ -2396,6 +2518,7 @@
             <w:pPr>
               <w:ind w:left="567" w:firstLine="993"/>
               <w:rPr>
+                <w:rFonts w:ascii="Arial" w:hAnsi="Arial" w:cs="Arial"/>
                 <w:sz w:val="18"/>
                 <w:szCs w:val="18"/>
                 <w:lang w:eastAsia="en-US"/>
@@ -2406,6 +2529,7 @@
             <w:pPr>
               <w:ind w:left="567" w:firstLine="993"/>
               <w:rPr>
+                <w:rFonts w:ascii="Arial" w:hAnsi="Arial" w:cs="Arial"/>
                 <w:sz w:val="14"/>
                 <w:szCs w:val="14"/>
                 <w:lang w:eastAsia="en-US"/>
@@ -2416,6 +2540,7 @@
             <w:pPr>
               <w:ind w:left="567" w:firstLine="993"/>
               <w:rPr>
+                <w:rFonts w:ascii="Arial" w:hAnsi="Arial" w:cs="Arial"/>
                 <w:sz w:val="22"/>
                 <w:szCs w:val="22"/>
                 <w:lang w:eastAsia="en-US"/>
@@ -2426,7 +2551,7 @@
             <w:pPr>
               <w:jc w:val="center"/>
               <w:rPr>
-                <w:rFonts w:ascii="Tahoma" w:hAnsi="Tahoma" w:cs="Tahoma" w:eastAsia="Tahoma"/>
+                <w:rFonts w:ascii="Arial" w:hAnsi="Arial" w:cs="Arial"/>
                 <w:sz w:val="22"/>
                 <w:szCs w:val="22"/>
                 <w:lang w:val="id-ID"/>
@@ -2434,7 +2559,7 @@
             </w:pPr>
             <w:r>
               <w:rPr>
-                <w:rFonts w:ascii="Tahoma" w:hAnsi="Tahoma" w:cs="Tahoma" w:eastAsia="Tahoma"/>
+                <w:rFonts w:ascii="Arial" w:hAnsi="Arial" w:cs="Arial"/>
                 <w:sz w:val="22"/>
                 <w:szCs w:val="22"/>
                 <w:u w:val="single"/>
@@ -2445,7 +2570,7 @@
             </w:r>
             <w:r>
               <w:rPr>
-                <w:rFonts w:ascii="Tahoma" w:hAnsi="Tahoma" w:cs="Tahoma" w:eastAsia="Tahoma"/>
+                <w:rFonts w:ascii="Arial" w:hAnsi="Arial" w:cs="Arial"/>
                 <w:sz w:val="22"/>
                 <w:szCs w:val="22"/>
                 <w:lang w:val="id-ID"/>
@@ -2457,7 +2582,7 @@
             <w:pPr>
               <w:jc w:val="center"/>
               <w:rPr>
-                <w:rFonts w:ascii="Tahoma" w:hAnsi="Tahoma" w:cs="Tahoma" w:eastAsia="Tahoma"/>
+                <w:rFonts w:ascii="Arial" w:hAnsi="Arial" w:cs="Arial"/>
                 <w:sz w:val="22"/>
                 <w:szCs w:val="22"/>
                 <w:lang w:val="en-GB"/>
@@ -2465,7 +2590,7 @@
             </w:pPr>
             <w:r>
               <w:rPr>
-                <w:rFonts w:ascii="Tahoma" w:hAnsi="Tahoma" w:cs="Tahoma" w:eastAsia="Tahoma"/>
+                <w:rFonts w:ascii="Arial" w:hAnsi="Arial" w:cs="Arial"/>
                 <w:sz w:val="22"/>
                 <w:szCs w:val="22"/>
                 <w:lang w:val="id-ID"/>
@@ -2474,7 +2599,7 @@
             </w:r>
             <w:r>
               <w:rPr>
-                <w:rFonts w:ascii="Tahoma" w:hAnsi="Tahoma" w:cs="Tahoma" w:eastAsia="Tahoma"/>
+                <w:rFonts w:ascii="Arial" w:hAnsi="Arial" w:cs="Arial"/>
                 <w:sz w:val="22"/>
                 <w:szCs w:val="22"/>
               </w:rPr>
@@ -2482,7 +2607,7 @@
             </w:r>
             <w:r>
               <w:rPr>
-                <w:rFonts w:ascii="Tahoma" w:hAnsi="Tahoma" w:cs="Tahoma" w:eastAsia="Tahoma"/>
+                <w:rFonts w:ascii="Arial" w:hAnsi="Arial" w:cs="Arial"/>
                 <w:sz w:val="22"/>
                 <w:szCs w:val="22"/>
                 <w:lang w:val="id-ID"/>
@@ -2491,7 +2616,7 @@
             </w:r>
             <w:r>
               <w:rPr>
-                <w:rFonts w:ascii="Tahoma" w:hAnsi="Tahoma" w:cs="Tahoma" w:eastAsia="Tahoma"/>
+                <w:rFonts w:ascii="Arial" w:hAnsi="Arial" w:cs="Arial"/>
                 <w:sz w:val="22"/>
                 <w:szCs w:val="22"/>
                 <w:shd w:val="clear" w:color="auto" w:fill="FFFFFF"/>
@@ -2510,7 +2635,7 @@
               <w:snapToGrid w:val="0"/>
               <w:jc w:val="center"/>
               <w:rPr>
-                <w:rFonts w:ascii="Tahoma" w:hAnsi="Tahoma" w:cs="Tahoma" w:eastAsia="Tahoma"/>
+                <w:rFonts w:ascii="Arial" w:hAnsi="Arial" w:cs="Arial"/>
                 <w:sz w:val="22"/>
                 <w:szCs w:val="22"/>
                 <w:lang w:eastAsia="en-US"/>
@@ -2521,6 +2646,7 @@
             <w:pPr>
               <w:jc w:val="center"/>
               <w:rPr>
+                <w:rFonts w:ascii="Arial" w:hAnsi="Arial" w:cs="Arial"/>
                 <w:sz w:val="14"/>
                 <w:szCs w:val="14"/>
                 <w:lang w:eastAsia="en-US"/>
@@ -2531,6 +2657,7 @@
             <w:pPr>
               <w:jc w:val="center"/>
               <w:rPr>
+                <w:rFonts w:ascii="Arial" w:hAnsi="Arial" w:cs="Arial"/>
                 <w:sz w:val="16"/>
                 <w:szCs w:val="16"/>
                 <w:lang w:eastAsia="en-US"/>
@@ -2541,6 +2668,7 @@
             <w:pPr>
               <w:jc w:val="center"/>
               <w:rPr>
+                <w:rFonts w:ascii="Arial" w:hAnsi="Arial" w:cs="Arial"/>
                 <w:sz w:val="22"/>
                 <w:szCs w:val="22"/>
                 <w:lang w:eastAsia="en-US"/>
@@ -2551,6 +2679,7 @@
             <w:pPr>
               <w:jc w:val="center"/>
               <w:rPr>
+                <w:rFonts w:ascii="Arial" w:hAnsi="Arial" w:cs="Arial"/>
                 <w:sz w:val="22"/>
                 <w:szCs w:val="22"/>
                 <w:lang w:eastAsia="en-US"/>
@@ -2561,7 +2690,7 @@
             <w:pPr>
               <w:jc w:val="center"/>
               <w:rPr>
-                <w:rFonts w:ascii="Tahoma" w:hAnsi="Tahoma" w:cs="Tahoma" w:eastAsia="Tahoma"/>
+                <w:rFonts w:ascii="Arial" w:hAnsi="Arial" w:cs="Arial"/>
                 <w:sz w:val="22"/>
                 <w:szCs w:val="22"/>
                 <w:u w:val="single"/>
@@ -2571,7 +2700,7 @@
             </w:pPr>
             <w:r>
               <w:rPr>
-                <w:rFonts w:ascii="Tahoma" w:hAnsi="Tahoma" w:cs="Tahoma" w:eastAsia="Tahoma"/>
+                <w:rFonts w:ascii="Arial" w:hAnsi="Arial" w:cs="Arial"/>
                 <w:sz w:val="22"/>
                 <w:szCs w:val="22"/>
                 <w:u w:val="single"/>
@@ -2583,6 +2712,7 @@
             <w:pPr>
               <w:jc w:val="center"/>
               <w:rPr>
+                <w:rFonts w:ascii="Arial" w:hAnsi="Arial" w:cs="Arial"/>
                 <w:sz w:val="22"/>
                 <w:szCs w:val="22"/>
                 <w:lang w:eastAsia="en-US"/>
@@ -2590,7 +2720,7 @@
             </w:pPr>
             <w:r>
               <w:rPr>
-                <w:rFonts w:ascii="Tahoma" w:hAnsi="Tahoma" w:cs="Tahoma" w:eastAsia="Tahoma"/>
+                <w:rFonts w:ascii="Arial" w:hAnsi="Arial" w:cs="Arial"/>
                 <w:sz w:val="22"/>
                 <w:szCs w:val="22"/>
                 <w:lang w:val="id-ID"/>
@@ -2599,7 +2729,7 @@
             </w:r>
             <w:r>
               <w:rPr>
-                <w:rFonts w:ascii="Tahoma" w:hAnsi="Tahoma" w:cs="Tahoma" w:eastAsia="Tahoma"/>
+                <w:rFonts w:ascii="Arial" w:hAnsi="Arial" w:cs="Arial"/>
                 <w:sz w:val="22"/>
                 <w:szCs w:val="22"/>
               </w:rPr>
@@ -2607,7 +2737,7 @@
             </w:r>
             <w:r>
               <w:rPr>
-                <w:rFonts w:ascii="Tahoma" w:hAnsi="Tahoma" w:cs="Tahoma" w:eastAsia="Tahoma"/>
+                <w:rFonts w:ascii="Arial" w:hAnsi="Arial" w:cs="Arial"/>
                 <w:sz w:val="22"/>
                 <w:szCs w:val="22"/>
                 <w:lang w:val="id-ID"/>
@@ -2616,7 +2746,7 @@
             </w:r>
             <w:r>
               <w:rPr>
-                <w:rFonts w:ascii="Tahoma" w:hAnsi="Tahoma" w:cs="Tahoma" w:eastAsia="Tahoma"/>
+                <w:rFonts w:ascii="Arial" w:hAnsi="Arial" w:cs="Arial"/>
                 <w:sz w:val="22"/>
                 <w:szCs w:val="22"/>
                 <w:shd w:val="clear" w:color="auto" w:fill="FFFFFF"/>
@@ -2634,6 +2764,7 @@
               <w:snapToGrid w:val="0"/>
               <w:jc w:val="center"/>
               <w:rPr>
+                <w:rFonts w:ascii="Arial" w:hAnsi="Arial" w:cs="Arial"/>
                 <w:sz w:val="22"/>
                 <w:szCs w:val="22"/>
                 <w:lang w:eastAsia="en-US"/>
@@ -2644,6 +2775,7 @@
             <w:pPr>
               <w:jc w:val="center"/>
               <w:rPr>
+                <w:rFonts w:ascii="Arial" w:hAnsi="Arial" w:cs="Arial"/>
                 <w:sz w:val="22"/>
                 <w:szCs w:val="22"/>
                 <w:lang w:eastAsia="en-US"/>
@@ -2654,6 +2786,7 @@
             <w:pPr>
               <w:jc w:val="center"/>
               <w:rPr>
+                <w:rFonts w:ascii="Arial" w:hAnsi="Arial" w:cs="Arial"/>
                 <w:sz w:val="22"/>
                 <w:szCs w:val="22"/>
                 <w:lang w:eastAsia="en-US"/>
@@ -2664,7 +2797,7 @@
             <w:pPr>
               <w:jc w:val="center"/>
               <w:rPr>
-                <w:rFonts w:ascii="Tahoma" w:hAnsi="Tahoma" w:cs="Tahoma" w:eastAsia="Tahoma"/>
+                <w:rFonts w:ascii="Arial" w:hAnsi="Arial" w:cs="Arial"/>
                 <w:sz w:val="22"/>
                 <w:szCs w:val="22"/>
                 <w:lang w:eastAsia="en-US"/>
@@ -2675,7 +2808,7 @@
             <w:pPr>
               <w:jc w:val="center"/>
               <w:rPr>
-                <w:rFonts w:ascii="Tahoma" w:hAnsi="Tahoma" w:cs="Tahoma" w:eastAsia="Tahoma"/>
+                <w:rFonts w:ascii="Arial" w:hAnsi="Arial" w:cs="Arial"/>
                 <w:sz w:val="22"/>
                 <w:szCs w:val="22"/>
                 <w:u w:val="single"/>
@@ -2683,7 +2816,7 @@
             </w:pPr>
             <w:r>
               <w:rPr>
-                <w:rFonts w:ascii="Tahoma" w:hAnsi="Tahoma" w:cs="Tahoma" w:eastAsia="Tahoma"/>
+                <w:rFonts w:ascii="Arial" w:hAnsi="Arial" w:cs="Arial"/>
                 <w:sz w:val="22"/>
                 <w:szCs w:val="22"/>
                 <w:u w:val="single"/>
@@ -2693,7 +2826,7 @@
             </w:r>
             <w:r>
               <w:rPr>
-                <w:rFonts w:ascii="Tahoma" w:hAnsi="Tahoma" w:cs="Tahoma" w:eastAsia="Tahoma"/>
+                <w:rFonts w:ascii="Arial" w:hAnsi="Arial" w:cs="Arial"/>
                 <w:sz w:val="22"/>
                 <w:szCs w:val="22"/>
                 <w:u w:val="single"/>
@@ -2703,7 +2836,7 @@
             </w:r>
             <w:r>
               <w:rPr>
-                <w:rFonts w:ascii="Tahoma" w:hAnsi="Tahoma" w:cs="Tahoma" w:eastAsia="Tahoma"/>
+                <w:rFonts w:ascii="Arial" w:hAnsi="Arial" w:cs="Arial"/>
                 <w:sz w:val="22"/>
                 <w:szCs w:val="22"/>
                 <w:u w:val="single"/>
@@ -2716,14 +2849,14 @@
             <w:pPr>
               <w:jc w:val="center"/>
               <w:rPr>
-                <w:rFonts w:ascii="Tahoma" w:hAnsi="Tahoma" w:cs="Tahoma" w:eastAsia="Tahoma"/>
-                <w:sz w:val="22"/>
-                <w:szCs w:val="22"/>
-              </w:rPr>
-            </w:pPr>
-            <w:r>
-              <w:rPr>
-                <w:rFonts w:ascii="Tahoma" w:hAnsi="Tahoma" w:cs="Tahoma" w:eastAsia="Tahoma"/>
+                <w:rFonts w:ascii="Arial" w:hAnsi="Arial" w:cs="Arial"/>
+                <w:sz w:val="22"/>
+                <w:szCs w:val="22"/>
+              </w:rPr>
+            </w:pPr>
+            <w:r>
+              <w:rPr>
+                <w:rFonts w:ascii="Arial" w:hAnsi="Arial" w:cs="Arial"/>
                 <w:sz w:val="22"/>
                 <w:szCs w:val="22"/>
                 <w:lang w:val="id-ID"/>
@@ -2732,7 +2865,7 @@
             </w:r>
             <w:r>
               <w:rPr>
-                <w:rFonts w:ascii="Tahoma" w:hAnsi="Tahoma" w:cs="Tahoma" w:eastAsia="Tahoma"/>
+                <w:rFonts w:ascii="Arial" w:hAnsi="Arial" w:cs="Arial"/>
                 <w:sz w:val="22"/>
                 <w:szCs w:val="22"/>
               </w:rPr>
@@ -2740,7 +2873,7 @@
             </w:r>
             <w:r>
               <w:rPr>
-                <w:rFonts w:ascii="Tahoma" w:hAnsi="Tahoma" w:cs="Tahoma" w:eastAsia="Tahoma"/>
+                <w:rFonts w:ascii="Arial" w:hAnsi="Arial" w:cs="Arial"/>
                 <w:sz w:val="22"/>
                 <w:szCs w:val="22"/>
                 <w:lang w:val="id-ID"/>
@@ -2749,7 +2882,7 @@
             </w:r>
             <w:r>
               <w:rPr>
-                <w:rFonts w:ascii="Tahoma" w:hAnsi="Tahoma" w:cs="Tahoma" w:eastAsia="Tahoma"/>
+                <w:rFonts w:ascii="Arial" w:hAnsi="Arial" w:cs="Arial"/>
                 <w:sz w:val="22"/>
                 <w:szCs w:val="22"/>
                 <w:lang w:val="id-ID" w:eastAsia="en-US"/>
@@ -2758,7 +2891,7 @@
             </w:r>
             <w:r>
               <w:rPr>
-                <w:rFonts w:ascii="Tahoma" w:hAnsi="Tahoma" w:cs="Tahoma" w:eastAsia="Tahoma"/>
+                <w:rFonts w:ascii="Arial" w:hAnsi="Arial" w:cs="Arial"/>
                 <w:sz w:val="22"/>
                 <w:szCs w:val="22"/>
                 <w:lang w:eastAsia="en-US"/>
@@ -2779,7 +2912,7 @@
             <w:pPr>
               <w:snapToGrid w:val="0"/>
               <w:rPr>
-                <w:rFonts w:ascii="Tahoma" w:hAnsi="Tahoma" w:cs="Tahoma" w:eastAsia="Tahoma"/>
+                <w:rFonts w:ascii="Arial" w:hAnsi="Arial" w:cs="Arial"/>
                 <w:sz w:val="22"/>
                 <w:szCs w:val="22"/>
               </w:rPr>
@@ -2795,6 +2928,7 @@
         <w:spacing w:line="240" w:lineRule="auto"/>
         <w:ind w:right="-176"/>
         <w:rPr>
+          <w:rFonts w:ascii="Arial" w:hAnsi="Arial" w:cs="Arial"/>
           <w:lang w:eastAsia="id-ID"/>
         </w:rPr>
       </w:pPr>
@@ -3208,7 +3342,6 @@
       <w:suppressAutoHyphens/>
     </w:pPr>
     <w:rPr>
-      <w:rFonts w:ascii="Tahoma" w:eastAsia="Tahoma" w:hAnsi="Tahoma" w:cs="Tahoma"/>
       <w:color w:val="000000"/>
       <w:sz w:val="24"/>
       <w:szCs w:val="24"/>
@@ -3245,7 +3378,7 @@
     <w:name w:val="WW8Num1z0"/>
     <w:qFormat/>
     <w:rPr>
-      <w:rFonts w:ascii="Tahoma" w:hAnsi="Tahoma" w:cs="Tahoma" w:eastAsia="Tahoma"/>
+      <w:rFonts w:ascii="Tahoma" w:eastAsia="Tahoma" w:hAnsi="Tahoma" w:cs="Tahoma"/>
       <w:b w:val="0"/>
       <w:bCs w:val="0"/>
       <w:i w:val="0"/>
@@ -3268,7 +3401,7 @@
     <w:name w:val="MSG_EN_FONT_STYLE_NAME_TEMPLATE_ROLE_NUMBER MSG_EN_FONT_STYLE_NAME_BY_ROLE_TEXT 2_"/>
     <w:qFormat/>
     <w:rPr>
-      <w:rFonts w:ascii="Tahoma" w:hAnsi="Tahoma" w:cs="Tahoma" w:eastAsia="Tahoma"/>
+      <w:rFonts w:ascii="Tahoma" w:eastAsia="Tahoma" w:hAnsi="Tahoma" w:cs="Tahoma"/>
       <w:sz w:val="21"/>
       <w:szCs w:val="21"/>
       <w:shd w:val="clear" w:color="auto" w:fill="FFFFFF"/>
@@ -3278,7 +3411,7 @@
     <w:name w:val="MSG_EN_FONT_STYLE_NAME_TEMPLATE_ROLE_NUMBER MSG_EN_FONT_STYLE_NAME_BY_ROLE_TEXT 3_"/>
     <w:qFormat/>
     <w:rPr>
-      <w:rFonts w:ascii="Tahoma" w:hAnsi="Tahoma" w:cs="Tahoma" w:eastAsia="Tahoma"/>
+      <w:rFonts w:ascii="Tahoma" w:eastAsia="Tahoma" w:hAnsi="Tahoma" w:cs="Tahoma"/>
       <w:b/>
       <w:bCs/>
       <w:i/>
@@ -3292,7 +3425,7 @@
     <w:name w:val="MSG_EN_FONT_STYLE_NAME_TEMPLATE_ROLE_NUMBER MSG_EN_FONT_STYLE_NAME_BY_ROLE_TEXT 3 + MSG_EN_FONT_STYLE_MODIFER_SIZE 5"/>
     <w:qFormat/>
     <w:rPr>
-      <w:rFonts w:ascii="Tahoma" w:hAnsi="Tahoma" w:cs="Tahoma" w:eastAsia="Tahoma"/>
+      <w:rFonts w:ascii="Tahoma" w:eastAsia="Tahoma" w:hAnsi="Tahoma" w:cs="Tahoma"/>
       <w:b w:val="0"/>
       <w:bCs w:val="0"/>
       <w:i w:val="0"/>
@@ -3306,7 +3439,7 @@
     <w:name w:val="MSG_EN_FONT_STYLE_NAME_TEMPLATE_ROLE MSG_EN_FONT_STYLE_NAME_BY_ROLE_PICTURE_CAPTION_"/>
     <w:qFormat/>
     <w:rPr>
-      <w:rFonts w:ascii="Tahoma" w:hAnsi="Tahoma" w:cs="Tahoma" w:eastAsia="Tahoma"/>
+      <w:rFonts w:ascii="Tahoma" w:eastAsia="Tahoma" w:hAnsi="Tahoma" w:cs="Tahoma"/>
       <w:sz w:val="21"/>
       <w:szCs w:val="21"/>
       <w:shd w:val="clear" w:color="auto" w:fill="FFFFFF"/>
@@ -3316,7 +3449,7 @@
     <w:name w:val="MSG_EN_FONT_STYLE_NAME_TEMPLATE_ROLE MSG_EN_FONT_STYLE_NAME_BY_ROLE_PICTURE_CAPTION"/>
     <w:qFormat/>
     <w:rPr>
-      <w:rFonts w:ascii="Tahoma" w:hAnsi="Tahoma" w:cs="Tahoma" w:eastAsia="Tahoma"/>
+      <w:rFonts w:ascii="Tahoma" w:eastAsia="Tahoma" w:hAnsi="Tahoma" w:cs="Tahoma"/>
       <w:sz w:val="21"/>
       <w:szCs w:val="21"/>
       <w:u w:val="single"/>
@@ -3366,7 +3499,6 @@
       <w:spacing w:before="240" w:after="120"/>
     </w:pPr>
     <w:rPr>
-      <w:rFonts w:ascii="Tahoma" w:eastAsia="Tahoma" w:hAnsi="Tahoma" w:cs="Tahoma"/>
       <w:sz w:val="28"/>
       <w:szCs w:val="28"/>
     </w:rPr>
@@ -3381,9 +3513,6 @@
   <w:style w:type="paragraph" w:styleId="List">
     <w:name w:val="List"/>
     <w:basedOn w:val="BodyText"/>
-    <w:rPr>
-      <w:rFonts w:cs="Tahoma" w:ascii="Tahoma" w:hAnsi="Tahoma" w:eastAsia="Tahoma"/>
-    </w:rPr>
   </w:style>
   <w:style w:type="paragraph" w:styleId="Caption">
     <w:name w:val="caption"/>
@@ -3394,7 +3523,6 @@
       <w:spacing w:before="120" w:after="120"/>
     </w:pPr>
     <w:rPr>
-      <w:rFonts w:cs="Tahoma" w:ascii="Tahoma" w:hAnsi="Tahoma" w:eastAsia="Tahoma"/>
       <w:i/>
       <w:iCs/>
     </w:rPr>
@@ -3406,9 +3534,6 @@
     <w:pPr>
       <w:suppressLineNumbers/>
     </w:pPr>
-    <w:rPr>
-      <w:rFonts w:cs="Tahoma" w:ascii="Tahoma" w:hAnsi="Tahoma" w:eastAsia="Tahoma"/>
-    </w:rPr>
   </w:style>
   <w:style w:type="paragraph" w:customStyle="1" w:styleId="MSGENFONTSTYLENAMETEMPLATEROLENUMBERMSGENFONTSTYLENAMEBYROLETEXT20">
     <w:name w:val="MSG_EN_FONT_STYLE_NAME_TEMPLATE_ROLE_NUMBER MSG_EN_FONT_STYLE_NAME_BY_ROLE_TEXT 2"/>
@@ -3420,7 +3545,6 @@
       <w:jc w:val="center"/>
     </w:pPr>
     <w:rPr>
-      <w:rFonts w:ascii="Tahoma" w:eastAsia="Tahoma" w:hAnsi="Tahoma" w:cs="Tahoma"/>
       <w:sz w:val="21"/>
       <w:szCs w:val="21"/>
       <w:lang w:val="id-ID"/>
@@ -3436,7 +3560,6 @@
       <w:jc w:val="both"/>
     </w:pPr>
     <w:rPr>
-      <w:rFonts w:ascii="Tahoma" w:eastAsia="Tahoma" w:hAnsi="Tahoma" w:cs="Tahoma"/>
       <w:b/>
       <w:bCs/>
       <w:i/>
@@ -3455,7 +3578,6 @@
       <w:spacing w:line="278" w:lineRule="exact"/>
     </w:pPr>
     <w:rPr>
-      <w:rFonts w:ascii="Tahoma" w:eastAsia="Tahoma" w:hAnsi="Tahoma" w:cs="Tahoma"/>
       <w:sz w:val="21"/>
       <w:szCs w:val="21"/>
       <w:lang w:val="id-ID"/>
@@ -3466,7 +3588,6 @@
     <w:basedOn w:val="Normal"/>
     <w:qFormat/>
     <w:rPr>
-      <w:rFonts w:ascii="Tahoma" w:hAnsi="Tahoma" w:cs="Tahoma" w:eastAsia="Tahoma"/>
       <w:sz w:val="16"/>
       <w:szCs w:val="16"/>
     </w:rPr>

</xml_diff>